<commit_message>
Update report and README with verified platform audit results
</commit_message>
<xml_diff>
--- a/output/pdf/taskflow-report.docx
+++ b/output/pdf/taskflow-report.docx
@@ -114,7 +114,7 @@
           <w:noProof/>
           <w:lang w:val="en-US"/>
         </w:rPr>
-        <w:pict w14:anchorId="7074431E">
+        <w:pict w14:anchorId="7A106C66">
           <v:shapetype id="_x0000_t75" coordsize="21600,21600" o:spt="75" o:preferrelative="t" path="m@4@5l@4@11@9@11@9@5xe" filled="f" stroked="f">
             <v:stroke joinstyle="miter"/>
             <v:formulas>
@@ -635,7 +635,7 @@
           <w:noProof/>
           <w:lang w:val="en-US"/>
         </w:rPr>
-        <w:pict w14:anchorId="373FCA0A">
+        <w:pict w14:anchorId="631B834F">
           <v:shape id="Picture 6" o:spid="_x0000_i1026" type="#_x0000_t75" style="width:117pt;height:65pt;visibility:visible">
             <v:imagedata r:id="rId7" o:title=""/>
           </v:shape>
@@ -1065,10 +1065,13 @@
         <w:t>This report investigates UI automation testing through TaskFlow, a Flutter task-management application with isolated offline, sample and account workspaces. The study connects unit, widget, golden, native integration and browser tests to specific risks rather than treating test count as a quality measure. Injectable repositories, clocks and identifiers support deterministic fixtures, while explicit completion gates expose loading and recovery states. The account implementation adds a Node.js and SQLite boun</w:t>
       </w:r>
       <w:r>
-        <w:t xml:space="preserve">dary with ownership checks and revision-based snapshot writes. A deliberate substring-to-prefix search defect is detected by a permanent regression, with authentic baseline, failure and corrected outputs. Three rounds of selected test-level commands illustrate local wall-time differences, but unequal workloads and startup overhead prevent a universal speed ranking. During report preparation, the updated Flutter suite passed 100 cases and the backend suite passed 14 cases. Retained Windows and Edge evidence </w:t>
-      </w:r>
-      <w:r>
-        <w:t>and historical Android CI results are reported with their revision and platform boundaries. These selected checks do not establish absence of defects or unconditional release readiness. The study concludes that clear oracles, isolated state, complementary execution boundaries and honest interpretation are central to a defensible Flutter testing case study.</w:t>
+        <w:t>dary with ownership checks and revision-based snapshot writes. A deliberate substring-to-prefix search defect is detected by a permanent regression, with authentic baseline, failure and corrected outputs. Three rounds of selected test-level commands illustrate local wall-time differences, but unequal workloads and startup overhead prevent a universal speed ranking. During report preparation, the updated Flutter suite passed 100 cases and the backend suite passed 14 cases. Retained Windows and Android native</w:t>
+      </w:r>
+      <w:r>
+        <w:t xml:space="preserve"> suites each passed 15 cases on 14 and 15 September 2026, respectively. Android release installation and process-restart persistence were verified on the local API 36 emulator. Edge and historical Android CI results retain their revision and platform boundaries. These selected checks do not establish absence of defects or unconditional release readiness. The study concludes that clear oracles, isolated state, complementary execution boundaries and honest interpretation are central to a defensible Flutter te</w:t>
+      </w:r>
+      <w:r>
+        <w:t>sting case study.</w:t>
       </w:r>
     </w:p>
     <w:p>
@@ -1114,7 +1117,7 @@
       <w:r>
         <w:fldChar w:fldCharType="separate"/>
       </w:r>
-      <w:hyperlink w:anchor="_Toc240233597" w:history="1">
+      <w:hyperlink w:anchor="_Toc240394910" w:history="1">
         <w:r>
           <w:rPr>
             <w:rStyle w:val="Hyperlink"/>
@@ -1141,7 +1144,7 @@
             <w:noProof/>
             <w:webHidden/>
           </w:rPr>
-          <w:instrText xml:space="preserve"> PAGEREF _Toc240233597 \h </w:instrText>
+          <w:instrText xml:space="preserve"> PAGEREF _Toc240394910 \h </w:instrText>
         </w:r>
         <w:r>
           <w:rPr>
@@ -1185,7 +1188,7 @@
           <w14:ligatures w14:val="standardContextual"/>
         </w:rPr>
       </w:pPr>
-      <w:hyperlink w:anchor="_Toc240233598" w:history="1">
+      <w:hyperlink w:anchor="_Toc240394911" w:history="1">
         <w:r>
           <w:rPr>
             <w:rStyle w:val="Hyperlink"/>
@@ -1212,7 +1215,7 @@
             <w:noProof/>
             <w:webHidden/>
           </w:rPr>
-          <w:instrText xml:space="preserve"> PAGEREF _Toc240233598 \h </w:instrText>
+          <w:instrText xml:space="preserve"> PAGEREF _Toc240394911 \h </w:instrText>
         </w:r>
         <w:r>
           <w:rPr>
@@ -1256,7 +1259,7 @@
           <w14:ligatures w14:val="standardContextual"/>
         </w:rPr>
       </w:pPr>
-      <w:hyperlink w:anchor="_Toc240233599" w:history="1">
+      <w:hyperlink w:anchor="_Toc240394912" w:history="1">
         <w:r>
           <w:rPr>
             <w:rStyle w:val="Hyperlink"/>
@@ -1283,7 +1286,7 @@
             <w:noProof/>
             <w:webHidden/>
           </w:rPr>
-          <w:instrText xml:space="preserve"> PAGEREF _Toc240233599 \h </w:instrText>
+          <w:instrText xml:space="preserve"> PAGEREF _Toc240394912 \h </w:instrText>
         </w:r>
         <w:r>
           <w:rPr>
@@ -1327,7 +1330,7 @@
           <w14:ligatures w14:val="standardContextual"/>
         </w:rPr>
       </w:pPr>
-      <w:hyperlink w:anchor="_Toc240233600" w:history="1">
+      <w:hyperlink w:anchor="_Toc240394913" w:history="1">
         <w:r>
           <w:rPr>
             <w:rStyle w:val="Hyperlink"/>
@@ -1354,7 +1357,7 @@
             <w:noProof/>
             <w:webHidden/>
           </w:rPr>
-          <w:instrText xml:space="preserve"> PAGEREF _Toc240233600 \h </w:instrText>
+          <w:instrText xml:space="preserve"> PAGEREF _Toc240394913 \h </w:instrText>
         </w:r>
         <w:r>
           <w:rPr>
@@ -1398,7 +1401,7 @@
           <w14:ligatures w14:val="standardContextual"/>
         </w:rPr>
       </w:pPr>
-      <w:hyperlink w:anchor="_Toc240233601" w:history="1">
+      <w:hyperlink w:anchor="_Toc240394914" w:history="1">
         <w:r>
           <w:rPr>
             <w:rStyle w:val="Hyperlink"/>
@@ -1425,7 +1428,7 @@
             <w:noProof/>
             <w:webHidden/>
           </w:rPr>
-          <w:instrText xml:space="preserve"> PAGEREF _Toc240233601 \h </w:instrText>
+          <w:instrText xml:space="preserve"> PAGEREF _Toc240394914 \h </w:instrText>
         </w:r>
         <w:r>
           <w:rPr>
@@ -1469,7 +1472,7 @@
           <w14:ligatures w14:val="standardContextual"/>
         </w:rPr>
       </w:pPr>
-      <w:hyperlink w:anchor="_Toc240233602" w:history="1">
+      <w:hyperlink w:anchor="_Toc240394915" w:history="1">
         <w:r>
           <w:rPr>
             <w:rStyle w:val="Hyperlink"/>
@@ -1496,7 +1499,7 @@
             <w:noProof/>
             <w:webHidden/>
           </w:rPr>
-          <w:instrText xml:space="preserve"> PAGEREF _Toc240233602 \h </w:instrText>
+          <w:instrText xml:space="preserve"> PAGEREF _Toc240394915 \h </w:instrText>
         </w:r>
         <w:r>
           <w:rPr>
@@ -1540,7 +1543,7 @@
           <w14:ligatures w14:val="standardContextual"/>
         </w:rPr>
       </w:pPr>
-      <w:hyperlink w:anchor="_Toc240233603" w:history="1">
+      <w:hyperlink w:anchor="_Toc240394916" w:history="1">
         <w:r>
           <w:rPr>
             <w:rStyle w:val="Hyperlink"/>
@@ -1567,7 +1570,7 @@
             <w:noProof/>
             <w:webHidden/>
           </w:rPr>
-          <w:instrText xml:space="preserve"> PAGEREF _Toc240233603 \h </w:instrText>
+          <w:instrText xml:space="preserve"> PAGEREF _Toc240394916 \h </w:instrText>
         </w:r>
         <w:r>
           <w:rPr>
@@ -1611,7 +1614,7 @@
           <w14:ligatures w14:val="standardContextual"/>
         </w:rPr>
       </w:pPr>
-      <w:hyperlink w:anchor="_Toc240233604" w:history="1">
+      <w:hyperlink w:anchor="_Toc240394917" w:history="1">
         <w:r>
           <w:rPr>
             <w:rStyle w:val="Hyperlink"/>
@@ -1638,7 +1641,7 @@
             <w:noProof/>
             <w:webHidden/>
           </w:rPr>
-          <w:instrText xml:space="preserve"> PAGEREF _Toc240233604 \h </w:instrText>
+          <w:instrText xml:space="preserve"> PAGEREF _Toc240394917 \h </w:instrText>
         </w:r>
         <w:r>
           <w:rPr>
@@ -1682,7 +1685,7 @@
           <w14:ligatures w14:val="standardContextual"/>
         </w:rPr>
       </w:pPr>
-      <w:hyperlink w:anchor="_Toc240233605" w:history="1">
+      <w:hyperlink w:anchor="_Toc240394918" w:history="1">
         <w:r>
           <w:rPr>
             <w:rStyle w:val="Hyperlink"/>
@@ -1709,7 +1712,7 @@
             <w:noProof/>
             <w:webHidden/>
           </w:rPr>
-          <w:instrText xml:space="preserve"> PAGEREF _Toc240233605 \h </w:instrText>
+          <w:instrText xml:space="preserve"> PAGEREF _Toc240394918 \h </w:instrText>
         </w:r>
         <w:r>
           <w:rPr>
@@ -1753,7 +1756,7 @@
           <w14:ligatures w14:val="standardContextual"/>
         </w:rPr>
       </w:pPr>
-      <w:hyperlink w:anchor="_Toc240233606" w:history="1">
+      <w:hyperlink w:anchor="_Toc240394919" w:history="1">
         <w:r>
           <w:rPr>
             <w:rStyle w:val="Hyperlink"/>
@@ -1780,7 +1783,7 @@
             <w:noProof/>
             <w:webHidden/>
           </w:rPr>
-          <w:instrText xml:space="preserve"> PAGEREF _Toc240233606 \h </w:instrText>
+          <w:instrText xml:space="preserve"> PAGEREF _Toc240394919 \h </w:instrText>
         </w:r>
         <w:r>
           <w:rPr>
@@ -1824,7 +1827,7 @@
           <w14:ligatures w14:val="standardContextual"/>
         </w:rPr>
       </w:pPr>
-      <w:hyperlink w:anchor="_Toc240233607" w:history="1">
+      <w:hyperlink w:anchor="_Toc240394920" w:history="1">
         <w:r>
           <w:rPr>
             <w:rStyle w:val="Hyperlink"/>
@@ -1851,7 +1854,7 @@
             <w:noProof/>
             <w:webHidden/>
           </w:rPr>
-          <w:instrText xml:space="preserve"> PAGEREF _Toc240233607 \h </w:instrText>
+          <w:instrText xml:space="preserve"> PAGEREF _Toc240394920 \h </w:instrText>
         </w:r>
         <w:r>
           <w:rPr>
@@ -1895,7 +1898,7 @@
           <w14:ligatures w14:val="standardContextual"/>
         </w:rPr>
       </w:pPr>
-      <w:hyperlink w:anchor="_Toc240233608" w:history="1">
+      <w:hyperlink w:anchor="_Toc240394921" w:history="1">
         <w:r>
           <w:rPr>
             <w:rStyle w:val="Hyperlink"/>
@@ -1922,7 +1925,7 @@
             <w:noProof/>
             <w:webHidden/>
           </w:rPr>
-          <w:instrText xml:space="preserve"> PAGEREF _Toc240233608 \h </w:instrText>
+          <w:instrText xml:space="preserve"> PAGEREF _Toc240394921 \h </w:instrText>
         </w:r>
         <w:r>
           <w:rPr>
@@ -1966,7 +1969,7 @@
           <w14:ligatures w14:val="standardContextual"/>
         </w:rPr>
       </w:pPr>
-      <w:hyperlink w:anchor="_Toc240233609" w:history="1">
+      <w:hyperlink w:anchor="_Toc240394922" w:history="1">
         <w:r>
           <w:rPr>
             <w:rStyle w:val="Hyperlink"/>
@@ -1993,7 +1996,7 @@
             <w:noProof/>
             <w:webHidden/>
           </w:rPr>
-          <w:instrText xml:space="preserve"> PAGEREF _Toc240233609 \h </w:instrText>
+          <w:instrText xml:space="preserve"> PAGEREF _Toc240394922 \h </w:instrText>
         </w:r>
         <w:r>
           <w:rPr>
@@ -2037,7 +2040,7 @@
           <w14:ligatures w14:val="standardContextual"/>
         </w:rPr>
       </w:pPr>
-      <w:hyperlink w:anchor="_Toc240233610" w:history="1">
+      <w:hyperlink w:anchor="_Toc240394923" w:history="1">
         <w:r>
           <w:rPr>
             <w:rStyle w:val="Hyperlink"/>
@@ -2064,7 +2067,7 @@
             <w:noProof/>
             <w:webHidden/>
           </w:rPr>
-          <w:instrText xml:space="preserve"> PAGEREF _Toc240233610 \h </w:instrText>
+          <w:instrText xml:space="preserve"> PAGEREF _Toc240394923 \h </w:instrText>
         </w:r>
         <w:r>
           <w:rPr>
@@ -2108,7 +2111,7 @@
           <w14:ligatures w14:val="standardContextual"/>
         </w:rPr>
       </w:pPr>
-      <w:hyperlink w:anchor="_Toc240233611" w:history="1">
+      <w:hyperlink w:anchor="_Toc240394924" w:history="1">
         <w:r>
           <w:rPr>
             <w:rStyle w:val="Hyperlink"/>
@@ -2135,7 +2138,7 @@
             <w:noProof/>
             <w:webHidden/>
           </w:rPr>
-          <w:instrText xml:space="preserve"> PAGEREF _Toc240233611 \h </w:instrText>
+          <w:instrText xml:space="preserve"> PAGEREF _Toc240394924 \h </w:instrText>
         </w:r>
         <w:r>
           <w:rPr>
@@ -2179,7 +2182,7 @@
           <w14:ligatures w14:val="standardContextual"/>
         </w:rPr>
       </w:pPr>
-      <w:hyperlink w:anchor="_Toc240233612" w:history="1">
+      <w:hyperlink w:anchor="_Toc240394925" w:history="1">
         <w:r>
           <w:rPr>
             <w:rStyle w:val="Hyperlink"/>
@@ -2206,7 +2209,7 @@
             <w:noProof/>
             <w:webHidden/>
           </w:rPr>
-          <w:instrText xml:space="preserve"> PAGEREF _Toc240233612 \h </w:instrText>
+          <w:instrText xml:space="preserve"> PAGEREF _Toc240394925 \h </w:instrText>
         </w:r>
         <w:r>
           <w:rPr>
@@ -2250,7 +2253,7 @@
           <w14:ligatures w14:val="standardContextual"/>
         </w:rPr>
       </w:pPr>
-      <w:hyperlink w:anchor="_Toc240233613" w:history="1">
+      <w:hyperlink w:anchor="_Toc240394926" w:history="1">
         <w:r>
           <w:rPr>
             <w:rStyle w:val="Hyperlink"/>
@@ -2277,7 +2280,7 @@
             <w:noProof/>
             <w:webHidden/>
           </w:rPr>
-          <w:instrText xml:space="preserve"> PAGEREF _Toc240233613 \h </w:instrText>
+          <w:instrText xml:space="preserve"> PAGEREF _Toc240394926 \h </w:instrText>
         </w:r>
         <w:r>
           <w:rPr>
@@ -2321,7 +2324,7 @@
           <w14:ligatures w14:val="standardContextual"/>
         </w:rPr>
       </w:pPr>
-      <w:hyperlink w:anchor="_Toc240233614" w:history="1">
+      <w:hyperlink w:anchor="_Toc240394927" w:history="1">
         <w:r>
           <w:rPr>
             <w:rStyle w:val="Hyperlink"/>
@@ -2348,7 +2351,7 @@
             <w:noProof/>
             <w:webHidden/>
           </w:rPr>
-          <w:instrText xml:space="preserve"> PAGEREF _Toc240233614 \h </w:instrText>
+          <w:instrText xml:space="preserve"> PAGEREF _Toc240394927 \h </w:instrText>
         </w:r>
         <w:r>
           <w:rPr>
@@ -2392,7 +2395,7 @@
           <w14:ligatures w14:val="standardContextual"/>
         </w:rPr>
       </w:pPr>
-      <w:hyperlink w:anchor="_Toc240233615" w:history="1">
+      <w:hyperlink w:anchor="_Toc240394928" w:history="1">
         <w:r>
           <w:rPr>
             <w:rStyle w:val="Hyperlink"/>
@@ -2419,7 +2422,7 @@
             <w:noProof/>
             <w:webHidden/>
           </w:rPr>
-          <w:instrText xml:space="preserve"> PAGEREF _Toc240233615 \h </w:instrText>
+          <w:instrText xml:space="preserve"> PAGEREF _Toc240394928 \h </w:instrText>
         </w:r>
         <w:r>
           <w:rPr>
@@ -2463,7 +2466,7 @@
           <w14:ligatures w14:val="standardContextual"/>
         </w:rPr>
       </w:pPr>
-      <w:hyperlink w:anchor="_Toc240233616" w:history="1">
+      <w:hyperlink w:anchor="_Toc240394929" w:history="1">
         <w:r>
           <w:rPr>
             <w:rStyle w:val="Hyperlink"/>
@@ -2490,7 +2493,7 @@
             <w:noProof/>
             <w:webHidden/>
           </w:rPr>
-          <w:instrText xml:space="preserve"> PAGEREF _Toc240233616 \h </w:instrText>
+          <w:instrText xml:space="preserve"> PAGEREF _Toc240394929 \h </w:instrText>
         </w:r>
         <w:r>
           <w:rPr>
@@ -2534,7 +2537,7 @@
           <w14:ligatures w14:val="standardContextual"/>
         </w:rPr>
       </w:pPr>
-      <w:hyperlink w:anchor="_Toc240233617" w:history="1">
+      <w:hyperlink w:anchor="_Toc240394930" w:history="1">
         <w:r>
           <w:rPr>
             <w:rStyle w:val="Hyperlink"/>
@@ -2561,7 +2564,7 @@
             <w:noProof/>
             <w:webHidden/>
           </w:rPr>
-          <w:instrText xml:space="preserve"> PAGEREF _Toc240233617 \h </w:instrText>
+          <w:instrText xml:space="preserve"> PAGEREF _Toc240394930 \h </w:instrText>
         </w:r>
         <w:r>
           <w:rPr>
@@ -2605,7 +2608,7 @@
           <w14:ligatures w14:val="standardContextual"/>
         </w:rPr>
       </w:pPr>
-      <w:hyperlink w:anchor="_Toc240233618" w:history="1">
+      <w:hyperlink w:anchor="_Toc240394931" w:history="1">
         <w:r>
           <w:rPr>
             <w:rStyle w:val="Hyperlink"/>
@@ -2632,7 +2635,7 @@
             <w:noProof/>
             <w:webHidden/>
           </w:rPr>
-          <w:instrText xml:space="preserve"> PAGEREF _Toc240233618 \h </w:instrText>
+          <w:instrText xml:space="preserve"> PAGEREF _Toc240394931 \h </w:instrText>
         </w:r>
         <w:r>
           <w:rPr>
@@ -2676,7 +2679,7 @@
           <w14:ligatures w14:val="standardContextual"/>
         </w:rPr>
       </w:pPr>
-      <w:hyperlink w:anchor="_Toc240233619" w:history="1">
+      <w:hyperlink w:anchor="_Toc240394932" w:history="1">
         <w:r>
           <w:rPr>
             <w:rStyle w:val="Hyperlink"/>
@@ -2703,7 +2706,7 @@
             <w:noProof/>
             <w:webHidden/>
           </w:rPr>
-          <w:instrText xml:space="preserve"> PAGEREF _Toc240233619 \h </w:instrText>
+          <w:instrText xml:space="preserve"> PAGEREF _Toc240394932 \h </w:instrText>
         </w:r>
         <w:r>
           <w:rPr>
@@ -2747,7 +2750,7 @@
           <w14:ligatures w14:val="standardContextual"/>
         </w:rPr>
       </w:pPr>
-      <w:hyperlink w:anchor="_Toc240233620" w:history="1">
+      <w:hyperlink w:anchor="_Toc240394933" w:history="1">
         <w:r>
           <w:rPr>
             <w:rStyle w:val="Hyperlink"/>
@@ -2774,7 +2777,7 @@
             <w:noProof/>
             <w:webHidden/>
           </w:rPr>
-          <w:instrText xml:space="preserve"> PAGEREF _Toc240233620 \h </w:instrText>
+          <w:instrText xml:space="preserve"> PAGEREF _Toc240394933 \h </w:instrText>
         </w:r>
         <w:r>
           <w:rPr>
@@ -2818,7 +2821,7 @@
           <w14:ligatures w14:val="standardContextual"/>
         </w:rPr>
       </w:pPr>
-      <w:hyperlink w:anchor="_Toc240233621" w:history="1">
+      <w:hyperlink w:anchor="_Toc240394934" w:history="1">
         <w:r>
           <w:rPr>
             <w:rStyle w:val="Hyperlink"/>
@@ -2845,7 +2848,7 @@
             <w:noProof/>
             <w:webHidden/>
           </w:rPr>
-          <w:instrText xml:space="preserve"> PAGEREF _Toc240233621 \h </w:instrText>
+          <w:instrText xml:space="preserve"> PAGEREF _Toc240394934 \h </w:instrText>
         </w:r>
         <w:r>
           <w:rPr>
@@ -2889,7 +2892,7 @@
           <w14:ligatures w14:val="standardContextual"/>
         </w:rPr>
       </w:pPr>
-      <w:hyperlink w:anchor="_Toc240233622" w:history="1">
+      <w:hyperlink w:anchor="_Toc240394935" w:history="1">
         <w:r>
           <w:rPr>
             <w:rStyle w:val="Hyperlink"/>
@@ -2916,7 +2919,7 @@
             <w:noProof/>
             <w:webHidden/>
           </w:rPr>
-          <w:instrText xml:space="preserve"> PAGEREF _Toc240233622 \h </w:instrText>
+          <w:instrText xml:space="preserve"> PAGEREF _Toc240394935 \h </w:instrText>
         </w:r>
         <w:r>
           <w:rPr>
@@ -2960,7 +2963,7 @@
           <w14:ligatures w14:val="standardContextual"/>
         </w:rPr>
       </w:pPr>
-      <w:hyperlink w:anchor="_Toc240233623" w:history="1">
+      <w:hyperlink w:anchor="_Toc240394936" w:history="1">
         <w:r>
           <w:rPr>
             <w:rStyle w:val="Hyperlink"/>
@@ -2987,7 +2990,7 @@
             <w:noProof/>
             <w:webHidden/>
           </w:rPr>
-          <w:instrText xml:space="preserve"> PAGEREF _Toc240233623 \h </w:instrText>
+          <w:instrText xml:space="preserve"> PAGEREF _Toc240394936 \h </w:instrText>
         </w:r>
         <w:r>
           <w:rPr>
@@ -3031,7 +3034,7 @@
           <w14:ligatures w14:val="standardContextual"/>
         </w:rPr>
       </w:pPr>
-      <w:hyperlink w:anchor="_Toc240233624" w:history="1">
+      <w:hyperlink w:anchor="_Toc240394937" w:history="1">
         <w:r>
           <w:rPr>
             <w:rStyle w:val="Hyperlink"/>
@@ -3058,7 +3061,7 @@
             <w:noProof/>
             <w:webHidden/>
           </w:rPr>
-          <w:instrText xml:space="preserve"> PAGEREF _Toc240233624 \h </w:instrText>
+          <w:instrText xml:space="preserve"> PAGEREF _Toc240394937 \h </w:instrText>
         </w:r>
         <w:r>
           <w:rPr>
@@ -3102,7 +3105,7 @@
           <w14:ligatures w14:val="standardContextual"/>
         </w:rPr>
       </w:pPr>
-      <w:hyperlink w:anchor="_Toc240233625" w:history="1">
+      <w:hyperlink w:anchor="_Toc240394938" w:history="1">
         <w:r>
           <w:rPr>
             <w:rStyle w:val="Hyperlink"/>
@@ -3129,7 +3132,7 @@
             <w:noProof/>
             <w:webHidden/>
           </w:rPr>
-          <w:instrText xml:space="preserve"> PAGEREF _Toc240233625 \h </w:instrText>
+          <w:instrText xml:space="preserve"> PAGEREF _Toc240394938 \h </w:instrText>
         </w:r>
         <w:r>
           <w:rPr>
@@ -3173,7 +3176,7 @@
           <w14:ligatures w14:val="standardContextual"/>
         </w:rPr>
       </w:pPr>
-      <w:hyperlink w:anchor="_Toc240233626" w:history="1">
+      <w:hyperlink w:anchor="_Toc240394939" w:history="1">
         <w:r>
           <w:rPr>
             <w:rStyle w:val="Hyperlink"/>
@@ -3200,7 +3203,7 @@
             <w:noProof/>
             <w:webHidden/>
           </w:rPr>
-          <w:instrText xml:space="preserve"> PAGEREF _Toc240233626 \h </w:instrText>
+          <w:instrText xml:space="preserve"> PAGEREF _Toc240394939 \h </w:instrText>
         </w:r>
         <w:r>
           <w:rPr>
@@ -3244,7 +3247,7 @@
           <w14:ligatures w14:val="standardContextual"/>
         </w:rPr>
       </w:pPr>
-      <w:hyperlink w:anchor="_Toc240233627" w:history="1">
+      <w:hyperlink w:anchor="_Toc240394940" w:history="1">
         <w:r>
           <w:rPr>
             <w:rStyle w:val="Hyperlink"/>
@@ -3271,7 +3274,7 @@
             <w:noProof/>
             <w:webHidden/>
           </w:rPr>
-          <w:instrText xml:space="preserve"> PAGEREF _Toc240233627 \h </w:instrText>
+          <w:instrText xml:space="preserve"> PAGEREF _Toc240394940 \h </w:instrText>
         </w:r>
         <w:r>
           <w:rPr>
@@ -3315,7 +3318,7 @@
           <w14:ligatures w14:val="standardContextual"/>
         </w:rPr>
       </w:pPr>
-      <w:hyperlink w:anchor="_Toc240233628" w:history="1">
+      <w:hyperlink w:anchor="_Toc240394941" w:history="1">
         <w:r>
           <w:rPr>
             <w:rStyle w:val="Hyperlink"/>
@@ -3342,7 +3345,7 @@
             <w:noProof/>
             <w:webHidden/>
           </w:rPr>
-          <w:instrText xml:space="preserve"> PAGEREF _Toc240233628 \h </w:instrText>
+          <w:instrText xml:space="preserve"> PAGEREF _Toc240394941 \h </w:instrText>
         </w:r>
         <w:r>
           <w:rPr>
@@ -3386,7 +3389,7 @@
           <w14:ligatures w14:val="standardContextual"/>
         </w:rPr>
       </w:pPr>
-      <w:hyperlink w:anchor="_Toc240233629" w:history="1">
+      <w:hyperlink w:anchor="_Toc240394942" w:history="1">
         <w:r>
           <w:rPr>
             <w:rStyle w:val="Hyperlink"/>
@@ -3413,7 +3416,7 @@
             <w:noProof/>
             <w:webHidden/>
           </w:rPr>
-          <w:instrText xml:space="preserve"> PAGEREF _Toc240233629 \h </w:instrText>
+          <w:instrText xml:space="preserve"> PAGEREF _Toc240394942 \h </w:instrText>
         </w:r>
         <w:r>
           <w:rPr>
@@ -3457,7 +3460,7 @@
           <w14:ligatures w14:val="standardContextual"/>
         </w:rPr>
       </w:pPr>
-      <w:hyperlink w:anchor="_Toc240233630" w:history="1">
+      <w:hyperlink w:anchor="_Toc240394943" w:history="1">
         <w:r>
           <w:rPr>
             <w:rStyle w:val="Hyperlink"/>
@@ -3484,7 +3487,7 @@
             <w:noProof/>
             <w:webHidden/>
           </w:rPr>
-          <w:instrText xml:space="preserve"> PAGEREF _Toc240233630 \h </w:instrText>
+          <w:instrText xml:space="preserve"> PAGEREF _Toc240394943 \h </w:instrText>
         </w:r>
         <w:r>
           <w:rPr>
@@ -3528,7 +3531,7 @@
           <w14:ligatures w14:val="standardContextual"/>
         </w:rPr>
       </w:pPr>
-      <w:hyperlink w:anchor="_Toc240233631" w:history="1">
+      <w:hyperlink w:anchor="_Toc240394944" w:history="1">
         <w:r>
           <w:rPr>
             <w:rStyle w:val="Hyperlink"/>
@@ -3555,7 +3558,7 @@
             <w:noProof/>
             <w:webHidden/>
           </w:rPr>
-          <w:instrText xml:space="preserve"> PAGEREF _Toc240233631 \h </w:instrText>
+          <w:instrText xml:space="preserve"> PAGEREF _Toc240394944 \h </w:instrText>
         </w:r>
         <w:r>
           <w:rPr>
@@ -3599,7 +3602,7 @@
           <w14:ligatures w14:val="standardContextual"/>
         </w:rPr>
       </w:pPr>
-      <w:hyperlink w:anchor="_Toc240233632" w:history="1">
+      <w:hyperlink w:anchor="_Toc240394945" w:history="1">
         <w:r>
           <w:rPr>
             <w:rStyle w:val="Hyperlink"/>
@@ -3626,7 +3629,7 @@
             <w:noProof/>
             <w:webHidden/>
           </w:rPr>
-          <w:instrText xml:space="preserve"> PAGEREF _Toc240233632 \h </w:instrText>
+          <w:instrText xml:space="preserve"> PAGEREF _Toc240394945 \h </w:instrText>
         </w:r>
         <w:r>
           <w:rPr>
@@ -3670,7 +3673,7 @@
           <w14:ligatures w14:val="standardContextual"/>
         </w:rPr>
       </w:pPr>
-      <w:hyperlink w:anchor="_Toc240233633" w:history="1">
+      <w:hyperlink w:anchor="_Toc240394946" w:history="1">
         <w:r>
           <w:rPr>
             <w:rStyle w:val="Hyperlink"/>
@@ -3697,7 +3700,7 @@
             <w:noProof/>
             <w:webHidden/>
           </w:rPr>
-          <w:instrText xml:space="preserve"> PAGEREF _Toc240233633 \h </w:instrText>
+          <w:instrText xml:space="preserve"> PAGEREF _Toc240394946 \h </w:instrText>
         </w:r>
         <w:r>
           <w:rPr>
@@ -3741,7 +3744,7 @@
           <w14:ligatures w14:val="standardContextual"/>
         </w:rPr>
       </w:pPr>
-      <w:hyperlink w:anchor="_Toc240233634" w:history="1">
+      <w:hyperlink w:anchor="_Toc240394947" w:history="1">
         <w:r>
           <w:rPr>
             <w:rStyle w:val="Hyperlink"/>
@@ -3768,7 +3771,7 @@
             <w:noProof/>
             <w:webHidden/>
           </w:rPr>
-          <w:instrText xml:space="preserve"> PAGEREF _Toc240233634 \h </w:instrText>
+          <w:instrText xml:space="preserve"> PAGEREF _Toc240394947 \h </w:instrText>
         </w:r>
         <w:r>
           <w:rPr>
@@ -3812,7 +3815,7 @@
           <w14:ligatures w14:val="standardContextual"/>
         </w:rPr>
       </w:pPr>
-      <w:hyperlink w:anchor="_Toc240233635" w:history="1">
+      <w:hyperlink w:anchor="_Toc240394948" w:history="1">
         <w:r>
           <w:rPr>
             <w:rStyle w:val="Hyperlink"/>
@@ -3839,7 +3842,7 @@
             <w:noProof/>
             <w:webHidden/>
           </w:rPr>
-          <w:instrText xml:space="preserve"> PAGEREF _Toc240233635 \h </w:instrText>
+          <w:instrText xml:space="preserve"> PAGEREF _Toc240394948 \h </w:instrText>
         </w:r>
         <w:r>
           <w:rPr>
@@ -3859,7 +3862,7 @@
             <w:noProof/>
             <w:webHidden/>
           </w:rPr>
-          <w:t>28</w:t>
+          <w:t>29</w:t>
         </w:r>
         <w:r>
           <w:rPr>
@@ -3883,7 +3886,7 @@
           <w14:ligatures w14:val="standardContextual"/>
         </w:rPr>
       </w:pPr>
-      <w:hyperlink w:anchor="_Toc240233636" w:history="1">
+      <w:hyperlink w:anchor="_Toc240394949" w:history="1">
         <w:r>
           <w:rPr>
             <w:rStyle w:val="Hyperlink"/>
@@ -3910,7 +3913,7 @@
             <w:noProof/>
             <w:webHidden/>
           </w:rPr>
-          <w:instrText xml:space="preserve"> PAGEREF _Toc240233636 \h </w:instrText>
+          <w:instrText xml:space="preserve"> PAGEREF _Toc240394949 \h </w:instrText>
         </w:r>
         <w:r>
           <w:rPr>
@@ -3954,7 +3957,7 @@
           <w14:ligatures w14:val="standardContextual"/>
         </w:rPr>
       </w:pPr>
-      <w:hyperlink w:anchor="_Toc240233637" w:history="1">
+      <w:hyperlink w:anchor="_Toc240394950" w:history="1">
         <w:r>
           <w:rPr>
             <w:rStyle w:val="Hyperlink"/>
@@ -3981,7 +3984,7 @@
             <w:noProof/>
             <w:webHidden/>
           </w:rPr>
-          <w:instrText xml:space="preserve"> PAGEREF _Toc240233637 \h </w:instrText>
+          <w:instrText xml:space="preserve"> PAGEREF _Toc240394950 \h </w:instrText>
         </w:r>
         <w:r>
           <w:rPr>
@@ -4025,7 +4028,7 @@
           <w14:ligatures w14:val="standardContextual"/>
         </w:rPr>
       </w:pPr>
-      <w:hyperlink w:anchor="_Toc240233638" w:history="1">
+      <w:hyperlink w:anchor="_Toc240394951" w:history="1">
         <w:r>
           <w:rPr>
             <w:rStyle w:val="Hyperlink"/>
@@ -4052,7 +4055,7 @@
             <w:noProof/>
             <w:webHidden/>
           </w:rPr>
-          <w:instrText xml:space="preserve"> PAGEREF _Toc240233638 \h </w:instrText>
+          <w:instrText xml:space="preserve"> PAGEREF _Toc240394951 \h </w:instrText>
         </w:r>
         <w:r>
           <w:rPr>
@@ -4096,7 +4099,7 @@
           <w14:ligatures w14:val="standardContextual"/>
         </w:rPr>
       </w:pPr>
-      <w:hyperlink w:anchor="_Toc240233639" w:history="1">
+      <w:hyperlink w:anchor="_Toc240394952" w:history="1">
         <w:r>
           <w:rPr>
             <w:rStyle w:val="Hyperlink"/>
@@ -4123,7 +4126,7 @@
             <w:noProof/>
             <w:webHidden/>
           </w:rPr>
-          <w:instrText xml:space="preserve"> PAGEREF _Toc240233639 \h </w:instrText>
+          <w:instrText xml:space="preserve"> PAGEREF _Toc240394952 \h </w:instrText>
         </w:r>
         <w:r>
           <w:rPr>
@@ -4167,7 +4170,7 @@
           <w14:ligatures w14:val="standardContextual"/>
         </w:rPr>
       </w:pPr>
-      <w:hyperlink w:anchor="_Toc240233640" w:history="1">
+      <w:hyperlink w:anchor="_Toc240394953" w:history="1">
         <w:r>
           <w:rPr>
             <w:rStyle w:val="Hyperlink"/>
@@ -4194,7 +4197,7 @@
             <w:noProof/>
             <w:webHidden/>
           </w:rPr>
-          <w:instrText xml:space="preserve"> PAGEREF _Toc240233640 \h </w:instrText>
+          <w:instrText xml:space="preserve"> PAGEREF _Toc240394953 \h </w:instrText>
         </w:r>
         <w:r>
           <w:rPr>
@@ -4238,7 +4241,7 @@
           <w14:ligatures w14:val="standardContextual"/>
         </w:rPr>
       </w:pPr>
-      <w:hyperlink w:anchor="_Toc240233641" w:history="1">
+      <w:hyperlink w:anchor="_Toc240394954" w:history="1">
         <w:r>
           <w:rPr>
             <w:rStyle w:val="Hyperlink"/>
@@ -4265,7 +4268,7 @@
             <w:noProof/>
             <w:webHidden/>
           </w:rPr>
-          <w:instrText xml:space="preserve"> PAGEREF _Toc240233641 \h </w:instrText>
+          <w:instrText xml:space="preserve"> PAGEREF _Toc240394954 \h </w:instrText>
         </w:r>
         <w:r>
           <w:rPr>
@@ -4309,7 +4312,7 @@
           <w14:ligatures w14:val="standardContextual"/>
         </w:rPr>
       </w:pPr>
-      <w:hyperlink w:anchor="_Toc240233642" w:history="1">
+      <w:hyperlink w:anchor="_Toc240394955" w:history="1">
         <w:r>
           <w:rPr>
             <w:rStyle w:val="Hyperlink"/>
@@ -4336,7 +4339,7 @@
             <w:noProof/>
             <w:webHidden/>
           </w:rPr>
-          <w:instrText xml:space="preserve"> PAGEREF _Toc240233642 \h </w:instrText>
+          <w:instrText xml:space="preserve"> PAGEREF _Toc240394955 \h </w:instrText>
         </w:r>
         <w:r>
           <w:rPr>
@@ -4380,7 +4383,7 @@
           <w14:ligatures w14:val="standardContextual"/>
         </w:rPr>
       </w:pPr>
-      <w:hyperlink w:anchor="_Toc240233643" w:history="1">
+      <w:hyperlink w:anchor="_Toc240394956" w:history="1">
         <w:r>
           <w:rPr>
             <w:rStyle w:val="Hyperlink"/>
@@ -4407,7 +4410,7 @@
             <w:noProof/>
             <w:webHidden/>
           </w:rPr>
-          <w:instrText xml:space="preserve"> PAGEREF _Toc240233643 \h </w:instrText>
+          <w:instrText xml:space="preserve"> PAGEREF _Toc240394956 \h </w:instrText>
         </w:r>
         <w:r>
           <w:rPr>
@@ -4451,7 +4454,7 @@
           <w14:ligatures w14:val="standardContextual"/>
         </w:rPr>
       </w:pPr>
-      <w:hyperlink w:anchor="_Toc240233644" w:history="1">
+      <w:hyperlink w:anchor="_Toc240394957" w:history="1">
         <w:r>
           <w:rPr>
             <w:rStyle w:val="Hyperlink"/>
@@ -4478,7 +4481,7 @@
             <w:noProof/>
             <w:webHidden/>
           </w:rPr>
-          <w:instrText xml:space="preserve"> PAGEREF _Toc240233644 \h </w:instrText>
+          <w:instrText xml:space="preserve"> PAGEREF _Toc240394957 \h </w:instrText>
         </w:r>
         <w:r>
           <w:rPr>
@@ -4522,7 +4525,7 @@
           <w14:ligatures w14:val="standardContextual"/>
         </w:rPr>
       </w:pPr>
-      <w:hyperlink w:anchor="_Toc240233645" w:history="1">
+      <w:hyperlink w:anchor="_Toc240394958" w:history="1">
         <w:r>
           <w:rPr>
             <w:rStyle w:val="Hyperlink"/>
@@ -4549,7 +4552,7 @@
             <w:noProof/>
             <w:webHidden/>
           </w:rPr>
-          <w:instrText xml:space="preserve"> PAGEREF _Toc240233645 \h </w:instrText>
+          <w:instrText xml:space="preserve"> PAGEREF _Toc240394958 \h </w:instrText>
         </w:r>
         <w:r>
           <w:rPr>
@@ -4620,7 +4623,7 @@
       <w:r>
         <w:fldChar w:fldCharType="separate"/>
       </w:r>
-      <w:hyperlink w:anchor="_Toc240233646" w:history="1">
+      <w:hyperlink w:anchor="_Toc240394959" w:history="1">
         <w:r>
           <w:rPr>
             <w:rStyle w:val="Hyperlink"/>
@@ -4647,7 +4650,7 @@
             <w:noProof/>
             <w:webHidden/>
           </w:rPr>
-          <w:instrText xml:space="preserve"> PAGEREF _Toc240233646 \h </w:instrText>
+          <w:instrText xml:space="preserve"> PAGEREF _Toc240394959 \h </w:instrText>
         </w:r>
         <w:r>
           <w:rPr>
@@ -4691,7 +4694,7 @@
           <w14:ligatures w14:val="standardContextual"/>
         </w:rPr>
       </w:pPr>
-      <w:hyperlink w:anchor="_Toc240233647" w:history="1">
+      <w:hyperlink w:anchor="_Toc240394960" w:history="1">
         <w:r>
           <w:rPr>
             <w:rStyle w:val="Hyperlink"/>
@@ -4718,7 +4721,7 @@
             <w:noProof/>
             <w:webHidden/>
           </w:rPr>
-          <w:instrText xml:space="preserve"> PAGEREF _Toc240233647 \h </w:instrText>
+          <w:instrText xml:space="preserve"> PAGEREF _Toc240394960 \h </w:instrText>
         </w:r>
         <w:r>
           <w:rPr>
@@ -4762,7 +4765,7 @@
           <w14:ligatures w14:val="standardContextual"/>
         </w:rPr>
       </w:pPr>
-      <w:hyperlink w:anchor="_Toc240233648" w:history="1">
+      <w:hyperlink w:anchor="_Toc240394961" w:history="1">
         <w:r>
           <w:rPr>
             <w:rStyle w:val="Hyperlink"/>
@@ -4789,7 +4792,7 @@
             <w:noProof/>
             <w:webHidden/>
           </w:rPr>
-          <w:instrText xml:space="preserve"> PAGEREF _Toc240233648 \h </w:instrText>
+          <w:instrText xml:space="preserve"> PAGEREF _Toc240394961 \h </w:instrText>
         </w:r>
         <w:r>
           <w:rPr>
@@ -4833,7 +4836,7 @@
           <w14:ligatures w14:val="standardContextual"/>
         </w:rPr>
       </w:pPr>
-      <w:hyperlink w:anchor="_Toc240233649" w:history="1">
+      <w:hyperlink w:anchor="_Toc240394962" w:history="1">
         <w:r>
           <w:rPr>
             <w:rStyle w:val="Hyperlink"/>
@@ -4860,7 +4863,7 @@
             <w:noProof/>
             <w:webHidden/>
           </w:rPr>
-          <w:instrText xml:space="preserve"> PAGEREF _Toc240233649 \h </w:instrText>
+          <w:instrText xml:space="preserve"> PAGEREF _Toc240394962 \h </w:instrText>
         </w:r>
         <w:r>
           <w:rPr>
@@ -4904,7 +4907,7 @@
           <w14:ligatures w14:val="standardContextual"/>
         </w:rPr>
       </w:pPr>
-      <w:hyperlink w:anchor="_Toc240233650" w:history="1">
+      <w:hyperlink w:anchor="_Toc240394963" w:history="1">
         <w:r>
           <w:rPr>
             <w:rStyle w:val="Hyperlink"/>
@@ -4931,7 +4934,7 @@
             <w:noProof/>
             <w:webHidden/>
           </w:rPr>
-          <w:instrText xml:space="preserve"> PAGEREF _Toc240233650 \h </w:instrText>
+          <w:instrText xml:space="preserve"> PAGEREF _Toc240394963 \h </w:instrText>
         </w:r>
         <w:r>
           <w:rPr>
@@ -4997,7 +5000,7 @@
       <w:r>
         <w:fldChar w:fldCharType="separate"/>
       </w:r>
-      <w:hyperlink w:anchor="_Toc240233651" w:history="1">
+      <w:hyperlink w:anchor="_Toc240394964" w:history="1">
         <w:r>
           <w:rPr>
             <w:rStyle w:val="Hyperlink"/>
@@ -5024,7 +5027,7 @@
             <w:noProof/>
             <w:webHidden/>
           </w:rPr>
-          <w:instrText xml:space="preserve"> PAGEREF _Toc240233651 \h </w:instrText>
+          <w:instrText xml:space="preserve"> PAGEREF _Toc240394964 \h </w:instrText>
         </w:r>
         <w:r>
           <w:rPr>
@@ -5068,7 +5071,7 @@
           <w14:ligatures w14:val="standardContextual"/>
         </w:rPr>
       </w:pPr>
-      <w:hyperlink w:anchor="_Toc240233652" w:history="1">
+      <w:hyperlink w:anchor="_Toc240394965" w:history="1">
         <w:r>
           <w:rPr>
             <w:rStyle w:val="Hyperlink"/>
@@ -5095,7 +5098,7 @@
             <w:noProof/>
             <w:webHidden/>
           </w:rPr>
-          <w:instrText xml:space="preserve"> PAGEREF _Toc240233652 \h </w:instrText>
+          <w:instrText xml:space="preserve"> PAGEREF _Toc240394965 \h </w:instrText>
         </w:r>
         <w:r>
           <w:rPr>
@@ -5139,7 +5142,7 @@
           <w14:ligatures w14:val="standardContextual"/>
         </w:rPr>
       </w:pPr>
-      <w:hyperlink w:anchor="_Toc240233653" w:history="1">
+      <w:hyperlink w:anchor="_Toc240394966" w:history="1">
         <w:r>
           <w:rPr>
             <w:rStyle w:val="Hyperlink"/>
@@ -5166,7 +5169,7 @@
             <w:noProof/>
             <w:webHidden/>
           </w:rPr>
-          <w:instrText xml:space="preserve"> PAGEREF _Toc240233653 \h </w:instrText>
+          <w:instrText xml:space="preserve"> PAGEREF _Toc240394966 \h </w:instrText>
         </w:r>
         <w:r>
           <w:rPr>
@@ -5210,7 +5213,7 @@
           <w14:ligatures w14:val="standardContextual"/>
         </w:rPr>
       </w:pPr>
-      <w:hyperlink w:anchor="_Toc240233654" w:history="1">
+      <w:hyperlink w:anchor="_Toc240394967" w:history="1">
         <w:r>
           <w:rPr>
             <w:rStyle w:val="Hyperlink"/>
@@ -5237,7 +5240,7 @@
             <w:noProof/>
             <w:webHidden/>
           </w:rPr>
-          <w:instrText xml:space="preserve"> PAGEREF _Toc240233654 \h </w:instrText>
+          <w:instrText xml:space="preserve"> PAGEREF _Toc240394967 \h </w:instrText>
         </w:r>
         <w:r>
           <w:rPr>
@@ -5281,7 +5284,7 @@
           <w14:ligatures w14:val="standardContextual"/>
         </w:rPr>
       </w:pPr>
-      <w:hyperlink w:anchor="_Toc240233655" w:history="1">
+      <w:hyperlink w:anchor="_Toc240394968" w:history="1">
         <w:r>
           <w:rPr>
             <w:rStyle w:val="Hyperlink"/>
@@ -5308,7 +5311,7 @@
             <w:noProof/>
             <w:webHidden/>
           </w:rPr>
-          <w:instrText xml:space="preserve"> PAGEREF _Toc240233655 \h </w:instrText>
+          <w:instrText xml:space="preserve"> PAGEREF _Toc240394968 \h </w:instrText>
         </w:r>
         <w:r>
           <w:rPr>
@@ -5352,7 +5355,7 @@
           <w14:ligatures w14:val="standardContextual"/>
         </w:rPr>
       </w:pPr>
-      <w:hyperlink w:anchor="_Toc240233656" w:history="1">
+      <w:hyperlink w:anchor="_Toc240394969" w:history="1">
         <w:r>
           <w:rPr>
             <w:rStyle w:val="Hyperlink"/>
@@ -5379,7 +5382,7 @@
             <w:noProof/>
             <w:webHidden/>
           </w:rPr>
-          <w:instrText xml:space="preserve"> PAGEREF _Toc240233656 \h </w:instrText>
+          <w:instrText xml:space="preserve"> PAGEREF _Toc240394969 \h </w:instrText>
         </w:r>
         <w:r>
           <w:rPr>
@@ -5423,7 +5426,7 @@
           <w14:ligatures w14:val="standardContextual"/>
         </w:rPr>
       </w:pPr>
-      <w:hyperlink w:anchor="_Toc240233657" w:history="1">
+      <w:hyperlink w:anchor="_Toc240394970" w:history="1">
         <w:r>
           <w:rPr>
             <w:rStyle w:val="Hyperlink"/>
@@ -5450,7 +5453,7 @@
             <w:noProof/>
             <w:webHidden/>
           </w:rPr>
-          <w:instrText xml:space="preserve"> PAGEREF _Toc240233657 \h </w:instrText>
+          <w:instrText xml:space="preserve"> PAGEREF _Toc240394970 \h </w:instrText>
         </w:r>
         <w:r>
           <w:rPr>
@@ -5494,7 +5497,7 @@
           <w14:ligatures w14:val="standardContextual"/>
         </w:rPr>
       </w:pPr>
-      <w:hyperlink w:anchor="_Toc240233658" w:history="1">
+      <w:hyperlink w:anchor="_Toc240394971" w:history="1">
         <w:r>
           <w:rPr>
             <w:rStyle w:val="Hyperlink"/>
@@ -5521,7 +5524,7 @@
             <w:noProof/>
             <w:webHidden/>
           </w:rPr>
-          <w:instrText xml:space="preserve"> PAGEREF _Toc240233658 \h </w:instrText>
+          <w:instrText xml:space="preserve"> PAGEREF _Toc240394971 \h </w:instrText>
         </w:r>
         <w:r>
           <w:rPr>
@@ -5575,7 +5578,7 @@
         <w:pStyle w:val="Heading1"/>
         <w:pageBreakBefore w:val="0"/>
       </w:pPr>
-      <w:bookmarkStart w:id="0" w:name="_Toc240233597"/>
+      <w:bookmarkStart w:id="0" w:name="_Toc240394910"/>
       <w:r>
         <w:lastRenderedPageBreak/>
         <w:t>1 Introduction</w:t>
@@ -5586,7 +5589,7 @@
       <w:pPr>
         <w:pStyle w:val="Heading2"/>
       </w:pPr>
-      <w:bookmarkStart w:id="1" w:name="_Toc240233598"/>
+      <w:bookmarkStart w:id="1" w:name="_Toc240394911"/>
       <w:r>
         <w:t>1.1 Problem and motivation</w:t>
       </w:r>
@@ -5623,7 +5626,7 @@
       <w:pPr>
         <w:pStyle w:val="Heading2"/>
       </w:pPr>
-      <w:bookmarkStart w:id="2" w:name="_Toc240233599"/>
+      <w:bookmarkStart w:id="2" w:name="_Toc240394912"/>
       <w:r>
         <w:t>1.2 Objectives and research questions</w:t>
       </w:r>
@@ -5661,7 +5664,7 @@
       <w:pPr>
         <w:pStyle w:val="Heading2"/>
       </w:pPr>
-      <w:bookmarkStart w:id="3" w:name="_Toc240233600"/>
+      <w:bookmarkStart w:id="3" w:name="_Toc240394913"/>
       <w:r>
         <w:t>1.3 Scope and evaluation boundary</w:t>
       </w:r>
@@ -5688,14 +5691,14 @@
         <w:pStyle w:val="ReportBody"/>
       </w:pPr>
       <w:r>
-        <w:t>The evaluated source is baseline commit 39dd199 on branch main-test plus the verified draft-consistency update in the working tree. The review reran the Flutter and backend suites and a Windows draft-exit workflow. Historical Windows, Edge and Android results retain their original dates and revisions. This manuscript describes the corrected implementation and completed experiments within their stated verification boundaries.</w:t>
+        <w:t>The evaluated source is commit 3e4f733 on branch main-test, containing the verified draft-consistency and platform updates. The 15 September review repeated 100 Flutter cases and 14 backend cases. Native suites passed 15 cases on Windows on 14 September and 15 cases on Android on 15 September. Earlier Edge and hosted Android results retain their original dates and revisions. This manuscript describes the corrected implementation within these verification boundaries.</w:t>
       </w:r>
     </w:p>
     <w:p>
       <w:pPr>
         <w:pStyle w:val="Heading2"/>
       </w:pPr>
-      <w:bookmarkStart w:id="4" w:name="_Toc240233601"/>
+      <w:bookmarkStart w:id="4" w:name="_Toc240394914"/>
       <w:r>
         <w:t>1.4 Research and evidence method</w:t>
       </w:r>
@@ -5725,7 +5728,7 @@
       <w:pPr>
         <w:pStyle w:val="Heading2"/>
       </w:pPr>
-      <w:bookmarkStart w:id="5" w:name="_Toc240233602"/>
+      <w:bookmarkStart w:id="5" w:name="_Toc240394915"/>
       <w:r>
         <w:t>1.5 Report organization</w:t>
       </w:r>
@@ -5746,7 +5749,7 @@
       <w:pPr>
         <w:pStyle w:val="Heading1"/>
       </w:pPr>
-      <w:bookmarkStart w:id="6" w:name="_Toc240233603"/>
+      <w:bookmarkStart w:id="6" w:name="_Toc240394916"/>
       <w:r>
         <w:lastRenderedPageBreak/>
         <w:t>2 Testing foundations and comparative analysis</w:t>
@@ -5757,7 +5760,7 @@
       <w:pPr>
         <w:pStyle w:val="Heading2"/>
       </w:pPr>
-      <w:bookmarkStart w:id="7" w:name="_Toc240233604"/>
+      <w:bookmarkStart w:id="7" w:name="_Toc240394917"/>
       <w:r>
         <w:t>2.1 Different tests answer different questions</w:t>
       </w:r>
@@ -5801,7 +5804,7 @@
         </w:rPr>
         <w:lastRenderedPageBreak/>
         <w:drawing>
-          <wp:inline distT="0" distB="0" distL="0" distR="0" wp14:anchorId="2536AA17" wp14:editId="3D2800A2">
+          <wp:inline distT="0" distB="0" distL="0" distR="0" wp14:anchorId="31894A16" wp14:editId="7AEC0668">
             <wp:extent cx="5472000" cy="2110629"/>
             <wp:effectExtent l="0" t="0" r="0" b="0"/>
             <wp:docPr id="1" name="Picture 1" descr="Figure 2.1 Testing layers and their TaskFlow evidence boundaries"/>
@@ -5841,7 +5844,7 @@
       <w:pPr>
         <w:pStyle w:val="ReportFigure"/>
       </w:pPr>
-      <w:bookmarkStart w:id="8" w:name="_Toc240233646"/>
+      <w:bookmarkStart w:id="8" w:name="_Toc240394959"/>
       <w:r>
         <w:t>Figure 2.1 Testing layers and their TaskFlow evidence boundaries</w:t>
       </w:r>
@@ -5851,7 +5854,7 @@
       <w:pPr>
         <w:pStyle w:val="Heading2"/>
       </w:pPr>
-      <w:bookmarkStart w:id="9" w:name="_Toc240233605"/>
+      <w:bookmarkStart w:id="9" w:name="_Toc240394918"/>
       <w:r>
         <w:t>2.2 Binding and frame scheduling</w:t>
       </w:r>
@@ -5892,7 +5895,7 @@
       <w:pPr>
         <w:pStyle w:val="Heading2"/>
       </w:pPr>
-      <w:bookmarkStart w:id="10" w:name="_Toc240233606"/>
+      <w:bookmarkStart w:id="10" w:name="_Toc240394919"/>
       <w:r>
         <w:t>2.3 Settling and bounded waiting</w:t>
       </w:r>
@@ -5926,7 +5929,7 @@
       <w:pPr>
         <w:pStyle w:val="Heading2"/>
       </w:pPr>
-      <w:bookmarkStart w:id="11" w:name="_Toc240233607"/>
+      <w:bookmarkStart w:id="11" w:name="_Toc240394920"/>
       <w:r>
         <w:t>2.4 Finders and meaningful assertions</w:t>
       </w:r>
@@ -5961,7 +5964,7 @@
       <w:pPr>
         <w:pStyle w:val="Heading2"/>
       </w:pPr>
-      <w:bookmarkStart w:id="12" w:name="_Toc240233608"/>
+      <w:bookmarkStart w:id="12" w:name="_Toc240394921"/>
       <w:r>
         <w:t>2.5 Fakes and dependency injection</w:t>
       </w:r>
@@ -6002,7 +6005,7 @@
       <w:pPr>
         <w:pStyle w:val="Heading2"/>
       </w:pPr>
-      <w:bookmarkStart w:id="13" w:name="_Toc240233609"/>
+      <w:bookmarkStart w:id="13" w:name="_Toc240394922"/>
       <w:r>
         <w:t>2.6 Golden tests and visual change control</w:t>
       </w:r>
@@ -6036,7 +6039,7 @@
       <w:pPr>
         <w:pStyle w:val="Heading2"/>
       </w:pPr>
-      <w:bookmarkStart w:id="14" w:name="_Toc240233610"/>
+      <w:bookmarkStart w:id="14" w:name="_Toc240394923"/>
       <w:r>
         <w:t>2.7 Native integration and browser automation</w:t>
       </w:r>
@@ -6085,7 +6088,7 @@
       <w:pPr>
         <w:pStyle w:val="ReportTableCaption"/>
       </w:pPr>
-      <w:bookmarkStart w:id="15" w:name="_Toc240233651"/>
+      <w:bookmarkStart w:id="15" w:name="_Toc240394964"/>
       <w:r>
         <w:t>Table 2.1 Test selection for TaskFlow risks</w:t>
       </w:r>
@@ -6492,7 +6495,7 @@
       <w:pPr>
         <w:pStyle w:val="Heading1"/>
       </w:pPr>
-      <w:bookmarkStart w:id="16" w:name="_Toc240233611"/>
+      <w:bookmarkStart w:id="16" w:name="_Toc240394924"/>
       <w:r>
         <w:lastRenderedPageBreak/>
         <w:t>3 Requirements and risk analysis</w:t>
@@ -6503,7 +6506,7 @@
       <w:pPr>
         <w:pStyle w:val="Heading2"/>
       </w:pPr>
-      <w:bookmarkStart w:id="17" w:name="_Toc240233612"/>
+      <w:bookmarkStart w:id="17" w:name="_Toc240394925"/>
       <w:r>
         <w:t>3.1 Actors and workspace modes</w:t>
       </w:r>
@@ -6537,7 +6540,7 @@
       <w:pPr>
         <w:pStyle w:val="Heading2"/>
       </w:pPr>
-      <w:bookmarkStart w:id="18" w:name="_Toc240233613"/>
+      <w:bookmarkStart w:id="18" w:name="_Toc240394926"/>
       <w:r>
         <w:t>3.2 Functional requirements and acceptance conditions</w:t>
       </w:r>
@@ -6564,7 +6567,7 @@
       <w:pPr>
         <w:pStyle w:val="ReportTableCaption"/>
       </w:pPr>
-      <w:bookmarkStart w:id="19" w:name="_Toc240233652"/>
+      <w:bookmarkStart w:id="19" w:name="_Toc240394965"/>
       <w:r>
         <w:t>Table 3.1 Functional acceptance matrix</w:t>
       </w:r>
@@ -7077,7 +7080,7 @@
       <w:pPr>
         <w:pStyle w:val="Heading2"/>
       </w:pPr>
-      <w:bookmarkStart w:id="20" w:name="_Toc240233614"/>
+      <w:bookmarkStart w:id="20" w:name="_Toc240394927"/>
       <w:r>
         <w:t>3.3 Nonfunctional requirements</w:t>
       </w:r>
@@ -7112,7 +7115,7 @@
       <w:pPr>
         <w:pStyle w:val="Heading2"/>
       </w:pPr>
-      <w:bookmarkStart w:id="21" w:name="_Toc240233615"/>
+      <w:bookmarkStart w:id="21" w:name="_Toc240394928"/>
       <w:r>
         <w:t>3.4 Risk priorities</w:t>
       </w:r>
@@ -7141,7 +7144,7 @@
       <w:pPr>
         <w:pStyle w:val="ReportTableCaption"/>
       </w:pPr>
-      <w:bookmarkStart w:id="22" w:name="_Toc240233653"/>
+      <w:bookmarkStart w:id="22" w:name="_Toc240394966"/>
       <w:r>
         <w:t>Table 3.2 Risk controls and remaining evidence gaps</w:t>
       </w:r>
@@ -7549,7 +7552,7 @@
       <w:pPr>
         <w:pStyle w:val="Heading2"/>
       </w:pPr>
-      <w:bookmarkStart w:id="23" w:name="_Toc240233616"/>
+      <w:bookmarkStart w:id="23" w:name="_Toc240394929"/>
       <w:r>
         <w:t>3.5 Investigation boundaries</w:t>
       </w:r>
@@ -7575,7 +7578,7 @@
       <w:pPr>
         <w:pStyle w:val="Heading1"/>
       </w:pPr>
-      <w:bookmarkStart w:id="24" w:name="_Toc240233617"/>
+      <w:bookmarkStart w:id="24" w:name="_Toc240394930"/>
       <w:r>
         <w:lastRenderedPageBreak/>
         <w:t>4 System design</w:t>
@@ -7586,7 +7589,7 @@
       <w:pPr>
         <w:pStyle w:val="Heading2"/>
       </w:pPr>
-      <w:bookmarkStart w:id="25" w:name="_Toc240233618"/>
+      <w:bookmarkStart w:id="25" w:name="_Toc240394931"/>
       <w:r>
         <w:t>4.1 Architecture and dependency direction</w:t>
       </w:r>
@@ -7621,7 +7624,7 @@
           <w:noProof/>
         </w:rPr>
         <w:drawing>
-          <wp:inline distT="0" distB="0" distL="0" distR="0" wp14:anchorId="42AD1D3E" wp14:editId="0647BDED">
+          <wp:inline distT="0" distB="0" distL="0" distR="0" wp14:anchorId="4BBEAA82" wp14:editId="6CA01843">
             <wp:extent cx="5472000" cy="2970514"/>
             <wp:effectExtent l="0" t="0" r="0" b="0"/>
             <wp:docPr id="2" name="Picture 2" descr="Figure 4.1 Dependency boundaries and the three repository modes"/>
@@ -7661,7 +7664,7 @@
       <w:pPr>
         <w:pStyle w:val="ReportFigure"/>
       </w:pPr>
-      <w:bookmarkStart w:id="26" w:name="_Toc240233647"/>
+      <w:bookmarkStart w:id="26" w:name="_Toc240394960"/>
       <w:r>
         <w:t>Figure 4.1 Dependency boundaries and the three repository modes</w:t>
       </w:r>
@@ -7691,7 +7694,7 @@
       <w:pPr>
         <w:pStyle w:val="Heading2"/>
       </w:pPr>
-      <w:bookmarkStart w:id="27" w:name="_Toc240233619"/>
+      <w:bookmarkStart w:id="27" w:name="_Toc240394932"/>
       <w:r>
         <w:t>4.2 Domain model and persistence representation</w:t>
       </w:r>
@@ -7717,7 +7720,7 @@
       <w:pPr>
         <w:pStyle w:val="ReportTableCaption"/>
       </w:pPr>
-      <w:bookmarkStart w:id="28" w:name="_Toc240233654"/>
+      <w:bookmarkStart w:id="28" w:name="_Toc240394967"/>
       <w:r>
         <w:t>Table 4.1 Main validation and ownership constraints</w:t>
       </w:r>
@@ -8245,7 +8248,7 @@
           <w:noProof/>
         </w:rPr>
         <w:drawing>
-          <wp:inline distT="0" distB="0" distL="0" distR="0" wp14:anchorId="094DDDE1" wp14:editId="0B45BDBC">
+          <wp:inline distT="0" distB="0" distL="0" distR="0" wp14:anchorId="54CFB6C7" wp14:editId="3FA3D49F">
             <wp:extent cx="5472000" cy="2540571"/>
             <wp:effectExtent l="0" t="0" r="0" b="0"/>
             <wp:docPr id="3" name="Picture 3" descr="Figure 4.2 SQLite ownership and session relationships"/>
@@ -8285,7 +8288,7 @@
       <w:pPr>
         <w:pStyle w:val="ReportFigure"/>
       </w:pPr>
-      <w:bookmarkStart w:id="29" w:name="_Toc240233648"/>
+      <w:bookmarkStart w:id="29" w:name="_Toc240394961"/>
       <w:r>
         <w:t>Figure 4.2 SQLite ownership and session relationships</w:t>
       </w:r>
@@ -8307,7 +8310,7 @@
       <w:pPr>
         <w:pStyle w:val="Heading2"/>
       </w:pPr>
-      <w:bookmarkStart w:id="30" w:name="_Toc240233620"/>
+      <w:bookmarkStart w:id="30" w:name="_Toc240394933"/>
       <w:r>
         <w:t>4.3 Controller state and successful writes</w:t>
       </w:r>
@@ -8340,7 +8343,7 @@
         </w:rPr>
         <w:lastRenderedPageBreak/>
         <w:drawing>
-          <wp:inline distT="0" distB="0" distL="0" distR="0" wp14:anchorId="0D8C833B" wp14:editId="62932F2B">
+          <wp:inline distT="0" distB="0" distL="0" distR="0" wp14:anchorId="0B20B9EC" wp14:editId="01894444">
             <wp:extent cx="5472000" cy="3009600"/>
             <wp:effectExtent l="0" t="0" r="0" b="0"/>
             <wp:docPr id="4" name="Picture 4" descr="Figure 4.3 State transitions around loading and mutation"/>
@@ -8380,7 +8383,7 @@
       <w:pPr>
         <w:pStyle w:val="ReportFigure"/>
       </w:pPr>
-      <w:bookmarkStart w:id="31" w:name="_Toc240233649"/>
+      <w:bookmarkStart w:id="31" w:name="_Toc240394962"/>
       <w:r>
         <w:t>Figure 4.3 State transitions around loading and mutation</w:t>
       </w:r>
@@ -8398,7 +8401,7 @@
       <w:pPr>
         <w:pStyle w:val="Heading2"/>
       </w:pPr>
-      <w:bookmarkStart w:id="32" w:name="_Toc240233621"/>
+      <w:bookmarkStart w:id="32" w:name="_Toc240394934"/>
       <w:r>
         <w:t>4.4 Remote concurrency and uncertain outcomes</w:t>
       </w:r>
@@ -8442,7 +8445,7 @@
       <w:pPr>
         <w:pStyle w:val="Heading2"/>
       </w:pPr>
-      <w:bookmarkStart w:id="33" w:name="_Toc240233622"/>
+      <w:bookmarkStart w:id="33" w:name="_Toc240394935"/>
       <w:r>
         <w:t>4.5 Session security and operational limits</w:t>
       </w:r>
@@ -8476,7 +8479,7 @@
       <w:pPr>
         <w:pStyle w:val="Heading1"/>
       </w:pPr>
-      <w:bookmarkStart w:id="34" w:name="_Toc240233623"/>
+      <w:bookmarkStart w:id="34" w:name="_Toc240394936"/>
       <w:r>
         <w:lastRenderedPageBreak/>
         <w:t>5 Implementation and platform behavior</w:t>
@@ -8487,7 +8490,7 @@
       <w:pPr>
         <w:pStyle w:val="Heading2"/>
       </w:pPr>
-      <w:bookmarkStart w:id="35" w:name="_Toc240233624"/>
+      <w:bookmarkStart w:id="35" w:name="_Toc240394937"/>
       <w:r>
         <w:t>5.1 Responsive workspace and interaction design</w:t>
       </w:r>
@@ -8519,7 +8522,7 @@
           <w:noProof/>
         </w:rPr>
         <w:drawing>
-          <wp:inline distT="0" distB="0" distL="0" distR="0" wp14:anchorId="4385826D" wp14:editId="73E96876">
+          <wp:inline distT="0" distB="0" distL="0" distR="0" wp14:anchorId="0A0C9AA8" wp14:editId="2095CA1E">
             <wp:extent cx="5472000" cy="3847500"/>
             <wp:effectExtent l="0" t="0" r="0" b="0"/>
             <wp:docPr id="5" name="Picture 5" descr="Figure 5.1 Wide TaskFlow layout from the controlled golden fixture"/>
@@ -8559,7 +8562,7 @@
       <w:pPr>
         <w:pStyle w:val="ReportFigure"/>
       </w:pPr>
-      <w:bookmarkStart w:id="36" w:name="_Toc240233650"/>
+      <w:bookmarkStart w:id="36" w:name="_Toc240394963"/>
       <w:r>
         <w:t>Figure 5.1 Wide TaskFlow layout from the controlled golden fixture</w:t>
       </w:r>
@@ -8578,7 +8581,7 @@
       <w:pPr>
         <w:pStyle w:val="Heading2"/>
       </w:pPr>
-      <w:bookmarkStart w:id="37" w:name="_Toc240233625"/>
+      <w:bookmarkStart w:id="37" w:name="_Toc240394938"/>
       <w:r>
         <w:t>5.2 Capture and edit forms</w:t>
       </w:r>
@@ -8615,7 +8618,7 @@
       <w:pPr>
         <w:pStyle w:val="Heading2"/>
       </w:pPr>
-      <w:bookmarkStart w:id="38" w:name="_Toc240233626"/>
+      <w:bookmarkStart w:id="38" w:name="_Toc240394939"/>
       <w:r>
         <w:lastRenderedPageBreak/>
         <w:t>5.3 Discovery and stable results</w:t>
@@ -8642,7 +8645,7 @@
       <w:pPr>
         <w:pStyle w:val="Heading2"/>
       </w:pPr>
-      <w:bookmarkStart w:id="39" w:name="_Toc240233627"/>
+      <w:bookmarkStart w:id="39" w:name="_Toc240394940"/>
       <w:r>
         <w:t>5.4 Loading and recoverable failures</w:t>
       </w:r>
@@ -8668,7 +8671,7 @@
       <w:pPr>
         <w:pStyle w:val="Heading2"/>
       </w:pPr>
-      <w:bookmarkStart w:id="40" w:name="_Toc240233628"/>
+      <w:bookmarkStart w:id="40" w:name="_Toc240394941"/>
       <w:r>
         <w:lastRenderedPageBreak/>
         <w:t>5.5 Account workflows and backend integration</w:t>
@@ -8703,7 +8706,7 @@
       <w:pPr>
         <w:pStyle w:val="Heading2"/>
       </w:pPr>
-      <w:bookmarkStart w:id="41" w:name="_Toc240233629"/>
+      <w:bookmarkStart w:id="41" w:name="_Toc240394942"/>
       <w:r>
         <w:t>5.6 Platform and accessibility boundaries</w:t>
       </w:r>
@@ -8714,10 +8717,10 @@
         <w:pStyle w:val="ReportBody"/>
       </w:pPr>
       <w:r>
-        <w:t xml:space="preserve">Windows supplies real native execution, local persistence and a release build in the retained evidence. Edge supplies real browser interactions, with an isolated harness for deterministic repository behavior and a separate account-lifecycle test. Historical hosted Android evidence supplies an emulator-based native gate and APK artifacts at an earlier revision. These forms of evidence complement each other; they cannot be combined into a claim that the newest interface has been manually tested on a physical </w:t>
-      </w:r>
-      <w:r>
-        <w:t>Android phone.</w:t>
+        <w:t>Windows and Android each supply 15 native case executions, including controlled repositories, real preferences, draft protection and an isolated API/SQLite workflow. The local Android 16/API 36 emulator also passed release APK installation, cold launch and an offline task check after force-stop and relaunch. Edge supplies retained browser interactions through a controlled harness and a separate account-lifecycle test. These results do not establish physical Android device testing. The iOS runner is scaffold</w:t>
+      </w:r>
+      <w:r>
+        <w:t>ed but build and execution remain unverified because this Windows host has no Mac/Xcode toolchain.</w:t>
       </w:r>
     </w:p>
     <w:p>
@@ -8726,6 +8729,14 @@
       </w:pPr>
       <w:r>
         <w:lastRenderedPageBreak/>
+        <w:t>The Android environment keeps the SDK, AVD, Gradle and Pub caches on drive D. The online emulator test reaches the host API through 10.0.2.2. Debug network policy permits HTTP only for that address and loopback hosts; release policy is unchanged. Release builds use normal dependency refresh after integration testing so the generated plugin registry matches the target. The coursework APK uses debug signing, not production signing.</w:t>
+      </w:r>
+    </w:p>
+    <w:p>
+      <w:pPr>
+        <w:pStyle w:val="ReportBody"/>
+      </w:pPr>
+      <w:r>
         <w:t>Automated accessibility checks cover selected semantics, target-size and contrast conditions, form traversal and enlarged text. Flutter's accessibility testing documentation describes programmatic guidelines that assist such checks (Flutter, n.d.-g). The full manual screen-reader and page-wide keyboard protocol remains unexecuted in the retained status. A meaningful semantics tree is a necessary part of access, but it does not prove the quality of a complete spoken interaction.</w:t>
       </w:r>
     </w:p>
@@ -8734,14 +8745,14 @@
         <w:pStyle w:val="ReportBody"/>
       </w:pPr>
       <w:r>
-        <w:t>Responsive tests also have a precise boundary. A logical viewport override verifies layout under that supplied size. It is not evidence of dragging a physical desktop window or using an Android input method. Native tests register and unregister the injected text-input channel to avoid Windows IME interference; consequently, those tests do not validate an actual IME. These limitations guide the next manual checks rather than invalidating the narrower automated evidence.</w:t>
+        <w:t>Logical viewport overrides verify layout at specified sizes, not physical resizing or rotation. Native suites register an injected text-input channel; they do not validate a real Windows or Android IME. These input checks remain part of manual acceptance.</w:t>
       </w:r>
     </w:p>
     <w:p>
       <w:pPr>
         <w:pStyle w:val="Heading1"/>
       </w:pPr>
-      <w:bookmarkStart w:id="42" w:name="_Toc240233630"/>
+      <w:bookmarkStart w:id="42" w:name="_Toc240394943"/>
       <w:r>
         <w:lastRenderedPageBreak/>
         <w:t>6 Testing experiments and evaluation</w:t>
@@ -8752,7 +8763,7 @@
       <w:pPr>
         <w:pStyle w:val="Heading2"/>
       </w:pPr>
-      <w:bookmarkStart w:id="43" w:name="_Toc240233631"/>
+      <w:bookmarkStart w:id="43" w:name="_Toc240394944"/>
       <w:r>
         <w:t>6.1 Evaluation protocol and evidence identity</w:t>
       </w:r>
@@ -8763,10 +8774,7 @@
         <w:pStyle w:val="ReportBody"/>
       </w:pPr>
       <w:r>
-        <w:t>Evaluation separates source identity, test selection, environment and observed outcome. The evaluated working tree is baseline 39dd199 plus the draft-consistency update. On 13 September 2026, the updated Flutter suite ran with coverage enabled, the Node API suite ran locally and the Windows draft-exit case passed. Logs are retained under docs/evidence/capture-fix/. These fresh checks are distinct from the retained desktop UI milestone and earlier Android CI. No historical result is relabelled as a new execu</w:t>
-      </w:r>
-      <w:r>
-        <w:t>tion.</w:t>
+        <w:t>Evaluation separates source identity, test selection, environment and observed outcome. The evaluated implementation is commit 3e4f733. Logs under docs/evidence/platform-audit-20260914 and docs/evidence/platform-audit-20260915 record the local audit. On 15 September, the Flutter suite passed 100 cases with coverage enabled and the Node suite passed 14 cases; publication review repeated both successfully. Earlier browser and hosted Android experiments keep their original evidence identities.</w:t>
       </w:r>
     </w:p>
     <w:p>
@@ -8774,14 +8782,14 @@
         <w:pStyle w:val="ReportBody"/>
       </w:pPr>
       <w:r>
-        <w:t>The local Flutter environment is Flutter 3.47.1 with Dart 3.13.1 on Windows 11, build 26200.9445. The backend uses Node 22.14.0 and the runtime's built-in SQLite support. Android SDK availability differs between the local and earlier hosts. This report therefore uses the dated hosted Android record rather than implying that the present machine executed Android tests during preparation.</w:t>
+        <w:t>The local environment is Flutter 3.47.1 with Dart 3.13.1 on Windows 11, build 26200.9445, and Node 22.14.0 with built-in SQLite. The Android target is Google APIs Android 16/API 36 x86_64, emulator 37.1.11, at 720 by 1280 pixels and density 240, with two cores and 2048 MB guest memory. SDK and caches are under D:/Android. Host PATH and SDK-manager license-status warnings remain documented rather than reported as a fully clean toolchain check.</w:t>
       </w:r>
     </w:p>
     <w:p>
       <w:pPr>
         <w:pStyle w:val="ReportTableCaption"/>
       </w:pPr>
-      <w:bookmarkStart w:id="44" w:name="_Toc240233655"/>
+      <w:bookmarkStart w:id="44" w:name="_Toc240394968"/>
       <w:r>
         <w:t>Table 6.1 Results and their actual verification boundaries</w:t>
       </w:r>
@@ -8949,7 +8957,7 @@
               <w:pStyle w:val="ReportTable"/>
             </w:pPr>
             <w:r>
-              <w:t>100 cases PASS on 13 September</w:t>
+              <w:t>100 cases PASS on 15 September</w:t>
             </w:r>
           </w:p>
         </w:tc>
@@ -8965,7 +8973,7 @@
               <w:pStyle w:val="ReportTable"/>
             </w:pPr>
             <w:r>
-              <w:t>Includes four new draft-consistency cases; no coverage percentage asserted</w:t>
+              <w:t>Includes draft-consistency cases and goldens; no coverage percentage asserted</w:t>
             </w:r>
           </w:p>
         </w:tc>
@@ -9002,7 +9010,7 @@
               <w:pStyle w:val="ReportTable"/>
             </w:pPr>
             <w:r>
-              <w:t>14 cases PASS on 13 September</w:t>
+              <w:t>14 cases PASS on 15 September</w:t>
             </w:r>
           </w:p>
         </w:tc>
@@ -9055,7 +9063,7 @@
               <w:pStyle w:val="ReportTable"/>
             </w:pPr>
             <w:r>
-              <w:t>Draft-exit case PASS; historical 11-case selection PASS</w:t>
+              <w:t>15 cases PASS on 14 September</w:t>
             </w:r>
           </w:p>
         </w:tc>
@@ -9071,7 +9079,7 @@
               <w:pStyle w:val="ReportTable"/>
             </w:pPr>
             <w:r>
-              <w:t>New exit check distinguished from retained native/API workflows</w:t>
+              <w:t>Six separate invocations, including real API/SQLite</w:t>
             </w:r>
           </w:p>
         </w:tc>
@@ -9108,7 +9116,7 @@
               <w:pStyle w:val="ReportTable"/>
             </w:pPr>
             <w:r>
-              <w:t>PASS in retained minimal UI evidence</w:t>
+              <w:t>PASS on 14 September</w:t>
             </w:r>
           </w:p>
         </w:tc>
@@ -9124,7 +9132,7 @@
               <w:pStyle w:val="ReportTable"/>
             </w:pPr>
             <w:r>
-              <w:t>Build result, not a clean-machine install certificate</w:t>
+              <w:t>Not a clean-machine install certificate</w:t>
             </w:r>
           </w:p>
         </w:tc>
@@ -9145,7 +9153,7 @@
               <w:pStyle w:val="ReportTable"/>
             </w:pPr>
             <w:r>
-              <w:t>Edge UI harness</w:t>
+              <w:t>Android local workflows</w:t>
             </w:r>
           </w:p>
         </w:tc>
@@ -9161,7 +9169,7 @@
               <w:pStyle w:val="ReportTable"/>
             </w:pPr>
             <w:r>
-              <w:t>Final 1 of 1 run PASS after corrections</w:t>
+              <w:t>15 cases PASS on 15 September</w:t>
             </w:r>
           </w:p>
         </w:tc>
@@ -9177,7 +9185,7 @@
               <w:pStyle w:val="ReportTable"/>
             </w:pPr>
             <w:r>
-              <w:t>Four earlier failed attempts retained; not a five-run success result</w:t>
+              <w:t>API 36 emulator; debug local API included</w:t>
             </w:r>
           </w:p>
         </w:tc>
@@ -9198,6 +9206,166 @@
               <w:pStyle w:val="ReportTable"/>
             </w:pPr>
             <w:r>
+              <w:t>Android release</w:t>
+            </w:r>
+          </w:p>
+        </w:tc>
+        <w:tc>
+          <w:tcPr>
+            <w:tcW w:w="3061" w:type="dxa"/>
+            <w:tcBorders>
+              <w:bottom w:val="single" w:sz="4" w:space="0" w:color="CBD5E1"/>
+            </w:tcBorders>
+          </w:tcPr>
+          <w:p>
+            <w:pPr>
+              <w:pStyle w:val="ReportTable"/>
+            </w:pPr>
+            <w:r>
+              <w:t>Build, install, launch and persistence PASS</w:t>
+            </w:r>
+          </w:p>
+        </w:tc>
+        <w:tc>
+          <w:tcPr>
+            <w:tcW w:w="3855" w:type="dxa"/>
+            <w:tcBorders>
+              <w:bottom w:val="single" w:sz="4" w:space="0" w:color="CBD5E1"/>
+            </w:tcBorders>
+          </w:tcPr>
+          <w:p>
+            <w:pPr>
+              <w:pStyle w:val="ReportTable"/>
+            </w:pPr>
+            <w:r>
+              <w:t>Offline process restart; not physical-device HTTPS</w:t>
+            </w:r>
+          </w:p>
+        </w:tc>
+      </w:tr>
+      <w:tr>
+        <w:trPr>
+          <w:cantSplit/>
+        </w:trPr>
+        <w:tc>
+          <w:tcPr>
+            <w:tcW w:w="1871" w:type="dxa"/>
+            <w:tcBorders>
+              <w:bottom w:val="single" w:sz="4" w:space="0" w:color="CBD5E1"/>
+            </w:tcBorders>
+          </w:tcPr>
+          <w:p>
+            <w:pPr>
+              <w:pStyle w:val="ReportTable"/>
+            </w:pPr>
+            <w:r>
+              <w:lastRenderedPageBreak/>
+              <w:t>iOS</w:t>
+            </w:r>
+          </w:p>
+        </w:tc>
+        <w:tc>
+          <w:tcPr>
+            <w:tcW w:w="3061" w:type="dxa"/>
+            <w:tcBorders>
+              <w:bottom w:val="single" w:sz="4" w:space="0" w:color="CBD5E1"/>
+            </w:tcBorders>
+          </w:tcPr>
+          <w:p>
+            <w:pPr>
+              <w:pStyle w:val="ReportTable"/>
+            </w:pPr>
+            <w:r>
+              <w:t>NOT RUN</w:t>
+            </w:r>
+          </w:p>
+        </w:tc>
+        <w:tc>
+          <w:tcPr>
+            <w:tcW w:w="3855" w:type="dxa"/>
+            <w:tcBorders>
+              <w:bottom w:val="single" w:sz="4" w:space="0" w:color="CBD5E1"/>
+            </w:tcBorders>
+          </w:tcPr>
+          <w:p>
+            <w:pPr>
+              <w:pStyle w:val="ReportTable"/>
+            </w:pPr>
+            <w:r>
+              <w:t>Scaffold only; Mac/Xcode required</w:t>
+            </w:r>
+          </w:p>
+        </w:tc>
+      </w:tr>
+      <w:tr>
+        <w:trPr>
+          <w:cantSplit/>
+        </w:trPr>
+        <w:tc>
+          <w:tcPr>
+            <w:tcW w:w="1871" w:type="dxa"/>
+            <w:tcBorders>
+              <w:bottom w:val="single" w:sz="4" w:space="0" w:color="CBD5E1"/>
+            </w:tcBorders>
+          </w:tcPr>
+          <w:p>
+            <w:pPr>
+              <w:pStyle w:val="ReportTable"/>
+            </w:pPr>
+            <w:r>
+              <w:t>Edge UI harness</w:t>
+            </w:r>
+          </w:p>
+        </w:tc>
+        <w:tc>
+          <w:tcPr>
+            <w:tcW w:w="3061" w:type="dxa"/>
+            <w:tcBorders>
+              <w:bottom w:val="single" w:sz="4" w:space="0" w:color="CBD5E1"/>
+            </w:tcBorders>
+          </w:tcPr>
+          <w:p>
+            <w:pPr>
+              <w:pStyle w:val="ReportTable"/>
+            </w:pPr>
+            <w:r>
+              <w:t>Final 1 of 1 run PASS after corrections</w:t>
+            </w:r>
+          </w:p>
+        </w:tc>
+        <w:tc>
+          <w:tcPr>
+            <w:tcW w:w="3855" w:type="dxa"/>
+            <w:tcBorders>
+              <w:bottom w:val="single" w:sz="4" w:space="0" w:color="CBD5E1"/>
+            </w:tcBorders>
+          </w:tcPr>
+          <w:p>
+            <w:pPr>
+              <w:pStyle w:val="ReportTable"/>
+            </w:pPr>
+            <w:r>
+              <w:t>Four earlier failed attempts retained; not a five-run success result</w:t>
+            </w:r>
+          </w:p>
+        </w:tc>
+      </w:tr>
+      <w:tr>
+        <w:trPr>
+          <w:cantSplit/>
+        </w:trPr>
+        <w:tc>
+          <w:tcPr>
+            <w:tcW w:w="1871" w:type="dxa"/>
+            <w:tcBorders>
+              <w:bottom w:val="single" w:sz="4" w:space="0" w:color="CBD5E1"/>
+            </w:tcBorders>
+          </w:tcPr>
+          <w:p>
+            <w:pPr>
+              <w:pStyle w:val="ReportTable"/>
+            </w:pPr>
+            <w:r>
               <w:t>Android hosted gate</w:t>
             </w:r>
           </w:p>
@@ -9242,26 +9410,71 @@
         <w:pStyle w:val="ReportBody"/>
       </w:pPr>
       <w:r>
+        <w:t>The 100-case result includes comparisons against 15 unchanged golden images; these are not additional tests. Each native platform executes six selections: four independent scenarios, three persisted scenarios, two preference-backed workflows, one quick-create exit scenario, four pending-capture cases and one online API workflow. The resulting 15 executions per platform do not represent 30 distinct scenarios across both platforms. Acceptance conditions determine what these counts establish.</w:t>
+      </w:r>
+    </w:p>
+    <w:p>
+      <w:pPr>
+        <w:pStyle w:val="Heading2"/>
+      </w:pPr>
+      <w:bookmarkStart w:id="45" w:name="_Toc240394945"/>
+      <w:r>
+        <w:t>6.2 Scenario design and assertion strength</w:t>
+      </w:r>
+      <w:bookmarkEnd w:id="45"/>
+    </w:p>
+    <w:p>
+      <w:pPr>
+        <w:pStyle w:val="ReportBody"/>
+      </w:pPr>
+      <w:r>
+        <w:t>The fresh-create scenario begins with isolated storage, observes an empty state, submits a valid record and checks its appearance. A validation scenario submits invalid input, observes readable validation, corrects the form and verifies a successful save. Discovery scenarios seed known records and assert normalized search, combined filters and exact ordering. Edit, completion, delete and undo scenarios compare full records and unaffected tasks where appropriate.</w:t>
+      </w:r>
+    </w:p>
+    <w:p>
+      <w:pPr>
+        <w:pStyle w:val="ReportBody"/>
+      </w:pPr>
+      <w:r>
+        <w:t>The persisted suite resets only its dedicated test preference keys. It does not clear all preferences on the host. A fresh repository and UI remount then verifies that persisted records can be read back. This is stronger than checking the previous widget's in-memory list, but it remains a remount rather than terminating and restarting the operating-system process. The distinction is stated because both actions are sometimes described imprecisely as a restart.</w:t>
+      </w:r>
+    </w:p>
+    <w:p>
+      <w:pPr>
+        <w:pStyle w:val="ReportBody"/>
+      </w:pPr>
+      <w:r>
+        <w:t xml:space="preserve">Independent controlled-repository cases exercise compact and wide validation, seeded discovery and recovery from load or write failures. Each case receives a fresh repository and resets its viewport. Completion gates make the </w:t>
+      </w:r>
+      <w:r>
         <w:lastRenderedPageBreak/>
-        <w:t>The 100-case result is not added to 15 golden images as though they were unrelated test populations. Golden comparisons are included in the Flutter suite and maintain 15 unchanged baseline images. Similarly, the historical 11 native cases describe selected Windows workflows rather than 11 different platforms. Counting is useful for locating evidence, but the acceptance conditions determine what those counts mean.</w:t>
+        <w:t>pending interval observable. The online Windows scenario adds the actual API and isolated SQLite store. Separating these cases makes a failure easier to localize than a single long scenario that depends on the records created by every preceding step.</w:t>
+      </w:r>
+    </w:p>
+    <w:p>
+      <w:pPr>
+        <w:pStyle w:val="ReportBody"/>
+      </w:pPr>
+      <w:r>
+        <w:t>An adequate assertion checks the intended invariant. After editing, retaining the identifier and metadata matters. After filtering, exact membership matters. After deleting one task, preserving another matters. After retry, preventing duplicate writes matters. These are stronger oracles than merely checking that no exception escaped, or that a button responded to a tap.</w:t>
       </w:r>
     </w:p>
     <w:p>
       <w:pPr>
         <w:pStyle w:val="Heading2"/>
       </w:pPr>
-      <w:bookmarkStart w:id="45" w:name="_Toc240233632"/>
-      <w:r>
-        <w:t>6.2 Scenario design and assertion strength</w:t>
-      </w:r>
-      <w:bookmarkEnd w:id="45"/>
+      <w:bookmarkStart w:id="46" w:name="_Toc240394946"/>
+      <w:r>
+        <w:t>6.3 Intentional semantic defect</w:t>
+      </w:r>
+      <w:bookmarkEnd w:id="46"/>
     </w:p>
     <w:p>
       <w:pPr>
         <w:pStyle w:val="ReportBody"/>
       </w:pPr>
       <w:r>
-        <w:t>The fresh-create scenario begins with isolated storage, observes an empty state, submits a valid record and checks its appearance. A validation scenario submits invalid input, observes readable validation, corrects the form and verifies a successful save. Discovery scenarios seed known records and assert normalized search, combined filters and exact ordering. Edit, completion, delete and undo scenarios compare full records and unaffected tasks where appropriate.</w:t>
+        <w:t>The intentional-defect experiment asks whether UI automation detects a search error that leaves compilation and basic navigation intact. The correct implementation uses normalized substring matching. The temporary faulty patch replaces that comparison with prefix matching. The fixture contains Review Flutter testing and Write report, and the query includes surrounding whitespace and uppercase text: FLUTTER. The first task should still match because normalization and substring search are both required.</w:t>
       </w:r>
     </w:p>
     <w:p>
@@ -9269,52 +9482,6 @@
         <w:pStyle w:val="ReportBody"/>
       </w:pPr>
       <w:r>
-        <w:t>The persisted suite resets only its dedicated test preference keys. It does not clear all preferences on the host. A fresh repository and UI remount then verifies that persisted records can be read back. This is stronger than checking the previous widget's in-memory list, but it remains a remount rather than terminating and restarting the operating-system process. The distinction is stated because both actions are sometimes described imprecisely as a restart.</w:t>
-      </w:r>
-    </w:p>
-    <w:p>
-      <w:pPr>
-        <w:pStyle w:val="ReportBody"/>
-      </w:pPr>
-      <w:r>
-        <w:t>Independent controlled-repository cases exercise compact and wide validation, seeded discovery and recovery from load or write failures. Each case receives a fresh repository and resets its viewport. Completion gates make the pending interval observable. The online Windows scenario adds the actual API and isolated SQLite store. Separating these cases makes a failure easier to localize than a single long scenario that depends on the records created by every preceding step.</w:t>
-      </w:r>
-    </w:p>
-    <w:p>
-      <w:pPr>
-        <w:pStyle w:val="ReportBody"/>
-      </w:pPr>
-      <w:r>
-        <w:t xml:space="preserve">An adequate assertion checks the intended invariant. After editing, retaining the identifier and metadata matters. After filtering, exact membership matters. After deleting one task, preserving another matters. After retry, preventing duplicate </w:t>
-      </w:r>
-      <w:r>
-        <w:lastRenderedPageBreak/>
-        <w:t>writes matters. These are stronger oracles than merely checking that no exception escaped, or that a button responded to a tap.</w:t>
-      </w:r>
-    </w:p>
-    <w:p>
-      <w:pPr>
-        <w:pStyle w:val="Heading2"/>
-      </w:pPr>
-      <w:bookmarkStart w:id="46" w:name="_Toc240233633"/>
-      <w:r>
-        <w:t>6.3 Intentional semantic defect</w:t>
-      </w:r>
-      <w:bookmarkEnd w:id="46"/>
-    </w:p>
-    <w:p>
-      <w:pPr>
-        <w:pStyle w:val="ReportBody"/>
-      </w:pPr>
-      <w:r>
-        <w:t>The intentional-defect experiment asks whether UI automation detects a search error that leaves compilation and basic navigation intact. The correct implementation uses normalized substring matching. The temporary faulty patch replaces that comparison with prefix matching. The fixture contains Review Flutter testing and Write report, and the query includes surrounding whitespace and uppercase text: FLUTTER. The first task should still match because normalization and substring search are both required.</w:t>
-      </w:r>
-    </w:p>
-    <w:p>
-      <w:pPr>
-        <w:pStyle w:val="ReportBody"/>
-      </w:pPr>
-      <w:r>
         <w:t>The baseline regression test passed before the change. With the faulty comparison, the expected task could not be found and the command failed. Restoring substring matching made the same regression pass again. The repository retains the buggy patch, corrected patch and unedited baseline, failure and recovery logs. The permanent test remains in the corrected source tree; the production implementation is not left intentionally defective.</w:t>
       </w:r>
     </w:p>
@@ -9322,7 +9489,7 @@
       <w:pPr>
         <w:pStyle w:val="ReportTableCaption"/>
       </w:pPr>
-      <w:bookmarkStart w:id="47" w:name="_Toc240233656"/>
+      <w:bookmarkStart w:id="47" w:name="_Toc240394969"/>
       <w:r>
         <w:t>Table 6.2 Deliberate search-defect experiment</w:t>
       </w:r>
@@ -9578,9 +9745,8 @@
       <w:pPr>
         <w:pStyle w:val="Heading2"/>
       </w:pPr>
-      <w:bookmarkStart w:id="48" w:name="_Toc240233634"/>
-      <w:r>
-        <w:lastRenderedPageBreak/>
+      <w:bookmarkStart w:id="48" w:name="_Toc240394947"/>
+      <w:r>
         <w:t>6.4 Test-level timing experiment</w:t>
       </w:r>
       <w:bookmarkEnd w:id="48"/>
@@ -9597,7 +9763,7 @@
       <w:pPr>
         <w:pStyle w:val="ReportTableCaption"/>
       </w:pPr>
-      <w:bookmarkStart w:id="49" w:name="_Toc240233657"/>
+      <w:bookmarkStart w:id="49" w:name="_Toc240394970"/>
       <w:r>
         <w:t>Table 6.3 Whole-command duration in seconds for the selected suites</w:t>
       </w:r>
@@ -9907,14 +10073,18 @@
         <w:pStyle w:val="ReportBody"/>
       </w:pPr>
       <w:r>
-        <w:t>The small sample cannot support a general reliability estimate. Three successful repetitions can reveal an immediate deterministic failure, but rare timing failures may remain unseen. Warm caches and one host also restrict external validity. The most useful conclusion is procedural: retain raw results, state the workload and rotate order, then avoid converting a small local experiment into an unsupported universal comparison.</w:t>
+        <w:t xml:space="preserve">The small sample cannot support a general reliability estimate. Three successful repetitions can reveal an immediate deterministic failure, but rare timing failures may remain unseen. Warm caches and one host also restrict external </w:t>
+      </w:r>
+      <w:r>
+        <w:lastRenderedPageBreak/>
+        <w:t>validity. The most useful conclusion is procedural: retain raw results, state the workload and rotate order, then avoid converting a small local experiment into an unsupported universal comparison.</w:t>
       </w:r>
     </w:p>
     <w:p>
       <w:pPr>
         <w:pStyle w:val="Heading2"/>
       </w:pPr>
-      <w:bookmarkStart w:id="50" w:name="_Toc240233635"/>
+      <w:bookmarkStart w:id="50" w:name="_Toc240394948"/>
       <w:r>
         <w:t>6.5 Browser automation and maintenance findings</w:t>
       </w:r>
@@ -9925,11 +10095,45 @@
         <w:pStyle w:val="ReportBody"/>
       </w:pPr>
       <w:r>
-        <w:t xml:space="preserve">The browser harness is compiled through an explicit QA entry point and uses synthetic in-memory data. It can hold repository operations and inject failures </w:t>
+        <w:t>The browser harness is compiled through an explicit QA entry point and uses synthetic in-memory data. It can hold repository operations and inject failures without touching account data or preferences. A separate real API scenario covers account task lifecycle. These two forms of browser testing must be reported independently because the controlled harness does not establish actual persistence or network behavior.</w:t>
+      </w:r>
+    </w:p>
+    <w:p>
+      <w:pPr>
+        <w:pStyle w:val="ReportBody"/>
+      </w:pPr>
+      <w:r>
+        <w:t>During the desktop redesign, the harness initially searched for an old heading. A later attempt assumed the input's accessible name was unchanged after focus, while the observed name included a second line. The corrected script checks the intended first line and verifies the active input before typing. Four failed attempts and the final successful run are retained. This is evidence of automation maintenance after a legitimate UI change, not evidence that four application defects were found and fixed.</w:t>
+      </w:r>
+    </w:p>
+    <w:p>
+      <w:pPr>
+        <w:pStyle w:val="ReportBody"/>
+      </w:pPr>
+      <w:r>
+        <w:t>The earlier browser stability experiment and multi-session work remain useful historical observations, but the current one-run success cannot inherit their repetition count. The script also retains raw outputs and exit codes and restores the default Web build after the harness. Those safeguards improve the reproducibility of evidence collection. They do not prove that all browsers, clean machines or assistive technologies behave identically.</w:t>
+      </w:r>
+    </w:p>
+    <w:p>
+      <w:pPr>
+        <w:pStyle w:val="Heading2"/>
+      </w:pPr>
+      <w:bookmarkStart w:id="51" w:name="_Toc240394949"/>
+      <w:r>
+        <w:t>6.6 Threats to validity and remaining gates</w:t>
+      </w:r>
+      <w:bookmarkEnd w:id="51"/>
+    </w:p>
+    <w:p>
+      <w:pPr>
+        <w:pStyle w:val="ReportBody"/>
+      </w:pPr>
+      <w:r>
+        <w:t xml:space="preserve">Internal validity depends on using independent fixtures and meaningful assertions. A fake may model an error more simply than a real transport failure, so a passing recovery test is not a complete network proof. Golden results depend on fonts and rendering environment. Test-level timings include overhead and unequal </w:t>
       </w:r>
       <w:r>
         <w:lastRenderedPageBreak/>
-        <w:t>without touching account data or preferences. A separate real API scenario covers account task lifecycle. These two forms of browser testing must be reported independently because the controlled harness does not establish actual persistence or network behavior.</w:t>
+        <w:t>work. Browser-script corrections change the measurement procedure, which is why previous failed attempts remain visible rather than being replaced.</w:t>
       </w:r>
     </w:p>
     <w:p>
@@ -9937,7 +10141,7 @@
         <w:pStyle w:val="ReportBody"/>
       </w:pPr>
       <w:r>
-        <w:t>During the desktop redesign, the harness initially searched for an old heading. A later attempt assumed the input's accessible name was unchanged after focus, while the observed name included a second line. The corrected script checks the intended first line and verifies the active input before typing. Four failed attempts and the final successful run are retained. This is evidence of automation maintenance after a legitimate UI change, not evidence that four application defects were found and fixed.</w:t>
+        <w:t>External validity is limited by the small coursework dataset and selected Windows host and Android emulator. The eager task list has not been stress-tested at the server's 500-record acceptance limit. No frame-time or sustained API-load study is reported. The local Android API workflow does not establish physical-device connectivity, release HTTPS operation or production signing.</w:t>
       </w:r>
     </w:p>
     <w:p>
@@ -9945,25 +10149,15 @@
         <w:pStyle w:val="ReportBody"/>
       </w:pPr>
       <w:r>
-        <w:t>The earlier browser stability experiment and multi-session work remain useful historical observations, but the current one-run success cannot inherit their repetition count. The script also retains raw outputs and exit codes and restores the default Web build after the harness. Those safeguards improve the reproducibility of evidence collection. They do not prove that all browsers, clean machines or assistive technologies behave identically.</w:t>
-      </w:r>
-    </w:p>
-    <w:p>
-      <w:pPr>
-        <w:pStyle w:val="Heading2"/>
-      </w:pPr>
-      <w:bookmarkStart w:id="51" w:name="_Toc240233636"/>
-      <w:r>
-        <w:t>6.6 Threats to validity and remaining gates</w:t>
-      </w:r>
-      <w:bookmarkEnd w:id="51"/>
+        <w:t>Construct validity also matters. Automated accessibility guidelines do not equal a complete screen-reader review, and successful remount does not equal process restart. Passing the selected checks does not imply absence of bugs. These distinctions prevent convenience metrics, especially total test count, from replacing the actual user risks under evaluation.</w:t>
+      </w:r>
     </w:p>
     <w:p>
       <w:pPr>
         <w:pStyle w:val="ReportBody"/>
       </w:pPr>
       <w:r>
-        <w:t>Internal validity depends on using independent fixtures and meaningful assertions. A fake may model an error more simply than a real transport failure, so a passing recovery test is not a complete network proof. Golden results depend on fonts and rendering environment. Test-level timings include overhead and unequal work. Browser-script corrections change the measurement procedure, which is why previous failed attempts remain visible rather than being replaced.</w:t>
+        <w:t>The Android release check adds a stronger persistence boundary than UI remount: a task entered through Android input events remained visible after force-stop and relaunch. This does not establish an operating-system reboot or general input-method compatibility. The APK is 53,112,106 bytes; its checksum and installation commands are retained in the platform evidence package.</w:t>
       </w:r>
     </w:p>
     <w:p>
@@ -9971,34 +10165,14 @@
         <w:pStyle w:val="ReportBody"/>
       </w:pPr>
       <w:r>
-        <w:t xml:space="preserve">External validity is limited by the small coursework dataset, the selected Windows host and historical emulator configuration. The eager task list has not been stress-tested at the server's 500-record acceptance limit. No frame-time or sustained API-load study is reported. A successful APK build or hosted emulator </w:t>
-      </w:r>
-      <w:r>
-        <w:lastRenderedPageBreak/>
-        <w:t>test does not establish manual physical-device installation, account-mode connectivity on Android or production signing.</w:t>
-      </w:r>
-    </w:p>
-    <w:p>
-      <w:pPr>
-        <w:pStyle w:val="ReportBody"/>
-      </w:pPr>
-      <w:r>
-        <w:t>Construct validity also matters. Automated accessibility guidelines do not equal a complete screen-reader review, and successful remount does not equal process restart. Passing the selected checks does not imply absence of bugs. These distinctions prevent convenience metrics, especially total test count, from replacing the actual user risks under evaluation.</w:t>
-      </w:r>
-    </w:p>
-    <w:p>
-      <w:pPr>
-        <w:pStyle w:val="ReportBody"/>
-      </w:pPr>
-      <w:r>
-        <w:t>The next evidence gates are manual screen-reader and whole-page keyboard testing, clean-machine setup, release-artifact installation and current-revision Android verification where the environment allows it. Submission readiness additionally requires closure of open engineering findings, the team's presentation video and a confirmed contribution record. These items remain separate from the document's formatting and narrative completion.</w:t>
+        <w:t>Remaining evidence gates are manual screen-reader and whole-page keyboard testing, clean-machine setup and Mac-based execution for the additional iOS target. Android account verification covers the debug emulator against a local API, not a release HTTPS deployment. Submission additionally requires the team's English presentation video and a confirmed contribution record. These items remain separate from document completion.</w:t>
       </w:r>
     </w:p>
     <w:p>
       <w:pPr>
         <w:pStyle w:val="Heading1"/>
       </w:pPr>
-      <w:bookmarkStart w:id="52" w:name="_Toc240233637"/>
+      <w:bookmarkStart w:id="52" w:name="_Toc240394950"/>
       <w:r>
         <w:lastRenderedPageBreak/>
         <w:t>7 Conclusion</w:t>
@@ -10009,7 +10183,7 @@
       <w:pPr>
         <w:pStyle w:val="Heading2"/>
       </w:pPr>
-      <w:bookmarkStart w:id="53" w:name="_Toc240233638"/>
+      <w:bookmarkStart w:id="53" w:name="_Toc240394951"/>
       <w:r>
         <w:t>7.1 Findings</w:t>
       </w:r>
@@ -10044,14 +10218,14 @@
         <w:pStyle w:val="ReportBody"/>
       </w:pPr>
       <w:r>
-        <w:t>For RQ4, results remain tied to their platforms and revisions. The selected existing suites passed, but these results do not establish absence of defects.</w:t>
+        <w:t>For RQ4, the current selection passed 15 native cases on each of Windows and Android, alongside 100 Flutter and 14 API cases. Android release installation and offline process-restart persistence were verified on the emulator. These observations support the required two-platform demonstration within the recorded conditions. iOS, physical-device HTTPS operation and manual screen-reader behavior remain outside the verified scope.</w:t>
       </w:r>
     </w:p>
     <w:p>
       <w:pPr>
         <w:pStyle w:val="Heading2"/>
       </w:pPr>
-      <w:bookmarkStart w:id="54" w:name="_Toc240233639"/>
+      <w:bookmarkStart w:id="54" w:name="_Toc240394952"/>
       <w:r>
         <w:t>7.2 Prioritized continuation</w:t>
       </w:r>
@@ -10077,7 +10251,7 @@
       <w:pPr>
         <w:pStyle w:val="Heading1"/>
       </w:pPr>
-      <w:bookmarkStart w:id="55" w:name="_Toc240233640"/>
+      <w:bookmarkStart w:id="55" w:name="_Toc240394953"/>
       <w:r>
         <w:lastRenderedPageBreak/>
         <w:t>References</w:t>
@@ -10185,11 +10359,11 @@
         <w:pStyle w:val="ReportReference"/>
       </w:pPr>
       <w:r>
-        <w:t>TaskFlow project. (2026). TaskFlow QA Lab [Source code and test evidence, revision 39dd199]. https://github.com/cross-platform-mobile-team/CROSS-</w:t>
+        <w:t>TaskFlow project. (2026). TaskFlow QA Lab [Source code and test evidence, revision 3e4f733]. https://github.com/cross-platform-mobile-team/CROSS-</w:t>
       </w:r>
       <w:r>
         <w:lastRenderedPageBreak/>
-        <w:t>PLATFORM-MOBILE-APP-DEVELOPMENT-Midterm-Project/tree/39dd199d9325f007fddf427622706d7de1419d38</w:t>
+        <w:t>PLATFORM-MOBILE-APP-DEVELOPMENT-Midterm-Project/tree/3e4f733acfcb219596aa4b60376f41b142d65857</w:t>
       </w:r>
     </w:p>
     <w:p>
@@ -10212,7 +10386,7 @@
       <w:pPr>
         <w:pStyle w:val="Heading1"/>
       </w:pPr>
-      <w:bookmarkStart w:id="56" w:name="_Toc240233641"/>
+      <w:bookmarkStart w:id="56" w:name="_Toc240394954"/>
       <w:r>
         <w:lastRenderedPageBreak/>
         <w:t>Appendix A Reproduction guide</w:t>
@@ -10223,7 +10397,7 @@
       <w:pPr>
         <w:pStyle w:val="Heading2"/>
       </w:pPr>
-      <w:bookmarkStart w:id="57" w:name="_Toc240233642"/>
+      <w:bookmarkStart w:id="57" w:name="_Toc240394955"/>
       <w:r>
         <w:t>Environment and safe setup</w:t>
       </w:r>
@@ -10264,18 +10438,26 @@
         <w:pStyle w:val="ReportBody"/>
       </w:pPr>
       <w:r>
-        <w:t xml:space="preserve">For browser reproduction, inspect scripts/test-edge-harness.ps1 and its supported parameters. It manages a QA build, server and isolated browser session, retains logs and restores the default Web build. The harness is a controlled in-memory test surface, not a replacement for the separate online browser lifecycle </w:t>
+        <w:t xml:space="preserve">Also run integration_test/pending_capture_test.dart separately; its four cases complete the 15-case native selection. For Android, dot-source scripts/use-android-d.ps1, start the configured emulator and use -d emulator-5554 after confirming the device ID. The isolated online helper accepts -TargetDevice emulator-5554 -ApiHost 10.0.2.2. Build the release APK with flutter build apk --release using </w:t>
       </w:r>
       <w:r>
         <w:lastRenderedPageBreak/>
-        <w:t>evidence. Output folders are unique and must not be overwritten to hide unsuccessful attempts.</w:t>
+        <w:t>normal dependency refresh after integration runs. The iOS procedure in docs/ios-validation.md requires Mac/Xcode and has not been executed here.</w:t>
+      </w:r>
+    </w:p>
+    <w:p>
+      <w:pPr>
+        <w:pStyle w:val="ReportBody"/>
+      </w:pPr>
+      <w:r>
+        <w:t>For browser reproduction, inspect scripts/test-edge-harness.ps1 and its supported parameters. It manages a QA build, server and isolated browser session, retains logs and restores the default Web build. The harness is a controlled in-memory test surface, not a replacement for the separate online browser lifecycle evidence. Output folders are unique and must not be overwritten to hide unsuccessful attempts.</w:t>
       </w:r>
     </w:p>
     <w:p>
       <w:pPr>
         <w:pStyle w:val="Heading2"/>
       </w:pPr>
-      <w:bookmarkStart w:id="58" w:name="_Toc240233643"/>
+      <w:bookmarkStart w:id="58" w:name="_Toc240394956"/>
       <w:r>
         <w:t>Deliberate defect safety</w:t>
       </w:r>
@@ -10294,14 +10476,14 @@
         <w:pStyle w:val="ReportBody"/>
       </w:pPr>
       <w:r>
-        <w:t>Additional engineering findings and their original diagnostics are maintained separately in docs/report/DEFERRED_REVIEW.md for a later manuscript update. They are outside the selected experiment results reported here and have not been relabelled as passing checks.</w:t>
+        <w:t>The resolved draft-consistency review is retained in docs/report/DEFERRED_REVIEW.md. The current report includes its corrected behavior and permanent regressions. Original diagnostics remain unchanged.</w:t>
       </w:r>
     </w:p>
     <w:p>
       <w:pPr>
         <w:pStyle w:val="Heading1"/>
       </w:pPr>
-      <w:bookmarkStart w:id="59" w:name="_Toc240233644"/>
+      <w:bookmarkStart w:id="59" w:name="_Toc240394957"/>
       <w:r>
         <w:lastRenderedPageBreak/>
         <w:t>Appendix B Evidence index</w:t>
@@ -10312,7 +10494,7 @@
       <w:pPr>
         <w:pStyle w:val="ReportTableCaption"/>
       </w:pPr>
-      <w:bookmarkStart w:id="60" w:name="_Toc240233658"/>
+      <w:bookmarkStart w:id="60" w:name="_Toc240394971"/>
       <w:r>
         <w:t>Table B.1 Evidence packages used in this report</w:t>
       </w:r>
@@ -10480,7 +10662,7 @@
               <w:pStyle w:val="ReportTable"/>
             </w:pPr>
             <w:r>
-              <w:t>Current UI milestone logs</w:t>
+              <w:t>Historical UI milestone logs</w:t>
             </w:r>
           </w:p>
         </w:tc>
@@ -10496,7 +10678,7 @@
               <w:pStyle w:val="ReportTable"/>
             </w:pPr>
             <w:r>
-              <w:t>Windows, Flutter, API and corrected Edge run</w:t>
+              <w:t>Retained corrected Edge run</w:t>
             </w:r>
           </w:p>
         </w:tc>
@@ -10517,7 +10699,7 @@
               <w:pStyle w:val="ReportTable"/>
             </w:pPr>
             <w:r>
-              <w:t>docs/evidence/intentional_defect</w:t>
+              <w:t>docs/evidence/platform-audit-20260914</w:t>
             </w:r>
           </w:p>
         </w:tc>
@@ -10533,7 +10715,7 @@
               <w:pStyle w:val="ReportTable"/>
             </w:pPr>
             <w:r>
-              <w:t>Baseline, faulty patch, fail log and fix pass</w:t>
+              <w:t>Windows native and release results</w:t>
             </w:r>
           </w:p>
         </w:tc>
@@ -10549,7 +10731,7 @@
               <w:pStyle w:val="ReportTable"/>
             </w:pPr>
             <w:r>
-              <w:t>One selected search defect</w:t>
+              <w:t>15 native case executions</w:t>
             </w:r>
           </w:p>
         </w:tc>
@@ -10570,7 +10752,7 @@
               <w:pStyle w:val="ReportTable"/>
             </w:pPr>
             <w:r>
-              <w:t>docs/experiments/test-levels-20260909.md</w:t>
+              <w:t>docs/evidence/platform-audit-20260915</w:t>
             </w:r>
           </w:p>
         </w:tc>
@@ -10586,7 +10768,7 @@
               <w:pStyle w:val="ReportTable"/>
             </w:pPr>
             <w:r>
-              <w:t>Experiment method and timing summary</w:t>
+              <w:t>Android release and source gates</w:t>
             </w:r>
           </w:p>
         </w:tc>
@@ -10602,7 +10784,7 @@
               <w:pStyle w:val="ReportTable"/>
             </w:pPr>
             <w:r>
-              <w:t>Unequal workloads, three rounds, one host</w:t>
+              <w:t>15 Android, 100 Flutter and 14 API cases</w:t>
             </w:r>
           </w:p>
         </w:tc>
@@ -10623,7 +10805,7 @@
               <w:pStyle w:val="ReportTable"/>
             </w:pPr>
             <w:r>
-              <w:t>docs/evidence/test-levels-20260909</w:t>
+              <w:t>docs/evidence/intentional_defect</w:t>
             </w:r>
           </w:p>
         </w:tc>
@@ -10639,7 +10821,7 @@
               <w:pStyle w:val="ReportTable"/>
             </w:pPr>
             <w:r>
-              <w:t>Raw timing outputs</w:t>
+              <w:t>Baseline, faulty patch, fail log and fix pass</w:t>
             </w:r>
           </w:p>
         </w:tc>
@@ -10655,7 +10837,7 @@
               <w:pStyle w:val="ReportTable"/>
             </w:pPr>
             <w:r>
-              <w:t>Whole-command wall time</w:t>
+              <w:t>One selected search defect</w:t>
             </w:r>
           </w:p>
         </w:tc>
@@ -10676,7 +10858,7 @@
               <w:pStyle w:val="ReportTable"/>
             </w:pPr>
             <w:r>
-              <w:t>docs/evidence/android-ci-20260909.md</w:t>
+              <w:t>docs/experiments/test-levels-20260909.md</w:t>
             </w:r>
           </w:p>
         </w:tc>
@@ -10692,7 +10874,7 @@
               <w:pStyle w:val="ReportTable"/>
             </w:pPr>
             <w:r>
-              <w:t>Hosted Android result</w:t>
+              <w:t>Experiment method and timing summary</w:t>
             </w:r>
           </w:p>
         </w:tc>
@@ -10708,7 +10890,7 @@
               <w:pStyle w:val="ReportTable"/>
             </w:pPr>
             <w:r>
-              <w:t>Historical revision 9ca2a96</w:t>
+              <w:t>Unequal workloads, three rounds, one host</w:t>
             </w:r>
           </w:p>
         </w:tc>
@@ -10729,7 +10911,7 @@
               <w:pStyle w:val="ReportTable"/>
             </w:pPr>
             <w:r>
-              <w:t>docs/accessibility-testing.md</w:t>
+              <w:t>docs/evidence/test-levels-20260909</w:t>
             </w:r>
           </w:p>
         </w:tc>
@@ -10745,7 +10927,7 @@
               <w:pStyle w:val="ReportTable"/>
             </w:pPr>
             <w:r>
-              <w:t>Automated scope and manual protocol</w:t>
+              <w:t>Raw timing outputs</w:t>
             </w:r>
           </w:p>
         </w:tc>
@@ -10761,7 +10943,7 @@
               <w:pStyle w:val="ReportTable"/>
             </w:pPr>
             <w:r>
-              <w:t>Manual protocol remains unexecuted</w:t>
+              <w:t>Whole-command wall time</w:t>
             </w:r>
           </w:p>
         </w:tc>
@@ -10782,6 +10964,112 @@
               <w:pStyle w:val="ReportTable"/>
             </w:pPr>
             <w:r>
+              <w:t>docs/evidence/android-ci-20260909.md</w:t>
+            </w:r>
+          </w:p>
+        </w:tc>
+        <w:tc>
+          <w:tcPr>
+            <w:tcW w:w="3061" w:type="dxa"/>
+            <w:tcBorders>
+              <w:bottom w:val="single" w:sz="4" w:space="0" w:color="CBD5E1"/>
+            </w:tcBorders>
+          </w:tcPr>
+          <w:p>
+            <w:pPr>
+              <w:pStyle w:val="ReportTable"/>
+            </w:pPr>
+            <w:r>
+              <w:t>Hosted Android result</w:t>
+            </w:r>
+          </w:p>
+        </w:tc>
+        <w:tc>
+          <w:tcPr>
+            <w:tcW w:w="3855" w:type="dxa"/>
+            <w:tcBorders>
+              <w:bottom w:val="single" w:sz="4" w:space="0" w:color="CBD5E1"/>
+            </w:tcBorders>
+          </w:tcPr>
+          <w:p>
+            <w:pPr>
+              <w:pStyle w:val="ReportTable"/>
+            </w:pPr>
+            <w:r>
+              <w:t>Historical revision 9ca2a96</w:t>
+            </w:r>
+          </w:p>
+        </w:tc>
+      </w:tr>
+      <w:tr>
+        <w:trPr>
+          <w:cantSplit/>
+        </w:trPr>
+        <w:tc>
+          <w:tcPr>
+            <w:tcW w:w="1871" w:type="dxa"/>
+            <w:tcBorders>
+              <w:bottom w:val="single" w:sz="4" w:space="0" w:color="CBD5E1"/>
+            </w:tcBorders>
+          </w:tcPr>
+          <w:p>
+            <w:pPr>
+              <w:pStyle w:val="ReportTable"/>
+            </w:pPr>
+            <w:r>
+              <w:t>docs/accessibility-testing.md</w:t>
+            </w:r>
+          </w:p>
+        </w:tc>
+        <w:tc>
+          <w:tcPr>
+            <w:tcW w:w="3061" w:type="dxa"/>
+            <w:tcBorders>
+              <w:bottom w:val="single" w:sz="4" w:space="0" w:color="CBD5E1"/>
+            </w:tcBorders>
+          </w:tcPr>
+          <w:p>
+            <w:pPr>
+              <w:pStyle w:val="ReportTable"/>
+            </w:pPr>
+            <w:r>
+              <w:t>Automated scope and manual protocol</w:t>
+            </w:r>
+          </w:p>
+        </w:tc>
+        <w:tc>
+          <w:tcPr>
+            <w:tcW w:w="3855" w:type="dxa"/>
+            <w:tcBorders>
+              <w:bottom w:val="single" w:sz="4" w:space="0" w:color="CBD5E1"/>
+            </w:tcBorders>
+          </w:tcPr>
+          <w:p>
+            <w:pPr>
+              <w:pStyle w:val="ReportTable"/>
+            </w:pPr>
+            <w:r>
+              <w:t>Manual protocol remains unexecuted</w:t>
+            </w:r>
+          </w:p>
+        </w:tc>
+      </w:tr>
+      <w:tr>
+        <w:trPr>
+          <w:cantSplit/>
+        </w:trPr>
+        <w:tc>
+          <w:tcPr>
+            <w:tcW w:w="1871" w:type="dxa"/>
+            <w:tcBorders>
+              <w:bottom w:val="single" w:sz="4" w:space="0" w:color="CBD5E1"/>
+            </w:tcBorders>
+          </w:tcPr>
+          <w:p>
+            <w:pPr>
+              <w:pStyle w:val="ReportTable"/>
+            </w:pPr>
+            <w:r>
               <w:t>docs/report/evidence</w:t>
             </w:r>
           </w:p>
@@ -10825,7 +11113,7 @@
       <w:pPr>
         <w:pStyle w:val="Heading1"/>
       </w:pPr>
-      <w:bookmarkStart w:id="61" w:name="_Toc240233645"/>
+      <w:bookmarkStart w:id="61" w:name="_Toc240394958"/>
       <w:r>
         <w:lastRenderedPageBreak/>
         <w:t>Appendix C Submission verification</w:t>
@@ -15490,7 +15778,7 @@
     <w:next w:val="Normal"/>
     <w:autoRedefine/>
     <w:uiPriority w:val="39"/>
-    <w:rsid w:val="00D43FA2"/>
+    <w:rsid w:val="00D3289F"/>
   </w:style>
   <w:style w:type="paragraph" w:styleId="TOC2">
     <w:name w:val="toc 2"/>
@@ -15498,7 +15786,7 @@
     <w:next w:val="Normal"/>
     <w:autoRedefine/>
     <w:uiPriority w:val="39"/>
-    <w:rsid w:val="00D43FA2"/>
+    <w:rsid w:val="00D3289F"/>
     <w:pPr>
       <w:ind w:left="240"/>
     </w:pPr>

</xml_diff>

<commit_message>
Fix snapshot capacity, expand native CI and refresh verified report
</commit_message>
<xml_diff>
--- a/output/pdf/taskflow-report.docx
+++ b/output/pdf/taskflow-report.docx
@@ -114,7 +114,7 @@
           <w:noProof/>
           <w:lang w:val="en-US"/>
         </w:rPr>
-        <w:pict w14:anchorId="7A106C66">
+        <w:pict w14:anchorId="2792FD1A">
           <v:shapetype id="_x0000_t75" coordsize="21600,21600" o:spt="75" o:preferrelative="t" path="m@4@5l@4@11@9@11@9@5xe" filled="f" stroked="f">
             <v:stroke joinstyle="miter"/>
             <v:formulas>
@@ -635,7 +635,7 @@
           <w:noProof/>
           <w:lang w:val="en-US"/>
         </w:rPr>
-        <w:pict w14:anchorId="631B834F">
+        <w:pict w14:anchorId="4D048D76">
           <v:shape id="Picture 6" o:spid="_x0000_i1026" type="#_x0000_t75" style="width:117pt;height:65pt;visibility:visible">
             <v:imagedata r:id="rId7" o:title=""/>
           </v:shape>
@@ -1065,13 +1065,13 @@
         <w:t>This report investigates UI automation testing through TaskFlow, a Flutter task-management application with isolated offline, sample and account workspaces. The study connects unit, widget, golden, native integration and browser tests to specific risks rather than treating test count as a quality measure. Injectable repositories, clocks and identifiers support deterministic fixtures, while explicit completion gates expose loading and recovery states. The account implementation adds a Node.js and SQLite boun</w:t>
       </w:r>
       <w:r>
-        <w:t>dary with ownership checks and revision-based snapshot writes. A deliberate substring-to-prefix search defect is detected by a permanent regression, with authentic baseline, failure and corrected outputs. Three rounds of selected test-level commands illustrate local wall-time differences, but unequal workloads and startup overhead prevent a universal speed ranking. During report preparation, the updated Flutter suite passed 100 cases and the backend suite passed 14 cases. Retained Windows and Android native</w:t>
-      </w:r>
-      <w:r>
-        <w:t xml:space="preserve"> suites each passed 15 cases on 14 and 15 September 2026, respectively. Android release installation and process-restart persistence were verified on the local API 36 emulator. Edge and historical Android CI results retain their revision and platform boundaries. These selected checks do not establish absence of defects or unconditional release readiness. The study concludes that clear oracles, isolated state, complementary execution boundaries and honest interpretation are central to a defensible Flutter te</w:t>
-      </w:r>
-      <w:r>
-        <w:t>sting case study.</w:t>
+        <w:t>dary with ownership checks and revision-based snapshot writes. A deliberate substring-to-prefix search defect is detected by a permanent regression, with authentic baseline, failure and corrected outputs. Three rounds of selected test-level commands illustrate local wall-time differences, but unequal workloads and startup overhead prevent a universal speed ranking. During report preparation, the 19 September Flutter suite passed 104 cases and the backend suite passed 17 cases. Retained Windows and Android n</w:t>
+      </w:r>
+      <w:r>
+        <w:t>ative suites each passed 15 cases on 14 and 15 September 2026, respectively. Android release installation and process-restart persistence were verified on the local API 36 emulator. Edge and historical Android CI results retain their revision and platform boundaries. These selected checks do not establish absence of defects or unconditional release readiness. The study concludes that clear oracles, isolated state, complementary execution boundaries and honest interpretation are central to a defensible Flutt</w:t>
+      </w:r>
+      <w:r>
+        <w:t>er testing case study.</w:t>
       </w:r>
     </w:p>
     <w:p>
@@ -1117,7 +1117,7 @@
       <w:r>
         <w:fldChar w:fldCharType="separate"/>
       </w:r>
-      <w:hyperlink w:anchor="_Toc240394910" w:history="1">
+      <w:hyperlink w:anchor="_Toc240744412" w:history="1">
         <w:r>
           <w:rPr>
             <w:rStyle w:val="Hyperlink"/>
@@ -1144,7 +1144,7 @@
             <w:noProof/>
             <w:webHidden/>
           </w:rPr>
-          <w:instrText xml:space="preserve"> PAGEREF _Toc240394910 \h </w:instrText>
+          <w:instrText xml:space="preserve"> PAGEREF _Toc240744412 \h </w:instrText>
         </w:r>
         <w:r>
           <w:rPr>
@@ -1188,7 +1188,7 @@
           <w14:ligatures w14:val="standardContextual"/>
         </w:rPr>
       </w:pPr>
-      <w:hyperlink w:anchor="_Toc240394911" w:history="1">
+      <w:hyperlink w:anchor="_Toc240744413" w:history="1">
         <w:r>
           <w:rPr>
             <w:rStyle w:val="Hyperlink"/>
@@ -1215,7 +1215,7 @@
             <w:noProof/>
             <w:webHidden/>
           </w:rPr>
-          <w:instrText xml:space="preserve"> PAGEREF _Toc240394911 \h </w:instrText>
+          <w:instrText xml:space="preserve"> PAGEREF _Toc240744413 \h </w:instrText>
         </w:r>
         <w:r>
           <w:rPr>
@@ -1259,7 +1259,7 @@
           <w14:ligatures w14:val="standardContextual"/>
         </w:rPr>
       </w:pPr>
-      <w:hyperlink w:anchor="_Toc240394912" w:history="1">
+      <w:hyperlink w:anchor="_Toc240744414" w:history="1">
         <w:r>
           <w:rPr>
             <w:rStyle w:val="Hyperlink"/>
@@ -1286,7 +1286,7 @@
             <w:noProof/>
             <w:webHidden/>
           </w:rPr>
-          <w:instrText xml:space="preserve"> PAGEREF _Toc240394912 \h </w:instrText>
+          <w:instrText xml:space="preserve"> PAGEREF _Toc240744414 \h </w:instrText>
         </w:r>
         <w:r>
           <w:rPr>
@@ -1330,7 +1330,7 @@
           <w14:ligatures w14:val="standardContextual"/>
         </w:rPr>
       </w:pPr>
-      <w:hyperlink w:anchor="_Toc240394913" w:history="1">
+      <w:hyperlink w:anchor="_Toc240744415" w:history="1">
         <w:r>
           <w:rPr>
             <w:rStyle w:val="Hyperlink"/>
@@ -1357,7 +1357,7 @@
             <w:noProof/>
             <w:webHidden/>
           </w:rPr>
-          <w:instrText xml:space="preserve"> PAGEREF _Toc240394913 \h </w:instrText>
+          <w:instrText xml:space="preserve"> PAGEREF _Toc240744415 \h </w:instrText>
         </w:r>
         <w:r>
           <w:rPr>
@@ -1401,7 +1401,7 @@
           <w14:ligatures w14:val="standardContextual"/>
         </w:rPr>
       </w:pPr>
-      <w:hyperlink w:anchor="_Toc240394914" w:history="1">
+      <w:hyperlink w:anchor="_Toc240744416" w:history="1">
         <w:r>
           <w:rPr>
             <w:rStyle w:val="Hyperlink"/>
@@ -1428,7 +1428,7 @@
             <w:noProof/>
             <w:webHidden/>
           </w:rPr>
-          <w:instrText xml:space="preserve"> PAGEREF _Toc240394914 \h </w:instrText>
+          <w:instrText xml:space="preserve"> PAGEREF _Toc240744416 \h </w:instrText>
         </w:r>
         <w:r>
           <w:rPr>
@@ -1448,7 +1448,7 @@
             <w:noProof/>
             <w:webHidden/>
           </w:rPr>
-          <w:t>2</w:t>
+          <w:t>3</w:t>
         </w:r>
         <w:r>
           <w:rPr>
@@ -1472,7 +1472,7 @@
           <w14:ligatures w14:val="standardContextual"/>
         </w:rPr>
       </w:pPr>
-      <w:hyperlink w:anchor="_Toc240394915" w:history="1">
+      <w:hyperlink w:anchor="_Toc240744417" w:history="1">
         <w:r>
           <w:rPr>
             <w:rStyle w:val="Hyperlink"/>
@@ -1499,7 +1499,7 @@
             <w:noProof/>
             <w:webHidden/>
           </w:rPr>
-          <w:instrText xml:space="preserve"> PAGEREF _Toc240394915 \h </w:instrText>
+          <w:instrText xml:space="preserve"> PAGEREF _Toc240744417 \h </w:instrText>
         </w:r>
         <w:r>
           <w:rPr>
@@ -1543,7 +1543,7 @@
           <w14:ligatures w14:val="standardContextual"/>
         </w:rPr>
       </w:pPr>
-      <w:hyperlink w:anchor="_Toc240394916" w:history="1">
+      <w:hyperlink w:anchor="_Toc240744418" w:history="1">
         <w:r>
           <w:rPr>
             <w:rStyle w:val="Hyperlink"/>
@@ -1570,7 +1570,7 @@
             <w:noProof/>
             <w:webHidden/>
           </w:rPr>
-          <w:instrText xml:space="preserve"> PAGEREF _Toc240394916 \h </w:instrText>
+          <w:instrText xml:space="preserve"> PAGEREF _Toc240744418 \h </w:instrText>
         </w:r>
         <w:r>
           <w:rPr>
@@ -1614,7 +1614,7 @@
           <w14:ligatures w14:val="standardContextual"/>
         </w:rPr>
       </w:pPr>
-      <w:hyperlink w:anchor="_Toc240394917" w:history="1">
+      <w:hyperlink w:anchor="_Toc240744419" w:history="1">
         <w:r>
           <w:rPr>
             <w:rStyle w:val="Hyperlink"/>
@@ -1641,7 +1641,7 @@
             <w:noProof/>
             <w:webHidden/>
           </w:rPr>
-          <w:instrText xml:space="preserve"> PAGEREF _Toc240394917 \h </w:instrText>
+          <w:instrText xml:space="preserve"> PAGEREF _Toc240744419 \h </w:instrText>
         </w:r>
         <w:r>
           <w:rPr>
@@ -1685,7 +1685,7 @@
           <w14:ligatures w14:val="standardContextual"/>
         </w:rPr>
       </w:pPr>
-      <w:hyperlink w:anchor="_Toc240394918" w:history="1">
+      <w:hyperlink w:anchor="_Toc240744420" w:history="1">
         <w:r>
           <w:rPr>
             <w:rStyle w:val="Hyperlink"/>
@@ -1712,7 +1712,7 @@
             <w:noProof/>
             <w:webHidden/>
           </w:rPr>
-          <w:instrText xml:space="preserve"> PAGEREF _Toc240394918 \h </w:instrText>
+          <w:instrText xml:space="preserve"> PAGEREF _Toc240744420 \h </w:instrText>
         </w:r>
         <w:r>
           <w:rPr>
@@ -1756,7 +1756,7 @@
           <w14:ligatures w14:val="standardContextual"/>
         </w:rPr>
       </w:pPr>
-      <w:hyperlink w:anchor="_Toc240394919" w:history="1">
+      <w:hyperlink w:anchor="_Toc240744421" w:history="1">
         <w:r>
           <w:rPr>
             <w:rStyle w:val="Hyperlink"/>
@@ -1783,7 +1783,7 @@
             <w:noProof/>
             <w:webHidden/>
           </w:rPr>
-          <w:instrText xml:space="preserve"> PAGEREF _Toc240394919 \h </w:instrText>
+          <w:instrText xml:space="preserve"> PAGEREF _Toc240744421 \h </w:instrText>
         </w:r>
         <w:r>
           <w:rPr>
@@ -1827,7 +1827,7 @@
           <w14:ligatures w14:val="standardContextual"/>
         </w:rPr>
       </w:pPr>
-      <w:hyperlink w:anchor="_Toc240394920" w:history="1">
+      <w:hyperlink w:anchor="_Toc240744422" w:history="1">
         <w:r>
           <w:rPr>
             <w:rStyle w:val="Hyperlink"/>
@@ -1854,7 +1854,7 @@
             <w:noProof/>
             <w:webHidden/>
           </w:rPr>
-          <w:instrText xml:space="preserve"> PAGEREF _Toc240394920 \h </w:instrText>
+          <w:instrText xml:space="preserve"> PAGEREF _Toc240744422 \h </w:instrText>
         </w:r>
         <w:r>
           <w:rPr>
@@ -1898,7 +1898,7 @@
           <w14:ligatures w14:val="standardContextual"/>
         </w:rPr>
       </w:pPr>
-      <w:hyperlink w:anchor="_Toc240394921" w:history="1">
+      <w:hyperlink w:anchor="_Toc240744423" w:history="1">
         <w:r>
           <w:rPr>
             <w:rStyle w:val="Hyperlink"/>
@@ -1925,7 +1925,7 @@
             <w:noProof/>
             <w:webHidden/>
           </w:rPr>
-          <w:instrText xml:space="preserve"> PAGEREF _Toc240394921 \h </w:instrText>
+          <w:instrText xml:space="preserve"> PAGEREF _Toc240744423 \h </w:instrText>
         </w:r>
         <w:r>
           <w:rPr>
@@ -1969,7 +1969,7 @@
           <w14:ligatures w14:val="standardContextual"/>
         </w:rPr>
       </w:pPr>
-      <w:hyperlink w:anchor="_Toc240394922" w:history="1">
+      <w:hyperlink w:anchor="_Toc240744424" w:history="1">
         <w:r>
           <w:rPr>
             <w:rStyle w:val="Hyperlink"/>
@@ -1996,7 +1996,7 @@
             <w:noProof/>
             <w:webHidden/>
           </w:rPr>
-          <w:instrText xml:space="preserve"> PAGEREF _Toc240394922 \h </w:instrText>
+          <w:instrText xml:space="preserve"> PAGEREF _Toc240744424 \h </w:instrText>
         </w:r>
         <w:r>
           <w:rPr>
@@ -2040,7 +2040,7 @@
           <w14:ligatures w14:val="standardContextual"/>
         </w:rPr>
       </w:pPr>
-      <w:hyperlink w:anchor="_Toc240394923" w:history="1">
+      <w:hyperlink w:anchor="_Toc240744425" w:history="1">
         <w:r>
           <w:rPr>
             <w:rStyle w:val="Hyperlink"/>
@@ -2067,7 +2067,7 @@
             <w:noProof/>
             <w:webHidden/>
           </w:rPr>
-          <w:instrText xml:space="preserve"> PAGEREF _Toc240394923 \h </w:instrText>
+          <w:instrText xml:space="preserve"> PAGEREF _Toc240744425 \h </w:instrText>
         </w:r>
         <w:r>
           <w:rPr>
@@ -2111,7 +2111,7 @@
           <w14:ligatures w14:val="standardContextual"/>
         </w:rPr>
       </w:pPr>
-      <w:hyperlink w:anchor="_Toc240394924" w:history="1">
+      <w:hyperlink w:anchor="_Toc240744426" w:history="1">
         <w:r>
           <w:rPr>
             <w:rStyle w:val="Hyperlink"/>
@@ -2138,7 +2138,7 @@
             <w:noProof/>
             <w:webHidden/>
           </w:rPr>
-          <w:instrText xml:space="preserve"> PAGEREF _Toc240394924 \h </w:instrText>
+          <w:instrText xml:space="preserve"> PAGEREF _Toc240744426 \h </w:instrText>
         </w:r>
         <w:r>
           <w:rPr>
@@ -2182,7 +2182,7 @@
           <w14:ligatures w14:val="standardContextual"/>
         </w:rPr>
       </w:pPr>
-      <w:hyperlink w:anchor="_Toc240394925" w:history="1">
+      <w:hyperlink w:anchor="_Toc240744427" w:history="1">
         <w:r>
           <w:rPr>
             <w:rStyle w:val="Hyperlink"/>
@@ -2209,7 +2209,7 @@
             <w:noProof/>
             <w:webHidden/>
           </w:rPr>
-          <w:instrText xml:space="preserve"> PAGEREF _Toc240394925 \h </w:instrText>
+          <w:instrText xml:space="preserve"> PAGEREF _Toc240744427 \h </w:instrText>
         </w:r>
         <w:r>
           <w:rPr>
@@ -2253,7 +2253,7 @@
           <w14:ligatures w14:val="standardContextual"/>
         </w:rPr>
       </w:pPr>
-      <w:hyperlink w:anchor="_Toc240394926" w:history="1">
+      <w:hyperlink w:anchor="_Toc240744428" w:history="1">
         <w:r>
           <w:rPr>
             <w:rStyle w:val="Hyperlink"/>
@@ -2280,7 +2280,7 @@
             <w:noProof/>
             <w:webHidden/>
           </w:rPr>
-          <w:instrText xml:space="preserve"> PAGEREF _Toc240394926 \h </w:instrText>
+          <w:instrText xml:space="preserve"> PAGEREF _Toc240744428 \h </w:instrText>
         </w:r>
         <w:r>
           <w:rPr>
@@ -2324,7 +2324,7 @@
           <w14:ligatures w14:val="standardContextual"/>
         </w:rPr>
       </w:pPr>
-      <w:hyperlink w:anchor="_Toc240394927" w:history="1">
+      <w:hyperlink w:anchor="_Toc240744429" w:history="1">
         <w:r>
           <w:rPr>
             <w:rStyle w:val="Hyperlink"/>
@@ -2351,7 +2351,7 @@
             <w:noProof/>
             <w:webHidden/>
           </w:rPr>
-          <w:instrText xml:space="preserve"> PAGEREF _Toc240394927 \h </w:instrText>
+          <w:instrText xml:space="preserve"> PAGEREF _Toc240744429 \h </w:instrText>
         </w:r>
         <w:r>
           <w:rPr>
@@ -2395,7 +2395,7 @@
           <w14:ligatures w14:val="standardContextual"/>
         </w:rPr>
       </w:pPr>
-      <w:hyperlink w:anchor="_Toc240394928" w:history="1">
+      <w:hyperlink w:anchor="_Toc240744430" w:history="1">
         <w:r>
           <w:rPr>
             <w:rStyle w:val="Hyperlink"/>
@@ -2422,7 +2422,7 @@
             <w:noProof/>
             <w:webHidden/>
           </w:rPr>
-          <w:instrText xml:space="preserve"> PAGEREF _Toc240394928 \h </w:instrText>
+          <w:instrText xml:space="preserve"> PAGEREF _Toc240744430 \h </w:instrText>
         </w:r>
         <w:r>
           <w:rPr>
@@ -2466,7 +2466,7 @@
           <w14:ligatures w14:val="standardContextual"/>
         </w:rPr>
       </w:pPr>
-      <w:hyperlink w:anchor="_Toc240394929" w:history="1">
+      <w:hyperlink w:anchor="_Toc240744431" w:history="1">
         <w:r>
           <w:rPr>
             <w:rStyle w:val="Hyperlink"/>
@@ -2493,7 +2493,7 @@
             <w:noProof/>
             <w:webHidden/>
           </w:rPr>
-          <w:instrText xml:space="preserve"> PAGEREF _Toc240394929 \h </w:instrText>
+          <w:instrText xml:space="preserve"> PAGEREF _Toc240744431 \h </w:instrText>
         </w:r>
         <w:r>
           <w:rPr>
@@ -2537,7 +2537,7 @@
           <w14:ligatures w14:val="standardContextual"/>
         </w:rPr>
       </w:pPr>
-      <w:hyperlink w:anchor="_Toc240394930" w:history="1">
+      <w:hyperlink w:anchor="_Toc240744432" w:history="1">
         <w:r>
           <w:rPr>
             <w:rStyle w:val="Hyperlink"/>
@@ -2564,7 +2564,7 @@
             <w:noProof/>
             <w:webHidden/>
           </w:rPr>
-          <w:instrText xml:space="preserve"> PAGEREF _Toc240394930 \h </w:instrText>
+          <w:instrText xml:space="preserve"> PAGEREF _Toc240744432 \h </w:instrText>
         </w:r>
         <w:r>
           <w:rPr>
@@ -2608,7 +2608,7 @@
           <w14:ligatures w14:val="standardContextual"/>
         </w:rPr>
       </w:pPr>
-      <w:hyperlink w:anchor="_Toc240394931" w:history="1">
+      <w:hyperlink w:anchor="_Toc240744433" w:history="1">
         <w:r>
           <w:rPr>
             <w:rStyle w:val="Hyperlink"/>
@@ -2635,7 +2635,7 @@
             <w:noProof/>
             <w:webHidden/>
           </w:rPr>
-          <w:instrText xml:space="preserve"> PAGEREF _Toc240394931 \h </w:instrText>
+          <w:instrText xml:space="preserve"> PAGEREF _Toc240744433 \h </w:instrText>
         </w:r>
         <w:r>
           <w:rPr>
@@ -2679,7 +2679,7 @@
           <w14:ligatures w14:val="standardContextual"/>
         </w:rPr>
       </w:pPr>
-      <w:hyperlink w:anchor="_Toc240394932" w:history="1">
+      <w:hyperlink w:anchor="_Toc240744434" w:history="1">
         <w:r>
           <w:rPr>
             <w:rStyle w:val="Hyperlink"/>
@@ -2706,7 +2706,7 @@
             <w:noProof/>
             <w:webHidden/>
           </w:rPr>
-          <w:instrText xml:space="preserve"> PAGEREF _Toc240394932 \h </w:instrText>
+          <w:instrText xml:space="preserve"> PAGEREF _Toc240744434 \h </w:instrText>
         </w:r>
         <w:r>
           <w:rPr>
@@ -2750,7 +2750,7 @@
           <w14:ligatures w14:val="standardContextual"/>
         </w:rPr>
       </w:pPr>
-      <w:hyperlink w:anchor="_Toc240394933" w:history="1">
+      <w:hyperlink w:anchor="_Toc240744435" w:history="1">
         <w:r>
           <w:rPr>
             <w:rStyle w:val="Hyperlink"/>
@@ -2777,7 +2777,7 @@
             <w:noProof/>
             <w:webHidden/>
           </w:rPr>
-          <w:instrText xml:space="preserve"> PAGEREF _Toc240394933 \h </w:instrText>
+          <w:instrText xml:space="preserve"> PAGEREF _Toc240744435 \h </w:instrText>
         </w:r>
         <w:r>
           <w:rPr>
@@ -2821,7 +2821,7 @@
           <w14:ligatures w14:val="standardContextual"/>
         </w:rPr>
       </w:pPr>
-      <w:hyperlink w:anchor="_Toc240394934" w:history="1">
+      <w:hyperlink w:anchor="_Toc240744436" w:history="1">
         <w:r>
           <w:rPr>
             <w:rStyle w:val="Hyperlink"/>
@@ -2848,7 +2848,7 @@
             <w:noProof/>
             <w:webHidden/>
           </w:rPr>
-          <w:instrText xml:space="preserve"> PAGEREF _Toc240394934 \h </w:instrText>
+          <w:instrText xml:space="preserve"> PAGEREF _Toc240744436 \h </w:instrText>
         </w:r>
         <w:r>
           <w:rPr>
@@ -2892,7 +2892,7 @@
           <w14:ligatures w14:val="standardContextual"/>
         </w:rPr>
       </w:pPr>
-      <w:hyperlink w:anchor="_Toc240394935" w:history="1">
+      <w:hyperlink w:anchor="_Toc240744437" w:history="1">
         <w:r>
           <w:rPr>
             <w:rStyle w:val="Hyperlink"/>
@@ -2919,7 +2919,7 @@
             <w:noProof/>
             <w:webHidden/>
           </w:rPr>
-          <w:instrText xml:space="preserve"> PAGEREF _Toc240394935 \h </w:instrText>
+          <w:instrText xml:space="preserve"> PAGEREF _Toc240744437 \h </w:instrText>
         </w:r>
         <w:r>
           <w:rPr>
@@ -2963,7 +2963,7 @@
           <w14:ligatures w14:val="standardContextual"/>
         </w:rPr>
       </w:pPr>
-      <w:hyperlink w:anchor="_Toc240394936" w:history="1">
+      <w:hyperlink w:anchor="_Toc240744438" w:history="1">
         <w:r>
           <w:rPr>
             <w:rStyle w:val="Hyperlink"/>
@@ -2990,7 +2990,7 @@
             <w:noProof/>
             <w:webHidden/>
           </w:rPr>
-          <w:instrText xml:space="preserve"> PAGEREF _Toc240394936 \h </w:instrText>
+          <w:instrText xml:space="preserve"> PAGEREF _Toc240744438 \h </w:instrText>
         </w:r>
         <w:r>
           <w:rPr>
@@ -3034,7 +3034,7 @@
           <w14:ligatures w14:val="standardContextual"/>
         </w:rPr>
       </w:pPr>
-      <w:hyperlink w:anchor="_Toc240394937" w:history="1">
+      <w:hyperlink w:anchor="_Toc240744439" w:history="1">
         <w:r>
           <w:rPr>
             <w:rStyle w:val="Hyperlink"/>
@@ -3061,7 +3061,7 @@
             <w:noProof/>
             <w:webHidden/>
           </w:rPr>
-          <w:instrText xml:space="preserve"> PAGEREF _Toc240394937 \h </w:instrText>
+          <w:instrText xml:space="preserve"> PAGEREF _Toc240744439 \h </w:instrText>
         </w:r>
         <w:r>
           <w:rPr>
@@ -3105,7 +3105,7 @@
           <w14:ligatures w14:val="standardContextual"/>
         </w:rPr>
       </w:pPr>
-      <w:hyperlink w:anchor="_Toc240394938" w:history="1">
+      <w:hyperlink w:anchor="_Toc240744440" w:history="1">
         <w:r>
           <w:rPr>
             <w:rStyle w:val="Hyperlink"/>
@@ -3132,7 +3132,7 @@
             <w:noProof/>
             <w:webHidden/>
           </w:rPr>
-          <w:instrText xml:space="preserve"> PAGEREF _Toc240394938 \h </w:instrText>
+          <w:instrText xml:space="preserve"> PAGEREF _Toc240744440 \h </w:instrText>
         </w:r>
         <w:r>
           <w:rPr>
@@ -3176,7 +3176,7 @@
           <w14:ligatures w14:val="standardContextual"/>
         </w:rPr>
       </w:pPr>
-      <w:hyperlink w:anchor="_Toc240394939" w:history="1">
+      <w:hyperlink w:anchor="_Toc240744441" w:history="1">
         <w:r>
           <w:rPr>
             <w:rStyle w:val="Hyperlink"/>
@@ -3203,7 +3203,7 @@
             <w:noProof/>
             <w:webHidden/>
           </w:rPr>
-          <w:instrText xml:space="preserve"> PAGEREF _Toc240394939 \h </w:instrText>
+          <w:instrText xml:space="preserve"> PAGEREF _Toc240744441 \h </w:instrText>
         </w:r>
         <w:r>
           <w:rPr>
@@ -3247,7 +3247,7 @@
           <w14:ligatures w14:val="standardContextual"/>
         </w:rPr>
       </w:pPr>
-      <w:hyperlink w:anchor="_Toc240394940" w:history="1">
+      <w:hyperlink w:anchor="_Toc240744442" w:history="1">
         <w:r>
           <w:rPr>
             <w:rStyle w:val="Hyperlink"/>
@@ -3274,7 +3274,7 @@
             <w:noProof/>
             <w:webHidden/>
           </w:rPr>
-          <w:instrText xml:space="preserve"> PAGEREF _Toc240394940 \h </w:instrText>
+          <w:instrText xml:space="preserve"> PAGEREF _Toc240744442 \h </w:instrText>
         </w:r>
         <w:r>
           <w:rPr>
@@ -3318,7 +3318,7 @@
           <w14:ligatures w14:val="standardContextual"/>
         </w:rPr>
       </w:pPr>
-      <w:hyperlink w:anchor="_Toc240394941" w:history="1">
+      <w:hyperlink w:anchor="_Toc240744443" w:history="1">
         <w:r>
           <w:rPr>
             <w:rStyle w:val="Hyperlink"/>
@@ -3345,7 +3345,7 @@
             <w:noProof/>
             <w:webHidden/>
           </w:rPr>
-          <w:instrText xml:space="preserve"> PAGEREF _Toc240394941 \h </w:instrText>
+          <w:instrText xml:space="preserve"> PAGEREF _Toc240744443 \h </w:instrText>
         </w:r>
         <w:r>
           <w:rPr>
@@ -3389,7 +3389,7 @@
           <w14:ligatures w14:val="standardContextual"/>
         </w:rPr>
       </w:pPr>
-      <w:hyperlink w:anchor="_Toc240394942" w:history="1">
+      <w:hyperlink w:anchor="_Toc240744444" w:history="1">
         <w:r>
           <w:rPr>
             <w:rStyle w:val="Hyperlink"/>
@@ -3416,7 +3416,7 @@
             <w:noProof/>
             <w:webHidden/>
           </w:rPr>
-          <w:instrText xml:space="preserve"> PAGEREF _Toc240394942 \h </w:instrText>
+          <w:instrText xml:space="preserve"> PAGEREF _Toc240744444 \h </w:instrText>
         </w:r>
         <w:r>
           <w:rPr>
@@ -3460,7 +3460,7 @@
           <w14:ligatures w14:val="standardContextual"/>
         </w:rPr>
       </w:pPr>
-      <w:hyperlink w:anchor="_Toc240394943" w:history="1">
+      <w:hyperlink w:anchor="_Toc240744445" w:history="1">
         <w:r>
           <w:rPr>
             <w:rStyle w:val="Hyperlink"/>
@@ -3487,7 +3487,7 @@
             <w:noProof/>
             <w:webHidden/>
           </w:rPr>
-          <w:instrText xml:space="preserve"> PAGEREF _Toc240394943 \h </w:instrText>
+          <w:instrText xml:space="preserve"> PAGEREF _Toc240744445 \h </w:instrText>
         </w:r>
         <w:r>
           <w:rPr>
@@ -3531,7 +3531,7 @@
           <w14:ligatures w14:val="standardContextual"/>
         </w:rPr>
       </w:pPr>
-      <w:hyperlink w:anchor="_Toc240394944" w:history="1">
+      <w:hyperlink w:anchor="_Toc240744446" w:history="1">
         <w:r>
           <w:rPr>
             <w:rStyle w:val="Hyperlink"/>
@@ -3558,7 +3558,7 @@
             <w:noProof/>
             <w:webHidden/>
           </w:rPr>
-          <w:instrText xml:space="preserve"> PAGEREF _Toc240394944 \h </w:instrText>
+          <w:instrText xml:space="preserve"> PAGEREF _Toc240744446 \h </w:instrText>
         </w:r>
         <w:r>
           <w:rPr>
@@ -3602,7 +3602,7 @@
           <w14:ligatures w14:val="standardContextual"/>
         </w:rPr>
       </w:pPr>
-      <w:hyperlink w:anchor="_Toc240394945" w:history="1">
+      <w:hyperlink w:anchor="_Toc240744447" w:history="1">
         <w:r>
           <w:rPr>
             <w:rStyle w:val="Hyperlink"/>
@@ -3629,7 +3629,7 @@
             <w:noProof/>
             <w:webHidden/>
           </w:rPr>
-          <w:instrText xml:space="preserve"> PAGEREF _Toc240394945 \h </w:instrText>
+          <w:instrText xml:space="preserve"> PAGEREF _Toc240744447 \h </w:instrText>
         </w:r>
         <w:r>
           <w:rPr>
@@ -3673,7 +3673,7 @@
           <w14:ligatures w14:val="standardContextual"/>
         </w:rPr>
       </w:pPr>
-      <w:hyperlink w:anchor="_Toc240394946" w:history="1">
+      <w:hyperlink w:anchor="_Toc240744448" w:history="1">
         <w:r>
           <w:rPr>
             <w:rStyle w:val="Hyperlink"/>
@@ -3700,7 +3700,7 @@
             <w:noProof/>
             <w:webHidden/>
           </w:rPr>
-          <w:instrText xml:space="preserve"> PAGEREF _Toc240394946 \h </w:instrText>
+          <w:instrText xml:space="preserve"> PAGEREF _Toc240744448 \h </w:instrText>
         </w:r>
         <w:r>
           <w:rPr>
@@ -3744,7 +3744,7 @@
           <w14:ligatures w14:val="standardContextual"/>
         </w:rPr>
       </w:pPr>
-      <w:hyperlink w:anchor="_Toc240394947" w:history="1">
+      <w:hyperlink w:anchor="_Toc240744449" w:history="1">
         <w:r>
           <w:rPr>
             <w:rStyle w:val="Hyperlink"/>
@@ -3771,7 +3771,7 @@
             <w:noProof/>
             <w:webHidden/>
           </w:rPr>
-          <w:instrText xml:space="preserve"> PAGEREF _Toc240394947 \h </w:instrText>
+          <w:instrText xml:space="preserve"> PAGEREF _Toc240744449 \h </w:instrText>
         </w:r>
         <w:r>
           <w:rPr>
@@ -3815,7 +3815,7 @@
           <w14:ligatures w14:val="standardContextual"/>
         </w:rPr>
       </w:pPr>
-      <w:hyperlink w:anchor="_Toc240394948" w:history="1">
+      <w:hyperlink w:anchor="_Toc240744450" w:history="1">
         <w:r>
           <w:rPr>
             <w:rStyle w:val="Hyperlink"/>
@@ -3842,7 +3842,7 @@
             <w:noProof/>
             <w:webHidden/>
           </w:rPr>
-          <w:instrText xml:space="preserve"> PAGEREF _Toc240394948 \h </w:instrText>
+          <w:instrText xml:space="preserve"> PAGEREF _Toc240744450 \h </w:instrText>
         </w:r>
         <w:r>
           <w:rPr>
@@ -3886,7 +3886,7 @@
           <w14:ligatures w14:val="standardContextual"/>
         </w:rPr>
       </w:pPr>
-      <w:hyperlink w:anchor="_Toc240394949" w:history="1">
+      <w:hyperlink w:anchor="_Toc240744451" w:history="1">
         <w:r>
           <w:rPr>
             <w:rStyle w:val="Hyperlink"/>
@@ -3913,7 +3913,7 @@
             <w:noProof/>
             <w:webHidden/>
           </w:rPr>
-          <w:instrText xml:space="preserve"> PAGEREF _Toc240394949 \h </w:instrText>
+          <w:instrText xml:space="preserve"> PAGEREF _Toc240744451 \h </w:instrText>
         </w:r>
         <w:r>
           <w:rPr>
@@ -3933,7 +3933,7 @@
             <w:noProof/>
             <w:webHidden/>
           </w:rPr>
-          <w:t>29</w:t>
+          <w:t>30</w:t>
         </w:r>
         <w:r>
           <w:rPr>
@@ -3957,7 +3957,7 @@
           <w14:ligatures w14:val="standardContextual"/>
         </w:rPr>
       </w:pPr>
-      <w:hyperlink w:anchor="_Toc240394950" w:history="1">
+      <w:hyperlink w:anchor="_Toc240744452" w:history="1">
         <w:r>
           <w:rPr>
             <w:rStyle w:val="Hyperlink"/>
@@ -3984,7 +3984,7 @@
             <w:noProof/>
             <w:webHidden/>
           </w:rPr>
-          <w:instrText xml:space="preserve"> PAGEREF _Toc240394950 \h </w:instrText>
+          <w:instrText xml:space="preserve"> PAGEREF _Toc240744452 \h </w:instrText>
         </w:r>
         <w:r>
           <w:rPr>
@@ -4028,7 +4028,7 @@
           <w14:ligatures w14:val="standardContextual"/>
         </w:rPr>
       </w:pPr>
-      <w:hyperlink w:anchor="_Toc240394951" w:history="1">
+      <w:hyperlink w:anchor="_Toc240744453" w:history="1">
         <w:r>
           <w:rPr>
             <w:rStyle w:val="Hyperlink"/>
@@ -4055,7 +4055,7 @@
             <w:noProof/>
             <w:webHidden/>
           </w:rPr>
-          <w:instrText xml:space="preserve"> PAGEREF _Toc240394951 \h </w:instrText>
+          <w:instrText xml:space="preserve"> PAGEREF _Toc240744453 \h </w:instrText>
         </w:r>
         <w:r>
           <w:rPr>
@@ -4099,7 +4099,7 @@
           <w14:ligatures w14:val="standardContextual"/>
         </w:rPr>
       </w:pPr>
-      <w:hyperlink w:anchor="_Toc240394952" w:history="1">
+      <w:hyperlink w:anchor="_Toc240744454" w:history="1">
         <w:r>
           <w:rPr>
             <w:rStyle w:val="Hyperlink"/>
@@ -4126,7 +4126,7 @@
             <w:noProof/>
             <w:webHidden/>
           </w:rPr>
-          <w:instrText xml:space="preserve"> PAGEREF _Toc240394952 \h </w:instrText>
+          <w:instrText xml:space="preserve"> PAGEREF _Toc240744454 \h </w:instrText>
         </w:r>
         <w:r>
           <w:rPr>
@@ -4170,7 +4170,7 @@
           <w14:ligatures w14:val="standardContextual"/>
         </w:rPr>
       </w:pPr>
-      <w:hyperlink w:anchor="_Toc240394953" w:history="1">
+      <w:hyperlink w:anchor="_Toc240744455" w:history="1">
         <w:r>
           <w:rPr>
             <w:rStyle w:val="Hyperlink"/>
@@ -4197,7 +4197,7 @@
             <w:noProof/>
             <w:webHidden/>
           </w:rPr>
-          <w:instrText xml:space="preserve"> PAGEREF _Toc240394953 \h </w:instrText>
+          <w:instrText xml:space="preserve"> PAGEREF _Toc240744455 \h </w:instrText>
         </w:r>
         <w:r>
           <w:rPr>
@@ -4241,7 +4241,7 @@
           <w14:ligatures w14:val="standardContextual"/>
         </w:rPr>
       </w:pPr>
-      <w:hyperlink w:anchor="_Toc240394954" w:history="1">
+      <w:hyperlink w:anchor="_Toc240744456" w:history="1">
         <w:r>
           <w:rPr>
             <w:rStyle w:val="Hyperlink"/>
@@ -4268,7 +4268,7 @@
             <w:noProof/>
             <w:webHidden/>
           </w:rPr>
-          <w:instrText xml:space="preserve"> PAGEREF _Toc240394954 \h </w:instrText>
+          <w:instrText xml:space="preserve"> PAGEREF _Toc240744456 \h </w:instrText>
         </w:r>
         <w:r>
           <w:rPr>
@@ -4312,7 +4312,7 @@
           <w14:ligatures w14:val="standardContextual"/>
         </w:rPr>
       </w:pPr>
-      <w:hyperlink w:anchor="_Toc240394955" w:history="1">
+      <w:hyperlink w:anchor="_Toc240744457" w:history="1">
         <w:r>
           <w:rPr>
             <w:rStyle w:val="Hyperlink"/>
@@ -4339,7 +4339,7 @@
             <w:noProof/>
             <w:webHidden/>
           </w:rPr>
-          <w:instrText xml:space="preserve"> PAGEREF _Toc240394955 \h </w:instrText>
+          <w:instrText xml:space="preserve"> PAGEREF _Toc240744457 \h </w:instrText>
         </w:r>
         <w:r>
           <w:rPr>
@@ -4383,7 +4383,7 @@
           <w14:ligatures w14:val="standardContextual"/>
         </w:rPr>
       </w:pPr>
-      <w:hyperlink w:anchor="_Toc240394956" w:history="1">
+      <w:hyperlink w:anchor="_Toc240744458" w:history="1">
         <w:r>
           <w:rPr>
             <w:rStyle w:val="Hyperlink"/>
@@ -4410,7 +4410,7 @@
             <w:noProof/>
             <w:webHidden/>
           </w:rPr>
-          <w:instrText xml:space="preserve"> PAGEREF _Toc240394956 \h </w:instrText>
+          <w:instrText xml:space="preserve"> PAGEREF _Toc240744458 \h </w:instrText>
         </w:r>
         <w:r>
           <w:rPr>
@@ -4454,7 +4454,7 @@
           <w14:ligatures w14:val="standardContextual"/>
         </w:rPr>
       </w:pPr>
-      <w:hyperlink w:anchor="_Toc240394957" w:history="1">
+      <w:hyperlink w:anchor="_Toc240744459" w:history="1">
         <w:r>
           <w:rPr>
             <w:rStyle w:val="Hyperlink"/>
@@ -4481,7 +4481,7 @@
             <w:noProof/>
             <w:webHidden/>
           </w:rPr>
-          <w:instrText xml:space="preserve"> PAGEREF _Toc240394957 \h </w:instrText>
+          <w:instrText xml:space="preserve"> PAGEREF _Toc240744459 \h </w:instrText>
         </w:r>
         <w:r>
           <w:rPr>
@@ -4525,7 +4525,7 @@
           <w14:ligatures w14:val="standardContextual"/>
         </w:rPr>
       </w:pPr>
-      <w:hyperlink w:anchor="_Toc240394958" w:history="1">
+      <w:hyperlink w:anchor="_Toc240744460" w:history="1">
         <w:r>
           <w:rPr>
             <w:rStyle w:val="Hyperlink"/>
@@ -4552,7 +4552,7 @@
             <w:noProof/>
             <w:webHidden/>
           </w:rPr>
-          <w:instrText xml:space="preserve"> PAGEREF _Toc240394958 \h </w:instrText>
+          <w:instrText xml:space="preserve"> PAGEREF _Toc240744460 \h </w:instrText>
         </w:r>
         <w:r>
           <w:rPr>
@@ -4623,7 +4623,7 @@
       <w:r>
         <w:fldChar w:fldCharType="separate"/>
       </w:r>
-      <w:hyperlink w:anchor="_Toc240394959" w:history="1">
+      <w:hyperlink w:anchor="_Toc240744461" w:history="1">
         <w:r>
           <w:rPr>
             <w:rStyle w:val="Hyperlink"/>
@@ -4650,7 +4650,7 @@
             <w:noProof/>
             <w:webHidden/>
           </w:rPr>
-          <w:instrText xml:space="preserve"> PAGEREF _Toc240394959 \h </w:instrText>
+          <w:instrText xml:space="preserve"> PAGEREF _Toc240744461 \h </w:instrText>
         </w:r>
         <w:r>
           <w:rPr>
@@ -4694,7 +4694,7 @@
           <w14:ligatures w14:val="standardContextual"/>
         </w:rPr>
       </w:pPr>
-      <w:hyperlink w:anchor="_Toc240394960" w:history="1">
+      <w:hyperlink w:anchor="_Toc240744462" w:history="1">
         <w:r>
           <w:rPr>
             <w:rStyle w:val="Hyperlink"/>
@@ -4721,7 +4721,7 @@
             <w:noProof/>
             <w:webHidden/>
           </w:rPr>
-          <w:instrText xml:space="preserve"> PAGEREF _Toc240394960 \h </w:instrText>
+          <w:instrText xml:space="preserve"> PAGEREF _Toc240744462 \h </w:instrText>
         </w:r>
         <w:r>
           <w:rPr>
@@ -4765,7 +4765,7 @@
           <w14:ligatures w14:val="standardContextual"/>
         </w:rPr>
       </w:pPr>
-      <w:hyperlink w:anchor="_Toc240394961" w:history="1">
+      <w:hyperlink w:anchor="_Toc240744463" w:history="1">
         <w:r>
           <w:rPr>
             <w:rStyle w:val="Hyperlink"/>
@@ -4792,7 +4792,7 @@
             <w:noProof/>
             <w:webHidden/>
           </w:rPr>
-          <w:instrText xml:space="preserve"> PAGEREF _Toc240394961 \h </w:instrText>
+          <w:instrText xml:space="preserve"> PAGEREF _Toc240744463 \h </w:instrText>
         </w:r>
         <w:r>
           <w:rPr>
@@ -4836,7 +4836,7 @@
           <w14:ligatures w14:val="standardContextual"/>
         </w:rPr>
       </w:pPr>
-      <w:hyperlink w:anchor="_Toc240394962" w:history="1">
+      <w:hyperlink w:anchor="_Toc240744464" w:history="1">
         <w:r>
           <w:rPr>
             <w:rStyle w:val="Hyperlink"/>
@@ -4863,7 +4863,7 @@
             <w:noProof/>
             <w:webHidden/>
           </w:rPr>
-          <w:instrText xml:space="preserve"> PAGEREF _Toc240394962 \h </w:instrText>
+          <w:instrText xml:space="preserve"> PAGEREF _Toc240744464 \h </w:instrText>
         </w:r>
         <w:r>
           <w:rPr>
@@ -4907,7 +4907,7 @@
           <w14:ligatures w14:val="standardContextual"/>
         </w:rPr>
       </w:pPr>
-      <w:hyperlink w:anchor="_Toc240394963" w:history="1">
+      <w:hyperlink w:anchor="_Toc240744465" w:history="1">
         <w:r>
           <w:rPr>
             <w:rStyle w:val="Hyperlink"/>
@@ -4934,7 +4934,7 @@
             <w:noProof/>
             <w:webHidden/>
           </w:rPr>
-          <w:instrText xml:space="preserve"> PAGEREF _Toc240394963 \h </w:instrText>
+          <w:instrText xml:space="preserve"> PAGEREF _Toc240744465 \h </w:instrText>
         </w:r>
         <w:r>
           <w:rPr>
@@ -5000,7 +5000,7 @@
       <w:r>
         <w:fldChar w:fldCharType="separate"/>
       </w:r>
-      <w:hyperlink w:anchor="_Toc240394964" w:history="1">
+      <w:hyperlink w:anchor="_Toc240744466" w:history="1">
         <w:r>
           <w:rPr>
             <w:rStyle w:val="Hyperlink"/>
@@ -5027,7 +5027,7 @@
             <w:noProof/>
             <w:webHidden/>
           </w:rPr>
-          <w:instrText xml:space="preserve"> PAGEREF _Toc240394964 \h </w:instrText>
+          <w:instrText xml:space="preserve"> PAGEREF _Toc240744466 \h </w:instrText>
         </w:r>
         <w:r>
           <w:rPr>
@@ -5071,7 +5071,7 @@
           <w14:ligatures w14:val="standardContextual"/>
         </w:rPr>
       </w:pPr>
-      <w:hyperlink w:anchor="_Toc240394965" w:history="1">
+      <w:hyperlink w:anchor="_Toc240744467" w:history="1">
         <w:r>
           <w:rPr>
             <w:rStyle w:val="Hyperlink"/>
@@ -5098,7 +5098,7 @@
             <w:noProof/>
             <w:webHidden/>
           </w:rPr>
-          <w:instrText xml:space="preserve"> PAGEREF _Toc240394965 \h </w:instrText>
+          <w:instrText xml:space="preserve"> PAGEREF _Toc240744467 \h </w:instrText>
         </w:r>
         <w:r>
           <w:rPr>
@@ -5142,7 +5142,7 @@
           <w14:ligatures w14:val="standardContextual"/>
         </w:rPr>
       </w:pPr>
-      <w:hyperlink w:anchor="_Toc240394966" w:history="1">
+      <w:hyperlink w:anchor="_Toc240744468" w:history="1">
         <w:r>
           <w:rPr>
             <w:rStyle w:val="Hyperlink"/>
@@ -5169,7 +5169,7 @@
             <w:noProof/>
             <w:webHidden/>
           </w:rPr>
-          <w:instrText xml:space="preserve"> PAGEREF _Toc240394966 \h </w:instrText>
+          <w:instrText xml:space="preserve"> PAGEREF _Toc240744468 \h </w:instrText>
         </w:r>
         <w:r>
           <w:rPr>
@@ -5213,7 +5213,7 @@
           <w14:ligatures w14:val="standardContextual"/>
         </w:rPr>
       </w:pPr>
-      <w:hyperlink w:anchor="_Toc240394967" w:history="1">
+      <w:hyperlink w:anchor="_Toc240744469" w:history="1">
         <w:r>
           <w:rPr>
             <w:rStyle w:val="Hyperlink"/>
@@ -5240,7 +5240,7 @@
             <w:noProof/>
             <w:webHidden/>
           </w:rPr>
-          <w:instrText xml:space="preserve"> PAGEREF _Toc240394967 \h </w:instrText>
+          <w:instrText xml:space="preserve"> PAGEREF _Toc240744469 \h </w:instrText>
         </w:r>
         <w:r>
           <w:rPr>
@@ -5284,7 +5284,7 @@
           <w14:ligatures w14:val="standardContextual"/>
         </w:rPr>
       </w:pPr>
-      <w:hyperlink w:anchor="_Toc240394968" w:history="1">
+      <w:hyperlink w:anchor="_Toc240744470" w:history="1">
         <w:r>
           <w:rPr>
             <w:rStyle w:val="Hyperlink"/>
@@ -5311,7 +5311,7 @@
             <w:noProof/>
             <w:webHidden/>
           </w:rPr>
-          <w:instrText xml:space="preserve"> PAGEREF _Toc240394968 \h </w:instrText>
+          <w:instrText xml:space="preserve"> PAGEREF _Toc240744470 \h </w:instrText>
         </w:r>
         <w:r>
           <w:rPr>
@@ -5355,7 +5355,7 @@
           <w14:ligatures w14:val="standardContextual"/>
         </w:rPr>
       </w:pPr>
-      <w:hyperlink w:anchor="_Toc240394969" w:history="1">
+      <w:hyperlink w:anchor="_Toc240744471" w:history="1">
         <w:r>
           <w:rPr>
             <w:rStyle w:val="Hyperlink"/>
@@ -5382,7 +5382,7 @@
             <w:noProof/>
             <w:webHidden/>
           </w:rPr>
-          <w:instrText xml:space="preserve"> PAGEREF _Toc240394969 \h </w:instrText>
+          <w:instrText xml:space="preserve"> PAGEREF _Toc240744471 \h </w:instrText>
         </w:r>
         <w:r>
           <w:rPr>
@@ -5402,7 +5402,7 @@
             <w:noProof/>
             <w:webHidden/>
           </w:rPr>
-          <w:t>27</w:t>
+          <w:t>28</w:t>
         </w:r>
         <w:r>
           <w:rPr>
@@ -5426,7 +5426,7 @@
           <w14:ligatures w14:val="standardContextual"/>
         </w:rPr>
       </w:pPr>
-      <w:hyperlink w:anchor="_Toc240394970" w:history="1">
+      <w:hyperlink w:anchor="_Toc240744472" w:history="1">
         <w:r>
           <w:rPr>
             <w:rStyle w:val="Hyperlink"/>
@@ -5453,7 +5453,7 @@
             <w:noProof/>
             <w:webHidden/>
           </w:rPr>
-          <w:instrText xml:space="preserve"> PAGEREF _Toc240394970 \h </w:instrText>
+          <w:instrText xml:space="preserve"> PAGEREF _Toc240744472 \h </w:instrText>
         </w:r>
         <w:r>
           <w:rPr>
@@ -5497,7 +5497,7 @@
           <w14:ligatures w14:val="standardContextual"/>
         </w:rPr>
       </w:pPr>
-      <w:hyperlink w:anchor="_Toc240394971" w:history="1">
+      <w:hyperlink w:anchor="_Toc240744473" w:history="1">
         <w:r>
           <w:rPr>
             <w:rStyle w:val="Hyperlink"/>
@@ -5524,7 +5524,7 @@
             <w:noProof/>
             <w:webHidden/>
           </w:rPr>
-          <w:instrText xml:space="preserve"> PAGEREF _Toc240394971 \h </w:instrText>
+          <w:instrText xml:space="preserve"> PAGEREF _Toc240744473 \h </w:instrText>
         </w:r>
         <w:r>
           <w:rPr>
@@ -5578,7 +5578,7 @@
         <w:pStyle w:val="Heading1"/>
         <w:pageBreakBefore w:val="0"/>
       </w:pPr>
-      <w:bookmarkStart w:id="0" w:name="_Toc240394910"/>
+      <w:bookmarkStart w:id="0" w:name="_Toc240744412"/>
       <w:r>
         <w:lastRenderedPageBreak/>
         <w:t>1 Introduction</w:t>
@@ -5589,7 +5589,7 @@
       <w:pPr>
         <w:pStyle w:val="Heading2"/>
       </w:pPr>
-      <w:bookmarkStart w:id="1" w:name="_Toc240394911"/>
+      <w:bookmarkStart w:id="1" w:name="_Toc240744413"/>
       <w:r>
         <w:t>1.1 Problem and motivation</w:t>
       </w:r>
@@ -5626,7 +5626,7 @@
       <w:pPr>
         <w:pStyle w:val="Heading2"/>
       </w:pPr>
-      <w:bookmarkStart w:id="2" w:name="_Toc240394912"/>
+      <w:bookmarkStart w:id="2" w:name="_Toc240744414"/>
       <w:r>
         <w:t>1.2 Objectives and research questions</w:t>
       </w:r>
@@ -5664,7 +5664,7 @@
       <w:pPr>
         <w:pStyle w:val="Heading2"/>
       </w:pPr>
-      <w:bookmarkStart w:id="3" w:name="_Toc240394913"/>
+      <w:bookmarkStart w:id="3" w:name="_Toc240744415"/>
       <w:r>
         <w:t>1.3 Scope and evaluation boundary</w:t>
       </w:r>
@@ -5691,15 +5691,16 @@
         <w:pStyle w:val="ReportBody"/>
       </w:pPr>
       <w:r>
-        <w:t>The evaluated source is commit 3e4f733 on branch main-test, containing the verified draft-consistency and platform updates. The 15 September review repeated 100 Flutter cases and 14 backend cases. Native suites passed 15 cases on Windows on 14 September and 15 cases on Android on 15 September. Earlier Edge and hosted Android results retain their original dates and revisions. This manuscript describes the corrected implementation within these verification boundaries.</w:t>
+        <w:t>The evaluated source starts from commit 06d3790 on branch main-test, with the local snapshot-capacity correction recorded on 19 September. That review passed 104 Flutter cases and 17 backend cases. Native suites previously passed 15 cases on Windows on 14 September and 15 cases on Android on 15 September. Earlier Edge and hosted Android results retain their original dates and revisions. This manuscript distinguishes the updated local verification from historical platform evidence.</w:t>
       </w:r>
     </w:p>
     <w:p>
       <w:pPr>
         <w:pStyle w:val="Heading2"/>
       </w:pPr>
-      <w:bookmarkStart w:id="4" w:name="_Toc240394914"/>
-      <w:r>
+      <w:bookmarkStart w:id="4" w:name="_Toc240744416"/>
+      <w:r>
+        <w:lastRenderedPageBreak/>
         <w:t>1.4 Research and evidence method</w:t>
       </w:r>
       <w:bookmarkEnd w:id="4"/>
@@ -5709,11 +5710,7 @@
         <w:pStyle w:val="ReportBody"/>
       </w:pPr>
       <w:r>
-        <w:t xml:space="preserve">The technical explanation combines official framework documentation with a source-level examination of TaskFlow. Documentation establishes API behavior; </w:t>
-      </w:r>
-      <w:r>
-        <w:lastRenderedPageBreak/>
-        <w:t>project code establishes how that behavior is used here. Tests establish only the observations asserted under their recorded conditions. The study therefore avoids inferring a real Android run from a golden test configured with an Android rendering variant, or inferring an operating-system restart from a widget remount.</w:t>
+        <w:t>The technical explanation combines official framework documentation with a source-level examination of TaskFlow. Documentation establishes API behavior; project code establishes how that behavior is used here. Tests establish only the observations asserted under their recorded conditions. The study therefore avoids inferring a real Android run from a golden test configured with an Android rendering variant, or inferring an operating-system restart from a widget remount.</w:t>
       </w:r>
     </w:p>
     <w:p>
@@ -5728,7 +5725,7 @@
       <w:pPr>
         <w:pStyle w:val="Heading2"/>
       </w:pPr>
-      <w:bookmarkStart w:id="5" w:name="_Toc240394915"/>
+      <w:bookmarkStart w:id="5" w:name="_Toc240744417"/>
       <w:r>
         <w:t>1.5 Report organization</w:t>
       </w:r>
@@ -5749,7 +5746,7 @@
       <w:pPr>
         <w:pStyle w:val="Heading1"/>
       </w:pPr>
-      <w:bookmarkStart w:id="6" w:name="_Toc240394916"/>
+      <w:bookmarkStart w:id="6" w:name="_Toc240744418"/>
       <w:r>
         <w:lastRenderedPageBreak/>
         <w:t>2 Testing foundations and comparative analysis</w:t>
@@ -5760,7 +5757,7 @@
       <w:pPr>
         <w:pStyle w:val="Heading2"/>
       </w:pPr>
-      <w:bookmarkStart w:id="7" w:name="_Toc240394917"/>
+      <w:bookmarkStart w:id="7" w:name="_Toc240744419"/>
       <w:r>
         <w:t>2.1 Different tests answer different questions</w:t>
       </w:r>
@@ -5804,7 +5801,7 @@
         </w:rPr>
         <w:lastRenderedPageBreak/>
         <w:drawing>
-          <wp:inline distT="0" distB="0" distL="0" distR="0" wp14:anchorId="31894A16" wp14:editId="7AEC0668">
+          <wp:inline distT="0" distB="0" distL="0" distR="0" wp14:anchorId="42B3B87D" wp14:editId="03B97E56">
             <wp:extent cx="5472000" cy="2110629"/>
             <wp:effectExtent l="0" t="0" r="0" b="0"/>
             <wp:docPr id="1" name="Picture 1" descr="Figure 2.1 Testing layers and their TaskFlow evidence boundaries"/>
@@ -5844,7 +5841,7 @@
       <w:pPr>
         <w:pStyle w:val="ReportFigure"/>
       </w:pPr>
-      <w:bookmarkStart w:id="8" w:name="_Toc240394959"/>
+      <w:bookmarkStart w:id="8" w:name="_Toc240744461"/>
       <w:r>
         <w:t>Figure 2.1 Testing layers and their TaskFlow evidence boundaries</w:t>
       </w:r>
@@ -5854,7 +5851,7 @@
       <w:pPr>
         <w:pStyle w:val="Heading2"/>
       </w:pPr>
-      <w:bookmarkStart w:id="9" w:name="_Toc240394918"/>
+      <w:bookmarkStart w:id="9" w:name="_Toc240744420"/>
       <w:r>
         <w:t>2.2 Binding and frame scheduling</w:t>
       </w:r>
@@ -5895,7 +5892,7 @@
       <w:pPr>
         <w:pStyle w:val="Heading2"/>
       </w:pPr>
-      <w:bookmarkStart w:id="10" w:name="_Toc240394919"/>
+      <w:bookmarkStart w:id="10" w:name="_Toc240744421"/>
       <w:r>
         <w:t>2.3 Settling and bounded waiting</w:t>
       </w:r>
@@ -5929,7 +5926,7 @@
       <w:pPr>
         <w:pStyle w:val="Heading2"/>
       </w:pPr>
-      <w:bookmarkStart w:id="11" w:name="_Toc240394920"/>
+      <w:bookmarkStart w:id="11" w:name="_Toc240744422"/>
       <w:r>
         <w:t>2.4 Finders and meaningful assertions</w:t>
       </w:r>
@@ -5964,7 +5961,7 @@
       <w:pPr>
         <w:pStyle w:val="Heading2"/>
       </w:pPr>
-      <w:bookmarkStart w:id="12" w:name="_Toc240394921"/>
+      <w:bookmarkStart w:id="12" w:name="_Toc240744423"/>
       <w:r>
         <w:t>2.5 Fakes and dependency injection</w:t>
       </w:r>
@@ -6005,7 +6002,7 @@
       <w:pPr>
         <w:pStyle w:val="Heading2"/>
       </w:pPr>
-      <w:bookmarkStart w:id="13" w:name="_Toc240394922"/>
+      <w:bookmarkStart w:id="13" w:name="_Toc240744424"/>
       <w:r>
         <w:t>2.6 Golden tests and visual change control</w:t>
       </w:r>
@@ -6039,7 +6036,7 @@
       <w:pPr>
         <w:pStyle w:val="Heading2"/>
       </w:pPr>
-      <w:bookmarkStart w:id="14" w:name="_Toc240394923"/>
+      <w:bookmarkStart w:id="14" w:name="_Toc240744425"/>
       <w:r>
         <w:t>2.7 Native integration and browser automation</w:t>
       </w:r>
@@ -6088,7 +6085,7 @@
       <w:pPr>
         <w:pStyle w:val="ReportTableCaption"/>
       </w:pPr>
-      <w:bookmarkStart w:id="15" w:name="_Toc240394964"/>
+      <w:bookmarkStart w:id="15" w:name="_Toc240744466"/>
       <w:r>
         <w:t>Table 2.1 Test selection for TaskFlow risks</w:t>
       </w:r>
@@ -6495,7 +6492,7 @@
       <w:pPr>
         <w:pStyle w:val="Heading1"/>
       </w:pPr>
-      <w:bookmarkStart w:id="16" w:name="_Toc240394924"/>
+      <w:bookmarkStart w:id="16" w:name="_Toc240744426"/>
       <w:r>
         <w:lastRenderedPageBreak/>
         <w:t>3 Requirements and risk analysis</w:t>
@@ -6506,7 +6503,7 @@
       <w:pPr>
         <w:pStyle w:val="Heading2"/>
       </w:pPr>
-      <w:bookmarkStart w:id="17" w:name="_Toc240394925"/>
+      <w:bookmarkStart w:id="17" w:name="_Toc240744427"/>
       <w:r>
         <w:t>3.1 Actors and workspace modes</w:t>
       </w:r>
@@ -6540,7 +6537,7 @@
       <w:pPr>
         <w:pStyle w:val="Heading2"/>
       </w:pPr>
-      <w:bookmarkStart w:id="18" w:name="_Toc240394926"/>
+      <w:bookmarkStart w:id="18" w:name="_Toc240744428"/>
       <w:r>
         <w:t>3.2 Functional requirements and acceptance conditions</w:t>
       </w:r>
@@ -6567,7 +6564,7 @@
       <w:pPr>
         <w:pStyle w:val="ReportTableCaption"/>
       </w:pPr>
-      <w:bookmarkStart w:id="19" w:name="_Toc240394965"/>
+      <w:bookmarkStart w:id="19" w:name="_Toc240744467"/>
       <w:r>
         <w:t>Table 3.1 Functional acceptance matrix</w:t>
       </w:r>
@@ -7080,7 +7077,7 @@
       <w:pPr>
         <w:pStyle w:val="Heading2"/>
       </w:pPr>
-      <w:bookmarkStart w:id="20" w:name="_Toc240394927"/>
+      <w:bookmarkStart w:id="20" w:name="_Toc240744429"/>
       <w:r>
         <w:t>3.3 Nonfunctional requirements</w:t>
       </w:r>
@@ -7115,7 +7112,7 @@
       <w:pPr>
         <w:pStyle w:val="Heading2"/>
       </w:pPr>
-      <w:bookmarkStart w:id="21" w:name="_Toc240394928"/>
+      <w:bookmarkStart w:id="21" w:name="_Toc240744430"/>
       <w:r>
         <w:t>3.4 Risk priorities</w:t>
       </w:r>
@@ -7144,7 +7141,7 @@
       <w:pPr>
         <w:pStyle w:val="ReportTableCaption"/>
       </w:pPr>
-      <w:bookmarkStart w:id="22" w:name="_Toc240394966"/>
+      <w:bookmarkStart w:id="22" w:name="_Toc240744468"/>
       <w:r>
         <w:t>Table 3.2 Risk controls and remaining evidence gaps</w:t>
       </w:r>
@@ -7552,7 +7549,7 @@
       <w:pPr>
         <w:pStyle w:val="Heading2"/>
       </w:pPr>
-      <w:bookmarkStart w:id="23" w:name="_Toc240394929"/>
+      <w:bookmarkStart w:id="23" w:name="_Toc240744431"/>
       <w:r>
         <w:t>3.5 Investigation boundaries</w:t>
       </w:r>
@@ -7578,7 +7575,7 @@
       <w:pPr>
         <w:pStyle w:val="Heading1"/>
       </w:pPr>
-      <w:bookmarkStart w:id="24" w:name="_Toc240394930"/>
+      <w:bookmarkStart w:id="24" w:name="_Toc240744432"/>
       <w:r>
         <w:lastRenderedPageBreak/>
         <w:t>4 System design</w:t>
@@ -7589,7 +7586,7 @@
       <w:pPr>
         <w:pStyle w:val="Heading2"/>
       </w:pPr>
-      <w:bookmarkStart w:id="25" w:name="_Toc240394931"/>
+      <w:bookmarkStart w:id="25" w:name="_Toc240744433"/>
       <w:r>
         <w:t>4.1 Architecture and dependency direction</w:t>
       </w:r>
@@ -7624,7 +7621,7 @@
           <w:noProof/>
         </w:rPr>
         <w:drawing>
-          <wp:inline distT="0" distB="0" distL="0" distR="0" wp14:anchorId="4BBEAA82" wp14:editId="6CA01843">
+          <wp:inline distT="0" distB="0" distL="0" distR="0" wp14:anchorId="7E30646F" wp14:editId="2189E332">
             <wp:extent cx="5472000" cy="2970514"/>
             <wp:effectExtent l="0" t="0" r="0" b="0"/>
             <wp:docPr id="2" name="Picture 2" descr="Figure 4.1 Dependency boundaries and the three repository modes"/>
@@ -7664,7 +7661,7 @@
       <w:pPr>
         <w:pStyle w:val="ReportFigure"/>
       </w:pPr>
-      <w:bookmarkStart w:id="26" w:name="_Toc240394960"/>
+      <w:bookmarkStart w:id="26" w:name="_Toc240744462"/>
       <w:r>
         <w:t>Figure 4.1 Dependency boundaries and the three repository modes</w:t>
       </w:r>
@@ -7694,7 +7691,7 @@
       <w:pPr>
         <w:pStyle w:val="Heading2"/>
       </w:pPr>
-      <w:bookmarkStart w:id="27" w:name="_Toc240394932"/>
+      <w:bookmarkStart w:id="27" w:name="_Toc240744434"/>
       <w:r>
         <w:t>4.2 Domain model and persistence representation</w:t>
       </w:r>
@@ -7720,7 +7717,7 @@
       <w:pPr>
         <w:pStyle w:val="ReportTableCaption"/>
       </w:pPr>
-      <w:bookmarkStart w:id="28" w:name="_Toc240394967"/>
+      <w:bookmarkStart w:id="28" w:name="_Toc240744469"/>
       <w:r>
         <w:t>Table 4.1 Main validation and ownership constraints</w:t>
       </w:r>
@@ -8248,7 +8245,7 @@
           <w:noProof/>
         </w:rPr>
         <w:drawing>
-          <wp:inline distT="0" distB="0" distL="0" distR="0" wp14:anchorId="54CFB6C7" wp14:editId="3FA3D49F">
+          <wp:inline distT="0" distB="0" distL="0" distR="0" wp14:anchorId="41DDCC28" wp14:editId="74EDEFF2">
             <wp:extent cx="5472000" cy="2540571"/>
             <wp:effectExtent l="0" t="0" r="0" b="0"/>
             <wp:docPr id="3" name="Picture 3" descr="Figure 4.2 SQLite ownership and session relationships"/>
@@ -8288,7 +8285,7 @@
       <w:pPr>
         <w:pStyle w:val="ReportFigure"/>
       </w:pPr>
-      <w:bookmarkStart w:id="29" w:name="_Toc240394961"/>
+      <w:bookmarkStart w:id="29" w:name="_Toc240744463"/>
       <w:r>
         <w:t>Figure 4.2 SQLite ownership and session relationships</w:t>
       </w:r>
@@ -8310,7 +8307,7 @@
       <w:pPr>
         <w:pStyle w:val="Heading2"/>
       </w:pPr>
-      <w:bookmarkStart w:id="30" w:name="_Toc240394933"/>
+      <w:bookmarkStart w:id="30" w:name="_Toc240744435"/>
       <w:r>
         <w:t>4.3 Controller state and successful writes</w:t>
       </w:r>
@@ -8343,7 +8340,7 @@
         </w:rPr>
         <w:lastRenderedPageBreak/>
         <w:drawing>
-          <wp:inline distT="0" distB="0" distL="0" distR="0" wp14:anchorId="0B20B9EC" wp14:editId="01894444">
+          <wp:inline distT="0" distB="0" distL="0" distR="0" wp14:anchorId="671B19D0" wp14:editId="15BA26FE">
             <wp:extent cx="5472000" cy="3009600"/>
             <wp:effectExtent l="0" t="0" r="0" b="0"/>
             <wp:docPr id="4" name="Picture 4" descr="Figure 4.3 State transitions around loading and mutation"/>
@@ -8383,7 +8380,7 @@
       <w:pPr>
         <w:pStyle w:val="ReportFigure"/>
       </w:pPr>
-      <w:bookmarkStart w:id="31" w:name="_Toc240394962"/>
+      <w:bookmarkStart w:id="31" w:name="_Toc240744464"/>
       <w:r>
         <w:t>Figure 4.3 State transitions around loading and mutation</w:t>
       </w:r>
@@ -8401,7 +8398,7 @@
       <w:pPr>
         <w:pStyle w:val="Heading2"/>
       </w:pPr>
-      <w:bookmarkStart w:id="32" w:name="_Toc240394934"/>
+      <w:bookmarkStart w:id="32" w:name="_Toc240744436"/>
       <w:r>
         <w:t>4.4 Remote concurrency and uncertain outcomes</w:t>
       </w:r>
@@ -8445,7 +8442,7 @@
       <w:pPr>
         <w:pStyle w:val="Heading2"/>
       </w:pPr>
-      <w:bookmarkStart w:id="33" w:name="_Toc240394935"/>
+      <w:bookmarkStart w:id="33" w:name="_Toc240744437"/>
       <w:r>
         <w:t>4.5 Session security and operational limits</w:t>
       </w:r>
@@ -8479,7 +8476,7 @@
       <w:pPr>
         <w:pStyle w:val="Heading1"/>
       </w:pPr>
-      <w:bookmarkStart w:id="34" w:name="_Toc240394936"/>
+      <w:bookmarkStart w:id="34" w:name="_Toc240744438"/>
       <w:r>
         <w:lastRenderedPageBreak/>
         <w:t>5 Implementation and platform behavior</w:t>
@@ -8490,7 +8487,7 @@
       <w:pPr>
         <w:pStyle w:val="Heading2"/>
       </w:pPr>
-      <w:bookmarkStart w:id="35" w:name="_Toc240394937"/>
+      <w:bookmarkStart w:id="35" w:name="_Toc240744439"/>
       <w:r>
         <w:t>5.1 Responsive workspace and interaction design</w:t>
       </w:r>
@@ -8522,7 +8519,7 @@
           <w:noProof/>
         </w:rPr>
         <w:drawing>
-          <wp:inline distT="0" distB="0" distL="0" distR="0" wp14:anchorId="0A0C9AA8" wp14:editId="2095CA1E">
+          <wp:inline distT="0" distB="0" distL="0" distR="0" wp14:anchorId="21769D5E" wp14:editId="5E7FD060">
             <wp:extent cx="5472000" cy="3847500"/>
             <wp:effectExtent l="0" t="0" r="0" b="0"/>
             <wp:docPr id="5" name="Picture 5" descr="Figure 5.1 Wide TaskFlow layout from the controlled golden fixture"/>
@@ -8562,7 +8559,7 @@
       <w:pPr>
         <w:pStyle w:val="ReportFigure"/>
       </w:pPr>
-      <w:bookmarkStart w:id="36" w:name="_Toc240394963"/>
+      <w:bookmarkStart w:id="36" w:name="_Toc240744465"/>
       <w:r>
         <w:t>Figure 5.1 Wide TaskFlow layout from the controlled golden fixture</w:t>
       </w:r>
@@ -8581,7 +8578,7 @@
       <w:pPr>
         <w:pStyle w:val="Heading2"/>
       </w:pPr>
-      <w:bookmarkStart w:id="37" w:name="_Toc240394938"/>
+      <w:bookmarkStart w:id="37" w:name="_Toc240744440"/>
       <w:r>
         <w:t>5.2 Capture and edit forms</w:t>
       </w:r>
@@ -8618,7 +8615,7 @@
       <w:pPr>
         <w:pStyle w:val="Heading2"/>
       </w:pPr>
-      <w:bookmarkStart w:id="38" w:name="_Toc240394939"/>
+      <w:bookmarkStart w:id="38" w:name="_Toc240744441"/>
       <w:r>
         <w:lastRenderedPageBreak/>
         <w:t>5.3 Discovery and stable results</w:t>
@@ -8645,7 +8642,7 @@
       <w:pPr>
         <w:pStyle w:val="Heading2"/>
       </w:pPr>
-      <w:bookmarkStart w:id="39" w:name="_Toc240394940"/>
+      <w:bookmarkStart w:id="39" w:name="_Toc240744442"/>
       <w:r>
         <w:t>5.4 Loading and recoverable failures</w:t>
       </w:r>
@@ -8671,7 +8668,7 @@
       <w:pPr>
         <w:pStyle w:val="Heading2"/>
       </w:pPr>
-      <w:bookmarkStart w:id="40" w:name="_Toc240394941"/>
+      <w:bookmarkStart w:id="40" w:name="_Toc240744443"/>
       <w:r>
         <w:lastRenderedPageBreak/>
         <w:t>5.5 Account workflows and backend integration</w:t>
@@ -8706,7 +8703,7 @@
       <w:pPr>
         <w:pStyle w:val="Heading2"/>
       </w:pPr>
-      <w:bookmarkStart w:id="41" w:name="_Toc240394942"/>
+      <w:bookmarkStart w:id="41" w:name="_Toc240744444"/>
       <w:r>
         <w:t>5.6 Platform and accessibility boundaries</w:t>
       </w:r>
@@ -8752,7 +8749,7 @@
       <w:pPr>
         <w:pStyle w:val="Heading1"/>
       </w:pPr>
-      <w:bookmarkStart w:id="42" w:name="_Toc240394943"/>
+      <w:bookmarkStart w:id="42" w:name="_Toc240744445"/>
       <w:r>
         <w:lastRenderedPageBreak/>
         <w:t>6 Testing experiments and evaluation</w:t>
@@ -8763,7 +8760,7 @@
       <w:pPr>
         <w:pStyle w:val="Heading2"/>
       </w:pPr>
-      <w:bookmarkStart w:id="43" w:name="_Toc240394944"/>
+      <w:bookmarkStart w:id="43" w:name="_Toc240744446"/>
       <w:r>
         <w:t>6.1 Evaluation protocol and evidence identity</w:t>
       </w:r>
@@ -8774,7 +8771,7 @@
         <w:pStyle w:val="ReportBody"/>
       </w:pPr>
       <w:r>
-        <w:t>Evaluation separates source identity, test selection, environment and observed outcome. The evaluated implementation is commit 3e4f733. Logs under docs/evidence/platform-audit-20260914 and docs/evidence/platform-audit-20260915 record the local audit. On 15 September, the Flutter suite passed 100 cases with coverage enabled and the Node suite passed 14 cases; publication review repeated both successfully. Earlier browser and hosted Android experiments keep their original evidence identities.</w:t>
+        <w:t>Evaluation separates source identity, test selection, environment and observed outcome. The latest local evaluation uses commit 06d3790 plus the snapshot-capacity correction of 19 September, recorded under docs/evidence/risk-closure-20260919. The Flutter suite passed 104 cases with coverage enabled and the Node suite passed 17 cases. Earlier native, browser and hosted Android experiments keep their original evidence identities; they are not relabelled as executions of the updated source.</w:t>
       </w:r>
     </w:p>
     <w:p>
@@ -8782,14 +8779,14 @@
         <w:pStyle w:val="ReportBody"/>
       </w:pPr>
       <w:r>
-        <w:t>The local environment is Flutter 3.47.1 with Dart 3.13.1 on Windows 11, build 26200.9445, and Node 22.14.0 with built-in SQLite. The Android target is Google APIs Android 16/API 36 x86_64, emulator 37.1.11, at 720 by 1280 pixels and density 240, with two cores and 2048 MB guest memory. SDK and caches are under D:/Android. Host PATH and SDK-manager license-status warnings remain documented rather than reported as a fully clean toolchain check.</w:t>
+        <w:t>The latest local environment is Flutter 3.47.1 with Dart 3.13.1 on Windows 11, build 26200.9457, and Node 22.14.0 with built-in SQLite. The earlier Android target is Google APIs Android 16/API 36 x86_64, emulator 37.1.11, at 720 by 1280 pixels and density 240, with two cores and 2048 MB guest memory. SDK and caches are under D:/Android. Host PATH and SDK-manager license-status warnings remain documented rather than reported as a fully clean toolchain check.</w:t>
       </w:r>
     </w:p>
     <w:p>
       <w:pPr>
         <w:pStyle w:val="ReportTableCaption"/>
       </w:pPr>
-      <w:bookmarkStart w:id="44" w:name="_Toc240394968"/>
+      <w:bookmarkStart w:id="44" w:name="_Toc240744470"/>
       <w:r>
         <w:t>Table 6.1 Results and their actual verification boundaries</w:t>
       </w:r>
@@ -8957,7 +8954,7 @@
               <w:pStyle w:val="ReportTable"/>
             </w:pPr>
             <w:r>
-              <w:t>100 cases PASS on 15 September</w:t>
+              <w:t>104 cases PASS on 19 September</w:t>
             </w:r>
           </w:p>
         </w:tc>
@@ -8973,7 +8970,7 @@
               <w:pStyle w:val="ReportTable"/>
             </w:pPr>
             <w:r>
-              <w:t>Includes draft-consistency cases and goldens; no coverage percentage asserted</w:t>
+              <w:t>Includes validation and golden checks; no coverage percentage asserted</w:t>
             </w:r>
           </w:p>
         </w:tc>
@@ -9010,7 +9007,7 @@
               <w:pStyle w:val="ReportTable"/>
             </w:pPr>
             <w:r>
-              <w:t>14 cases PASS on 15 September</w:t>
+              <w:t>17 cases PASS on 19 September</w:t>
             </w:r>
           </w:p>
         </w:tc>
@@ -9026,7 +9023,7 @@
               <w:pStyle w:val="ReportTable"/>
             </w:pPr>
             <w:r>
-              <w:t>Local HTTP, account and SQLite behaviors</w:t>
+              <w:t>Includes full 500-task snapshot, byte limits and unchanged rejected writes</w:t>
             </w:r>
           </w:p>
         </w:tc>
@@ -9063,7 +9060,7 @@
               <w:pStyle w:val="ReportTable"/>
             </w:pPr>
             <w:r>
-              <w:t>15 cases PASS on 14 September</w:t>
+              <w:t>15 cases PASS on 19 September</w:t>
             </w:r>
           </w:p>
         </w:tc>
@@ -9259,7 +9256,6 @@
               <w:pStyle w:val="ReportTable"/>
             </w:pPr>
             <w:r>
-              <w:lastRenderedPageBreak/>
               <w:t>iOS</w:t>
             </w:r>
           </w:p>
@@ -9313,6 +9309,7 @@
               <w:pStyle w:val="ReportTable"/>
             </w:pPr>
             <w:r>
+              <w:lastRenderedPageBreak/>
               <w:t>Edge UI harness</w:t>
             </w:r>
           </w:p>
@@ -9410,14 +9407,22 @@
         <w:pStyle w:val="ReportBody"/>
       </w:pPr>
       <w:r>
-        <w:t>The 100-case result includes comparisons against 15 unchanged golden images; these are not additional tests. Each native platform executes six selections: four independent scenarios, three persisted scenarios, two preference-backed workflows, one quick-create exit scenario, four pending-capture cases and one online API workflow. The resulting 15 executions per platform do not represent 30 distinct scenarios across both platforms. Acceptance conditions determine what these counts establish.</w:t>
+        <w:t>The 104-case total includes golden comparisons using checked-in baselines reviewed at 06d3790, without regeneration. The six native selections comprise four independent, three persisted, two preference-backed, one quick-create exit, four pending-capture and one online case. Windows repeated all 15 successfully on 19 September; Android retains its 15 September evidence. These are overlapping scenarios, not 30 distinct tests.</w:t>
+      </w:r>
+    </w:p>
+    <w:p>
+      <w:pPr>
+        <w:pStyle w:val="ReportBody"/>
+      </w:pPr>
+      <w:r>
+        <w:t>The snapshot endpoint accepts 500 records within an authenticated 8 MiB budget; other routes retain 1 MiB. Tests round-trip maximum-length notes and multibyte tags and verify rejection without mutation for stale revisions, excess records and excess bytes. CI now selects all six native suites; hosted execution remains pending.</w:t>
       </w:r>
     </w:p>
     <w:p>
       <w:pPr>
         <w:pStyle w:val="Heading2"/>
       </w:pPr>
-      <w:bookmarkStart w:id="45" w:name="_Toc240394945"/>
+      <w:bookmarkStart w:id="45" w:name="_Toc240744447"/>
       <w:r>
         <w:t>6.2 Scenario design and assertion strength</w:t>
       </w:r>
@@ -9436,7 +9441,11 @@
         <w:pStyle w:val="ReportBody"/>
       </w:pPr>
       <w:r>
-        <w:t>The persisted suite resets only its dedicated test preference keys. It does not clear all preferences on the host. A fresh repository and UI remount then verifies that persisted records can be read back. This is stronger than checking the previous widget's in-memory list, but it remains a remount rather than terminating and restarting the operating-system process. The distinction is stated because both actions are sometimes described imprecisely as a restart.</w:t>
+        <w:t xml:space="preserve">The persisted suite resets only its dedicated test preference keys. It does not clear all preferences on the host. A fresh repository and UI remount then verifies that persisted records can be read back. This is stronger than checking the previous widget's in-memory list, but it remains a remount rather than terminating and </w:t>
+      </w:r>
+      <w:r>
+        <w:lastRenderedPageBreak/>
+        <w:t>restarting the operating-system process. The distinction is stated because both actions are sometimes described imprecisely as a restart.</w:t>
       </w:r>
     </w:p>
     <w:p>
@@ -9444,53 +9453,50 @@
         <w:pStyle w:val="ReportBody"/>
       </w:pPr>
       <w:r>
-        <w:t xml:space="preserve">Independent controlled-repository cases exercise compact and wide validation, seeded discovery and recovery from load or write failures. Each case receives a fresh repository and resets its viewport. Completion gates make the </w:t>
-      </w:r>
+        <w:t>Independent controlled-repository cases exercise compact and wide validation, seeded discovery and recovery from load or write failures. Each case receives a fresh repository and resets its viewport. Completion gates make the pending interval observable. The online Windows scenario adds the actual API and isolated SQLite store. Separating these cases makes a failure easier to localize than a single long scenario that depends on the records created by every preceding step.</w:t>
+      </w:r>
+    </w:p>
+    <w:p>
+      <w:pPr>
+        <w:pStyle w:val="ReportBody"/>
+      </w:pPr>
+      <w:r>
+        <w:t>An adequate assertion checks the intended invariant. After editing, retaining the identifier and metadata matters. After filtering, exact membership matters. After deleting one task, preserving another matters. After retry, preventing duplicate writes matters. These are stronger oracles than merely checking that no exception escaped, or that a button responded to a tap.</w:t>
+      </w:r>
+    </w:p>
+    <w:p>
+      <w:pPr>
+        <w:pStyle w:val="Heading2"/>
+      </w:pPr>
+      <w:bookmarkStart w:id="46" w:name="_Toc240744448"/>
+      <w:r>
+        <w:t>6.3 Intentional semantic defect</w:t>
+      </w:r>
+      <w:bookmarkEnd w:id="46"/>
+    </w:p>
+    <w:p>
+      <w:pPr>
+        <w:pStyle w:val="ReportBody"/>
+      </w:pPr>
+      <w:r>
+        <w:t>The intentional-defect experiment asks whether UI automation detects a search error that leaves compilation and basic navigation intact. The correct implementation uses normalized substring matching. The temporary faulty patch replaces that comparison with prefix matching. The fixture contains Review Flutter testing and Write report, and the query includes surrounding whitespace and uppercase text: FLUTTER. The first task should still match because normalization and substring search are both required.</w:t>
+      </w:r>
+    </w:p>
+    <w:p>
+      <w:pPr>
+        <w:pStyle w:val="ReportBody"/>
+      </w:pPr>
+      <w:r>
+        <w:t>The baseline regression test passed before the change. With the faulty comparison, the expected task could not be found and the command failed. Restoring substring matching made the same regression pass again. The repository retains the buggy patch, corrected patch and unedited baseline, failure and recovery logs. The permanent test remains in the corrected source tree; the production implementation is not left intentionally defective.</w:t>
+      </w:r>
+    </w:p>
+    <w:p>
+      <w:pPr>
+        <w:pStyle w:val="ReportTableCaption"/>
+      </w:pPr>
+      <w:bookmarkStart w:id="47" w:name="_Toc240744471"/>
       <w:r>
         <w:lastRenderedPageBreak/>
-        <w:t>pending interval observable. The online Windows scenario adds the actual API and isolated SQLite store. Separating these cases makes a failure easier to localize than a single long scenario that depends on the records created by every preceding step.</w:t>
-      </w:r>
-    </w:p>
-    <w:p>
-      <w:pPr>
-        <w:pStyle w:val="ReportBody"/>
-      </w:pPr>
-      <w:r>
-        <w:t>An adequate assertion checks the intended invariant. After editing, retaining the identifier and metadata matters. After filtering, exact membership matters. After deleting one task, preserving another matters. After retry, preventing duplicate writes matters. These are stronger oracles than merely checking that no exception escaped, or that a button responded to a tap.</w:t>
-      </w:r>
-    </w:p>
-    <w:p>
-      <w:pPr>
-        <w:pStyle w:val="Heading2"/>
-      </w:pPr>
-      <w:bookmarkStart w:id="46" w:name="_Toc240394946"/>
-      <w:r>
-        <w:t>6.3 Intentional semantic defect</w:t>
-      </w:r>
-      <w:bookmarkEnd w:id="46"/>
-    </w:p>
-    <w:p>
-      <w:pPr>
-        <w:pStyle w:val="ReportBody"/>
-      </w:pPr>
-      <w:r>
-        <w:t>The intentional-defect experiment asks whether UI automation detects a search error that leaves compilation and basic navigation intact. The correct implementation uses normalized substring matching. The temporary faulty patch replaces that comparison with prefix matching. The fixture contains Review Flutter testing and Write report, and the query includes surrounding whitespace and uppercase text: FLUTTER. The first task should still match because normalization and substring search are both required.</w:t>
-      </w:r>
-    </w:p>
-    <w:p>
-      <w:pPr>
-        <w:pStyle w:val="ReportBody"/>
-      </w:pPr>
-      <w:r>
-        <w:t>The baseline regression test passed before the change. With the faulty comparison, the expected task could not be found and the command failed. Restoring substring matching made the same regression pass again. The repository retains the buggy patch, corrected patch and unedited baseline, failure and recovery logs. The permanent test remains in the corrected source tree; the production implementation is not left intentionally defective.</w:t>
-      </w:r>
-    </w:p>
-    <w:p>
-      <w:pPr>
-        <w:pStyle w:val="ReportTableCaption"/>
-      </w:pPr>
-      <w:bookmarkStart w:id="47" w:name="_Toc240394969"/>
-      <w:r>
         <w:t>Table 6.2 Deliberate search-defect experiment</w:t>
       </w:r>
       <w:bookmarkEnd w:id="47"/>
@@ -9745,7 +9751,7 @@
       <w:pPr>
         <w:pStyle w:val="Heading2"/>
       </w:pPr>
-      <w:bookmarkStart w:id="48" w:name="_Toc240394947"/>
+      <w:bookmarkStart w:id="48" w:name="_Toc240744449"/>
       <w:r>
         <w:t>6.4 Test-level timing experiment</w:t>
       </w:r>
@@ -9763,7 +9769,7 @@
       <w:pPr>
         <w:pStyle w:val="ReportTableCaption"/>
       </w:pPr>
-      <w:bookmarkStart w:id="49" w:name="_Toc240394970"/>
+      <w:bookmarkStart w:id="49" w:name="_Toc240744472"/>
       <w:r>
         <w:t>Table 6.3 Whole-command duration in seconds for the selected suites</w:t>
       </w:r>
@@ -10065,7 +10071,11 @@
         <w:pStyle w:val="ReportBody"/>
       </w:pPr>
       <w:r>
-        <w:t>All twelve selected commands passed. Within this setup, the native selection required substantially more wall time than the other selected commands. That observation helps justify running narrow tests during development before the larger native gate. It does not establish a fair per-test speed ranking, because the scenario counts and assertions differ, nor does it predict cold-cache CI duration.</w:t>
+        <w:t xml:space="preserve">All twelve selected commands passed. Within this setup, the native selection required substantially more wall time than the other selected commands. That </w:t>
+      </w:r>
+      <w:r>
+        <w:lastRenderedPageBreak/>
+        <w:t>observation helps justify running narrow tests during development before the larger native gate. It does not establish a fair per-test speed ranking, because the scenario counts and assertions differ, nor does it predict cold-cache CI duration.</w:t>
       </w:r>
     </w:p>
     <w:p>
@@ -10073,29 +10083,63 @@
         <w:pStyle w:val="ReportBody"/>
       </w:pPr>
       <w:r>
-        <w:t xml:space="preserve">The small sample cannot support a general reliability estimate. Three successful repetitions can reveal an immediate deterministic failure, but rare timing failures may remain unseen. Warm caches and one host also restrict external </w:t>
+        <w:t>The small sample cannot support a general reliability estimate. Three successful repetitions can reveal an immediate deterministic failure, but rare timing failures may remain unseen. Warm caches and one host also restrict external validity. The most useful conclusion is procedural: retain raw results, state the workload and rotate order, then avoid converting a small local experiment into an unsupported universal comparison.</w:t>
+      </w:r>
+    </w:p>
+    <w:p>
+      <w:pPr>
+        <w:pStyle w:val="Heading2"/>
+      </w:pPr>
+      <w:bookmarkStart w:id="50" w:name="_Toc240744450"/>
+      <w:r>
+        <w:t>6.5 Browser automation and maintenance findings</w:t>
+      </w:r>
+      <w:bookmarkEnd w:id="50"/>
+    </w:p>
+    <w:p>
+      <w:pPr>
+        <w:pStyle w:val="ReportBody"/>
+      </w:pPr>
+      <w:r>
+        <w:t>The browser harness is compiled through an explicit QA entry point and uses synthetic in-memory data. It can hold repository operations and inject failures without touching account data or preferences. A separate real API scenario covers account task lifecycle. These two forms of browser testing must be reported independently because the controlled harness does not establish actual persistence or network behavior.</w:t>
+      </w:r>
+    </w:p>
+    <w:p>
+      <w:pPr>
+        <w:pStyle w:val="ReportBody"/>
+      </w:pPr>
+      <w:r>
+        <w:t>During the desktop redesign, the harness initially searched for an old heading. A later attempt assumed the input's accessible name was unchanged after focus, while the observed name included a second line. The corrected script checks the intended first line and verifies the active input before typing. Four failed attempts and the final successful run are retained. This is evidence of automation maintenance after a legitimate UI change, not evidence that four application defects were found and fixed.</w:t>
+      </w:r>
+    </w:p>
+    <w:p>
+      <w:pPr>
+        <w:pStyle w:val="ReportBody"/>
+      </w:pPr>
+      <w:r>
+        <w:t xml:space="preserve">The earlier browser stability experiment and multi-session work remain useful historical observations, but the current one-run success cannot inherit their repetition count. The script also retains raw outputs and exit codes and restores the default Web build after the harness. Those safeguards improve the reproducibility </w:t>
       </w:r>
       <w:r>
         <w:lastRenderedPageBreak/>
-        <w:t>validity. The most useful conclusion is procedural: retain raw results, state the workload and rotate order, then avoid converting a small local experiment into an unsupported universal comparison.</w:t>
+        <w:t>of evidence collection. They do not prove that all browsers, clean machines or assistive technologies behave identically.</w:t>
       </w:r>
     </w:p>
     <w:p>
       <w:pPr>
         <w:pStyle w:val="Heading2"/>
       </w:pPr>
-      <w:bookmarkStart w:id="50" w:name="_Toc240394948"/>
-      <w:r>
-        <w:t>6.5 Browser automation and maintenance findings</w:t>
-      </w:r>
-      <w:bookmarkEnd w:id="50"/>
+      <w:bookmarkStart w:id="51" w:name="_Toc240744451"/>
+      <w:r>
+        <w:t>6.6 Threats to validity and remaining gates</w:t>
+      </w:r>
+      <w:bookmarkEnd w:id="51"/>
     </w:p>
     <w:p>
       <w:pPr>
         <w:pStyle w:val="ReportBody"/>
       </w:pPr>
       <w:r>
-        <w:t>The browser harness is compiled through an explicit QA entry point and uses synthetic in-memory data. It can hold repository operations and inject failures without touching account data or preferences. A separate real API scenario covers account task lifecycle. These two forms of browser testing must be reported independently because the controlled harness does not establish actual persistence or network behavior.</w:t>
+        <w:t>Independent fixtures and meaningful assertions support internal validity. Fake failures simplify real transport behavior; golden comparisons depend on fonts and rendering; timings include overhead and unequal workloads. Browser-script corrections change the procedure, so earlier failed attempts remain available.</w:t>
       </w:r>
     </w:p>
     <w:p>
@@ -10103,7 +10147,7 @@
         <w:pStyle w:val="ReportBody"/>
       </w:pPr>
       <w:r>
-        <w:t>During the desktop redesign, the harness initially searched for an old heading. A later attempt assumed the input's accessible name was unchanged after focus, while the observed name included a second line. The corrected script checks the intended first line and verifies the active input before typing. Four failed attempts and the final successful run are retained. This is evidence of automation maintenance after a legitimate UI change, not evidence that four application defects were found and fixed.</w:t>
+        <w:t>External validity is limited by the small coursework dataset and selected Windows host and Android emulator. The eager task list has not been stress-tested at the server's 500-record acceptance limit. No frame-time or sustained API-load study is reported. The local Android API workflow does not establish physical-device connectivity, release HTTPS operation or production signing.</w:t>
       </w:r>
     </w:p>
     <w:p>
@@ -10111,29 +10155,15 @@
         <w:pStyle w:val="ReportBody"/>
       </w:pPr>
       <w:r>
-        <w:t>The earlier browser stability experiment and multi-session work remain useful historical observations, but the current one-run success cannot inherit their repetition count. The script also retains raw outputs and exit codes and restores the default Web build after the harness. Those safeguards improve the reproducibility of evidence collection. They do not prove that all browsers, clean machines or assistive technologies behave identically.</w:t>
-      </w:r>
-    </w:p>
-    <w:p>
-      <w:pPr>
-        <w:pStyle w:val="Heading2"/>
-      </w:pPr>
-      <w:bookmarkStart w:id="51" w:name="_Toc240394949"/>
-      <w:r>
-        <w:t>6.6 Threats to validity and remaining gates</w:t>
-      </w:r>
-      <w:bookmarkEnd w:id="51"/>
+        <w:t>Automated accessibility checks do not establish screen-reader usability, and remount does not establish process-restart persistence. Passing test counts alone cannot establish absence of defects.</w:t>
+      </w:r>
     </w:p>
     <w:p>
       <w:pPr>
         <w:pStyle w:val="ReportBody"/>
       </w:pPr>
       <w:r>
-        <w:t xml:space="preserve">Internal validity depends on using independent fixtures and meaningful assertions. A fake may model an error more simply than a real transport failure, so a passing recovery test is not a complete network proof. Golden results depend on fonts and rendering environment. Test-level timings include overhead and unequal </w:t>
-      </w:r>
-      <w:r>
-        <w:lastRenderedPageBreak/>
-        <w:t>work. Browser-script corrections change the measurement procedure, which is why previous failed attempts remain visible rather than being replaced.</w:t>
+        <w:t>The Android release check adds a stronger persistence boundary than UI remount: a task entered through Android input events remained visible after force-stop and relaunch. This does not establish an operating-system reboot or general input-method compatibility. The APK is 53,112,106 bytes; its checksum and installation commands are retained in the platform evidence package.</w:t>
       </w:r>
     </w:p>
     <w:p>
@@ -10141,30 +10171,6 @@
         <w:pStyle w:val="ReportBody"/>
       </w:pPr>
       <w:r>
-        <w:t>External validity is limited by the small coursework dataset and selected Windows host and Android emulator. The eager task list has not been stress-tested at the server's 500-record acceptance limit. No frame-time or sustained API-load study is reported. The local Android API workflow does not establish physical-device connectivity, release HTTPS operation or production signing.</w:t>
-      </w:r>
-    </w:p>
-    <w:p>
-      <w:pPr>
-        <w:pStyle w:val="ReportBody"/>
-      </w:pPr>
-      <w:r>
-        <w:t>Construct validity also matters. Automated accessibility guidelines do not equal a complete screen-reader review, and successful remount does not equal process restart. Passing the selected checks does not imply absence of bugs. These distinctions prevent convenience metrics, especially total test count, from replacing the actual user risks under evaluation.</w:t>
-      </w:r>
-    </w:p>
-    <w:p>
-      <w:pPr>
-        <w:pStyle w:val="ReportBody"/>
-      </w:pPr>
-      <w:r>
-        <w:t>The Android release check adds a stronger persistence boundary than UI remount: a task entered through Android input events remained visible after force-stop and relaunch. This does not establish an operating-system reboot or general input-method compatibility. The APK is 53,112,106 bytes; its checksum and installation commands are retained in the platform evidence package.</w:t>
-      </w:r>
-    </w:p>
-    <w:p>
-      <w:pPr>
-        <w:pStyle w:val="ReportBody"/>
-      </w:pPr>
-      <w:r>
         <w:t>Remaining evidence gates are manual screen-reader and whole-page keyboard testing, clean-machine setup and Mac-based execution for the additional iOS target. Android account verification covers the debug emulator against a local API, not a release HTTPS deployment. Submission additionally requires the team's English presentation video and a confirmed contribution record. These items remain separate from document completion.</w:t>
       </w:r>
     </w:p>
@@ -10172,7 +10178,7 @@
       <w:pPr>
         <w:pStyle w:val="Heading1"/>
       </w:pPr>
-      <w:bookmarkStart w:id="52" w:name="_Toc240394950"/>
+      <w:bookmarkStart w:id="52" w:name="_Toc240744452"/>
       <w:r>
         <w:lastRenderedPageBreak/>
         <w:t>7 Conclusion</w:t>
@@ -10183,7 +10189,7 @@
       <w:pPr>
         <w:pStyle w:val="Heading2"/>
       </w:pPr>
-      <w:bookmarkStart w:id="53" w:name="_Toc240394951"/>
+      <w:bookmarkStart w:id="53" w:name="_Toc240744453"/>
       <w:r>
         <w:t>7.1 Findings</w:t>
       </w:r>
@@ -10218,14 +10224,17 @@
         <w:pStyle w:val="ReportBody"/>
       </w:pPr>
       <w:r>
-        <w:t>For RQ4, the current selection passed 15 native cases on each of Windows and Android, alongside 100 Flutter and 14 API cases. Android release installation and offline process-restart persistence were verified on the emulator. These observations support the required two-platform demonstration within the recorded conditions. iOS, physical-device HTTPS operation and manual screen-reader behavior remain outside the verified scope.</w:t>
+        <w:t>For RQ4, the retained platform selection passed 15 native cases on each of Windows and Android on 14 and 15 September. The latest local source checks passed 104 Flutter and 17 API cases on 19 September. Android release installation and offline process-restart persistence were verified on the emulator during the earlier audit. These observations support the required two-platform demonstration within the recorded conditions. iOS, physical-device HTTPS operation and manual screen-reader behavior remain outside</w:t>
+      </w:r>
+      <w:r>
+        <w:t xml:space="preserve"> the verified scope.</w:t>
       </w:r>
     </w:p>
     <w:p>
       <w:pPr>
         <w:pStyle w:val="Heading2"/>
       </w:pPr>
-      <w:bookmarkStart w:id="54" w:name="_Toc240394952"/>
+      <w:bookmarkStart w:id="54" w:name="_Toc240744454"/>
       <w:r>
         <w:t>7.2 Prioritized continuation</w:t>
       </w:r>
@@ -10251,7 +10260,7 @@
       <w:pPr>
         <w:pStyle w:val="Heading1"/>
       </w:pPr>
-      <w:bookmarkStart w:id="55" w:name="_Toc240394953"/>
+      <w:bookmarkStart w:id="55" w:name="_Toc240744455"/>
       <w:r>
         <w:lastRenderedPageBreak/>
         <w:t>References</w:t>
@@ -10359,11 +10368,11 @@
         <w:pStyle w:val="ReportReference"/>
       </w:pPr>
       <w:r>
-        <w:t>TaskFlow project. (2026). TaskFlow QA Lab [Source code and test evidence, revision 3e4f733]. https://github.com/cross-platform-mobile-team/CROSS-</w:t>
+        <w:t xml:space="preserve">TaskFlow project. (2026). TaskFlow QA Lab [Source baseline, revision 06d3790; local 19 September verification is identified separately]. </w:t>
       </w:r>
       <w:r>
         <w:lastRenderedPageBreak/>
-        <w:t>PLATFORM-MOBILE-APP-DEVELOPMENT-Midterm-Project/tree/3e4f733acfcb219596aa4b60376f41b142d65857</w:t>
+        <w:t>https://github.com/cross-platform-mobile-team/CROSS-PLATFORM-MOBILE-APP-DEVELOPMENT-Midterm-Project/tree/06d3790deb6b5b1376311e102b15b968b2b51baf</w:t>
       </w:r>
     </w:p>
     <w:p>
@@ -10386,7 +10395,7 @@
       <w:pPr>
         <w:pStyle w:val="Heading1"/>
       </w:pPr>
-      <w:bookmarkStart w:id="56" w:name="_Toc240394954"/>
+      <w:bookmarkStart w:id="56" w:name="_Toc240744456"/>
       <w:r>
         <w:lastRenderedPageBreak/>
         <w:t>Appendix A Reproduction guide</w:t>
@@ -10397,7 +10406,7 @@
       <w:pPr>
         <w:pStyle w:val="Heading2"/>
       </w:pPr>
-      <w:bookmarkStart w:id="57" w:name="_Toc240394955"/>
+      <w:bookmarkStart w:id="57" w:name="_Toc240744457"/>
       <w:r>
         <w:t>Environment and safe setup</w:t>
       </w:r>
@@ -10457,7 +10466,7 @@
       <w:pPr>
         <w:pStyle w:val="Heading2"/>
       </w:pPr>
-      <w:bookmarkStart w:id="58" w:name="_Toc240394956"/>
+      <w:bookmarkStart w:id="58" w:name="_Toc240744458"/>
       <w:r>
         <w:t>Deliberate defect safety</w:t>
       </w:r>
@@ -10483,7 +10492,7 @@
       <w:pPr>
         <w:pStyle w:val="Heading1"/>
       </w:pPr>
-      <w:bookmarkStart w:id="59" w:name="_Toc240394957"/>
+      <w:bookmarkStart w:id="59" w:name="_Toc240744459"/>
       <w:r>
         <w:lastRenderedPageBreak/>
         <w:t>Appendix B Evidence index</w:t>
@@ -10494,7 +10503,7 @@
       <w:pPr>
         <w:pStyle w:val="ReportTableCaption"/>
       </w:pPr>
-      <w:bookmarkStart w:id="60" w:name="_Toc240394971"/>
+      <w:bookmarkStart w:id="60" w:name="_Toc240744473"/>
       <w:r>
         <w:t>Table B.1 Evidence packages used in this report</w:t>
       </w:r>
@@ -11113,7 +11122,7 @@
       <w:pPr>
         <w:pStyle w:val="Heading1"/>
       </w:pPr>
-      <w:bookmarkStart w:id="61" w:name="_Toc240394958"/>
+      <w:bookmarkStart w:id="61" w:name="_Toc240744460"/>
       <w:r>
         <w:lastRenderedPageBreak/>
         <w:t>Appendix C Submission verification</w:t>
@@ -15778,7 +15787,7 @@
     <w:next w:val="Normal"/>
     <w:autoRedefine/>
     <w:uiPriority w:val="39"/>
-    <w:rsid w:val="00D3289F"/>
+    <w:rsid w:val="00E51637"/>
   </w:style>
   <w:style w:type="paragraph" w:styleId="TOC2">
     <w:name w:val="toc 2"/>
@@ -15786,7 +15795,7 @@
     <w:next w:val="Normal"/>
     <w:autoRedefine/>
     <w:uiPriority w:val="39"/>
-    <w:rsid w:val="00D3289F"/>
+    <w:rsid w:val="00E51637"/>
     <w:pPr>
       <w:ind w:left="240"/>
     </w:pPr>

</xml_diff>

<commit_message>
Refresh report and LaTeX, organize verified evidence
</commit_message>
<xml_diff>
--- a/output/pdf/taskflow-report.docx
+++ b/output/pdf/taskflow-report.docx
@@ -1,6 +1,6 @@
 
 <file path=word/document.xml><?xml version="1.0" encoding="utf-8"?>
-<w:document xmlns:wpc="http://schemas.microsoft.com/office/word/2010/wordprocessingCanvas" xmlns:cx="http://schemas.microsoft.com/office/drawing/2014/chartex" xmlns:cx1="http://schemas.microsoft.com/office/drawing/2015/9/8/chartex" xmlns:cx2="http://schemas.microsoft.com/office/drawing/2015/10/21/chartex" xmlns:cx3="http://schemas.microsoft.com/office/drawing/2016/5/9/chartex" xmlns:cx4="http://schemas.microsoft.com/office/drawing/2016/5/10/chartex" xmlns:cx5="http://schemas.microsoft.com/office/drawing/2016/5/11/chartex" xmlns:cx6="http://schemas.microsoft.com/office/drawing/2016/5/12/chartex" xmlns:cx7="http://schemas.microsoft.com/office/drawing/2016/5/13/chartex" xmlns:cx8="http://schemas.microsoft.com/office/drawing/2016/5/14/chartex" xmlns:mc="http://schemas.openxmlformats.org/markup-compatibility/2006" xmlns:aink="http://schemas.microsoft.com/office/drawing/2016/ink" xmlns:am3d="http://schemas.microsoft.com/office/drawing/2017/model3d" xmlns:o="urn:schemas-microsoft-com:office:office" xmlns:oel="http://schemas.microsoft.com/office/2019/extlst" xmlns:r="http://schemas.openxmlformats.org/officeDocument/2006/relationships" xmlns:m="http://schemas.openxmlformats.org/officeDocument/2006/math" xmlns:v="urn:schemas-microsoft-com:vml" xmlns:wp14="http://schemas.microsoft.com/office/word/2010/wordprocessingDrawing" xmlns:wp="http://schemas.openxmlformats.org/drawingml/2006/wordprocessingDrawing" xmlns:w10="urn:schemas-microsoft-com:office:word" xmlns:w="http://schemas.openxmlformats.org/wordprocessingml/2006/main" xmlns:w14="http://schemas.microsoft.com/office/word/2010/wordml" xmlns:w15="http://schemas.microsoft.com/office/word/2012/wordml" xmlns:w16cex="http://schemas.microsoft.com/office/word/2018/wordml/cex" xmlns:w16cid="http://schemas.microsoft.com/office/word/2016/wordml/cid" xmlns:w16="http://schemas.microsoft.com/office/word/2018/wordml" xmlns:w16du="http://schemas.microsoft.com/office/word/2023/wordml/word16du" xmlns:w16sdtdh="http://schemas.microsoft.com/office/word/2020/wordml/sdtdatahash" xmlns:w16sdtfl="http://schemas.microsoft.com/office/word/2024/wordml/sdtformatlock" xmlns:w16se="http://schemas.microsoft.com/office/word/2015/wordml/symex" xmlns:wpg="http://schemas.microsoft.com/office/word/2010/wordprocessingGroup" xmlns:wpi="http://schemas.microsoft.com/office/word/2010/wordprocessingInk" xmlns:wne="http://schemas.microsoft.com/office/word/2006/wordml" xmlns:wps="http://schemas.microsoft.com/office/word/2010/wordprocessingShape" mc:Ignorable="w14 w15 w16se w16cid w16 w16cex w16sdtdh w16sdtfl w16du wp14">
+<w:document xmlns:wpc="http://schemas.microsoft.com/office/word/2010/wordprocessingCanvas" xmlns:cx="http://schemas.microsoft.com/office/drawing/2014/chartex" xmlns:cx1="http://schemas.microsoft.com/office/drawing/2015/9/8/chartex" xmlns:cx2="http://schemas.microsoft.com/office/drawing/2015/10/21/chartex" xmlns:cx3="http://schemas.microsoft.com/office/drawing/2016/5/9/chartex" xmlns:cx4="http://schemas.microsoft.com/office/drawing/2016/5/10/chartex" xmlns:cx5="http://schemas.microsoft.com/office/drawing/2016/5/11/chartex" xmlns:cx6="http://schemas.microsoft.com/office/drawing/2016/5/12/chartex" xmlns:cx7="http://schemas.microsoft.com/office/drawing/2016/5/13/chartex" xmlns:cx8="http://schemas.microsoft.com/office/drawing/2016/5/14/chartex" xmlns:mc="http://schemas.openxmlformats.org/markup-compatibility/2006" xmlns:aink="http://schemas.microsoft.com/office/drawing/2016/ink" xmlns:am3d="http://schemas.microsoft.com/office/drawing/2017/model3d" xmlns:o="urn:schemas-microsoft-com:office:office" xmlns:oel="http://schemas.microsoft.com/office/2019/extlst" xmlns:r="http://schemas.openxmlformats.org/officeDocument/2006/relationships" xmlns:m="http://schemas.openxmlformats.org/officeDocument/2006/math" xmlns:v="urn:schemas-microsoft-com:vml" xmlns:wp14="http://schemas.microsoft.com/office/word/2010/wordprocessingDrawing" xmlns:wp="http://schemas.openxmlformats.org/drawingml/2006/wordprocessingDrawing" xmlns:w10="urn:schemas-microsoft-com:office:word" xmlns:w="http://schemas.openxmlformats.org/wordprocessingml/2006/main" xmlns:w14="http://schemas.microsoft.com/office/word/2010/wordml" xmlns:w15="http://schemas.microsoft.com/office/word/2012/wordml" xmlns:w16cex="http://schemas.microsoft.com/office/word/2018/wordml/cex" xmlns:w16cid="http://schemas.microsoft.com/office/word/2016/wordml/cid" xmlns:w16="http://schemas.microsoft.com/office/word/2018/wordml" xmlns:w16sdtdh="http://schemas.microsoft.com/office/word/2020/wordml/sdtdatahash" xmlns:w16se="http://schemas.microsoft.com/office/word/2015/wordml/symex" xmlns:wpg="http://schemas.microsoft.com/office/word/2010/wordprocessingGroup" xmlns:wpi="http://schemas.microsoft.com/office/word/2010/wordprocessingInk" xmlns:wne="http://schemas.microsoft.com/office/word/2006/wordml" xmlns:wps="http://schemas.microsoft.com/office/word/2010/wordprocessingShape" mc:Ignorable="w14 w15 w16se w16cid w16 w16cex w16sdtdh wp14">
   <w:body>
     <w:p>
       <w:pPr>
@@ -114,7 +114,7 @@
           <w:noProof/>
           <w:lang w:val="en-US"/>
         </w:rPr>
-        <w:pict w14:anchorId="2792FD1A">
+        <w:pict w14:anchorId="1F0D3F08">
           <v:shapetype id="_x0000_t75" coordsize="21600,21600" o:spt="75" o:preferrelative="t" path="m@4@5l@4@11@9@11@9@5xe" filled="f" stroked="f">
             <v:stroke joinstyle="miter"/>
             <v:formulas>
@@ -134,7 +134,7 @@
             <v:path o:extrusionok="f" gradientshapeok="t" o:connecttype="rect"/>
             <o:lock v:ext="edit" aspectratio="t"/>
           </v:shapetype>
-          <v:shape id="Picture 21" o:spid="_x0000_i1025" type="#_x0000_t75" style="width:117pt;height:60.5pt;visibility:visible">
+          <v:shape id="Picture 21" o:spid="_x0000_i1025" type="#_x0000_t75" style="width:117pt;height:60.6pt;visibility:visible">
             <v:imagedata r:id="rId7" o:title=""/>
           </v:shape>
         </w:pict>
@@ -635,8 +635,8 @@
           <w:noProof/>
           <w:lang w:val="en-US"/>
         </w:rPr>
-        <w:pict w14:anchorId="4D048D76">
-          <v:shape id="Picture 6" o:spid="_x0000_i1026" type="#_x0000_t75" style="width:117pt;height:65pt;visibility:visible">
+        <w:pict w14:anchorId="5A37D166">
+          <v:shape id="Picture 6" o:spid="_x0000_i1026" type="#_x0000_t75" style="width:117pt;height:64.8pt;visibility:visible">
             <v:imagedata r:id="rId7" o:title=""/>
           </v:shape>
         </w:pict>
@@ -1062,16 +1062,7 @@
         <w:pStyle w:val="ReportBody"/>
       </w:pPr>
       <w:r>
-        <w:t>This report investigates UI automation testing through TaskFlow, a Flutter task-management application with isolated offline, sample and account workspaces. The study connects unit, widget, golden, native integration and browser tests to specific risks rather than treating test count as a quality measure. Injectable repositories, clocks and identifiers support deterministic fixtures, while explicit completion gates expose loading and recovery states. The account implementation adds a Node.js and SQLite boun</w:t>
-      </w:r>
-      <w:r>
-        <w:t>dary with ownership checks and revision-based snapshot writes. A deliberate substring-to-prefix search defect is detected by a permanent regression, with authentic baseline, failure and corrected outputs. Three rounds of selected test-level commands illustrate local wall-time differences, but unequal workloads and startup overhead prevent a universal speed ranking. During report preparation, the 19 September Flutter suite passed 104 cases and the backend suite passed 17 cases. Retained Windows and Android n</w:t>
-      </w:r>
-      <w:r>
-        <w:t>ative suites each passed 15 cases on 14 and 15 September 2026, respectively. Android release installation and process-restart persistence were verified on the local API 36 emulator. Edge and historical Android CI results retain their revision and platform boundaries. These selected checks do not establish absence of defects or unconditional release readiness. The study concludes that clear oracles, isolated state, complementary execution boundaries and honest interpretation are central to a defensible Flutt</w:t>
-      </w:r>
-      <w:r>
-        <w:t>er testing case study.</w:t>
+        <w:t>This report investigates UI automation testing through TaskFlow, a Flutter task-management application with isolated offline, sample and account workspaces. The study connects unit, widget, golden, native integration and browser tests to specific risks rather than treating test count as a quality measure. Injectable repositories, clocks and identifiers support deterministic fixtures, while explicit completion gates expose loading and recovery states. The account implementation adds a Node.js and SQLite boundary with ownership checks and revision-based snapshot writes. A deliberate substring-to-prefix search defect is detected by a permanent regression, with authentic baseline, failure and corrected outputs. Three rounds of selected test-level commands illustrate local wall-time differences, but unequal workloads and startup overhead prevent a universal speed ranking. During report preparation, the 11 October Flutter suite passed 133 cases and the backend suite passed 17 cases. Retained Windows and Android native suites each passed 15 cases in the retained October evidence, with revision boundaries stated in the evaluation. Android release installation and process-restart persistence were verified on the local API 36 emulator. Edge and historical Android CI results retain their revision and platform boundaries. These selected checks do not establish absence of defects or unconditional release readiness. The study concludes that clear oracles, isolated state, complementary execution boundaries and honest interpretation are central to a defensible Flutter testing case study.</w:t>
       </w:r>
     </w:p>
     <w:p>
@@ -1105,6 +1096,7 @@
           <w:rFonts w:asciiTheme="minorHAnsi" w:eastAsiaTheme="minorEastAsia" w:hAnsiTheme="minorHAnsi" w:cstheme="minorBidi"/>
           <w:noProof/>
           <w:kern w:val="2"/>
+          <w:lang w:eastAsia="ja-JP"/>
           <w14:ligatures w14:val="standardContextual"/>
         </w:rPr>
       </w:pPr>
@@ -1117,7 +1109,7 @@
       <w:r>
         <w:fldChar w:fldCharType="separate"/>
       </w:r>
-      <w:hyperlink w:anchor="_Toc240744412" w:history="1">
+      <w:hyperlink w:anchor="_Toc243487860" w:history="1">
         <w:r>
           <w:rPr>
             <w:rStyle w:val="Hyperlink"/>
@@ -1144,7 +1136,7 @@
             <w:noProof/>
             <w:webHidden/>
           </w:rPr>
-          <w:instrText xml:space="preserve"> PAGEREF _Toc240744412 \h </w:instrText>
+          <w:instrText xml:space="preserve"> PAGEREF _Toc243487860 \h </w:instrText>
         </w:r>
         <w:r>
           <w:rPr>
@@ -1185,10 +1177,11 @@
           <w:rFonts w:asciiTheme="minorHAnsi" w:eastAsiaTheme="minorEastAsia" w:hAnsiTheme="minorHAnsi" w:cstheme="minorBidi"/>
           <w:noProof/>
           <w:kern w:val="2"/>
+          <w:lang w:eastAsia="ja-JP"/>
           <w14:ligatures w14:val="standardContextual"/>
         </w:rPr>
       </w:pPr>
-      <w:hyperlink w:anchor="_Toc240744413" w:history="1">
+      <w:hyperlink w:anchor="_Toc243487861" w:history="1">
         <w:r>
           <w:rPr>
             <w:rStyle w:val="Hyperlink"/>
@@ -1215,7 +1208,7 @@
             <w:noProof/>
             <w:webHidden/>
           </w:rPr>
-          <w:instrText xml:space="preserve"> PAGEREF _Toc240744413 \h </w:instrText>
+          <w:instrText xml:space="preserve"> PAGEREF _Toc243487861 \h </w:instrText>
         </w:r>
         <w:r>
           <w:rPr>
@@ -1256,10 +1249,11 @@
           <w:rFonts w:asciiTheme="minorHAnsi" w:eastAsiaTheme="minorEastAsia" w:hAnsiTheme="minorHAnsi" w:cstheme="minorBidi"/>
           <w:noProof/>
           <w:kern w:val="2"/>
+          <w:lang w:eastAsia="ja-JP"/>
           <w14:ligatures w14:val="standardContextual"/>
         </w:rPr>
       </w:pPr>
-      <w:hyperlink w:anchor="_Toc240744414" w:history="1">
+      <w:hyperlink w:anchor="_Toc243487862" w:history="1">
         <w:r>
           <w:rPr>
             <w:rStyle w:val="Hyperlink"/>
@@ -1286,7 +1280,7 @@
             <w:noProof/>
             <w:webHidden/>
           </w:rPr>
-          <w:instrText xml:space="preserve"> PAGEREF _Toc240744414 \h </w:instrText>
+          <w:instrText xml:space="preserve"> PAGEREF _Toc243487862 \h </w:instrText>
         </w:r>
         <w:r>
           <w:rPr>
@@ -1327,10 +1321,11 @@
           <w:rFonts w:asciiTheme="minorHAnsi" w:eastAsiaTheme="minorEastAsia" w:hAnsiTheme="minorHAnsi" w:cstheme="minorBidi"/>
           <w:noProof/>
           <w:kern w:val="2"/>
+          <w:lang w:eastAsia="ja-JP"/>
           <w14:ligatures w14:val="standardContextual"/>
         </w:rPr>
       </w:pPr>
-      <w:hyperlink w:anchor="_Toc240744415" w:history="1">
+      <w:hyperlink w:anchor="_Toc243487863" w:history="1">
         <w:r>
           <w:rPr>
             <w:rStyle w:val="Hyperlink"/>
@@ -1357,7 +1352,7 @@
             <w:noProof/>
             <w:webHidden/>
           </w:rPr>
-          <w:instrText xml:space="preserve"> PAGEREF _Toc240744415 \h </w:instrText>
+          <w:instrText xml:space="preserve"> PAGEREF _Toc243487863 \h </w:instrText>
         </w:r>
         <w:r>
           <w:rPr>
@@ -1398,10 +1393,11 @@
           <w:rFonts w:asciiTheme="minorHAnsi" w:eastAsiaTheme="minorEastAsia" w:hAnsiTheme="minorHAnsi" w:cstheme="minorBidi"/>
           <w:noProof/>
           <w:kern w:val="2"/>
+          <w:lang w:eastAsia="ja-JP"/>
           <w14:ligatures w14:val="standardContextual"/>
         </w:rPr>
       </w:pPr>
-      <w:hyperlink w:anchor="_Toc240744416" w:history="1">
+      <w:hyperlink w:anchor="_Toc243487864" w:history="1">
         <w:r>
           <w:rPr>
             <w:rStyle w:val="Hyperlink"/>
@@ -1428,7 +1424,7 @@
             <w:noProof/>
             <w:webHidden/>
           </w:rPr>
-          <w:instrText xml:space="preserve"> PAGEREF _Toc240744416 \h </w:instrText>
+          <w:instrText xml:space="preserve"> PAGEREF _Toc243487864 \h </w:instrText>
         </w:r>
         <w:r>
           <w:rPr>
@@ -1469,10 +1465,11 @@
           <w:rFonts w:asciiTheme="minorHAnsi" w:eastAsiaTheme="minorEastAsia" w:hAnsiTheme="minorHAnsi" w:cstheme="minorBidi"/>
           <w:noProof/>
           <w:kern w:val="2"/>
+          <w:lang w:eastAsia="ja-JP"/>
           <w14:ligatures w14:val="standardContextual"/>
         </w:rPr>
       </w:pPr>
-      <w:hyperlink w:anchor="_Toc240744417" w:history="1">
+      <w:hyperlink w:anchor="_Toc243487865" w:history="1">
         <w:r>
           <w:rPr>
             <w:rStyle w:val="Hyperlink"/>
@@ -1499,7 +1496,7 @@
             <w:noProof/>
             <w:webHidden/>
           </w:rPr>
-          <w:instrText xml:space="preserve"> PAGEREF _Toc240744417 \h </w:instrText>
+          <w:instrText xml:space="preserve"> PAGEREF _Toc243487865 \h </w:instrText>
         </w:r>
         <w:r>
           <w:rPr>
@@ -1540,10 +1537,11 @@
           <w:rFonts w:asciiTheme="minorHAnsi" w:eastAsiaTheme="minorEastAsia" w:hAnsiTheme="minorHAnsi" w:cstheme="minorBidi"/>
           <w:noProof/>
           <w:kern w:val="2"/>
+          <w:lang w:eastAsia="ja-JP"/>
           <w14:ligatures w14:val="standardContextual"/>
         </w:rPr>
       </w:pPr>
-      <w:hyperlink w:anchor="_Toc240744418" w:history="1">
+      <w:hyperlink w:anchor="_Toc243487866" w:history="1">
         <w:r>
           <w:rPr>
             <w:rStyle w:val="Hyperlink"/>
@@ -1570,7 +1568,7 @@
             <w:noProof/>
             <w:webHidden/>
           </w:rPr>
-          <w:instrText xml:space="preserve"> PAGEREF _Toc240744418 \h </w:instrText>
+          <w:instrText xml:space="preserve"> PAGEREF _Toc243487866 \h </w:instrText>
         </w:r>
         <w:r>
           <w:rPr>
@@ -1611,10 +1609,11 @@
           <w:rFonts w:asciiTheme="minorHAnsi" w:eastAsiaTheme="minorEastAsia" w:hAnsiTheme="minorHAnsi" w:cstheme="minorBidi"/>
           <w:noProof/>
           <w:kern w:val="2"/>
+          <w:lang w:eastAsia="ja-JP"/>
           <w14:ligatures w14:val="standardContextual"/>
         </w:rPr>
       </w:pPr>
-      <w:hyperlink w:anchor="_Toc240744419" w:history="1">
+      <w:hyperlink w:anchor="_Toc243487867" w:history="1">
         <w:r>
           <w:rPr>
             <w:rStyle w:val="Hyperlink"/>
@@ -1641,7 +1640,7 @@
             <w:noProof/>
             <w:webHidden/>
           </w:rPr>
-          <w:instrText xml:space="preserve"> PAGEREF _Toc240744419 \h </w:instrText>
+          <w:instrText xml:space="preserve"> PAGEREF _Toc243487867 \h </w:instrText>
         </w:r>
         <w:r>
           <w:rPr>
@@ -1682,10 +1681,11 @@
           <w:rFonts w:asciiTheme="minorHAnsi" w:eastAsiaTheme="minorEastAsia" w:hAnsiTheme="minorHAnsi" w:cstheme="minorBidi"/>
           <w:noProof/>
           <w:kern w:val="2"/>
+          <w:lang w:eastAsia="ja-JP"/>
           <w14:ligatures w14:val="standardContextual"/>
         </w:rPr>
       </w:pPr>
-      <w:hyperlink w:anchor="_Toc240744420" w:history="1">
+      <w:hyperlink w:anchor="_Toc243487868" w:history="1">
         <w:r>
           <w:rPr>
             <w:rStyle w:val="Hyperlink"/>
@@ -1712,7 +1712,7 @@
             <w:noProof/>
             <w:webHidden/>
           </w:rPr>
-          <w:instrText xml:space="preserve"> PAGEREF _Toc240744420 \h </w:instrText>
+          <w:instrText xml:space="preserve"> PAGEREF _Toc243487868 \h </w:instrText>
         </w:r>
         <w:r>
           <w:rPr>
@@ -1753,10 +1753,11 @@
           <w:rFonts w:asciiTheme="minorHAnsi" w:eastAsiaTheme="minorEastAsia" w:hAnsiTheme="minorHAnsi" w:cstheme="minorBidi"/>
           <w:noProof/>
           <w:kern w:val="2"/>
+          <w:lang w:eastAsia="ja-JP"/>
           <w14:ligatures w14:val="standardContextual"/>
         </w:rPr>
       </w:pPr>
-      <w:hyperlink w:anchor="_Toc240744421" w:history="1">
+      <w:hyperlink w:anchor="_Toc243487869" w:history="1">
         <w:r>
           <w:rPr>
             <w:rStyle w:val="Hyperlink"/>
@@ -1783,7 +1784,7 @@
             <w:noProof/>
             <w:webHidden/>
           </w:rPr>
-          <w:instrText xml:space="preserve"> PAGEREF _Toc240744421 \h </w:instrText>
+          <w:instrText xml:space="preserve"> PAGEREF _Toc243487869 \h </w:instrText>
         </w:r>
         <w:r>
           <w:rPr>
@@ -1824,10 +1825,11 @@
           <w:rFonts w:asciiTheme="minorHAnsi" w:eastAsiaTheme="minorEastAsia" w:hAnsiTheme="minorHAnsi" w:cstheme="minorBidi"/>
           <w:noProof/>
           <w:kern w:val="2"/>
+          <w:lang w:eastAsia="ja-JP"/>
           <w14:ligatures w14:val="standardContextual"/>
         </w:rPr>
       </w:pPr>
-      <w:hyperlink w:anchor="_Toc240744422" w:history="1">
+      <w:hyperlink w:anchor="_Toc243487870" w:history="1">
         <w:r>
           <w:rPr>
             <w:rStyle w:val="Hyperlink"/>
@@ -1854,7 +1856,7 @@
             <w:noProof/>
             <w:webHidden/>
           </w:rPr>
-          <w:instrText xml:space="preserve"> PAGEREF _Toc240744422 \h </w:instrText>
+          <w:instrText xml:space="preserve"> PAGEREF _Toc243487870 \h </w:instrText>
         </w:r>
         <w:r>
           <w:rPr>
@@ -1895,10 +1897,11 @@
           <w:rFonts w:asciiTheme="minorHAnsi" w:eastAsiaTheme="minorEastAsia" w:hAnsiTheme="minorHAnsi" w:cstheme="minorBidi"/>
           <w:noProof/>
           <w:kern w:val="2"/>
+          <w:lang w:eastAsia="ja-JP"/>
           <w14:ligatures w14:val="standardContextual"/>
         </w:rPr>
       </w:pPr>
-      <w:hyperlink w:anchor="_Toc240744423" w:history="1">
+      <w:hyperlink w:anchor="_Toc243487871" w:history="1">
         <w:r>
           <w:rPr>
             <w:rStyle w:val="Hyperlink"/>
@@ -1925,7 +1928,7 @@
             <w:noProof/>
             <w:webHidden/>
           </w:rPr>
-          <w:instrText xml:space="preserve"> PAGEREF _Toc240744423 \h </w:instrText>
+          <w:instrText xml:space="preserve"> PAGEREF _Toc243487871 \h </w:instrText>
         </w:r>
         <w:r>
           <w:rPr>
@@ -1966,10 +1969,11 @@
           <w:rFonts w:asciiTheme="minorHAnsi" w:eastAsiaTheme="minorEastAsia" w:hAnsiTheme="minorHAnsi" w:cstheme="minorBidi"/>
           <w:noProof/>
           <w:kern w:val="2"/>
+          <w:lang w:eastAsia="ja-JP"/>
           <w14:ligatures w14:val="standardContextual"/>
         </w:rPr>
       </w:pPr>
-      <w:hyperlink w:anchor="_Toc240744424" w:history="1">
+      <w:hyperlink w:anchor="_Toc243487872" w:history="1">
         <w:r>
           <w:rPr>
             <w:rStyle w:val="Hyperlink"/>
@@ -1996,7 +2000,7 @@
             <w:noProof/>
             <w:webHidden/>
           </w:rPr>
-          <w:instrText xml:space="preserve"> PAGEREF _Toc240744424 \h </w:instrText>
+          <w:instrText xml:space="preserve"> PAGEREF _Toc243487872 \h </w:instrText>
         </w:r>
         <w:r>
           <w:rPr>
@@ -2037,10 +2041,11 @@
           <w:rFonts w:asciiTheme="minorHAnsi" w:eastAsiaTheme="minorEastAsia" w:hAnsiTheme="minorHAnsi" w:cstheme="minorBidi"/>
           <w:noProof/>
           <w:kern w:val="2"/>
+          <w:lang w:eastAsia="ja-JP"/>
           <w14:ligatures w14:val="standardContextual"/>
         </w:rPr>
       </w:pPr>
-      <w:hyperlink w:anchor="_Toc240744425" w:history="1">
+      <w:hyperlink w:anchor="_Toc243487873" w:history="1">
         <w:r>
           <w:rPr>
             <w:rStyle w:val="Hyperlink"/>
@@ -2067,7 +2072,7 @@
             <w:noProof/>
             <w:webHidden/>
           </w:rPr>
-          <w:instrText xml:space="preserve"> PAGEREF _Toc240744425 \h </w:instrText>
+          <w:instrText xml:space="preserve"> PAGEREF _Toc243487873 \h </w:instrText>
         </w:r>
         <w:r>
           <w:rPr>
@@ -2108,10 +2113,11 @@
           <w:rFonts w:asciiTheme="minorHAnsi" w:eastAsiaTheme="minorEastAsia" w:hAnsiTheme="minorHAnsi" w:cstheme="minorBidi"/>
           <w:noProof/>
           <w:kern w:val="2"/>
+          <w:lang w:eastAsia="ja-JP"/>
           <w14:ligatures w14:val="standardContextual"/>
         </w:rPr>
       </w:pPr>
-      <w:hyperlink w:anchor="_Toc240744426" w:history="1">
+      <w:hyperlink w:anchor="_Toc243487874" w:history="1">
         <w:r>
           <w:rPr>
             <w:rStyle w:val="Hyperlink"/>
@@ -2138,7 +2144,7 @@
             <w:noProof/>
             <w:webHidden/>
           </w:rPr>
-          <w:instrText xml:space="preserve"> PAGEREF _Toc240744426 \h </w:instrText>
+          <w:instrText xml:space="preserve"> PAGEREF _Toc243487874 \h </w:instrText>
         </w:r>
         <w:r>
           <w:rPr>
@@ -2179,10 +2185,11 @@
           <w:rFonts w:asciiTheme="minorHAnsi" w:eastAsiaTheme="minorEastAsia" w:hAnsiTheme="minorHAnsi" w:cstheme="minorBidi"/>
           <w:noProof/>
           <w:kern w:val="2"/>
+          <w:lang w:eastAsia="ja-JP"/>
           <w14:ligatures w14:val="standardContextual"/>
         </w:rPr>
       </w:pPr>
-      <w:hyperlink w:anchor="_Toc240744427" w:history="1">
+      <w:hyperlink w:anchor="_Toc243487875" w:history="1">
         <w:r>
           <w:rPr>
             <w:rStyle w:val="Hyperlink"/>
@@ -2209,7 +2216,7 @@
             <w:noProof/>
             <w:webHidden/>
           </w:rPr>
-          <w:instrText xml:space="preserve"> PAGEREF _Toc240744427 \h </w:instrText>
+          <w:instrText xml:space="preserve"> PAGEREF _Toc243487875 \h </w:instrText>
         </w:r>
         <w:r>
           <w:rPr>
@@ -2250,10 +2257,11 @@
           <w:rFonts w:asciiTheme="minorHAnsi" w:eastAsiaTheme="minorEastAsia" w:hAnsiTheme="minorHAnsi" w:cstheme="minorBidi"/>
           <w:noProof/>
           <w:kern w:val="2"/>
+          <w:lang w:eastAsia="ja-JP"/>
           <w14:ligatures w14:val="standardContextual"/>
         </w:rPr>
       </w:pPr>
-      <w:hyperlink w:anchor="_Toc240744428" w:history="1">
+      <w:hyperlink w:anchor="_Toc243487876" w:history="1">
         <w:r>
           <w:rPr>
             <w:rStyle w:val="Hyperlink"/>
@@ -2280,7 +2288,7 @@
             <w:noProof/>
             <w:webHidden/>
           </w:rPr>
-          <w:instrText xml:space="preserve"> PAGEREF _Toc240744428 \h </w:instrText>
+          <w:instrText xml:space="preserve"> PAGEREF _Toc243487876 \h </w:instrText>
         </w:r>
         <w:r>
           <w:rPr>
@@ -2321,10 +2329,11 @@
           <w:rFonts w:asciiTheme="minorHAnsi" w:eastAsiaTheme="minorEastAsia" w:hAnsiTheme="minorHAnsi" w:cstheme="minorBidi"/>
           <w:noProof/>
           <w:kern w:val="2"/>
+          <w:lang w:eastAsia="ja-JP"/>
           <w14:ligatures w14:val="standardContextual"/>
         </w:rPr>
       </w:pPr>
-      <w:hyperlink w:anchor="_Toc240744429" w:history="1">
+      <w:hyperlink w:anchor="_Toc243487877" w:history="1">
         <w:r>
           <w:rPr>
             <w:rStyle w:val="Hyperlink"/>
@@ -2351,7 +2360,7 @@
             <w:noProof/>
             <w:webHidden/>
           </w:rPr>
-          <w:instrText xml:space="preserve"> PAGEREF _Toc240744429 \h </w:instrText>
+          <w:instrText xml:space="preserve"> PAGEREF _Toc243487877 \h </w:instrText>
         </w:r>
         <w:r>
           <w:rPr>
@@ -2392,10 +2401,11 @@
           <w:rFonts w:asciiTheme="minorHAnsi" w:eastAsiaTheme="minorEastAsia" w:hAnsiTheme="minorHAnsi" w:cstheme="minorBidi"/>
           <w:noProof/>
           <w:kern w:val="2"/>
+          <w:lang w:eastAsia="ja-JP"/>
           <w14:ligatures w14:val="standardContextual"/>
         </w:rPr>
       </w:pPr>
-      <w:hyperlink w:anchor="_Toc240744430" w:history="1">
+      <w:hyperlink w:anchor="_Toc243487878" w:history="1">
         <w:r>
           <w:rPr>
             <w:rStyle w:val="Hyperlink"/>
@@ -2422,7 +2432,7 @@
             <w:noProof/>
             <w:webHidden/>
           </w:rPr>
-          <w:instrText xml:space="preserve"> PAGEREF _Toc240744430 \h </w:instrText>
+          <w:instrText xml:space="preserve"> PAGEREF _Toc243487878 \h </w:instrText>
         </w:r>
         <w:r>
           <w:rPr>
@@ -2463,10 +2473,11 @@
           <w:rFonts w:asciiTheme="minorHAnsi" w:eastAsiaTheme="minorEastAsia" w:hAnsiTheme="minorHAnsi" w:cstheme="minorBidi"/>
           <w:noProof/>
           <w:kern w:val="2"/>
+          <w:lang w:eastAsia="ja-JP"/>
           <w14:ligatures w14:val="standardContextual"/>
         </w:rPr>
       </w:pPr>
-      <w:hyperlink w:anchor="_Toc240744431" w:history="1">
+      <w:hyperlink w:anchor="_Toc243487879" w:history="1">
         <w:r>
           <w:rPr>
             <w:rStyle w:val="Hyperlink"/>
@@ -2493,7 +2504,7 @@
             <w:noProof/>
             <w:webHidden/>
           </w:rPr>
-          <w:instrText xml:space="preserve"> PAGEREF _Toc240744431 \h </w:instrText>
+          <w:instrText xml:space="preserve"> PAGEREF _Toc243487879 \h </w:instrText>
         </w:r>
         <w:r>
           <w:rPr>
@@ -2534,10 +2545,11 @@
           <w:rFonts w:asciiTheme="minorHAnsi" w:eastAsiaTheme="minorEastAsia" w:hAnsiTheme="minorHAnsi" w:cstheme="minorBidi"/>
           <w:noProof/>
           <w:kern w:val="2"/>
+          <w:lang w:eastAsia="ja-JP"/>
           <w14:ligatures w14:val="standardContextual"/>
         </w:rPr>
       </w:pPr>
-      <w:hyperlink w:anchor="_Toc240744432" w:history="1">
+      <w:hyperlink w:anchor="_Toc243487880" w:history="1">
         <w:r>
           <w:rPr>
             <w:rStyle w:val="Hyperlink"/>
@@ -2564,7 +2576,7 @@
             <w:noProof/>
             <w:webHidden/>
           </w:rPr>
-          <w:instrText xml:space="preserve"> PAGEREF _Toc240744432 \h </w:instrText>
+          <w:instrText xml:space="preserve"> PAGEREF _Toc243487880 \h </w:instrText>
         </w:r>
         <w:r>
           <w:rPr>
@@ -2605,10 +2617,11 @@
           <w:rFonts w:asciiTheme="minorHAnsi" w:eastAsiaTheme="minorEastAsia" w:hAnsiTheme="minorHAnsi" w:cstheme="minorBidi"/>
           <w:noProof/>
           <w:kern w:val="2"/>
+          <w:lang w:eastAsia="ja-JP"/>
           <w14:ligatures w14:val="standardContextual"/>
         </w:rPr>
       </w:pPr>
-      <w:hyperlink w:anchor="_Toc240744433" w:history="1">
+      <w:hyperlink w:anchor="_Toc243487881" w:history="1">
         <w:r>
           <w:rPr>
             <w:rStyle w:val="Hyperlink"/>
@@ -2635,7 +2648,7 @@
             <w:noProof/>
             <w:webHidden/>
           </w:rPr>
-          <w:instrText xml:space="preserve"> PAGEREF _Toc240744433 \h </w:instrText>
+          <w:instrText xml:space="preserve"> PAGEREF _Toc243487881 \h </w:instrText>
         </w:r>
         <w:r>
           <w:rPr>
@@ -2676,10 +2689,11 @@
           <w:rFonts w:asciiTheme="minorHAnsi" w:eastAsiaTheme="minorEastAsia" w:hAnsiTheme="minorHAnsi" w:cstheme="minorBidi"/>
           <w:noProof/>
           <w:kern w:val="2"/>
+          <w:lang w:eastAsia="ja-JP"/>
           <w14:ligatures w14:val="standardContextual"/>
         </w:rPr>
       </w:pPr>
-      <w:hyperlink w:anchor="_Toc240744434" w:history="1">
+      <w:hyperlink w:anchor="_Toc243487882" w:history="1">
         <w:r>
           <w:rPr>
             <w:rStyle w:val="Hyperlink"/>
@@ -2706,7 +2720,7 @@
             <w:noProof/>
             <w:webHidden/>
           </w:rPr>
-          <w:instrText xml:space="preserve"> PAGEREF _Toc240744434 \h </w:instrText>
+          <w:instrText xml:space="preserve"> PAGEREF _Toc243487882 \h </w:instrText>
         </w:r>
         <w:r>
           <w:rPr>
@@ -2747,10 +2761,11 @@
           <w:rFonts w:asciiTheme="minorHAnsi" w:eastAsiaTheme="minorEastAsia" w:hAnsiTheme="minorHAnsi" w:cstheme="minorBidi"/>
           <w:noProof/>
           <w:kern w:val="2"/>
+          <w:lang w:eastAsia="ja-JP"/>
           <w14:ligatures w14:val="standardContextual"/>
         </w:rPr>
       </w:pPr>
-      <w:hyperlink w:anchor="_Toc240744435" w:history="1">
+      <w:hyperlink w:anchor="_Toc243487883" w:history="1">
         <w:r>
           <w:rPr>
             <w:rStyle w:val="Hyperlink"/>
@@ -2777,7 +2792,7 @@
             <w:noProof/>
             <w:webHidden/>
           </w:rPr>
-          <w:instrText xml:space="preserve"> PAGEREF _Toc240744435 \h </w:instrText>
+          <w:instrText xml:space="preserve"> PAGEREF _Toc243487883 \h </w:instrText>
         </w:r>
         <w:r>
           <w:rPr>
@@ -2818,10 +2833,11 @@
           <w:rFonts w:asciiTheme="minorHAnsi" w:eastAsiaTheme="minorEastAsia" w:hAnsiTheme="minorHAnsi" w:cstheme="minorBidi"/>
           <w:noProof/>
           <w:kern w:val="2"/>
+          <w:lang w:eastAsia="ja-JP"/>
           <w14:ligatures w14:val="standardContextual"/>
         </w:rPr>
       </w:pPr>
-      <w:hyperlink w:anchor="_Toc240744436" w:history="1">
+      <w:hyperlink w:anchor="_Toc243487884" w:history="1">
         <w:r>
           <w:rPr>
             <w:rStyle w:val="Hyperlink"/>
@@ -2848,7 +2864,7 @@
             <w:noProof/>
             <w:webHidden/>
           </w:rPr>
-          <w:instrText xml:space="preserve"> PAGEREF _Toc240744436 \h </w:instrText>
+          <w:instrText xml:space="preserve"> PAGEREF _Toc243487884 \h </w:instrText>
         </w:r>
         <w:r>
           <w:rPr>
@@ -2889,10 +2905,11 @@
           <w:rFonts w:asciiTheme="minorHAnsi" w:eastAsiaTheme="minorEastAsia" w:hAnsiTheme="minorHAnsi" w:cstheme="minorBidi"/>
           <w:noProof/>
           <w:kern w:val="2"/>
+          <w:lang w:eastAsia="ja-JP"/>
           <w14:ligatures w14:val="standardContextual"/>
         </w:rPr>
       </w:pPr>
-      <w:hyperlink w:anchor="_Toc240744437" w:history="1">
+      <w:hyperlink w:anchor="_Toc243487885" w:history="1">
         <w:r>
           <w:rPr>
             <w:rStyle w:val="Hyperlink"/>
@@ -2919,7 +2936,7 @@
             <w:noProof/>
             <w:webHidden/>
           </w:rPr>
-          <w:instrText xml:space="preserve"> PAGEREF _Toc240744437 \h </w:instrText>
+          <w:instrText xml:space="preserve"> PAGEREF _Toc243487885 \h </w:instrText>
         </w:r>
         <w:r>
           <w:rPr>
@@ -2960,10 +2977,11 @@
           <w:rFonts w:asciiTheme="minorHAnsi" w:eastAsiaTheme="minorEastAsia" w:hAnsiTheme="minorHAnsi" w:cstheme="minorBidi"/>
           <w:noProof/>
           <w:kern w:val="2"/>
+          <w:lang w:eastAsia="ja-JP"/>
           <w14:ligatures w14:val="standardContextual"/>
         </w:rPr>
       </w:pPr>
-      <w:hyperlink w:anchor="_Toc240744438" w:history="1">
+      <w:hyperlink w:anchor="_Toc243487886" w:history="1">
         <w:r>
           <w:rPr>
             <w:rStyle w:val="Hyperlink"/>
@@ -2990,7 +3008,7 @@
             <w:noProof/>
             <w:webHidden/>
           </w:rPr>
-          <w:instrText xml:space="preserve"> PAGEREF _Toc240744438 \h </w:instrText>
+          <w:instrText xml:space="preserve"> PAGEREF _Toc243487886 \h </w:instrText>
         </w:r>
         <w:r>
           <w:rPr>
@@ -3031,10 +3049,11 @@
           <w:rFonts w:asciiTheme="minorHAnsi" w:eastAsiaTheme="minorEastAsia" w:hAnsiTheme="minorHAnsi" w:cstheme="minorBidi"/>
           <w:noProof/>
           <w:kern w:val="2"/>
+          <w:lang w:eastAsia="ja-JP"/>
           <w14:ligatures w14:val="standardContextual"/>
         </w:rPr>
       </w:pPr>
-      <w:hyperlink w:anchor="_Toc240744439" w:history="1">
+      <w:hyperlink w:anchor="_Toc243487887" w:history="1">
         <w:r>
           <w:rPr>
             <w:rStyle w:val="Hyperlink"/>
@@ -3061,7 +3080,7 @@
             <w:noProof/>
             <w:webHidden/>
           </w:rPr>
-          <w:instrText xml:space="preserve"> PAGEREF _Toc240744439 \h </w:instrText>
+          <w:instrText xml:space="preserve"> PAGEREF _Toc243487887 \h </w:instrText>
         </w:r>
         <w:r>
           <w:rPr>
@@ -3102,10 +3121,11 @@
           <w:rFonts w:asciiTheme="minorHAnsi" w:eastAsiaTheme="minorEastAsia" w:hAnsiTheme="minorHAnsi" w:cstheme="minorBidi"/>
           <w:noProof/>
           <w:kern w:val="2"/>
+          <w:lang w:eastAsia="ja-JP"/>
           <w14:ligatures w14:val="standardContextual"/>
         </w:rPr>
       </w:pPr>
-      <w:hyperlink w:anchor="_Toc240744440" w:history="1">
+      <w:hyperlink w:anchor="_Toc243487888" w:history="1">
         <w:r>
           <w:rPr>
             <w:rStyle w:val="Hyperlink"/>
@@ -3132,7 +3152,7 @@
             <w:noProof/>
             <w:webHidden/>
           </w:rPr>
-          <w:instrText xml:space="preserve"> PAGEREF _Toc240744440 \h </w:instrText>
+          <w:instrText xml:space="preserve"> PAGEREF _Toc243487888 \h </w:instrText>
         </w:r>
         <w:r>
           <w:rPr>
@@ -3152,7 +3172,7 @@
             <w:noProof/>
             <w:webHidden/>
           </w:rPr>
-          <w:t>21</w:t>
+          <w:t>22</w:t>
         </w:r>
         <w:r>
           <w:rPr>
@@ -3173,10 +3193,11 @@
           <w:rFonts w:asciiTheme="minorHAnsi" w:eastAsiaTheme="minorEastAsia" w:hAnsiTheme="minorHAnsi" w:cstheme="minorBidi"/>
           <w:noProof/>
           <w:kern w:val="2"/>
+          <w:lang w:eastAsia="ja-JP"/>
           <w14:ligatures w14:val="standardContextual"/>
         </w:rPr>
       </w:pPr>
-      <w:hyperlink w:anchor="_Toc240744441" w:history="1">
+      <w:hyperlink w:anchor="_Toc243487889" w:history="1">
         <w:r>
           <w:rPr>
             <w:rStyle w:val="Hyperlink"/>
@@ -3203,7 +3224,7 @@
             <w:noProof/>
             <w:webHidden/>
           </w:rPr>
-          <w:instrText xml:space="preserve"> PAGEREF _Toc240744441 \h </w:instrText>
+          <w:instrText xml:space="preserve"> PAGEREF _Toc243487889 \h </w:instrText>
         </w:r>
         <w:r>
           <w:rPr>
@@ -3244,10 +3265,11 @@
           <w:rFonts w:asciiTheme="minorHAnsi" w:eastAsiaTheme="minorEastAsia" w:hAnsiTheme="minorHAnsi" w:cstheme="minorBidi"/>
           <w:noProof/>
           <w:kern w:val="2"/>
+          <w:lang w:eastAsia="ja-JP"/>
           <w14:ligatures w14:val="standardContextual"/>
         </w:rPr>
       </w:pPr>
-      <w:hyperlink w:anchor="_Toc240744442" w:history="1">
+      <w:hyperlink w:anchor="_Toc243487890" w:history="1">
         <w:r>
           <w:rPr>
             <w:rStyle w:val="Hyperlink"/>
@@ -3274,7 +3296,7 @@
             <w:noProof/>
             <w:webHidden/>
           </w:rPr>
-          <w:instrText xml:space="preserve"> PAGEREF _Toc240744442 \h </w:instrText>
+          <w:instrText xml:space="preserve"> PAGEREF _Toc243487890 \h </w:instrText>
         </w:r>
         <w:r>
           <w:rPr>
@@ -3294,7 +3316,7 @@
             <w:noProof/>
             <w:webHidden/>
           </w:rPr>
-          <w:t>22</w:t>
+          <w:t>23</w:t>
         </w:r>
         <w:r>
           <w:rPr>
@@ -3315,10 +3337,11 @@
           <w:rFonts w:asciiTheme="minorHAnsi" w:eastAsiaTheme="minorEastAsia" w:hAnsiTheme="minorHAnsi" w:cstheme="minorBidi"/>
           <w:noProof/>
           <w:kern w:val="2"/>
+          <w:lang w:eastAsia="ja-JP"/>
           <w14:ligatures w14:val="standardContextual"/>
         </w:rPr>
       </w:pPr>
-      <w:hyperlink w:anchor="_Toc240744443" w:history="1">
+      <w:hyperlink w:anchor="_Toc243487891" w:history="1">
         <w:r>
           <w:rPr>
             <w:rStyle w:val="Hyperlink"/>
@@ -3345,7 +3368,7 @@
             <w:noProof/>
             <w:webHidden/>
           </w:rPr>
-          <w:instrText xml:space="preserve"> PAGEREF _Toc240744443 \h </w:instrText>
+          <w:instrText xml:space="preserve"> PAGEREF _Toc243487891 \h </w:instrText>
         </w:r>
         <w:r>
           <w:rPr>
@@ -3365,7 +3388,7 @@
             <w:noProof/>
             <w:webHidden/>
           </w:rPr>
-          <w:t>23</w:t>
+          <w:t>25</w:t>
         </w:r>
         <w:r>
           <w:rPr>
@@ -3386,10 +3409,11 @@
           <w:rFonts w:asciiTheme="minorHAnsi" w:eastAsiaTheme="minorEastAsia" w:hAnsiTheme="minorHAnsi" w:cstheme="minorBidi"/>
           <w:noProof/>
           <w:kern w:val="2"/>
+          <w:lang w:eastAsia="ja-JP"/>
           <w14:ligatures w14:val="standardContextual"/>
         </w:rPr>
       </w:pPr>
-      <w:hyperlink w:anchor="_Toc240744444" w:history="1">
+      <w:hyperlink w:anchor="_Toc243487892" w:history="1">
         <w:r>
           <w:rPr>
             <w:rStyle w:val="Hyperlink"/>
@@ -3416,7 +3440,7 @@
             <w:noProof/>
             <w:webHidden/>
           </w:rPr>
-          <w:instrText xml:space="preserve"> PAGEREF _Toc240744444 \h </w:instrText>
+          <w:instrText xml:space="preserve"> PAGEREF _Toc243487892 \h </w:instrText>
         </w:r>
         <w:r>
           <w:rPr>
@@ -3436,7 +3460,7 @@
             <w:noProof/>
             <w:webHidden/>
           </w:rPr>
-          <w:t>23</w:t>
+          <w:t>25</w:t>
         </w:r>
         <w:r>
           <w:rPr>
@@ -3457,10 +3481,11 @@
           <w:rFonts w:asciiTheme="minorHAnsi" w:eastAsiaTheme="minorEastAsia" w:hAnsiTheme="minorHAnsi" w:cstheme="minorBidi"/>
           <w:noProof/>
           <w:kern w:val="2"/>
+          <w:lang w:eastAsia="ja-JP"/>
           <w14:ligatures w14:val="standardContextual"/>
         </w:rPr>
       </w:pPr>
-      <w:hyperlink w:anchor="_Toc240744445" w:history="1">
+      <w:hyperlink w:anchor="_Toc243487893" w:history="1">
         <w:r>
           <w:rPr>
             <w:rStyle w:val="Hyperlink"/>
@@ -3487,7 +3512,7 @@
             <w:noProof/>
             <w:webHidden/>
           </w:rPr>
-          <w:instrText xml:space="preserve"> PAGEREF _Toc240744445 \h </w:instrText>
+          <w:instrText xml:space="preserve"> PAGEREF _Toc243487893 \h </w:instrText>
         </w:r>
         <w:r>
           <w:rPr>
@@ -3507,7 +3532,7 @@
             <w:noProof/>
             <w:webHidden/>
           </w:rPr>
-          <w:t>25</w:t>
+          <w:t>27</w:t>
         </w:r>
         <w:r>
           <w:rPr>
@@ -3528,10 +3553,11 @@
           <w:rFonts w:asciiTheme="minorHAnsi" w:eastAsiaTheme="minorEastAsia" w:hAnsiTheme="minorHAnsi" w:cstheme="minorBidi"/>
           <w:noProof/>
           <w:kern w:val="2"/>
+          <w:lang w:eastAsia="ja-JP"/>
           <w14:ligatures w14:val="standardContextual"/>
         </w:rPr>
       </w:pPr>
-      <w:hyperlink w:anchor="_Toc240744446" w:history="1">
+      <w:hyperlink w:anchor="_Toc243487894" w:history="1">
         <w:r>
           <w:rPr>
             <w:rStyle w:val="Hyperlink"/>
@@ -3558,7 +3584,7 @@
             <w:noProof/>
             <w:webHidden/>
           </w:rPr>
-          <w:instrText xml:space="preserve"> PAGEREF _Toc240744446 \h </w:instrText>
+          <w:instrText xml:space="preserve"> PAGEREF _Toc243487894 \h </w:instrText>
         </w:r>
         <w:r>
           <w:rPr>
@@ -3578,7 +3604,7 @@
             <w:noProof/>
             <w:webHidden/>
           </w:rPr>
-          <w:t>25</w:t>
+          <w:t>27</w:t>
         </w:r>
         <w:r>
           <w:rPr>
@@ -3599,10 +3625,11 @@
           <w:rFonts w:asciiTheme="minorHAnsi" w:eastAsiaTheme="minorEastAsia" w:hAnsiTheme="minorHAnsi" w:cstheme="minorBidi"/>
           <w:noProof/>
           <w:kern w:val="2"/>
+          <w:lang w:eastAsia="ja-JP"/>
           <w14:ligatures w14:val="standardContextual"/>
         </w:rPr>
       </w:pPr>
-      <w:hyperlink w:anchor="_Toc240744447" w:history="1">
+      <w:hyperlink w:anchor="_Toc243487895" w:history="1">
         <w:r>
           <w:rPr>
             <w:rStyle w:val="Hyperlink"/>
@@ -3629,7 +3656,7 @@
             <w:noProof/>
             <w:webHidden/>
           </w:rPr>
-          <w:instrText xml:space="preserve"> PAGEREF _Toc240744447 \h </w:instrText>
+          <w:instrText xml:space="preserve"> PAGEREF _Toc243487895 \h </w:instrText>
         </w:r>
         <w:r>
           <w:rPr>
@@ -3649,7 +3676,7 @@
             <w:noProof/>
             <w:webHidden/>
           </w:rPr>
-          <w:t>26</w:t>
+          <w:t>28</w:t>
         </w:r>
         <w:r>
           <w:rPr>
@@ -3670,10 +3697,11 @@
           <w:rFonts w:asciiTheme="minorHAnsi" w:eastAsiaTheme="minorEastAsia" w:hAnsiTheme="minorHAnsi" w:cstheme="minorBidi"/>
           <w:noProof/>
           <w:kern w:val="2"/>
+          <w:lang w:eastAsia="ja-JP"/>
           <w14:ligatures w14:val="standardContextual"/>
         </w:rPr>
       </w:pPr>
-      <w:hyperlink w:anchor="_Toc240744448" w:history="1">
+      <w:hyperlink w:anchor="_Toc243487896" w:history="1">
         <w:r>
           <w:rPr>
             <w:rStyle w:val="Hyperlink"/>
@@ -3700,7 +3728,7 @@
             <w:noProof/>
             <w:webHidden/>
           </w:rPr>
-          <w:instrText xml:space="preserve"> PAGEREF _Toc240744448 \h </w:instrText>
+          <w:instrText xml:space="preserve"> PAGEREF _Toc243487896 \h </w:instrText>
         </w:r>
         <w:r>
           <w:rPr>
@@ -3720,7 +3748,7 @@
             <w:noProof/>
             <w:webHidden/>
           </w:rPr>
-          <w:t>27</w:t>
+          <w:t>29</w:t>
         </w:r>
         <w:r>
           <w:rPr>
@@ -3741,10 +3769,11 @@
           <w:rFonts w:asciiTheme="minorHAnsi" w:eastAsiaTheme="minorEastAsia" w:hAnsiTheme="minorHAnsi" w:cstheme="minorBidi"/>
           <w:noProof/>
           <w:kern w:val="2"/>
+          <w:lang w:eastAsia="ja-JP"/>
           <w14:ligatures w14:val="standardContextual"/>
         </w:rPr>
       </w:pPr>
-      <w:hyperlink w:anchor="_Toc240744449" w:history="1">
+      <w:hyperlink w:anchor="_Toc243487897" w:history="1">
         <w:r>
           <w:rPr>
             <w:rStyle w:val="Hyperlink"/>
@@ -3771,7 +3800,7 @@
             <w:noProof/>
             <w:webHidden/>
           </w:rPr>
-          <w:instrText xml:space="preserve"> PAGEREF _Toc240744449 \h </w:instrText>
+          <w:instrText xml:space="preserve"> PAGEREF _Toc243487897 \h </w:instrText>
         </w:r>
         <w:r>
           <w:rPr>
@@ -3791,7 +3820,7 @@
             <w:noProof/>
             <w:webHidden/>
           </w:rPr>
-          <w:t>28</w:t>
+          <w:t>30</w:t>
         </w:r>
         <w:r>
           <w:rPr>
@@ -3812,10 +3841,11 @@
           <w:rFonts w:asciiTheme="minorHAnsi" w:eastAsiaTheme="minorEastAsia" w:hAnsiTheme="minorHAnsi" w:cstheme="minorBidi"/>
           <w:noProof/>
           <w:kern w:val="2"/>
+          <w:lang w:eastAsia="ja-JP"/>
           <w14:ligatures w14:val="standardContextual"/>
         </w:rPr>
       </w:pPr>
-      <w:hyperlink w:anchor="_Toc240744450" w:history="1">
+      <w:hyperlink w:anchor="_Toc243487898" w:history="1">
         <w:r>
           <w:rPr>
             <w:rStyle w:val="Hyperlink"/>
@@ -3842,7 +3872,7 @@
             <w:noProof/>
             <w:webHidden/>
           </w:rPr>
-          <w:instrText xml:space="preserve"> PAGEREF _Toc240744450 \h </w:instrText>
+          <w:instrText xml:space="preserve"> PAGEREF _Toc243487898 \h </w:instrText>
         </w:r>
         <w:r>
           <w:rPr>
@@ -3862,7 +3892,7 @@
             <w:noProof/>
             <w:webHidden/>
           </w:rPr>
-          <w:t>29</w:t>
+          <w:t>31</w:t>
         </w:r>
         <w:r>
           <w:rPr>
@@ -3883,16 +3913,17 @@
           <w:rFonts w:asciiTheme="minorHAnsi" w:eastAsiaTheme="minorEastAsia" w:hAnsiTheme="minorHAnsi" w:cstheme="minorBidi"/>
           <w:noProof/>
           <w:kern w:val="2"/>
+          <w:lang w:eastAsia="ja-JP"/>
           <w14:ligatures w14:val="standardContextual"/>
         </w:rPr>
       </w:pPr>
-      <w:hyperlink w:anchor="_Toc240744451" w:history="1">
+      <w:hyperlink w:anchor="_Toc243487899" w:history="1">
         <w:r>
           <w:rPr>
             <w:rStyle w:val="Hyperlink"/>
             <w:noProof/>
           </w:rPr>
-          <w:t>6.6 Threats to validity and remaining gates</w:t>
+          <w:t>6.6 Windows profile comparison</w:t>
         </w:r>
         <w:r>
           <w:rPr>
@@ -3913,7 +3944,7 @@
             <w:noProof/>
             <w:webHidden/>
           </w:rPr>
-          <w:instrText xml:space="preserve"> PAGEREF _Toc240744451 \h </w:instrText>
+          <w:instrText xml:space="preserve"> PAGEREF _Toc243487899 \h </w:instrText>
         </w:r>
         <w:r>
           <w:rPr>
@@ -3933,7 +3964,79 @@
             <w:noProof/>
             <w:webHidden/>
           </w:rPr>
-          <w:t>30</w:t>
+          <w:t>32</w:t>
+        </w:r>
+        <w:r>
+          <w:rPr>
+            <w:noProof/>
+            <w:webHidden/>
+          </w:rPr>
+          <w:fldChar w:fldCharType="end"/>
+        </w:r>
+      </w:hyperlink>
+    </w:p>
+    <w:p>
+      <w:pPr>
+        <w:pStyle w:val="TOC2"/>
+        <w:tabs>
+          <w:tab w:val="right" w:leader="dot" w:pos="8778"/>
+        </w:tabs>
+        <w:rPr>
+          <w:rFonts w:asciiTheme="minorHAnsi" w:eastAsiaTheme="minorEastAsia" w:hAnsiTheme="minorHAnsi" w:cstheme="minorBidi"/>
+          <w:noProof/>
+          <w:kern w:val="2"/>
+          <w:lang w:eastAsia="ja-JP"/>
+          <w14:ligatures w14:val="standardContextual"/>
+        </w:rPr>
+      </w:pPr>
+      <w:hyperlink w:anchor="_Toc243487900" w:history="1">
+        <w:r>
+          <w:rPr>
+            <w:rStyle w:val="Hyperlink"/>
+            <w:noProof/>
+          </w:rPr>
+          <w:t>6.7 Threats to validity and remaining gates</w:t>
+        </w:r>
+        <w:r>
+          <w:rPr>
+            <w:noProof/>
+            <w:webHidden/>
+          </w:rPr>
+          <w:tab/>
+        </w:r>
+        <w:r>
+          <w:rPr>
+            <w:noProof/>
+            <w:webHidden/>
+          </w:rPr>
+          <w:fldChar w:fldCharType="begin"/>
+        </w:r>
+        <w:r>
+          <w:rPr>
+            <w:noProof/>
+            <w:webHidden/>
+          </w:rPr>
+          <w:instrText xml:space="preserve"> PAGEREF _Toc243487900 \h </w:instrText>
+        </w:r>
+        <w:r>
+          <w:rPr>
+            <w:noProof/>
+            <w:webHidden/>
+          </w:rPr>
+        </w:r>
+        <w:r>
+          <w:rPr>
+            <w:noProof/>
+            <w:webHidden/>
+          </w:rPr>
+          <w:fldChar w:fldCharType="separate"/>
+        </w:r>
+        <w:r>
+          <w:rPr>
+            <w:noProof/>
+            <w:webHidden/>
+          </w:rPr>
+          <w:t>32</w:t>
         </w:r>
         <w:r>
           <w:rPr>
@@ -3954,10 +4057,11 @@
           <w:rFonts w:asciiTheme="minorHAnsi" w:eastAsiaTheme="minorEastAsia" w:hAnsiTheme="minorHAnsi" w:cstheme="minorBidi"/>
           <w:noProof/>
           <w:kern w:val="2"/>
+          <w:lang w:eastAsia="ja-JP"/>
           <w14:ligatures w14:val="standardContextual"/>
         </w:rPr>
       </w:pPr>
-      <w:hyperlink w:anchor="_Toc240744452" w:history="1">
+      <w:hyperlink w:anchor="_Toc243487901" w:history="1">
         <w:r>
           <w:rPr>
             <w:rStyle w:val="Hyperlink"/>
@@ -3984,7 +4088,7 @@
             <w:noProof/>
             <w:webHidden/>
           </w:rPr>
-          <w:instrText xml:space="preserve"> PAGEREF _Toc240744452 \h </w:instrText>
+          <w:instrText xml:space="preserve"> PAGEREF _Toc243487901 \h </w:instrText>
         </w:r>
         <w:r>
           <w:rPr>
@@ -4004,7 +4108,7 @@
             <w:noProof/>
             <w:webHidden/>
           </w:rPr>
-          <w:t>31</w:t>
+          <w:t>35</w:t>
         </w:r>
         <w:r>
           <w:rPr>
@@ -4025,10 +4129,11 @@
           <w:rFonts w:asciiTheme="minorHAnsi" w:eastAsiaTheme="minorEastAsia" w:hAnsiTheme="minorHAnsi" w:cstheme="minorBidi"/>
           <w:noProof/>
           <w:kern w:val="2"/>
+          <w:lang w:eastAsia="ja-JP"/>
           <w14:ligatures w14:val="standardContextual"/>
         </w:rPr>
       </w:pPr>
-      <w:hyperlink w:anchor="_Toc240744453" w:history="1">
+      <w:hyperlink w:anchor="_Toc243487902" w:history="1">
         <w:r>
           <w:rPr>
             <w:rStyle w:val="Hyperlink"/>
@@ -4055,7 +4160,7 @@
             <w:noProof/>
             <w:webHidden/>
           </w:rPr>
-          <w:instrText xml:space="preserve"> PAGEREF _Toc240744453 \h </w:instrText>
+          <w:instrText xml:space="preserve"> PAGEREF _Toc243487902 \h </w:instrText>
         </w:r>
         <w:r>
           <w:rPr>
@@ -4075,7 +4180,7 @@
             <w:noProof/>
             <w:webHidden/>
           </w:rPr>
-          <w:t>31</w:t>
+          <w:t>35</w:t>
         </w:r>
         <w:r>
           <w:rPr>
@@ -4096,10 +4201,11 @@
           <w:rFonts w:asciiTheme="minorHAnsi" w:eastAsiaTheme="minorEastAsia" w:hAnsiTheme="minorHAnsi" w:cstheme="minorBidi"/>
           <w:noProof/>
           <w:kern w:val="2"/>
+          <w:lang w:eastAsia="ja-JP"/>
           <w14:ligatures w14:val="standardContextual"/>
         </w:rPr>
       </w:pPr>
-      <w:hyperlink w:anchor="_Toc240744454" w:history="1">
+      <w:hyperlink w:anchor="_Toc243487903" w:history="1">
         <w:r>
           <w:rPr>
             <w:rStyle w:val="Hyperlink"/>
@@ -4126,7 +4232,7 @@
             <w:noProof/>
             <w:webHidden/>
           </w:rPr>
-          <w:instrText xml:space="preserve"> PAGEREF _Toc240744454 \h </w:instrText>
+          <w:instrText xml:space="preserve"> PAGEREF _Toc243487903 \h </w:instrText>
         </w:r>
         <w:r>
           <w:rPr>
@@ -4146,7 +4252,7 @@
             <w:noProof/>
             <w:webHidden/>
           </w:rPr>
-          <w:t>31</w:t>
+          <w:t>35</w:t>
         </w:r>
         <w:r>
           <w:rPr>
@@ -4167,10 +4273,11 @@
           <w:rFonts w:asciiTheme="minorHAnsi" w:eastAsiaTheme="minorEastAsia" w:hAnsiTheme="minorHAnsi" w:cstheme="minorBidi"/>
           <w:noProof/>
           <w:kern w:val="2"/>
+          <w:lang w:eastAsia="ja-JP"/>
           <w14:ligatures w14:val="standardContextual"/>
         </w:rPr>
       </w:pPr>
-      <w:hyperlink w:anchor="_Toc240744455" w:history="1">
+      <w:hyperlink w:anchor="_Toc243487904" w:history="1">
         <w:r>
           <w:rPr>
             <w:rStyle w:val="Hyperlink"/>
@@ -4197,7 +4304,7 @@
             <w:noProof/>
             <w:webHidden/>
           </w:rPr>
-          <w:instrText xml:space="preserve"> PAGEREF _Toc240744455 \h </w:instrText>
+          <w:instrText xml:space="preserve"> PAGEREF _Toc243487904 \h </w:instrText>
         </w:r>
         <w:r>
           <w:rPr>
@@ -4217,7 +4324,7 @@
             <w:noProof/>
             <w:webHidden/>
           </w:rPr>
-          <w:t>32</w:t>
+          <w:t>36</w:t>
         </w:r>
         <w:r>
           <w:rPr>
@@ -4238,10 +4345,11 @@
           <w:rFonts w:asciiTheme="minorHAnsi" w:eastAsiaTheme="minorEastAsia" w:hAnsiTheme="minorHAnsi" w:cstheme="minorBidi"/>
           <w:noProof/>
           <w:kern w:val="2"/>
+          <w:lang w:eastAsia="ja-JP"/>
           <w14:ligatures w14:val="standardContextual"/>
         </w:rPr>
       </w:pPr>
-      <w:hyperlink w:anchor="_Toc240744456" w:history="1">
+      <w:hyperlink w:anchor="_Toc243487905" w:history="1">
         <w:r>
           <w:rPr>
             <w:rStyle w:val="Hyperlink"/>
@@ -4268,7 +4376,7 @@
             <w:noProof/>
             <w:webHidden/>
           </w:rPr>
-          <w:instrText xml:space="preserve"> PAGEREF _Toc240744456 \h </w:instrText>
+          <w:instrText xml:space="preserve"> PAGEREF _Toc243487905 \h </w:instrText>
         </w:r>
         <w:r>
           <w:rPr>
@@ -4288,7 +4396,7 @@
             <w:noProof/>
             <w:webHidden/>
           </w:rPr>
-          <w:t>34</w:t>
+          <w:t>38</w:t>
         </w:r>
         <w:r>
           <w:rPr>
@@ -4309,10 +4417,11 @@
           <w:rFonts w:asciiTheme="minorHAnsi" w:eastAsiaTheme="minorEastAsia" w:hAnsiTheme="minorHAnsi" w:cstheme="minorBidi"/>
           <w:noProof/>
           <w:kern w:val="2"/>
+          <w:lang w:eastAsia="ja-JP"/>
           <w14:ligatures w14:val="standardContextual"/>
         </w:rPr>
       </w:pPr>
-      <w:hyperlink w:anchor="_Toc240744457" w:history="1">
+      <w:hyperlink w:anchor="_Toc243487906" w:history="1">
         <w:r>
           <w:rPr>
             <w:rStyle w:val="Hyperlink"/>
@@ -4339,7 +4448,7 @@
             <w:noProof/>
             <w:webHidden/>
           </w:rPr>
-          <w:instrText xml:space="preserve"> PAGEREF _Toc240744457 \h </w:instrText>
+          <w:instrText xml:space="preserve"> PAGEREF _Toc243487906 \h </w:instrText>
         </w:r>
         <w:r>
           <w:rPr>
@@ -4359,7 +4468,7 @@
             <w:noProof/>
             <w:webHidden/>
           </w:rPr>
-          <w:t>34</w:t>
+          <w:t>38</w:t>
         </w:r>
         <w:r>
           <w:rPr>
@@ -4380,10 +4489,11 @@
           <w:rFonts w:asciiTheme="minorHAnsi" w:eastAsiaTheme="minorEastAsia" w:hAnsiTheme="minorHAnsi" w:cstheme="minorBidi"/>
           <w:noProof/>
           <w:kern w:val="2"/>
+          <w:lang w:eastAsia="ja-JP"/>
           <w14:ligatures w14:val="standardContextual"/>
         </w:rPr>
       </w:pPr>
-      <w:hyperlink w:anchor="_Toc240744458" w:history="1">
+      <w:hyperlink w:anchor="_Toc243487907" w:history="1">
         <w:r>
           <w:rPr>
             <w:rStyle w:val="Hyperlink"/>
@@ -4410,7 +4520,7 @@
             <w:noProof/>
             <w:webHidden/>
           </w:rPr>
-          <w:instrText xml:space="preserve"> PAGEREF _Toc240744458 \h </w:instrText>
+          <w:instrText xml:space="preserve"> PAGEREF _Toc243487907 \h </w:instrText>
         </w:r>
         <w:r>
           <w:rPr>
@@ -4430,7 +4540,7 @@
             <w:noProof/>
             <w:webHidden/>
           </w:rPr>
-          <w:t>35</w:t>
+          <w:t>39</w:t>
         </w:r>
         <w:r>
           <w:rPr>
@@ -4451,10 +4561,11 @@
           <w:rFonts w:asciiTheme="minorHAnsi" w:eastAsiaTheme="minorEastAsia" w:hAnsiTheme="minorHAnsi" w:cstheme="minorBidi"/>
           <w:noProof/>
           <w:kern w:val="2"/>
+          <w:lang w:eastAsia="ja-JP"/>
           <w14:ligatures w14:val="standardContextual"/>
         </w:rPr>
       </w:pPr>
-      <w:hyperlink w:anchor="_Toc240744459" w:history="1">
+      <w:hyperlink w:anchor="_Toc243487908" w:history="1">
         <w:r>
           <w:rPr>
             <w:rStyle w:val="Hyperlink"/>
@@ -4481,7 +4592,7 @@
             <w:noProof/>
             <w:webHidden/>
           </w:rPr>
-          <w:instrText xml:space="preserve"> PAGEREF _Toc240744459 \h </w:instrText>
+          <w:instrText xml:space="preserve"> PAGEREF _Toc243487908 \h </w:instrText>
         </w:r>
         <w:r>
           <w:rPr>
@@ -4501,7 +4612,7 @@
             <w:noProof/>
             <w:webHidden/>
           </w:rPr>
-          <w:t>36</w:t>
+          <w:t>40</w:t>
         </w:r>
         <w:r>
           <w:rPr>
@@ -4522,10 +4633,11 @@
           <w:rFonts w:asciiTheme="minorHAnsi" w:eastAsiaTheme="minorEastAsia" w:hAnsiTheme="minorHAnsi" w:cstheme="minorBidi"/>
           <w:noProof/>
           <w:kern w:val="2"/>
+          <w:lang w:eastAsia="ja-JP"/>
           <w14:ligatures w14:val="standardContextual"/>
         </w:rPr>
       </w:pPr>
-      <w:hyperlink w:anchor="_Toc240744460" w:history="1">
+      <w:hyperlink w:anchor="_Toc243487909" w:history="1">
         <w:r>
           <w:rPr>
             <w:rStyle w:val="Hyperlink"/>
@@ -4552,7 +4664,7 @@
             <w:noProof/>
             <w:webHidden/>
           </w:rPr>
-          <w:instrText xml:space="preserve"> PAGEREF _Toc240744460 \h </w:instrText>
+          <w:instrText xml:space="preserve"> PAGEREF _Toc243487909 \h </w:instrText>
         </w:r>
         <w:r>
           <w:rPr>
@@ -4572,7 +4684,7 @@
             <w:noProof/>
             <w:webHidden/>
           </w:rPr>
-          <w:t>37</w:t>
+          <w:t>41</w:t>
         </w:r>
         <w:r>
           <w:rPr>
@@ -4611,6 +4723,7 @@
           <w:rFonts w:asciiTheme="minorHAnsi" w:eastAsiaTheme="minorEastAsia" w:hAnsiTheme="minorHAnsi" w:cstheme="minorBidi"/>
           <w:noProof/>
           <w:kern w:val="2"/>
+          <w:lang w:eastAsia="ja-JP"/>
           <w14:ligatures w14:val="standardContextual"/>
         </w:rPr>
       </w:pPr>
@@ -4623,7 +4736,7 @@
       <w:r>
         <w:fldChar w:fldCharType="separate"/>
       </w:r>
-      <w:hyperlink w:anchor="_Toc240744461" w:history="1">
+      <w:hyperlink w:anchor="_Toc243487910" w:history="1">
         <w:r>
           <w:rPr>
             <w:rStyle w:val="Hyperlink"/>
@@ -4650,7 +4763,7 @@
             <w:noProof/>
             <w:webHidden/>
           </w:rPr>
-          <w:instrText xml:space="preserve"> PAGEREF _Toc240744461 \h </w:instrText>
+          <w:instrText xml:space="preserve"> PAGEREF _Toc243487910 \h </w:instrText>
         </w:r>
         <w:r>
           <w:rPr>
@@ -4691,10 +4804,11 @@
           <w:rFonts w:asciiTheme="minorHAnsi" w:eastAsiaTheme="minorEastAsia" w:hAnsiTheme="minorHAnsi" w:cstheme="minorBidi"/>
           <w:noProof/>
           <w:kern w:val="2"/>
+          <w:lang w:eastAsia="ja-JP"/>
           <w14:ligatures w14:val="standardContextual"/>
         </w:rPr>
       </w:pPr>
-      <w:hyperlink w:anchor="_Toc240744462" w:history="1">
+      <w:hyperlink w:anchor="_Toc243487911" w:history="1">
         <w:r>
           <w:rPr>
             <w:rStyle w:val="Hyperlink"/>
@@ -4721,7 +4835,7 @@
             <w:noProof/>
             <w:webHidden/>
           </w:rPr>
-          <w:instrText xml:space="preserve"> PAGEREF _Toc240744462 \h </w:instrText>
+          <w:instrText xml:space="preserve"> PAGEREF _Toc243487911 \h </w:instrText>
         </w:r>
         <w:r>
           <w:rPr>
@@ -4762,10 +4876,11 @@
           <w:rFonts w:asciiTheme="minorHAnsi" w:eastAsiaTheme="minorEastAsia" w:hAnsiTheme="minorHAnsi" w:cstheme="minorBidi"/>
           <w:noProof/>
           <w:kern w:val="2"/>
+          <w:lang w:eastAsia="ja-JP"/>
           <w14:ligatures w14:val="standardContextual"/>
         </w:rPr>
       </w:pPr>
-      <w:hyperlink w:anchor="_Toc240744463" w:history="1">
+      <w:hyperlink w:anchor="_Toc243487912" w:history="1">
         <w:r>
           <w:rPr>
             <w:rStyle w:val="Hyperlink"/>
@@ -4792,7 +4907,7 @@
             <w:noProof/>
             <w:webHidden/>
           </w:rPr>
-          <w:instrText xml:space="preserve"> PAGEREF _Toc240744463 \h </w:instrText>
+          <w:instrText xml:space="preserve"> PAGEREF _Toc243487912 \h </w:instrText>
         </w:r>
         <w:r>
           <w:rPr>
@@ -4833,10 +4948,11 @@
           <w:rFonts w:asciiTheme="minorHAnsi" w:eastAsiaTheme="minorEastAsia" w:hAnsiTheme="minorHAnsi" w:cstheme="minorBidi"/>
           <w:noProof/>
           <w:kern w:val="2"/>
+          <w:lang w:eastAsia="ja-JP"/>
           <w14:ligatures w14:val="standardContextual"/>
         </w:rPr>
       </w:pPr>
-      <w:hyperlink w:anchor="_Toc240744464" w:history="1">
+      <w:hyperlink w:anchor="_Toc243487913" w:history="1">
         <w:r>
           <w:rPr>
             <w:rStyle w:val="Hyperlink"/>
@@ -4863,7 +4979,7 @@
             <w:noProof/>
             <w:webHidden/>
           </w:rPr>
-          <w:instrText xml:space="preserve"> PAGEREF _Toc240744464 \h </w:instrText>
+          <w:instrText xml:space="preserve"> PAGEREF _Toc243487913 \h </w:instrText>
         </w:r>
         <w:r>
           <w:rPr>
@@ -4904,10 +5020,11 @@
           <w:rFonts w:asciiTheme="minorHAnsi" w:eastAsiaTheme="minorEastAsia" w:hAnsiTheme="minorHAnsi" w:cstheme="minorBidi"/>
           <w:noProof/>
           <w:kern w:val="2"/>
+          <w:lang w:eastAsia="ja-JP"/>
           <w14:ligatures w14:val="standardContextual"/>
         </w:rPr>
       </w:pPr>
-      <w:hyperlink w:anchor="_Toc240744465" w:history="1">
+      <w:hyperlink w:anchor="_Toc243487914" w:history="1">
         <w:r>
           <w:rPr>
             <w:rStyle w:val="Hyperlink"/>
@@ -4934,7 +5051,7 @@
             <w:noProof/>
             <w:webHidden/>
           </w:rPr>
-          <w:instrText xml:space="preserve"> PAGEREF _Toc240744465 \h </w:instrText>
+          <w:instrText xml:space="preserve"> PAGEREF _Toc243487914 \h </w:instrText>
         </w:r>
         <w:r>
           <w:rPr>
@@ -4964,19 +5081,6 @@
           <w:fldChar w:fldCharType="end"/>
         </w:r>
       </w:hyperlink>
-    </w:p>
-    <w:p>
-      <w:r>
-        <w:fldChar w:fldCharType="end"/>
-      </w:r>
-    </w:p>
-    <w:p>
-      <w:pPr>
-        <w:pStyle w:val="ReportFront"/>
-      </w:pPr>
-      <w:r>
-        <w:t>LIST OF TABLES</w:t>
-      </w:r>
     </w:p>
     <w:p>
       <w:pPr>
@@ -4988,25 +5092,17 @@
           <w:rFonts w:asciiTheme="minorHAnsi" w:eastAsiaTheme="minorEastAsia" w:hAnsiTheme="minorHAnsi" w:cstheme="minorBidi"/>
           <w:noProof/>
           <w:kern w:val="2"/>
+          <w:lang w:eastAsia="ja-JP"/>
           <w14:ligatures w14:val="standardContextual"/>
         </w:rPr>
       </w:pPr>
-      <w:r>
-        <w:fldChar w:fldCharType="begin"/>
-      </w:r>
-      <w:r>
-        <w:instrText xml:space="preserve"> TOC \t "Report Table Caption,1" \h \z </w:instrText>
-      </w:r>
-      <w:r>
-        <w:fldChar w:fldCharType="separate"/>
-      </w:r>
-      <w:hyperlink w:anchor="_Toc240744466" w:history="1">
+      <w:hyperlink w:anchor="_Toc243487915" w:history="1">
         <w:r>
           <w:rPr>
             <w:rStyle w:val="Hyperlink"/>
             <w:noProof/>
           </w:rPr>
-          <w:t>Table 2.1 Test selection for TaskFlow risks</w:t>
+          <w:t>Figure 5.2 Compact TaskFlow fixture at 390 by 844 logical pixels from the October audit</w:t>
         </w:r>
         <w:r>
           <w:rPr>
@@ -5027,7 +5123,7 @@
             <w:noProof/>
             <w:webHidden/>
           </w:rPr>
-          <w:instrText xml:space="preserve"> PAGEREF _Toc240744466 \h </w:instrText>
+          <w:instrText xml:space="preserve"> PAGEREF _Toc243487915 \h </w:instrText>
         </w:r>
         <w:r>
           <w:rPr>
@@ -5047,7 +5143,7 @@
             <w:noProof/>
             <w:webHidden/>
           </w:rPr>
-          <w:t>9</w:t>
+          <w:t>21</w:t>
         </w:r>
         <w:r>
           <w:rPr>
@@ -5068,16 +5164,17 @@
           <w:rFonts w:asciiTheme="minorHAnsi" w:eastAsiaTheme="minorEastAsia" w:hAnsiTheme="minorHAnsi" w:cstheme="minorBidi"/>
           <w:noProof/>
           <w:kern w:val="2"/>
+          <w:lang w:eastAsia="ja-JP"/>
           <w14:ligatures w14:val="standardContextual"/>
         </w:rPr>
       </w:pPr>
-      <w:hyperlink w:anchor="_Toc240744467" w:history="1">
+      <w:hyperlink w:anchor="_Toc243487916" w:history="1">
         <w:r>
           <w:rPr>
             <w:rStyle w:val="Hyperlink"/>
             <w:noProof/>
           </w:rPr>
-          <w:t>Table 3.1 Functional acceptance matrix</w:t>
+          <w:t>Figure 5.3 Retained edit draft and latest saved version in the controlled recovery fixture</w:t>
         </w:r>
         <w:r>
           <w:rPr>
@@ -5098,7 +5195,7 @@
             <w:noProof/>
             <w:webHidden/>
           </w:rPr>
-          <w:instrText xml:space="preserve"> PAGEREF _Toc240744467 \h </w:instrText>
+          <w:instrText xml:space="preserve"> PAGEREF _Toc243487916 \h </w:instrText>
         </w:r>
         <w:r>
           <w:rPr>
@@ -5118,7 +5215,7 @@
             <w:noProof/>
             <w:webHidden/>
           </w:rPr>
-          <w:t>11</w:t>
+          <w:t>24</w:t>
         </w:r>
         <w:r>
           <w:rPr>
@@ -5139,16 +5236,17 @@
           <w:rFonts w:asciiTheme="minorHAnsi" w:eastAsiaTheme="minorEastAsia" w:hAnsiTheme="minorHAnsi" w:cstheme="minorBidi"/>
           <w:noProof/>
           <w:kern w:val="2"/>
+          <w:lang w:eastAsia="ja-JP"/>
           <w14:ligatures w14:val="standardContextual"/>
         </w:rPr>
       </w:pPr>
-      <w:hyperlink w:anchor="_Toc240744468" w:history="1">
+      <w:hyperlink w:anchor="_Toc243487917" w:history="1">
         <w:r>
           <w:rPr>
             <w:rStyle w:val="Hyperlink"/>
             <w:noProof/>
           </w:rPr>
-          <w:t>Table 3.2 Risk controls and remaining evidence gaps</w:t>
+          <w:t>Figure 6.1 Android API 36 emulator after release application force-stop and relaunch on 11 October 2026</w:t>
         </w:r>
         <w:r>
           <w:rPr>
@@ -5169,7 +5267,7 @@
             <w:noProof/>
             <w:webHidden/>
           </w:rPr>
-          <w:instrText xml:space="preserve"> PAGEREF _Toc240744468 \h </w:instrText>
+          <w:instrText xml:space="preserve"> PAGEREF _Toc243487917 \h </w:instrText>
         </w:r>
         <w:r>
           <w:rPr>
@@ -5189,7 +5287,7 @@
             <w:noProof/>
             <w:webHidden/>
           </w:rPr>
-          <w:t>12</w:t>
+          <w:t>33</w:t>
         </w:r>
         <w:r>
           <w:rPr>
@@ -5199,6 +5297,19 @@
           <w:fldChar w:fldCharType="end"/>
         </w:r>
       </w:hyperlink>
+    </w:p>
+    <w:p>
+      <w:r>
+        <w:fldChar w:fldCharType="end"/>
+      </w:r>
+    </w:p>
+    <w:p>
+      <w:pPr>
+        <w:pStyle w:val="ReportFront"/>
+      </w:pPr>
+      <w:r>
+        <w:t>LIST OF TABLES</w:t>
+      </w:r>
     </w:p>
     <w:p>
       <w:pPr>
@@ -5210,16 +5321,26 @@
           <w:rFonts w:asciiTheme="minorHAnsi" w:eastAsiaTheme="minorEastAsia" w:hAnsiTheme="minorHAnsi" w:cstheme="minorBidi"/>
           <w:noProof/>
           <w:kern w:val="2"/>
+          <w:lang w:eastAsia="ja-JP"/>
           <w14:ligatures w14:val="standardContextual"/>
         </w:rPr>
       </w:pPr>
-      <w:hyperlink w:anchor="_Toc240744469" w:history="1">
+      <w:r>
+        <w:fldChar w:fldCharType="begin"/>
+      </w:r>
+      <w:r>
+        <w:instrText xml:space="preserve"> TOC \t "Report Table Caption,1" \h \z </w:instrText>
+      </w:r>
+      <w:r>
+        <w:fldChar w:fldCharType="separate"/>
+      </w:r>
+      <w:hyperlink w:anchor="_Toc243487918" w:history="1">
         <w:r>
           <w:rPr>
             <w:rStyle w:val="Hyperlink"/>
             <w:noProof/>
           </w:rPr>
-          <w:t>Table 4.1 Main validation and ownership constraints</w:t>
+          <w:t>Table 2.1 Test selection for TaskFlow risks</w:t>
         </w:r>
         <w:r>
           <w:rPr>
@@ -5240,7 +5361,7 @@
             <w:noProof/>
             <w:webHidden/>
           </w:rPr>
-          <w:instrText xml:space="preserve"> PAGEREF _Toc240744469 \h </w:instrText>
+          <w:instrText xml:space="preserve"> PAGEREF _Toc243487918 \h </w:instrText>
         </w:r>
         <w:r>
           <w:rPr>
@@ -5260,7 +5381,7 @@
             <w:noProof/>
             <w:webHidden/>
           </w:rPr>
-          <w:t>15</w:t>
+          <w:t>9</w:t>
         </w:r>
         <w:r>
           <w:rPr>
@@ -5281,16 +5402,17 @@
           <w:rFonts w:asciiTheme="minorHAnsi" w:eastAsiaTheme="minorEastAsia" w:hAnsiTheme="minorHAnsi" w:cstheme="minorBidi"/>
           <w:noProof/>
           <w:kern w:val="2"/>
+          <w:lang w:eastAsia="ja-JP"/>
           <w14:ligatures w14:val="standardContextual"/>
         </w:rPr>
       </w:pPr>
-      <w:hyperlink w:anchor="_Toc240744470" w:history="1">
+      <w:hyperlink w:anchor="_Toc243487919" w:history="1">
         <w:r>
           <w:rPr>
             <w:rStyle w:val="Hyperlink"/>
             <w:noProof/>
           </w:rPr>
-          <w:t>Table 6.1 Results and their actual verification boundaries</w:t>
+          <w:t>Table 3.1 Functional acceptance matrix</w:t>
         </w:r>
         <w:r>
           <w:rPr>
@@ -5311,7 +5433,7 @@
             <w:noProof/>
             <w:webHidden/>
           </w:rPr>
-          <w:instrText xml:space="preserve"> PAGEREF _Toc240744470 \h </w:instrText>
+          <w:instrText xml:space="preserve"> PAGEREF _Toc243487919 \h </w:instrText>
         </w:r>
         <w:r>
           <w:rPr>
@@ -5331,7 +5453,7 @@
             <w:noProof/>
             <w:webHidden/>
           </w:rPr>
-          <w:t>25</w:t>
+          <w:t>11</w:t>
         </w:r>
         <w:r>
           <w:rPr>
@@ -5352,16 +5474,17 @@
           <w:rFonts w:asciiTheme="minorHAnsi" w:eastAsiaTheme="minorEastAsia" w:hAnsiTheme="minorHAnsi" w:cstheme="minorBidi"/>
           <w:noProof/>
           <w:kern w:val="2"/>
+          <w:lang w:eastAsia="ja-JP"/>
           <w14:ligatures w14:val="standardContextual"/>
         </w:rPr>
       </w:pPr>
-      <w:hyperlink w:anchor="_Toc240744471" w:history="1">
+      <w:hyperlink w:anchor="_Toc243487920" w:history="1">
         <w:r>
           <w:rPr>
             <w:rStyle w:val="Hyperlink"/>
             <w:noProof/>
           </w:rPr>
-          <w:t>Table 6.2 Deliberate search-defect experiment</w:t>
+          <w:t>Table 3.2 Risk controls and remaining evidence gaps</w:t>
         </w:r>
         <w:r>
           <w:rPr>
@@ -5382,7 +5505,7 @@
             <w:noProof/>
             <w:webHidden/>
           </w:rPr>
-          <w:instrText xml:space="preserve"> PAGEREF _Toc240744471 \h </w:instrText>
+          <w:instrText xml:space="preserve"> PAGEREF _Toc243487920 \h </w:instrText>
         </w:r>
         <w:r>
           <w:rPr>
@@ -5402,7 +5525,7 @@
             <w:noProof/>
             <w:webHidden/>
           </w:rPr>
-          <w:t>28</w:t>
+          <w:t>12</w:t>
         </w:r>
         <w:r>
           <w:rPr>
@@ -5423,16 +5546,17 @@
           <w:rFonts w:asciiTheme="minorHAnsi" w:eastAsiaTheme="minorEastAsia" w:hAnsiTheme="minorHAnsi" w:cstheme="minorBidi"/>
           <w:noProof/>
           <w:kern w:val="2"/>
+          <w:lang w:eastAsia="ja-JP"/>
           <w14:ligatures w14:val="standardContextual"/>
         </w:rPr>
       </w:pPr>
-      <w:hyperlink w:anchor="_Toc240744472" w:history="1">
+      <w:hyperlink w:anchor="_Toc243487921" w:history="1">
         <w:r>
           <w:rPr>
             <w:rStyle w:val="Hyperlink"/>
             <w:noProof/>
           </w:rPr>
-          <w:t>Table 6.3 Whole-command duration in seconds for the selected suites</w:t>
+          <w:t>Table 4.1 Main validation and ownership constraints</w:t>
         </w:r>
         <w:r>
           <w:rPr>
@@ -5453,7 +5577,7 @@
             <w:noProof/>
             <w:webHidden/>
           </w:rPr>
-          <w:instrText xml:space="preserve"> PAGEREF _Toc240744472 \h </w:instrText>
+          <w:instrText xml:space="preserve"> PAGEREF _Toc243487921 \h </w:instrText>
         </w:r>
         <w:r>
           <w:rPr>
@@ -5473,7 +5597,7 @@
             <w:noProof/>
             <w:webHidden/>
           </w:rPr>
-          <w:t>28</w:t>
+          <w:t>15</w:t>
         </w:r>
         <w:r>
           <w:rPr>
@@ -5494,15 +5618,232 @@
           <w:rFonts w:asciiTheme="minorHAnsi" w:eastAsiaTheme="minorEastAsia" w:hAnsiTheme="minorHAnsi" w:cstheme="minorBidi"/>
           <w:noProof/>
           <w:kern w:val="2"/>
+          <w:lang w:eastAsia="ja-JP"/>
           <w14:ligatures w14:val="standardContextual"/>
         </w:rPr>
       </w:pPr>
-      <w:hyperlink w:anchor="_Toc240744473" w:history="1">
+      <w:hyperlink w:anchor="_Toc243487922" w:history="1">
         <w:r>
           <w:rPr>
             <w:rStyle w:val="Hyperlink"/>
             <w:noProof/>
           </w:rPr>
+          <w:t>Table 6.1 Results and their actual verification boundaries</w:t>
+        </w:r>
+        <w:r>
+          <w:rPr>
+            <w:noProof/>
+            <w:webHidden/>
+          </w:rPr>
+          <w:tab/>
+        </w:r>
+        <w:r>
+          <w:rPr>
+            <w:noProof/>
+            <w:webHidden/>
+          </w:rPr>
+          <w:fldChar w:fldCharType="begin"/>
+        </w:r>
+        <w:r>
+          <w:rPr>
+            <w:noProof/>
+            <w:webHidden/>
+          </w:rPr>
+          <w:instrText xml:space="preserve"> PAGEREF _Toc243487922 \h </w:instrText>
+        </w:r>
+        <w:r>
+          <w:rPr>
+            <w:noProof/>
+            <w:webHidden/>
+          </w:rPr>
+        </w:r>
+        <w:r>
+          <w:rPr>
+            <w:noProof/>
+            <w:webHidden/>
+          </w:rPr>
+          <w:fldChar w:fldCharType="separate"/>
+        </w:r>
+        <w:r>
+          <w:rPr>
+            <w:noProof/>
+            <w:webHidden/>
+          </w:rPr>
+          <w:t>27</w:t>
+        </w:r>
+        <w:r>
+          <w:rPr>
+            <w:noProof/>
+            <w:webHidden/>
+          </w:rPr>
+          <w:fldChar w:fldCharType="end"/>
+        </w:r>
+      </w:hyperlink>
+    </w:p>
+    <w:p>
+      <w:pPr>
+        <w:pStyle w:val="TOC1"/>
+        <w:tabs>
+          <w:tab w:val="right" w:leader="dot" w:pos="8778"/>
+        </w:tabs>
+        <w:rPr>
+          <w:rFonts w:asciiTheme="minorHAnsi" w:eastAsiaTheme="minorEastAsia" w:hAnsiTheme="minorHAnsi" w:cstheme="minorBidi"/>
+          <w:noProof/>
+          <w:kern w:val="2"/>
+          <w:lang w:eastAsia="ja-JP"/>
+          <w14:ligatures w14:val="standardContextual"/>
+        </w:rPr>
+      </w:pPr>
+      <w:hyperlink w:anchor="_Toc243487923" w:history="1">
+        <w:r>
+          <w:rPr>
+            <w:rStyle w:val="Hyperlink"/>
+            <w:noProof/>
+          </w:rPr>
+          <w:t>Table 6.2 Deliberate search-defect experiment</w:t>
+        </w:r>
+        <w:r>
+          <w:rPr>
+            <w:noProof/>
+            <w:webHidden/>
+          </w:rPr>
+          <w:tab/>
+        </w:r>
+        <w:r>
+          <w:rPr>
+            <w:noProof/>
+            <w:webHidden/>
+          </w:rPr>
+          <w:fldChar w:fldCharType="begin"/>
+        </w:r>
+        <w:r>
+          <w:rPr>
+            <w:noProof/>
+            <w:webHidden/>
+          </w:rPr>
+          <w:instrText xml:space="preserve"> PAGEREF _Toc243487923 \h </w:instrText>
+        </w:r>
+        <w:r>
+          <w:rPr>
+            <w:noProof/>
+            <w:webHidden/>
+          </w:rPr>
+        </w:r>
+        <w:r>
+          <w:rPr>
+            <w:noProof/>
+            <w:webHidden/>
+          </w:rPr>
+          <w:fldChar w:fldCharType="separate"/>
+        </w:r>
+        <w:r>
+          <w:rPr>
+            <w:noProof/>
+            <w:webHidden/>
+          </w:rPr>
+          <w:t>30</w:t>
+        </w:r>
+        <w:r>
+          <w:rPr>
+            <w:noProof/>
+            <w:webHidden/>
+          </w:rPr>
+          <w:fldChar w:fldCharType="end"/>
+        </w:r>
+      </w:hyperlink>
+    </w:p>
+    <w:p>
+      <w:pPr>
+        <w:pStyle w:val="TOC1"/>
+        <w:tabs>
+          <w:tab w:val="right" w:leader="dot" w:pos="8778"/>
+        </w:tabs>
+        <w:rPr>
+          <w:rFonts w:asciiTheme="minorHAnsi" w:eastAsiaTheme="minorEastAsia" w:hAnsiTheme="minorHAnsi" w:cstheme="minorBidi"/>
+          <w:noProof/>
+          <w:kern w:val="2"/>
+          <w:lang w:eastAsia="ja-JP"/>
+          <w14:ligatures w14:val="standardContextual"/>
+        </w:rPr>
+      </w:pPr>
+      <w:hyperlink w:anchor="_Toc243487924" w:history="1">
+        <w:r>
+          <w:rPr>
+            <w:rStyle w:val="Hyperlink"/>
+            <w:noProof/>
+          </w:rPr>
+          <w:t>Table 6.3 Whole-command duration in seconds for the selected suites</w:t>
+        </w:r>
+        <w:r>
+          <w:rPr>
+            <w:noProof/>
+            <w:webHidden/>
+          </w:rPr>
+          <w:tab/>
+        </w:r>
+        <w:r>
+          <w:rPr>
+            <w:noProof/>
+            <w:webHidden/>
+          </w:rPr>
+          <w:fldChar w:fldCharType="begin"/>
+        </w:r>
+        <w:r>
+          <w:rPr>
+            <w:noProof/>
+            <w:webHidden/>
+          </w:rPr>
+          <w:instrText xml:space="preserve"> PAGEREF _Toc243487924 \h </w:instrText>
+        </w:r>
+        <w:r>
+          <w:rPr>
+            <w:noProof/>
+            <w:webHidden/>
+          </w:rPr>
+        </w:r>
+        <w:r>
+          <w:rPr>
+            <w:noProof/>
+            <w:webHidden/>
+          </w:rPr>
+          <w:fldChar w:fldCharType="separate"/>
+        </w:r>
+        <w:r>
+          <w:rPr>
+            <w:noProof/>
+            <w:webHidden/>
+          </w:rPr>
+          <w:t>30</w:t>
+        </w:r>
+        <w:r>
+          <w:rPr>
+            <w:noProof/>
+            <w:webHidden/>
+          </w:rPr>
+          <w:fldChar w:fldCharType="end"/>
+        </w:r>
+      </w:hyperlink>
+    </w:p>
+    <w:p>
+      <w:pPr>
+        <w:pStyle w:val="TOC1"/>
+        <w:tabs>
+          <w:tab w:val="right" w:leader="dot" w:pos="8778"/>
+        </w:tabs>
+        <w:rPr>
+          <w:rFonts w:asciiTheme="minorHAnsi" w:eastAsiaTheme="minorEastAsia" w:hAnsiTheme="minorHAnsi" w:cstheme="minorBidi"/>
+          <w:noProof/>
+          <w:kern w:val="2"/>
+          <w:lang w:eastAsia="ja-JP"/>
+          <w14:ligatures w14:val="standardContextual"/>
+        </w:rPr>
+      </w:pPr>
+      <w:hyperlink w:anchor="_Toc243487925" w:history="1">
+        <w:r>
+          <w:rPr>
+            <w:rStyle w:val="Hyperlink"/>
+            <w:noProof/>
+          </w:rPr>
           <w:t>Table B.1 Evidence packages used in this report</w:t>
         </w:r>
         <w:r>
@@ -5524,7 +5865,7 @@
             <w:noProof/>
             <w:webHidden/>
           </w:rPr>
-          <w:instrText xml:space="preserve"> PAGEREF _Toc240744473 \h </w:instrText>
+          <w:instrText xml:space="preserve"> PAGEREF _Toc243487925 \h </w:instrText>
         </w:r>
         <w:r>
           <w:rPr>
@@ -5544,7 +5885,7 @@
             <w:noProof/>
             <w:webHidden/>
           </w:rPr>
-          <w:t>36</w:t>
+          <w:t>40</w:t>
         </w:r>
         <w:r>
           <w:rPr>
@@ -5578,7 +5919,7 @@
         <w:pStyle w:val="Heading1"/>
         <w:pageBreakBefore w:val="0"/>
       </w:pPr>
-      <w:bookmarkStart w:id="0" w:name="_Toc240744412"/>
+      <w:bookmarkStart w:id="0" w:name="_Toc243487860"/>
       <w:r>
         <w:lastRenderedPageBreak/>
         <w:t>1 Introduction</w:t>
@@ -5589,7 +5930,7 @@
       <w:pPr>
         <w:pStyle w:val="Heading2"/>
       </w:pPr>
-      <w:bookmarkStart w:id="1" w:name="_Toc240744413"/>
+      <w:bookmarkStart w:id="1" w:name="_Toc243487861"/>
       <w:r>
         <w:t>1.1 Problem and motivation</w:t>
       </w:r>
@@ -5608,10 +5949,7 @@
         <w:pStyle w:val="ReportBody"/>
       </w:pPr>
       <w:r>
-        <w:t>This report addresses Topic 4, UI Automation Testing in Flutter: Implementing End-to-End Testing, for Cross-Platform Mobile App Development, course 503107. The demonstration application is TaskFlow, a Flutter task manager developed as a testing case study. Its offline mode uses local preferences, its sample mode is temporary, and its account mode communicates with a Node.js and SQLite backend. The backend is included because it exposes realistic failure and concurrency conditions, not because the report att</w:t>
-      </w:r>
-      <w:r>
-        <w:t>empts to become a general backend-development survey.</w:t>
+        <w:t>This report addresses Topic 4, UI Automation Testing in Flutter: Implementing End-to-End Testing, for Cross-Platform Mobile App Development, course 503107. The demonstration application is TaskFlow, a Flutter task manager developed as a testing case study. Its offline mode uses local preferences, its sample mode is temporary, and its account mode communicates with a Node.js and SQLite backend. The backend is included because it exposes realistic failure and concurrency conditions, not because the report attempts to become a general backend-development survey.</w:t>
       </w:r>
     </w:p>
     <w:p>
@@ -5626,7 +5964,7 @@
       <w:pPr>
         <w:pStyle w:val="Heading2"/>
       </w:pPr>
-      <w:bookmarkStart w:id="2" w:name="_Toc240744414"/>
+      <w:bookmarkStart w:id="2" w:name="_Toc243487862"/>
       <w:r>
         <w:t>1.2 Objectives and research questions</w:t>
       </w:r>
@@ -5664,7 +6002,7 @@
       <w:pPr>
         <w:pStyle w:val="Heading2"/>
       </w:pPr>
-      <w:bookmarkStart w:id="3" w:name="_Toc240744415"/>
+      <w:bookmarkStart w:id="3" w:name="_Toc243487863"/>
       <w:r>
         <w:t>1.3 Scope and evaluation boundary</w:t>
       </w:r>
@@ -5691,14 +6029,14 @@
         <w:pStyle w:val="ReportBody"/>
       </w:pPr>
       <w:r>
-        <w:t>The evaluated source starts from commit 06d3790 on branch main-test, with the local snapshot-capacity correction recorded on 19 September. That review passed 104 Flutter cases and 17 backend cases. Native suites previously passed 15 cases on Windows on 14 September and 15 cases on Android on 15 September. Earlier Edge and hosted Android results retain their original dates and revisions. This manuscript distinguishes the updated local verification from historical platform evidence.</w:t>
+        <w:t>The reviewed source is commit a153046 on branch main-test. Retained 11 October evidence records 133 Flutter cases, 17 backend cases and 15 named native scenarios on each of Windows and Android. These runs cover different boundaries and are not 30 distinct scenarios. Most Windows native selections precede the final replacement-ID correction; the online selection was rerun afterward. Earlier Edge and hosted Android results retain their original dates and revisions. This report refresh does not claim a new execution of those suites.</w:t>
       </w:r>
     </w:p>
     <w:p>
       <w:pPr>
         <w:pStyle w:val="Heading2"/>
       </w:pPr>
-      <w:bookmarkStart w:id="4" w:name="_Toc240744416"/>
+      <w:bookmarkStart w:id="4" w:name="_Toc243487864"/>
       <w:r>
         <w:lastRenderedPageBreak/>
         <w:t>1.4 Research and evidence method</w:t>
@@ -5725,7 +6063,7 @@
       <w:pPr>
         <w:pStyle w:val="Heading2"/>
       </w:pPr>
-      <w:bookmarkStart w:id="5" w:name="_Toc240744417"/>
+      <w:bookmarkStart w:id="5" w:name="_Toc243487865"/>
       <w:r>
         <w:t>1.5 Report organization</w:t>
       </w:r>
@@ -5736,17 +6074,14 @@
         <w:pStyle w:val="ReportBody"/>
       </w:pPr>
       <w:r>
-        <w:t>Chapter 2 explains the test mechanisms and compares the approaches used in the project. Chapter 3 translates product requirements into risks and observable acceptance conditions. Chapter 4 describes the architecture, data model and security boundaries. Chapter 5 connects those designs to implementation and platform behavior. Chapter 6 presents the test design, experimental results, audit findings and threats to validity. Chapter 7 concludes with the supported findings and prioritized remaining work. The app</w:t>
-      </w:r>
-      <w:r>
-        <w:t>endices provide a compact reproduction guide and an evidence index rather than reproducing long raw logs.</w:t>
+        <w:t>Chapter 2 explains the test mechanisms and compares the approaches used in the project. Chapter 3 translates product requirements into risks and observable acceptance conditions. Chapter 4 describes the architecture, data model and security boundaries. Chapter 5 connects those designs to implementation and platform behavior. Chapter 6 presents the test design, experimental results, audit findings and threats to validity. Chapter 7 concludes with the supported findings and prioritized remaining work. The appendices provide a compact reproduction guide and an evidence index rather than reproducing long raw logs.</w:t>
       </w:r>
     </w:p>
     <w:p>
       <w:pPr>
         <w:pStyle w:val="Heading1"/>
       </w:pPr>
-      <w:bookmarkStart w:id="6" w:name="_Toc240744418"/>
+      <w:bookmarkStart w:id="6" w:name="_Toc243487866"/>
       <w:r>
         <w:lastRenderedPageBreak/>
         <w:t>2 Testing foundations and comparative analysis</w:t>
@@ -5757,7 +6092,7 @@
       <w:pPr>
         <w:pStyle w:val="Heading2"/>
       </w:pPr>
-      <w:bookmarkStart w:id="7" w:name="_Toc240744419"/>
+      <w:bookmarkStart w:id="7" w:name="_Toc243487867"/>
       <w:r>
         <w:t>2.1 Different tests answer different questions</w:t>
       </w:r>
@@ -5776,10 +6111,7 @@
         <w:pStyle w:val="ReportBody"/>
       </w:pPr>
       <w:r>
-        <w:t>A unit test of TaskFilters can construct records directly and check the exact output order. It does not need a rendered search box or a device. A widget test can type a query into TaskScreen and check the resulting task widgets. This verifies the connection between an input event, controller filtering and the displayed list, while still allowing a fake repository. A native integration workflow uses an actual Windows application process and, in the persistence suites, the preference plugin. Its additional va</w:t>
-      </w:r>
-      <w:r>
-        <w:t>lue is crossing those platform and storage boundaries, not merely executing a longer sequence of taps.</w:t>
+        <w:t>A unit test of TaskFilters can construct records directly and check the exact output order. It does not need a rendered search box or a device. A widget test can type a query into TaskScreen and check the resulting task widgets. This verifies the connection between an input event, controller filtering and the displayed list, while still allowing a fake repository. A native integration workflow uses an actual Windows application process and, in the persistence suites, the preference plugin. Its additional value is crossing those platform and storage boundaries, not merely executing a longer sequence of taps.</w:t>
       </w:r>
     </w:p>
     <w:p>
@@ -5801,7 +6133,7 @@
         </w:rPr>
         <w:lastRenderedPageBreak/>
         <w:drawing>
-          <wp:inline distT="0" distB="0" distL="0" distR="0" wp14:anchorId="42B3B87D" wp14:editId="03B97E56">
+          <wp:inline distT="0" distB="0" distL="0" distR="0" wp14:anchorId="2A691870" wp14:editId="1CDB471F">
             <wp:extent cx="5472000" cy="2110629"/>
             <wp:effectExtent l="0" t="0" r="0" b="0"/>
             <wp:docPr id="1" name="Picture 1" descr="Figure 2.1 Testing layers and their TaskFlow evidence boundaries"/>
@@ -5841,7 +6173,7 @@
       <w:pPr>
         <w:pStyle w:val="ReportFigure"/>
       </w:pPr>
-      <w:bookmarkStart w:id="8" w:name="_Toc240744461"/>
+      <w:bookmarkStart w:id="8" w:name="_Toc243487910"/>
       <w:r>
         <w:t>Figure 2.1 Testing layers and their TaskFlow evidence boundaries</w:t>
       </w:r>
@@ -5851,7 +6183,7 @@
       <w:pPr>
         <w:pStyle w:val="Heading2"/>
       </w:pPr>
-      <w:bookmarkStart w:id="9" w:name="_Toc240744420"/>
+      <w:bookmarkStart w:id="9" w:name="_Toc243487868"/>
       <w:r>
         <w:t>2.2 Binding and frame scheduling</w:t>
       </w:r>
@@ -5870,10 +6202,7 @@
         <w:pStyle w:val="ReportBody"/>
       </w:pPr>
       <w:r>
-        <w:t>In TaskFlow, an asynchronous repository operation changes controller state before it produces a result. The controller sets busy, clears an earlier error and notifies listeners. The screen can now display loading and disable mutation actions while the repository future remains incomplete. When the future completes, the controller publishes either the confirmed task list or an error. A test that asserts only the final list can miss a broken intermediate state, such as an Add button remaining active and allow</w:t>
-      </w:r>
-      <w:r>
-        <w:t>ing duplicate work.</w:t>
+        <w:t>In TaskFlow, an asynchronous repository operation changes controller state before it produces a result. The controller sets busy, clears an earlier error and notifies listeners. The screen can now display loading and disable mutation actions while the repository future remains incomplete. When the future completes, the controller publishes either the confirmed task list or an error. A test that asserts only the final list can miss a broken intermediate state, such as an Add button remaining active and allowing duplicate work.</w:t>
       </w:r>
     </w:p>
     <w:p>
@@ -5892,7 +6221,7 @@
       <w:pPr>
         <w:pStyle w:val="Heading2"/>
       </w:pPr>
-      <w:bookmarkStart w:id="10" w:name="_Toc240744421"/>
+      <w:bookmarkStart w:id="10" w:name="_Toc243487869"/>
       <w:r>
         <w:t>2.3 Settling and bounded waiting</w:t>
       </w:r>
@@ -5926,7 +6255,7 @@
       <w:pPr>
         <w:pStyle w:val="Heading2"/>
       </w:pPr>
-      <w:bookmarkStart w:id="11" w:name="_Toc240744422"/>
+      <w:bookmarkStart w:id="11" w:name="_Toc243487870"/>
       <w:r>
         <w:t>2.4 Finders and meaningful assertions</w:t>
       </w:r>
@@ -5961,7 +6290,7 @@
       <w:pPr>
         <w:pStyle w:val="Heading2"/>
       </w:pPr>
-      <w:bookmarkStart w:id="12" w:name="_Toc240744423"/>
+      <w:bookmarkStart w:id="12" w:name="_Toc243487871"/>
       <w:r>
         <w:t>2.5 Fakes and dependency injection</w:t>
       </w:r>
@@ -5980,10 +6309,7 @@
         <w:pStyle w:val="ReportBody"/>
       </w:pPr>
       <w:r>
-        <w:t>A fake is a simplified working implementation, not a guarantee that the real dependency behaves identically. The in-memory repository is appropriate for inspecting error states because the failure can be produced at a known point. It cannot establish serialization compatibility with the preference plugin or isolation between two API accounts. Those questions require separate tests at the actual boundary. The project intentionally retains both controlled-repository scenarios and real-preference scenarios for</w:t>
-      </w:r>
-      <w:r>
-        <w:t xml:space="preserve"> this reason.</w:t>
+        <w:t>A fake is a simplified working implementation, not a guarantee that the real dependency behaves identically. The in-memory repository is appropriate for inspecting error states because the failure can be produced at a known point. It cannot establish serialization compatibility with the preference plugin or isolation between two API accounts. Those questions require separate tests at the actual boundary. The project intentionally retains both controlled-repository scenarios and real-preference scenarios for this reason.</w:t>
       </w:r>
     </w:p>
     <w:p>
@@ -6002,7 +6328,7 @@
       <w:pPr>
         <w:pStyle w:val="Heading2"/>
       </w:pPr>
-      <w:bookmarkStart w:id="13" w:name="_Toc240744424"/>
+      <w:bookmarkStart w:id="13" w:name="_Toc243487872"/>
       <w:r>
         <w:t>2.6 Golden tests and visual change control</w:t>
       </w:r>
@@ -6036,7 +6362,7 @@
       <w:pPr>
         <w:pStyle w:val="Heading2"/>
       </w:pPr>
-      <w:bookmarkStart w:id="14" w:name="_Toc240744425"/>
+      <w:bookmarkStart w:id="14" w:name="_Toc243487873"/>
       <w:r>
         <w:t>2.7 Native integration and browser automation</w:t>
       </w:r>
@@ -6059,10 +6385,7 @@
         <w:pStyle w:val="ReportBody"/>
       </w:pPr>
       <w:r>
-        <w:t>TaskFlow uses a compile-time-gated Web harness for deterministic browser validation, discovery and retry scenarios. It contains synthetic in-memory data and no API client. Playwright locators can use roles and accessible names and resolve their targets again for subsequent actions; its documentation also notes that role locators are not a substitute for an accessibility audit (Microsoft, n.d.). The actual-browser check complements widget testing because it observes Flutter's generated DOM semantics and brow</w:t>
-      </w:r>
-      <w:r>
-        <w:t>ser focus behavior.</w:t>
+        <w:t>TaskFlow uses a compile-time-gated Web harness for deterministic browser validation, discovery and retry scenarios. It contains synthetic in-memory data and no API client. Playwright locators can use roles and accessible names and resolve their targets again for subsequent actions; its documentation also notes that role locators are not a substitute for an accessibility audit (Microsoft, n.d.). The actual-browser check complements widget testing because it observes Flutter's generated DOM semantics and browser focus behavior.</w:t>
       </w:r>
     </w:p>
     <w:p>
@@ -6085,7 +6408,7 @@
       <w:pPr>
         <w:pStyle w:val="ReportTableCaption"/>
       </w:pPr>
-      <w:bookmarkStart w:id="15" w:name="_Toc240744466"/>
+      <w:bookmarkStart w:id="15" w:name="_Toc243487918"/>
       <w:r>
         <w:t>Table 2.1 Test selection for TaskFlow risks</w:t>
       </w:r>
@@ -6492,7 +6815,7 @@
       <w:pPr>
         <w:pStyle w:val="Heading1"/>
       </w:pPr>
-      <w:bookmarkStart w:id="16" w:name="_Toc240744426"/>
+      <w:bookmarkStart w:id="16" w:name="_Toc243487874"/>
       <w:r>
         <w:lastRenderedPageBreak/>
         <w:t>3 Requirements and risk analysis</w:t>
@@ -6503,7 +6826,7 @@
       <w:pPr>
         <w:pStyle w:val="Heading2"/>
       </w:pPr>
-      <w:bookmarkStart w:id="17" w:name="_Toc240744427"/>
+      <w:bookmarkStart w:id="17" w:name="_Toc243487875"/>
       <w:r>
         <w:t>3.1 Actors and workspace modes</w:t>
       </w:r>
@@ -6537,7 +6860,7 @@
       <w:pPr>
         <w:pStyle w:val="Heading2"/>
       </w:pPr>
-      <w:bookmarkStart w:id="18" w:name="_Toc240744428"/>
+      <w:bookmarkStart w:id="18" w:name="_Toc243487876"/>
       <w:r>
         <w:t>3.2 Functional requirements and acceptance conditions</w:t>
       </w:r>
@@ -6564,7 +6887,7 @@
       <w:pPr>
         <w:pStyle w:val="ReportTableCaption"/>
       </w:pPr>
-      <w:bookmarkStart w:id="19" w:name="_Toc240744467"/>
+      <w:bookmarkStart w:id="19" w:name="_Toc243487919"/>
       <w:r>
         <w:t>Table 3.1 Functional acceptance matrix</w:t>
       </w:r>
@@ -7077,7 +7400,7 @@
       <w:pPr>
         <w:pStyle w:val="Heading2"/>
       </w:pPr>
-      <w:bookmarkStart w:id="20" w:name="_Toc240744429"/>
+      <w:bookmarkStart w:id="20" w:name="_Toc243487877"/>
       <w:r>
         <w:t>3.3 Nonfunctional requirements</w:t>
       </w:r>
@@ -7112,7 +7435,7 @@
       <w:pPr>
         <w:pStyle w:val="Heading2"/>
       </w:pPr>
-      <w:bookmarkStart w:id="21" w:name="_Toc240744430"/>
+      <w:bookmarkStart w:id="21" w:name="_Toc243487878"/>
       <w:r>
         <w:t>3.4 Risk priorities</w:t>
       </w:r>
@@ -7123,10 +7446,7 @@
         <w:pStyle w:val="ReportBody"/>
       </w:pPr>
       <w:r>
-        <w:t>The highest data-integrity risks are overwriting an unknown snapshot, replaying an uncertain remote save, crossing account boundaries and discarding a user's unsaved changes. Visual polish has value, but it does not compensate for these failures. A second priority is interaction ambiguity: duplicate submissions, hidden validation, unreachable controls, inaccessible labels and unclear workspace persistence. A third is evidence ambiguity, such as attributing a historical CI result to newer source or confusing</w:t>
-      </w:r>
-      <w:r>
-        <w:t xml:space="preserve"> remount with process restart.</w:t>
+        <w:t>The highest data-integrity risks are overwriting an unknown snapshot, replaying an uncertain remote save, crossing account boundaries and discarding a user's unsaved changes. Visual polish has value, but it does not compensate for these failures. A second priority is interaction ambiguity: duplicate submissions, hidden validation, unreachable controls, inaccessible labels and unclear workspace persistence. A third is evidence ambiguity, such as attributing a historical CI result to newer source or confusing remount with process restart.</w:t>
       </w:r>
     </w:p>
     <w:p>
@@ -7141,7 +7461,7 @@
       <w:pPr>
         <w:pStyle w:val="ReportTableCaption"/>
       </w:pPr>
-      <w:bookmarkStart w:id="22" w:name="_Toc240744468"/>
+      <w:bookmarkStart w:id="22" w:name="_Toc243487920"/>
       <w:r>
         <w:t>Table 3.2 Risk controls and remaining evidence gaps</w:t>
       </w:r>
@@ -7549,7 +7869,7 @@
       <w:pPr>
         <w:pStyle w:val="Heading2"/>
       </w:pPr>
-      <w:bookmarkStart w:id="23" w:name="_Toc240744431"/>
+      <w:bookmarkStart w:id="23" w:name="_Toc243487879"/>
       <w:r>
         <w:t>3.5 Investigation boundaries</w:t>
       </w:r>
@@ -7575,7 +7895,7 @@
       <w:pPr>
         <w:pStyle w:val="Heading1"/>
       </w:pPr>
-      <w:bookmarkStart w:id="24" w:name="_Toc240744432"/>
+      <w:bookmarkStart w:id="24" w:name="_Toc243487880"/>
       <w:r>
         <w:lastRenderedPageBreak/>
         <w:t>4 System design</w:t>
@@ -7586,7 +7906,7 @@
       <w:pPr>
         <w:pStyle w:val="Heading2"/>
       </w:pPr>
-      <w:bookmarkStart w:id="25" w:name="_Toc240744433"/>
+      <w:bookmarkStart w:id="25" w:name="_Toc243487881"/>
       <w:r>
         <w:t>4.1 Architecture and dependency direction</w:t>
       </w:r>
@@ -7605,10 +7925,7 @@
         <w:pStyle w:val="ReportBody"/>
       </w:pPr>
       <w:r>
-        <w:t xml:space="preserve">This arrangement makes the test boundary explicit. A widget test can mount the real task screen and controller with a controllable repository. A persistence test can replace that repository with the real preferences implementation while retaining the same user workflow. An account integration test additionally exercises the client, HTTP transport and database. The interface reduces duplicated interaction code, but it does not make those environments equivalent: only the latter tests cross the corresponding </w:t>
-      </w:r>
-      <w:r>
-        <w:t>production boundaries.</w:t>
+        <w:t>This arrangement makes the test boundary explicit. A widget test can mount the real task screen and controller with a controllable repository. A persistence test can replace that repository with the real preferences implementation while retaining the same user workflow. An account integration test additionally exercises the client, HTTP transport and database. The interface reduces duplicated interaction code, but it does not make those environments equivalent: only the latter tests cross the corresponding production boundaries.</w:t>
       </w:r>
     </w:p>
     <w:p>
@@ -7621,7 +7938,7 @@
           <w:noProof/>
         </w:rPr>
         <w:drawing>
-          <wp:inline distT="0" distB="0" distL="0" distR="0" wp14:anchorId="7E30646F" wp14:editId="2189E332">
+          <wp:inline distT="0" distB="0" distL="0" distR="0" wp14:anchorId="23444036" wp14:editId="0C602A31">
             <wp:extent cx="5472000" cy="2970514"/>
             <wp:effectExtent l="0" t="0" r="0" b="0"/>
             <wp:docPr id="2" name="Picture 2" descr="Figure 4.1 Dependency boundaries and the three repository modes"/>
@@ -7661,7 +7978,7 @@
       <w:pPr>
         <w:pStyle w:val="ReportFigure"/>
       </w:pPr>
-      <w:bookmarkStart w:id="26" w:name="_Toc240744462"/>
+      <w:bookmarkStart w:id="26" w:name="_Toc243487911"/>
       <w:r>
         <w:t>Figure 4.1 Dependency boundaries and the three repository modes</w:t>
       </w:r>
@@ -7691,7 +8008,7 @@
       <w:pPr>
         <w:pStyle w:val="Heading2"/>
       </w:pPr>
-      <w:bookmarkStart w:id="27" w:name="_Toc240744434"/>
+      <w:bookmarkStart w:id="27" w:name="_Toc243487882"/>
       <w:r>
         <w:t>4.2 Domain model and persistence representation</w:t>
       </w:r>
@@ -7717,7 +8034,7 @@
       <w:pPr>
         <w:pStyle w:val="ReportTableCaption"/>
       </w:pPr>
-      <w:bookmarkStart w:id="28" w:name="_Toc240744469"/>
+      <w:bookmarkStart w:id="28" w:name="_Toc243487921"/>
       <w:r>
         <w:t>Table 4.1 Main validation and ownership constraints</w:t>
       </w:r>
@@ -8245,7 +8562,7 @@
           <w:noProof/>
         </w:rPr>
         <w:drawing>
-          <wp:inline distT="0" distB="0" distL="0" distR="0" wp14:anchorId="41DDCC28" wp14:editId="74EDEFF2">
+          <wp:inline distT="0" distB="0" distL="0" distR="0" wp14:anchorId="603F53B8" wp14:editId="787BA357">
             <wp:extent cx="5472000" cy="2540571"/>
             <wp:effectExtent l="0" t="0" r="0" b="0"/>
             <wp:docPr id="3" name="Picture 3" descr="Figure 4.2 SQLite ownership and session relationships"/>
@@ -8285,7 +8602,7 @@
       <w:pPr>
         <w:pStyle w:val="ReportFigure"/>
       </w:pPr>
-      <w:bookmarkStart w:id="29" w:name="_Toc240744463"/>
+      <w:bookmarkStart w:id="29" w:name="_Toc243487912"/>
       <w:r>
         <w:t>Figure 4.2 SQLite ownership and session relationships</w:t>
       </w:r>
@@ -8307,7 +8624,7 @@
       <w:pPr>
         <w:pStyle w:val="Heading2"/>
       </w:pPr>
-      <w:bookmarkStart w:id="30" w:name="_Toc240744435"/>
+      <w:bookmarkStart w:id="30" w:name="_Toc243487883"/>
       <w:r>
         <w:t>4.3 Controller state and successful writes</w:t>
       </w:r>
@@ -8340,7 +8657,7 @@
         </w:rPr>
         <w:lastRenderedPageBreak/>
         <w:drawing>
-          <wp:inline distT="0" distB="0" distL="0" distR="0" wp14:anchorId="671B19D0" wp14:editId="15BA26FE">
+          <wp:inline distT="0" distB="0" distL="0" distR="0" wp14:anchorId="3A363738" wp14:editId="4CF12780">
             <wp:extent cx="5472000" cy="3009600"/>
             <wp:effectExtent l="0" t="0" r="0" b="0"/>
             <wp:docPr id="4" name="Picture 4" descr="Figure 4.3 State transitions around loading and mutation"/>
@@ -8380,7 +8697,7 @@
       <w:pPr>
         <w:pStyle w:val="ReportFigure"/>
       </w:pPr>
-      <w:bookmarkStart w:id="31" w:name="_Toc240744464"/>
+      <w:bookmarkStart w:id="31" w:name="_Toc243487913"/>
       <w:r>
         <w:t>Figure 4.3 State transitions around loading and mutation</w:t>
       </w:r>
@@ -8398,7 +8715,7 @@
       <w:pPr>
         <w:pStyle w:val="Heading2"/>
       </w:pPr>
-      <w:bookmarkStart w:id="32" w:name="_Toc240744436"/>
+      <w:bookmarkStart w:id="32" w:name="_Toc243487884"/>
       <w:r>
         <w:t>4.4 Remote concurrency and uncertain outcomes</w:t>
       </w:r>
@@ -8409,10 +8726,7 @@
         <w:pStyle w:val="ReportBody"/>
       </w:pPr>
       <w:r>
-        <w:t>The HTTP repository loads both the task snapshot and its revision. A subsequent write supplies that revision. The server begins an immediate SQLite transaction, compares the expected revision, replaces only the owning user's collection, increments the revision and commits. A stale writer receives a conflict instead of overwriting changes based on an older snapshot. SQLite documents transactions and immediate transaction behavior; the account scoping and revision protocol are TaskFlow's own application desig</w:t>
-      </w:r>
-      <w:r>
-        <w:t>n (SQLite, n.d.).</w:t>
+        <w:t>The HTTP repository loads both the task snapshot and its revision. A subsequent write supplies that revision. The server begins an immediate SQLite transaction, compares the expected revision, replaces only the owning user's collection, increments the revision and commits. A stale writer receives a conflict instead of overwriting changes based on an older snapshot. SQLite documents transactions and immediate transaction behavior; the account scoping and revision protocol are TaskFlow's own application design (SQLite, n.d.).</w:t>
       </w:r>
     </w:p>
     <w:p>
@@ -8432,17 +8746,14 @@
         <w:pStyle w:val="ReportBody"/>
       </w:pPr>
       <w:r>
-        <w:t>Whole-snapshot replacement is easy to reason about for the small test dataset and makes rollback assertions straightforward. Its cost is repeated transfer of records that did not change, and a broad conflict boundary when different clients edit different tasks. Per-task endpoints also exist on the server, but the inspected Flutter repository uses the snapshot route. A future change to per-record synchronization would require a new contract and tests for partial success, deletion conflicts and reconciliation</w:t>
-      </w:r>
-      <w:r>
-        <w:t xml:space="preserve"> rather than merely substituting an endpoint URL.</w:t>
+        <w:t>Whole-snapshot replacement is easy to reason about for the small test dataset and makes rollback assertions straightforward. Its cost is repeated transfer of records that did not change, and a broad conflict boundary when different clients edit different tasks. Per-task endpoints also exist on the server, but the inspected Flutter repository uses the snapshot route. A future change to per-record synchronization would require a new contract and tests for partial success, deletion conflicts and reconciliation rather than merely substituting an endpoint URL.</w:t>
       </w:r>
     </w:p>
     <w:p>
       <w:pPr>
         <w:pStyle w:val="Heading2"/>
       </w:pPr>
-      <w:bookmarkStart w:id="33" w:name="_Toc240744437"/>
+      <w:bookmarkStart w:id="33" w:name="_Toc243487885"/>
       <w:r>
         <w:t>4.5 Session security and operational limits</w:t>
       </w:r>
@@ -8476,7 +8787,7 @@
       <w:pPr>
         <w:pStyle w:val="Heading1"/>
       </w:pPr>
-      <w:bookmarkStart w:id="34" w:name="_Toc240744438"/>
+      <w:bookmarkStart w:id="34" w:name="_Toc243487886"/>
       <w:r>
         <w:lastRenderedPageBreak/>
         <w:t>5 Implementation and platform behavior</w:t>
@@ -8487,7 +8798,7 @@
       <w:pPr>
         <w:pStyle w:val="Heading2"/>
       </w:pPr>
-      <w:bookmarkStart w:id="35" w:name="_Toc240744439"/>
+      <w:bookmarkStart w:id="35" w:name="_Toc243487887"/>
       <w:r>
         <w:t>5.1 Responsive workspace and interaction design</w:t>
       </w:r>
@@ -8506,7 +8817,7 @@
         <w:pStyle w:val="ReportBody"/>
       </w:pPr>
       <w:r>
-        <w:t>The visual system uses a pale neutral application background, white surfaces, a restrained indigo accent and clear typographic hierarchy. Small shadows and borders separate surfaces without turning every control into a prominent card. The design goal is legibility and predictable action placement. This goal should not be confused with a measured rendering-performance improvement: the repository does not contain a frame-time study proving that the redesign eliminated jank.</w:t>
+        <w:t>The visual system combines violet, mint and peach accents with readable surfaces and explicit status text. The October audit makes compact capture and active filters clearer, adds removable conditions and separates search reset from filter reset. Figure 5.1 shows the current controlled wide fixture. Visual changes alone do not establish runtime speed; the profile experiment in Chapter 6 measures the separate transition to lazy list construction.</w:t>
       </w:r>
     </w:p>
     <w:p>
@@ -8519,7 +8830,7 @@
           <w:noProof/>
         </w:rPr>
         <w:drawing>
-          <wp:inline distT="0" distB="0" distL="0" distR="0" wp14:anchorId="21769D5E" wp14:editId="5E7FD060">
+          <wp:inline distT="0" distB="0" distL="0" distR="0" wp14:anchorId="5A853044" wp14:editId="42998794">
             <wp:extent cx="5472000" cy="3847500"/>
             <wp:effectExtent l="0" t="0" r="0" b="0"/>
             <wp:docPr id="5" name="Picture 5" descr="Figure 5.1 Wide TaskFlow layout from the controlled golden fixture"/>
@@ -8559,7 +8870,7 @@
       <w:pPr>
         <w:pStyle w:val="ReportFigure"/>
       </w:pPr>
-      <w:bookmarkStart w:id="36" w:name="_Toc240744465"/>
+      <w:bookmarkStart w:id="36" w:name="_Toc243487914"/>
       <w:r>
         <w:t>Figure 5.1 Wide TaskFlow layout from the controlled golden fixture</w:t>
       </w:r>
@@ -8576,13 +8887,79 @@
     </w:p>
     <w:p>
       <w:pPr>
+        <w:keepNext/>
+        <w:jc w:val="center"/>
+      </w:pPr>
+      <w:r>
+        <w:rPr>
+          <w:noProof/>
+        </w:rPr>
+        <w:drawing>
+          <wp:inline distT="0" distB="0" distL="0" distR="0" wp14:anchorId="16F321AB" wp14:editId="085F5BFD">
+            <wp:extent cx="2162559" cy="4679999"/>
+            <wp:effectExtent l="0" t="0" r="0" b="0"/>
+            <wp:docPr id="6" name="Picture 6" descr="Figure 5.2 Compact TaskFlow fixture at 390 by 844 logical pixels from the October audit"/>
+            <wp:cNvGraphicFramePr>
+              <a:graphicFrameLocks xmlns:a="http://schemas.openxmlformats.org/drawingml/2006/main" noChangeAspect="1"/>
+            </wp:cNvGraphicFramePr>
+            <a:graphic xmlns:a="http://schemas.openxmlformats.org/drawingml/2006/main">
+              <a:graphicData uri="http://schemas.openxmlformats.org/drawingml/2006/picture">
+                <pic:pic xmlns:pic="http://schemas.openxmlformats.org/drawingml/2006/picture">
+                  <pic:nvPicPr>
+                    <pic:cNvPr id="0" name="ui-phone.png"/>
+                    <pic:cNvPicPr/>
+                  </pic:nvPicPr>
+                  <pic:blipFill>
+                    <a:blip r:embed="rId20"/>
+                    <a:stretch>
+                      <a:fillRect/>
+                    </a:stretch>
+                  </pic:blipFill>
+                  <pic:spPr>
+                    <a:xfrm>
+                      <a:off x="0" y="0"/>
+                      <a:ext cx="2162559" cy="4679999"/>
+                    </a:xfrm>
+                    <a:prstGeom prst="rect">
+                      <a:avLst/>
+                    </a:prstGeom>
+                  </pic:spPr>
+                </pic:pic>
+              </a:graphicData>
+            </a:graphic>
+          </wp:inline>
+        </w:drawing>
+      </w:r>
+    </w:p>
+    <w:p>
+      <w:pPr>
+        <w:pStyle w:val="ReportFigure"/>
+        <w:keepNext/>
+      </w:pPr>
+      <w:bookmarkStart w:id="37" w:name="_Toc243487915"/>
+      <w:r>
+        <w:t>Figure 5.2 Compact TaskFlow fixture at 390 by 844 logical pixels from the October audit</w:t>
+      </w:r>
+      <w:bookmarkEnd w:id="37"/>
+    </w:p>
+    <w:p>
+      <w:pPr>
+        <w:pStyle w:val="ReportBody"/>
+      </w:pPr>
+      <w:r>
+        <w:t>Figure 5.2 shows the compact layout with quick capture, search, status selection and visible task metadata. This deterministic golden render uses synthetic records and an injected clock; it is not an Android device capture. The partially visible second card indicates scrollable content rather than a requirement to fit every record on one screen.</w:t>
+      </w:r>
+    </w:p>
+    <w:p>
+      <w:pPr>
         <w:pStyle w:val="Heading2"/>
       </w:pPr>
-      <w:bookmarkStart w:id="37" w:name="_Toc240744440"/>
-      <w:r>
+      <w:bookmarkStart w:id="38" w:name="_Toc243487888"/>
+      <w:r>
+        <w:lastRenderedPageBreak/>
         <w:t>5.2 Capture and edit forms</w:t>
       </w:r>
-      <w:bookmarkEnd w:id="37"/>
+      <w:bookmarkEnd w:id="38"/>
     </w:p>
     <w:p>
       <w:pPr>
@@ -8605,29 +8982,52 @@
         <w:pStyle w:val="ReportBody"/>
       </w:pPr>
       <w:r>
-        <w:t>Quick-create workspace exits likewise check whether a draft should be discarded. Each asynchronous save captures its submitted title and metadata. Completion resets the form only when its current draft still matches that submission; newer input is retained for the next task. Four controlled widget cases verify this behavior at compact and wide sizes for successful and unsuccessful writes, including duplicate-submit prevention and the subsequent save. These protections concern explicit workspace transitions.</w:t>
-      </w:r>
-      <w:r>
-        <w:t xml:space="preserve"> They do not establish a general operating-system-close, browser-refresh or crash-recovery guarantee.</w:t>
+        <w:t>Quick-create workspace exits likewise check whether a draft should be discarded. Each asynchronous save captures its submitted title and metadata. Completion resets the form only when its current draft still matches that submission; newer input is retained for the next task. Four controlled widget cases verify this behavior at compact and wide sizes for successful and unsuccessful writes, including duplicate-submit prevention and the subsequent save. These protections concern explicit workspace transitions. They do not establish a general operating-system-close, browser-refresh or crash-recovery guarantee.</w:t>
       </w:r>
     </w:p>
     <w:p>
       <w:pPr>
         <w:pStyle w:val="Heading2"/>
       </w:pPr>
-      <w:bookmarkStart w:id="38" w:name="_Toc240744441"/>
+      <w:bookmarkStart w:id="39" w:name="_Toc243487889"/>
+      <w:r>
+        <w:t>5.3 Discovery and stable results</w:t>
+      </w:r>
+      <w:bookmarkEnd w:id="39"/>
+    </w:p>
+    <w:p>
+      <w:pPr>
+        <w:pStyle w:val="ReportBody"/>
+      </w:pPr>
+      <w:r>
+        <w:t>Search normalizes input and performs substring matching. The intentional-defect experiment deliberately violates that rule with prefix-only matching. Filters combine, so a result must satisfy the selected conditions rather than satisfying any single one. Sorting is stable and deterministic. Together these requirements enable exact list assertions: the test can compare the expected task set and order rather than accepting any nonempty result.</w:t>
+      </w:r>
+    </w:p>
+    <w:p>
+      <w:pPr>
+        <w:pStyle w:val="ReportBody"/>
+      </w:pPr>
       <w:r>
         <w:lastRenderedPageBreak/>
-        <w:t>5.3 Discovery and stable results</w:t>
-      </w:r>
-      <w:bookmarkEnd w:id="38"/>
+        <w:t>Search has a keyboard shortcut, and filter and sort controls retain meaningful labels. Clearing discovery conditions returns the user to an understandable state. A no-match result is distinct from an empty repository: the first invites changing the search or filters, while the second invites creating a task. Tests should preserve this distinction because showing the wrong empty state can hide a still-active filter and make a saved record appear lost.</w:t>
+      </w:r>
+    </w:p>
+    <w:p>
+      <w:pPr>
+        <w:pStyle w:val="Heading2"/>
+      </w:pPr>
+      <w:bookmarkStart w:id="40" w:name="_Toc243487890"/>
+      <w:r>
+        <w:t>5.4 Loading and recoverable failures</w:t>
+      </w:r>
+      <w:bookmarkEnd w:id="40"/>
     </w:p>
     <w:p>
       <w:pPr>
         <w:pStyle w:val="ReportBody"/>
       </w:pPr>
       <w:r>
-        <w:t>Search normalizes input and performs substring matching. The intentional-defect experiment deliberately violates that rule with prefix-only matching. Filters combine, so a result must satisfy the selected conditions rather than satisfying any single one. Sorting is stable and deterministic. Together these requirements enable exact list assertions: the test can compare the expected task set and order rather than accepting any nonempty result.</w:t>
+        <w:t>The loading state is not verified by waiting for an arbitrary delay and hoping the repository remains busy. A test-controlled completion gate holds the operation open. The test can then inspect disabled actions, the progress indication and draft state before releasing the operation. A separate failure path verifies the readable error and an explicit recovery action. This pattern makes intermediate UI states testable even when normal local storage is fast.</w:t>
       </w:r>
     </w:p>
     <w:p>
@@ -8635,45 +9035,85 @@
         <w:pStyle w:val="ReportBody"/>
       </w:pPr>
       <w:r>
-        <w:t>Search has a keyboard shortcut, and filter and sort controls retain meaningful labels. Clearing discovery conditions returns the user to an understandable state. A no-match result is distinct from an empty repository: the first invites changing the search or filters, while the second invites creating a task. Tests should preserve this distinction because showing the wrong empty state can hide a still-active filter and make a saved record appear lost.</w:t>
+        <w:t>Save failures are tested independently from initial-load failures. They have different data risks: a failed initial load must not permit replacement of unknown data, while a failed save must preserve the previously accepted collection and useful draft input. Remote write failures also require revision recovery. A generic error screen alone would not establish these invariants, so the assertions inspect both visible state and repository results.</w:t>
+      </w:r>
+    </w:p>
+    <w:p>
+      <w:pPr>
+        <w:keepNext/>
+        <w:jc w:val="center"/>
+      </w:pPr>
+      <w:r>
+        <w:rPr>
+          <w:noProof/>
+        </w:rPr>
+        <w:lastRenderedPageBreak/>
+        <w:drawing>
+          <wp:inline distT="0" distB="0" distL="0" distR="0" wp14:anchorId="4D58BB99" wp14:editId="6021A962">
+            <wp:extent cx="4320000" cy="5760000"/>
+            <wp:effectExtent l="0" t="0" r="0" b="0"/>
+            <wp:docPr id="7" name="Picture 7" descr="Figure 5.3 Retained edit draft and latest saved version in the controlled recovery fixture"/>
+            <wp:cNvGraphicFramePr>
+              <a:graphicFrameLocks xmlns:a="http://schemas.openxmlformats.org/drawingml/2006/main" noChangeAspect="1"/>
+            </wp:cNvGraphicFramePr>
+            <a:graphic xmlns:a="http://schemas.openxmlformats.org/drawingml/2006/main">
+              <a:graphicData uri="http://schemas.openxmlformats.org/drawingml/2006/picture">
+                <pic:pic xmlns:pic="http://schemas.openxmlformats.org/drawingml/2006/picture">
+                  <pic:nvPicPr>
+                    <pic:cNvPr id="0" name="ui-edit-recovery.png"/>
+                    <pic:cNvPicPr/>
+                  </pic:nvPicPr>
+                  <pic:blipFill>
+                    <a:blip r:embed="rId21"/>
+                    <a:stretch>
+                      <a:fillRect/>
+                    </a:stretch>
+                  </pic:blipFill>
+                  <pic:spPr>
+                    <a:xfrm>
+                      <a:off x="0" y="0"/>
+                      <a:ext cx="4320000" cy="5760000"/>
+                    </a:xfrm>
+                    <a:prstGeom prst="rect">
+                      <a:avLst/>
+                    </a:prstGeom>
+                  </pic:spPr>
+                </pic:pic>
+              </a:graphicData>
+            </a:graphic>
+          </wp:inline>
+        </w:drawing>
+      </w:r>
+    </w:p>
+    <w:p>
+      <w:pPr>
+        <w:pStyle w:val="ReportFigure"/>
+        <w:keepNext/>
+      </w:pPr>
+      <w:bookmarkStart w:id="41" w:name="_Toc243487916"/>
+      <w:r>
+        <w:t>Figure 5.3 Retained edit draft and latest saved version in the controlled recovery fixture</w:t>
+      </w:r>
+      <w:bookmarkEnd w:id="41"/>
+    </w:p>
+    <w:p>
+      <w:pPr>
+        <w:pStyle w:val="ReportBody"/>
+      </w:pPr>
+      <w:r>
+        <w:t>Figure 5.3 makes the recovery decision visible: the form retains the user's draft while an expandable section shows the latest saved version. Applying the draft is an explicit action. This golden fixture illustrates presentation; the controlled recovery tests verify that reload does not write, server completion status is preserved and a lost replacement response does not create a duplicate.</w:t>
       </w:r>
     </w:p>
     <w:p>
       <w:pPr>
         <w:pStyle w:val="Heading2"/>
       </w:pPr>
-      <w:bookmarkStart w:id="39" w:name="_Toc240744442"/>
-      <w:r>
-        <w:t>5.4 Loading and recoverable failures</w:t>
-      </w:r>
-      <w:bookmarkEnd w:id="39"/>
-    </w:p>
-    <w:p>
-      <w:pPr>
-        <w:pStyle w:val="ReportBody"/>
-      </w:pPr>
-      <w:r>
-        <w:t>The loading state is not verified by waiting for an arbitrary delay and hoping the repository remains busy. A test-controlled completion gate holds the operation open. The test can then inspect disabled actions, the progress indication and draft state before releasing the operation. A separate failure path verifies the readable error and an explicit recovery action. This pattern makes intermediate UI states testable even when normal local storage is fast.</w:t>
-      </w:r>
-    </w:p>
-    <w:p>
-      <w:pPr>
-        <w:pStyle w:val="ReportBody"/>
-      </w:pPr>
-      <w:r>
-        <w:t>Save failures are tested independently from initial-load failures. They have different data risks: a failed initial load must not permit replacement of unknown data, while a failed save must preserve the previously accepted collection and useful draft input. Remote write failures also require revision recovery. A generic error screen alone would not establish these invariants, so the assertions inspect both visible state and repository results.</w:t>
-      </w:r>
-    </w:p>
-    <w:p>
-      <w:pPr>
-        <w:pStyle w:val="Heading2"/>
-      </w:pPr>
-      <w:bookmarkStart w:id="40" w:name="_Toc240744443"/>
+      <w:bookmarkStart w:id="42" w:name="_Toc243487891"/>
       <w:r>
         <w:lastRenderedPageBreak/>
         <w:t>5.5 Account workflows and backend integration</w:t>
       </w:r>
-      <w:bookmarkEnd w:id="40"/>
+      <w:bookmarkEnd w:id="42"/>
     </w:p>
     <w:p>
       <w:pPr>
@@ -8703,21 +9143,18 @@
       <w:pPr>
         <w:pStyle w:val="Heading2"/>
       </w:pPr>
-      <w:bookmarkStart w:id="41" w:name="_Toc240744444"/>
+      <w:bookmarkStart w:id="43" w:name="_Toc243487892"/>
       <w:r>
         <w:t>5.6 Platform and accessibility boundaries</w:t>
       </w:r>
-      <w:bookmarkEnd w:id="41"/>
+      <w:bookmarkEnd w:id="43"/>
     </w:p>
     <w:p>
       <w:pPr>
         <w:pStyle w:val="ReportBody"/>
       </w:pPr>
       <w:r>
-        <w:t>Windows and Android each supply 15 native case executions, including controlled repositories, real preferences, draft protection and an isolated API/SQLite workflow. The local Android 16/API 36 emulator also passed release APK installation, cold launch and an offline task check after force-stop and relaunch. Edge supplies retained browser interactions through a controlled harness and a separate account-lifecycle test. These results do not establish physical Android device testing. The iOS runner is scaffold</w:t>
-      </w:r>
-      <w:r>
-        <w:t>ed but build and execution remain unverified because this Windows host has no Mac/Xcode toolchain.</w:t>
+        <w:t>Windows and Android each supply 15 native case executions, including controlled repositories, real preferences, draft protection and an isolated API/SQLite workflow. The local Android 16/API 36 emulator also passed release APK installation, cold launch and an offline task check after force-stop and relaunch. Edge supplies retained browser interactions through a controlled harness and a separate account-lifecycle test. These results do not establish physical Android device testing. The iOS runner is scaffolded but build and execution remain unverified because this Windows host has no Mac/Xcode toolchain.</w:t>
       </w:r>
     </w:p>
     <w:p>
@@ -8749,29 +9186,29 @@
       <w:pPr>
         <w:pStyle w:val="Heading1"/>
       </w:pPr>
-      <w:bookmarkStart w:id="42" w:name="_Toc240744445"/>
+      <w:bookmarkStart w:id="44" w:name="_Toc243487893"/>
       <w:r>
         <w:lastRenderedPageBreak/>
         <w:t>6 Testing experiments and evaluation</w:t>
       </w:r>
-      <w:bookmarkEnd w:id="42"/>
+      <w:bookmarkEnd w:id="44"/>
     </w:p>
     <w:p>
       <w:pPr>
         <w:pStyle w:val="Heading2"/>
       </w:pPr>
-      <w:bookmarkStart w:id="43" w:name="_Toc240744446"/>
+      <w:bookmarkStart w:id="45" w:name="_Toc243487894"/>
       <w:r>
         <w:t>6.1 Evaluation protocol and evidence identity</w:t>
       </w:r>
-      <w:bookmarkEnd w:id="43"/>
+      <w:bookmarkEnd w:id="45"/>
     </w:p>
     <w:p>
       <w:pPr>
         <w:pStyle w:val="ReportBody"/>
       </w:pPr>
       <w:r>
-        <w:t>Evaluation separates source identity, test selection, environment and observed outcome. The latest local evaluation uses commit 06d3790 plus the snapshot-capacity correction of 19 September, recorded under docs/evidence/risk-closure-20260919. The Flutter suite passed 104 cases with coverage enabled and the Node suite passed 17 cases. Earlier native, browser and hosted Android experiments keep their original evidence identities; they are not relabelled as executions of the updated source.</w:t>
+        <w:t>Evaluation separates source identity, test selection, environment and observed outcome. The reviewed source is a153046. The 11 October UI/UX and Android follow-up evidence packages record 133 Flutter cases with coverage, 17 Node cases and 15 native scenarios per platform. Logs are retained under docs/evidence/uiux-audit-20261011 and docs/evidence/android-loopback-20261011. This document update reuses those dated observations; it is not a new test or hosted CI run.</w:t>
       </w:r>
     </w:p>
     <w:p>
@@ -8779,18 +9216,18 @@
         <w:pStyle w:val="ReportBody"/>
       </w:pPr>
       <w:r>
-        <w:t>The latest local environment is Flutter 3.47.1 with Dart 3.13.1 on Windows 11, build 26200.9457, and Node 22.14.0 with built-in SQLite. The earlier Android target is Google APIs Android 16/API 36 x86_64, emulator 37.1.11, at 720 by 1280 pixels and density 240, with two cores and 2048 MB guest memory. SDK and caches are under D:/Android. Host PATH and SDK-manager license-status warnings remain documented rather than reported as a fully clean toolchain check.</w:t>
+        <w:t>The October profile host used Flutter 3.47.0, Dart 3.13.0 and Windows 11 build 26200.9457 on an Intel Core i7-12700H. Android native evidence uses an Android 16/API 36 x86_64 emulator in debug mode with SwiftShader/OpenGLES and the standard integration driver. Native text injection uses a test channel, so it does not validate a physical keyboard or input method. Environment details belong to each evidence package rather than one assumed configuration for every run.</w:t>
       </w:r>
     </w:p>
     <w:p>
       <w:pPr>
         <w:pStyle w:val="ReportTableCaption"/>
       </w:pPr>
-      <w:bookmarkStart w:id="44" w:name="_Toc240744470"/>
+      <w:bookmarkStart w:id="46" w:name="_Toc243487922"/>
       <w:r>
         <w:t>Table 6.1 Results and their actual verification boundaries</w:t>
       </w:r>
-      <w:bookmarkEnd w:id="44"/>
+      <w:bookmarkEnd w:id="46"/>
     </w:p>
     <w:tbl>
       <w:tblPr>
@@ -8901,7 +9338,7 @@
               <w:pStyle w:val="ReportTable"/>
             </w:pPr>
             <w:r>
-              <w:t>PASS during report preparation</w:t>
+              <w:t>PASS in retained October evidence</w:t>
             </w:r>
           </w:p>
         </w:tc>
@@ -8954,7 +9391,7 @@
               <w:pStyle w:val="ReportTable"/>
             </w:pPr>
             <w:r>
-              <w:t>104 cases PASS on 19 September</w:t>
+              <w:t>133 cases PASS on 11 October</w:t>
             </w:r>
           </w:p>
         </w:tc>
@@ -8970,7 +9407,7 @@
               <w:pStyle w:val="ReportTable"/>
             </w:pPr>
             <w:r>
-              <w:t>Includes validation and golden checks; no coverage percentage asserted</w:t>
+              <w:t>Includes 17 reviewed golden baselines; no coverage percentage asserted</w:t>
             </w:r>
           </w:p>
         </w:tc>
@@ -9007,7 +9444,7 @@
               <w:pStyle w:val="ReportTable"/>
             </w:pPr>
             <w:r>
-              <w:t>17 cases PASS on 19 September</w:t>
+              <w:t>17 cases PASS on 11 October</w:t>
             </w:r>
           </w:p>
         </w:tc>
@@ -9060,7 +9497,7 @@
               <w:pStyle w:val="ReportTable"/>
             </w:pPr>
             <w:r>
-              <w:t>15 cases PASS on 19 September</w:t>
+              <w:t>15 cases PASS on 11 October</w:t>
             </w:r>
           </w:p>
         </w:tc>
@@ -9113,7 +9550,7 @@
               <w:pStyle w:val="ReportTable"/>
             </w:pPr>
             <w:r>
-              <w:t>PASS on 14 September</w:t>
+              <w:t>Historical PASS on 14 September</w:t>
             </w:r>
           </w:p>
         </w:tc>
@@ -9166,7 +9603,7 @@
               <w:pStyle w:val="ReportTable"/>
             </w:pPr>
             <w:r>
-              <w:t>15 cases PASS on 15 September</w:t>
+              <w:t>15 cases PASS on 11 October</w:t>
             </w:r>
           </w:p>
         </w:tc>
@@ -9256,6 +9693,7 @@
               <w:pStyle w:val="ReportTable"/>
             </w:pPr>
             <w:r>
+              <w:lastRenderedPageBreak/>
               <w:t>iOS</w:t>
             </w:r>
           </w:p>
@@ -9309,7 +9747,6 @@
               <w:pStyle w:val="ReportTable"/>
             </w:pPr>
             <w:r>
-              <w:lastRenderedPageBreak/>
               <w:t>Edge UI harness</w:t>
             </w:r>
           </w:p>
@@ -9407,7 +9844,7 @@
         <w:pStyle w:val="ReportBody"/>
       </w:pPr>
       <w:r>
-        <w:t>The 104-case total includes golden comparisons using checked-in baselines reviewed at 06d3790, without regeneration. The six native selections comprise four independent, three persisted, two preference-backed, one quick-create exit, four pending-capture and one online case. Windows repeated all 15 successfully on 19 September; Android retains its 15 September evidence. These are overlapping scenarios, not 30 distinct tests.</w:t>
+        <w:t>The 133-case suite includes five controlled fake-HTTP recovery scenarios and 17 golden baselines: 13 existing images were reviewed and changed, two existing edit-dialog baselines stayed unchanged, and two audit baselines were added. Native selections comprise four independent, three persisted, two preference-backed, one quick-create exit, four pending-capture and one online scenario. Windows selections have the final-fix boundary described in Chapter 1. Android completed all six selections in separate invocations after the loopback workaround. These are overlapping scenarios across platforms, not 30 different test designs.</w:t>
       </w:r>
     </w:p>
     <w:p>
@@ -9422,11 +9859,11 @@
       <w:pPr>
         <w:pStyle w:val="Heading2"/>
       </w:pPr>
-      <w:bookmarkStart w:id="45" w:name="_Toc240744447"/>
+      <w:bookmarkStart w:id="47" w:name="_Toc243487895"/>
       <w:r>
         <w:t>6.2 Scenario design and assertion strength</w:t>
       </w:r>
-      <w:bookmarkEnd w:id="45"/>
+      <w:bookmarkEnd w:id="47"/>
     </w:p>
     <w:p>
       <w:pPr>
@@ -9441,11 +9878,11 @@
         <w:pStyle w:val="ReportBody"/>
       </w:pPr>
       <w:r>
-        <w:t xml:space="preserve">The persisted suite resets only its dedicated test preference keys. It does not clear all preferences on the host. A fresh repository and UI remount then verifies that persisted records can be read back. This is stronger than checking the previous widget's in-memory list, but it remains a remount rather than terminating and </w:t>
+        <w:t xml:space="preserve">The persisted suite resets only its dedicated test preference keys. It does not clear all preferences on the host. A fresh repository and UI remount then verifies </w:t>
       </w:r>
       <w:r>
         <w:lastRenderedPageBreak/>
-        <w:t>restarting the operating-system process. The distinction is stated because both actions are sometimes described imprecisely as a restart.</w:t>
+        <w:t>that persisted records can be read back. This is stronger than checking the previous widget's in-memory list, but it remains a remount rather than terminating and restarting the operating-system process. The distinction is stated because both actions are sometimes described imprecisely as a restart.</w:t>
       </w:r>
     </w:p>
     <w:p>
@@ -9468,11 +9905,11 @@
       <w:pPr>
         <w:pStyle w:val="Heading2"/>
       </w:pPr>
-      <w:bookmarkStart w:id="46" w:name="_Toc240744448"/>
+      <w:bookmarkStart w:id="48" w:name="_Toc243487896"/>
       <w:r>
         <w:t>6.3 Intentional semantic defect</w:t>
       </w:r>
-      <w:bookmarkEnd w:id="46"/>
+      <w:bookmarkEnd w:id="48"/>
     </w:p>
     <w:p>
       <w:pPr>
@@ -9487,19 +9924,22 @@
         <w:pStyle w:val="ReportBody"/>
       </w:pPr>
       <w:r>
-        <w:t>The baseline regression test passed before the change. With the faulty comparison, the expected task could not be found and the command failed. Restoring substring matching made the same regression pass again. The repository retains the buggy patch, corrected patch and unedited baseline, failure and recovery logs. The permanent test remains in the corrected source tree; the production implementation is not left intentionally defective.</w:t>
+        <w:t xml:space="preserve">The baseline regression test passed before the change. With the faulty comparison, the expected task could not be found and the command failed. Restoring substring matching made the same regression pass again. The repository retains the buggy patch, corrected patch and unedited baseline, failure and recovery </w:t>
+      </w:r>
+      <w:r>
+        <w:lastRenderedPageBreak/>
+        <w:t>logs. The permanent test remains in the corrected source tree; the production implementation is not left intentionally defective.</w:t>
       </w:r>
     </w:p>
     <w:p>
       <w:pPr>
         <w:pStyle w:val="ReportTableCaption"/>
       </w:pPr>
-      <w:bookmarkStart w:id="47" w:name="_Toc240744471"/>
-      <w:r>
-        <w:lastRenderedPageBreak/>
+      <w:bookmarkStart w:id="49" w:name="_Toc243487923"/>
+      <w:r>
         <w:t>Table 6.2 Deliberate search-defect experiment</w:t>
       </w:r>
-      <w:bookmarkEnd w:id="47"/>
+      <w:bookmarkEnd w:id="49"/>
     </w:p>
     <w:tbl>
       <w:tblPr>
@@ -9751,11 +10191,11 @@
       <w:pPr>
         <w:pStyle w:val="Heading2"/>
       </w:pPr>
-      <w:bookmarkStart w:id="48" w:name="_Toc240744449"/>
+      <w:bookmarkStart w:id="50" w:name="_Toc243487897"/>
       <w:r>
         <w:t>6.4 Test-level timing experiment</w:t>
       </w:r>
-      <w:bookmarkEnd w:id="48"/>
+      <w:bookmarkEnd w:id="50"/>
     </w:p>
     <w:p>
       <w:pPr>
@@ -9769,11 +10209,11 @@
       <w:pPr>
         <w:pStyle w:val="ReportTableCaption"/>
       </w:pPr>
-      <w:bookmarkStart w:id="49" w:name="_Toc240744472"/>
+      <w:bookmarkStart w:id="51" w:name="_Toc243487924"/>
       <w:r>
         <w:t>Table 6.3 Whole-command duration in seconds for the selected suites</w:t>
       </w:r>
-      <w:bookmarkEnd w:id="49"/>
+      <w:bookmarkEnd w:id="51"/>
     </w:p>
     <w:tbl>
       <w:tblPr>
@@ -10071,11 +10511,8 @@
         <w:pStyle w:val="ReportBody"/>
       </w:pPr>
       <w:r>
-        <w:t xml:space="preserve">All twelve selected commands passed. Within this setup, the native selection required substantially more wall time than the other selected commands. That </w:t>
-      </w:r>
-      <w:r>
         <w:lastRenderedPageBreak/>
-        <w:t>observation helps justify running narrow tests during development before the larger native gate. It does not establish a fair per-test speed ranking, because the scenario counts and assertions differ, nor does it predict cold-cache CI duration.</w:t>
+        <w:t>All twelve selected commands passed. Within this setup, the native selection required substantially more wall time than the other selected commands. That observation helps justify running narrow tests during development before the larger native gate. It does not establish a fair per-test speed ranking, because the scenario counts and assertions differ, nor does it predict cold-cache CI duration.</w:t>
       </w:r>
     </w:p>
     <w:p>
@@ -10090,11 +10527,11 @@
       <w:pPr>
         <w:pStyle w:val="Heading2"/>
       </w:pPr>
-      <w:bookmarkStart w:id="50" w:name="_Toc240744450"/>
+      <w:bookmarkStart w:id="52" w:name="_Toc243487898"/>
       <w:r>
         <w:t>6.5 Browser automation and maintenance findings</w:t>
       </w:r>
-      <w:bookmarkEnd w:id="50"/>
+      <w:bookmarkEnd w:id="52"/>
     </w:p>
     <w:p>
       <w:pPr>
@@ -10117,28 +10554,47 @@
         <w:pStyle w:val="ReportBody"/>
       </w:pPr>
       <w:r>
-        <w:t xml:space="preserve">The earlier browser stability experiment and multi-session work remain useful historical observations, but the current one-run success cannot inherit their repetition count. The script also retains raw outputs and exit codes and restores the default Web build after the harness. Those safeguards improve the reproducibility </w:t>
+        <w:t xml:space="preserve">The earlier browser stability experiment and multi-session work remain useful historical observations, but the current one-run success cannot inherit their repetition count. The script also retains raw outputs and exit codes and restores the </w:t>
       </w:r>
       <w:r>
         <w:lastRenderedPageBreak/>
-        <w:t>of evidence collection. They do not prove that all browsers, clean machines or assistive technologies behave identically.</w:t>
-      </w:r>
-    </w:p>
+        <w:t>default Web build after the harness. Those safeguards improve the reproducibility of evidence collection. They do not prove that all browsers, clean machines or assistive technologies behave identically.</w:t>
+      </w:r>
+    </w:p>
+    <w:p/>
     <w:p>
       <w:pPr>
         <w:pStyle w:val="Heading2"/>
       </w:pPr>
-      <w:bookmarkStart w:id="51" w:name="_Toc240744451"/>
-      <w:r>
-        <w:t>6.6 Threats to validity and remaining gates</w:t>
-      </w:r>
-      <w:bookmarkEnd w:id="51"/>
+      <w:bookmarkStart w:id="53" w:name="_Toc243487899"/>
+      <w:r>
+        <w:t>6.6 Windows profile comparison</w:t>
+      </w:r>
+      <w:bookmarkEnd w:id="53"/>
     </w:p>
     <w:p>
       <w:pPr>
         <w:pStyle w:val="ReportBody"/>
       </w:pPr>
       <w:r>
+        <w:t>The October implementation replaces eager task construction with CustomScrollView and SliverList. Stable child-index lookup preserves task identity during reorder; expanded notes and focused actions request keep-alive. One complete eager run and one lazy run used four search changes, three status changes and eight scroll flings per dataset at a logical viewport of 1265.6 by 682.4. For 500 tasks, mean build time changed from 179.163 to 6.511 ms during search, 420.933 to 3.346 ms during filtering and 37.278 to 0.380 ms during scrolling. These are engine FrameTiming build samples, not FPS or widget-test durations. Sample counts differ with scheduling; one host and one run per strategy cannot establish a general speedup. Some lazy search frames still exceeded 16.67 ms. Raw build/raster/GC arrays are retained in profile-metrics.json in the October UI/UX evidence package.</w:t>
+      </w:r>
+    </w:p>
+    <w:p>
+      <w:pPr>
+        <w:pStyle w:val="Heading2"/>
+      </w:pPr>
+      <w:bookmarkStart w:id="54" w:name="_Toc243487900"/>
+      <w:r>
+        <w:t>6.7 Threats to validity and remaining gates</w:t>
+      </w:r>
+      <w:bookmarkEnd w:id="54"/>
+    </w:p>
+    <w:p>
+      <w:pPr>
+        <w:pStyle w:val="ReportBody"/>
+      </w:pPr>
+      <w:r>
         <w:t>Independent fixtures and meaningful assertions support internal validity. Fake failures simplify real transport behavior; golden comparisons depend on fonts and rendering; timings include overhead and unequal workloads. Browser-script corrections change the procedure, so earlier failed attempts remain available.</w:t>
       </w:r>
     </w:p>
@@ -10147,7 +10603,7 @@
         <w:pStyle w:val="ReportBody"/>
       </w:pPr>
       <w:r>
-        <w:t>External validity is limited by the small coursework dataset and selected Windows host and Android emulator. The eager task list has not been stress-tested at the server's 500-record acceptance limit. No frame-time or sustained API-load study is reported. The local Android API workflow does not establish physical-device connectivity, release HTTPS operation or production signing.</w:t>
+        <w:t>External validity is limited by selected Windows hardware and an Android emulator. The October experiment measured 100 and 500 synthetic in-memory records with 1,900-character notes in Windows profile mode. It did not measure API throughput, physical Android performance or production signing. The local Android API workflow does not establish release HTTPS operation.</w:t>
       </w:r>
     </w:p>
     <w:p>
@@ -10155,7 +10611,11 @@
         <w:pStyle w:val="ReportBody"/>
       </w:pPr>
       <w:r>
-        <w:t>Automated accessibility checks do not establish screen-reader usability, and remount does not establish process-restart persistence. Passing test counts alone cannot establish absence of defects.</w:t>
+        <w:t xml:space="preserve">Automated accessibility checks do not establish screen-reader usability. TalkBack 16.0 was bound with touch exploration; email focus, password traversal </w:t>
+      </w:r>
+      <w:r>
+        <w:lastRenderedPageBreak/>
+        <w:t>by Tab and task creation were observed. This is a basic compatibility check: speech quality, physical swipe/double-tap completion and a full manual audit remain unverified. Narrator and iOS remain NOT RUN. Remount does not establish process-restart persistence, and passing counts do not establish absence of defects.</w:t>
       </w:r>
     </w:p>
     <w:p>
@@ -10163,14 +10623,83 @@
         <w:pStyle w:val="ReportBody"/>
       </w:pPr>
       <w:r>
-        <w:t>The Android release check adds a stronger persistence boundary than UI remount: a task entered through Android input events remained visible after force-stop and relaunch. This does not establish an operating-system reboot or general input-method compatibility. The APK is 53,112,106 bytes; its checksum and installation commands are retained in the platform evidence package.</w:t>
-      </w:r>
+        <w:t>The Android release check adds a stronger persistence boundary than UI remount: a task entered through Android input events remained visible after force-stop and relaunch. This does not establish an operating-system reboot or general input-method compatibility. The October APK is 53,308,746 bytes; its checksum and installation commands are retained in the Android follow-up evidence package.</w:t>
+      </w:r>
+    </w:p>
+    <w:p>
+      <w:pPr>
+        <w:keepNext/>
+        <w:jc w:val="center"/>
+      </w:pPr>
+      <w:r>
+        <w:rPr>
+          <w:noProof/>
+        </w:rPr>
+        <w:drawing>
+          <wp:inline distT="0" distB="0" distL="0" distR="0" wp14:anchorId="066BF56A" wp14:editId="76B28AB1">
+            <wp:extent cx="2106000" cy="4680000"/>
+            <wp:effectExtent l="0" t="0" r="0" b="0"/>
+            <wp:docPr id="8" name="Picture 8" descr="Figure 6.1 Android API 36 emulator after release application force-stop and relaunch on 11 October 2026"/>
+            <wp:cNvGraphicFramePr>
+              <a:graphicFrameLocks xmlns:a="http://schemas.openxmlformats.org/drawingml/2006/main" noChangeAspect="1"/>
+            </wp:cNvGraphicFramePr>
+            <a:graphic xmlns:a="http://schemas.openxmlformats.org/drawingml/2006/main">
+              <a:graphicData uri="http://schemas.openxmlformats.org/drawingml/2006/picture">
+                <pic:pic xmlns:pic="http://schemas.openxmlformats.org/drawingml/2006/picture">
+                  <pic:nvPicPr>
+                    <pic:cNvPr id="0" name="ui-android-restart.png"/>
+                    <pic:cNvPicPr/>
+                  </pic:nvPicPr>
+                  <pic:blipFill>
+                    <a:blip r:embed="rId22"/>
+                    <a:stretch>
+                      <a:fillRect/>
+                    </a:stretch>
+                  </pic:blipFill>
+                  <pic:spPr>
+                    <a:xfrm>
+                      <a:off x="0" y="0"/>
+                      <a:ext cx="2106000" cy="4680000"/>
+                    </a:xfrm>
+                    <a:prstGeom prst="rect">
+                      <a:avLst/>
+                    </a:prstGeom>
+                  </pic:spPr>
+                </pic:pic>
+              </a:graphicData>
+            </a:graphic>
+          </wp:inline>
+        </w:drawing>
+      </w:r>
+    </w:p>
+    <w:p>
+      <w:pPr>
+        <w:pStyle w:val="ReportFigure"/>
+        <w:keepNext/>
+      </w:pPr>
+      <w:bookmarkStart w:id="55" w:name="_Toc243487917"/>
+      <w:r>
+        <w:t>Figure 6.1 Android API 36 emulator after release application force-stop and relaunch on 11 October 2026</w:t>
+      </w:r>
+      <w:bookmarkEnd w:id="55"/>
     </w:p>
     <w:p>
       <w:pPr>
         <w:pStyle w:val="ReportBody"/>
       </w:pPr>
       <w:r>
+        <w:t xml:space="preserve">Figure 6.1 is the retained emulator screenshot showing the synthetic task APK test persistence after relaunch. The accompanying android-release-restart.log </w:t>
+      </w:r>
+      <w:r>
+        <w:lastRenderedPageBreak/>
+        <w:t>and UI hierarchy in docs/evidence/android-loopback-20261011 establish the recorded process sequence; the screenshot alone cannot prove that a restart occurred. The result concerns offline persistence, not a physical device or release HTTPS account connectivity.</w:t>
+      </w:r>
+    </w:p>
+    <w:p>
+      <w:pPr>
+        <w:pStyle w:val="ReportBody"/>
+      </w:pPr>
+      <w:r>
         <w:t>Remaining evidence gates are manual screen-reader and whole-page keyboard testing, clean-machine setup and Mac-based execution for the additional iOS target. Android account verification covers the debug emulator against a local API, not a release HTTPS deployment. Submission additionally requires the team's English presentation video and a confirmed contribution record. These items remain separate from document completion.</w:t>
       </w:r>
     </w:p>
@@ -10178,22 +10707,22 @@
       <w:pPr>
         <w:pStyle w:val="Heading1"/>
       </w:pPr>
-      <w:bookmarkStart w:id="52" w:name="_Toc240744452"/>
+      <w:bookmarkStart w:id="56" w:name="_Toc243487901"/>
       <w:r>
         <w:lastRenderedPageBreak/>
         <w:t>7 Conclusion</w:t>
       </w:r>
-      <w:bookmarkEnd w:id="52"/>
+      <w:bookmarkEnd w:id="56"/>
     </w:p>
     <w:p>
       <w:pPr>
         <w:pStyle w:val="Heading2"/>
       </w:pPr>
-      <w:bookmarkStart w:id="53" w:name="_Toc240744453"/>
+      <w:bookmarkStart w:id="57" w:name="_Toc243487902"/>
       <w:r>
         <w:t>7.1 Findings</w:t>
       </w:r>
-      <w:bookmarkEnd w:id="53"/>
+      <w:bookmarkEnd w:id="57"/>
     </w:p>
     <w:p>
       <w:pPr>
@@ -10224,21 +10753,18 @@
         <w:pStyle w:val="ReportBody"/>
       </w:pPr>
       <w:r>
-        <w:t>For RQ4, the retained platform selection passed 15 native cases on each of Windows and Android on 14 and 15 September. The latest local source checks passed 104 Flutter and 17 API cases on 19 September. Android release installation and offline process-restart persistence were verified on the emulator during the earlier audit. These observations support the required two-platform demonstration within the recorded conditions. iOS, physical-device HTTPS operation and manual screen-reader behavior remain outside</w:t>
-      </w:r>
-      <w:r>
-        <w:t xml:space="preserve"> the verified scope.</w:t>
+        <w:t>For RQ4, October evidence records 133 Flutter cases, 17 API cases and 15 native scenarios per platform, with the Windows revision boundary stated in Chapter 1. Android release restart persistence was verified on the emulator. Windows profile results support lazy construction within the single-host experiment. Basic TalkBack compatibility was observed; a full screen-reader audit, iOS and physical-device HTTPS remain unverified.</w:t>
       </w:r>
     </w:p>
     <w:p>
       <w:pPr>
         <w:pStyle w:val="Heading2"/>
       </w:pPr>
-      <w:bookmarkStart w:id="54" w:name="_Toc240744454"/>
+      <w:bookmarkStart w:id="58" w:name="_Toc243487903"/>
       <w:r>
         <w:t>7.2 Prioritized continuation</w:t>
       </w:r>
-      <w:bookmarkEnd w:id="54"/>
+      <w:bookmarkEnd w:id="58"/>
     </w:p>
     <w:p>
       <w:pPr>
@@ -10253,19 +10779,19 @@
         <w:pStyle w:val="ReportBody"/>
       </w:pPr>
       <w:r>
-        <w:t>Final submission requires student verification and presentation materials. The demonstration should explain each workflow's assertions, execution boundary and remaining uncertainty, using the retained success and failure records.</w:t>
+        <w:t>Submission requires team verification, a usable English video and confirmed contributions. Each member must explain the workflow assertions, execution boundaries and remaining uncertainty.</w:t>
       </w:r>
     </w:p>
     <w:p>
       <w:pPr>
         <w:pStyle w:val="Heading1"/>
       </w:pPr>
-      <w:bookmarkStart w:id="55" w:name="_Toc240744455"/>
+      <w:bookmarkStart w:id="59" w:name="_Toc243487904"/>
       <w:r>
         <w:lastRenderedPageBreak/>
         <w:t>References</w:t>
       </w:r>
-      <w:bookmarkEnd w:id="55"/>
+      <w:bookmarkEnd w:id="59"/>
     </w:p>
     <w:p>
       <w:pPr>
@@ -10368,11 +10894,11 @@
         <w:pStyle w:val="ReportReference"/>
       </w:pPr>
       <w:r>
-        <w:t xml:space="preserve">TaskFlow project. (2026). TaskFlow QA Lab [Source baseline, revision 06d3790; local 19 September verification is identified separately]. </w:t>
+        <w:t xml:space="preserve">TaskFlow project. (2026). TaskFlow QA Lab [Reviewed source revision a153046; dated execution boundaries are identified in Chapter 6]. </w:t>
       </w:r>
       <w:r>
         <w:lastRenderedPageBreak/>
-        <w:t>https://github.com/cross-platform-mobile-team/CROSS-PLATFORM-MOBILE-APP-DEVELOPMENT-Midterm-Project/tree/06d3790deb6b5b1376311e102b15b968b2b51baf</w:t>
+        <w:t>https://github.com/cross-platform-mobile-team/CROSS-PLATFORM-MOBILE-APP-DEVELOPMENT-Midterm-Project/tree/a153046</w:t>
       </w:r>
     </w:p>
     <w:p>
@@ -10395,32 +10921,29 @@
       <w:pPr>
         <w:pStyle w:val="Heading1"/>
       </w:pPr>
-      <w:bookmarkStart w:id="56" w:name="_Toc240744456"/>
+      <w:bookmarkStart w:id="60" w:name="_Toc243487905"/>
       <w:r>
         <w:lastRenderedPageBreak/>
         <w:t>Appendix A Reproduction guide</w:t>
       </w:r>
-      <w:bookmarkEnd w:id="56"/>
+      <w:bookmarkEnd w:id="60"/>
     </w:p>
     <w:p>
       <w:pPr>
         <w:pStyle w:val="Heading2"/>
       </w:pPr>
-      <w:bookmarkStart w:id="57" w:name="_Toc240744457"/>
+      <w:bookmarkStart w:id="61" w:name="_Toc243487906"/>
       <w:r>
         <w:t>Environment and safe setup</w:t>
       </w:r>
-      <w:bookmarkEnd w:id="57"/>
+      <w:bookmarkEnd w:id="61"/>
     </w:p>
     <w:p>
       <w:pPr>
         <w:pStyle w:val="ReportBody"/>
       </w:pPr>
       <w:r>
-        <w:t>Check out branch main-test and record the exact source revision before repeating a result. Use the pinned project SDK expectations and resolved pubspec.lock. On the report-preparation machine, Flutter is installed at C:/Users/LENOVO/flutter-sdk and is not on PATH. Run flutter --version, dart --version, flutter doctor -v and flutter devices before selecting a native target. The commands below assume the corresponding executables are on PATH; otherwise use their full paths. Do not install an SDK or change sys</w:t>
-      </w:r>
-      <w:r>
-        <w:t>tem configuration merely to reproduce a document claim.</w:t>
+        <w:t>Check out branch main-test and record the exact source revision before repeating a result. Use the pinned project SDK expectations and resolved pubspec.lock. On the report-preparation machine, Flutter is installed at C:/Users/LENOVO/flutter-sdk and is not on PATH. Run flutter --version, dart --version, flutter doctor -v and flutter devices before selecting a native target. The commands below assume the corresponding executables are on PATH; otherwise use their full paths. Do not install an SDK or change system configuration merely to reproduce a document claim.</w:t>
       </w:r>
     </w:p>
     <w:p>
@@ -10436,10 +10959,7 @@
         <w:pStyle w:val="ReportBody"/>
       </w:pPr>
       <w:r>
-        <w:t>Run native suites in separate invocations. The selected files are integration_test/independent_scenarios_test.dart, integration_test/persisted_scenarios_test.dart, integration_test/quick_create_exit_test.dart and integration_test/windows_workflow_test.dart. Use flutter test followed by the actual file and -d windows. Verify the current filenames against the repository before execution. The real API workflow is orchestrated by scripts/test-online-windows.ps1 with an isolated service and database. Never direc</w:t>
-      </w:r>
-      <w:r>
-        <w:t>t synthetic test accounts or destructive account tests at a production endpoint.</w:t>
+        <w:t>Run native suites in separate invocations. The selected files are integration_test/independent_scenarios_test.dart, integration_test/persisted_scenarios_test.dart, integration_test/quick_create_exit_test.dart and integration_test/windows_workflow_test.dart. Use flutter test followed by the actual file and -d windows. Verify the current filenames against the repository before execution. The real API workflow is orchestrated by scripts/test-online-windows.ps1 with an isolated service and database. Never direct synthetic test accounts or destructive account tests at a production endpoint.</w:t>
       </w:r>
     </w:p>
     <w:p>
@@ -10466,11 +10986,11 @@
       <w:pPr>
         <w:pStyle w:val="Heading2"/>
       </w:pPr>
-      <w:bookmarkStart w:id="58" w:name="_Toc240744458"/>
+      <w:bookmarkStart w:id="62" w:name="_Toc243487907"/>
       <w:r>
         <w:t>Deliberate defect safety</w:t>
       </w:r>
-      <w:bookmarkEnd w:id="58"/>
+      <w:bookmarkEnd w:id="62"/>
     </w:p>
     <w:p>
       <w:pPr>
@@ -10492,22 +11012,22 @@
       <w:pPr>
         <w:pStyle w:val="Heading1"/>
       </w:pPr>
-      <w:bookmarkStart w:id="59" w:name="_Toc240744459"/>
+      <w:bookmarkStart w:id="63" w:name="_Toc243487908"/>
       <w:r>
         <w:lastRenderedPageBreak/>
         <w:t>Appendix B Evidence index</w:t>
       </w:r>
-      <w:bookmarkEnd w:id="59"/>
+      <w:bookmarkEnd w:id="63"/>
     </w:p>
     <w:p>
       <w:pPr>
         <w:pStyle w:val="ReportTableCaption"/>
       </w:pPr>
-      <w:bookmarkStart w:id="60" w:name="_Toc240744473"/>
+      <w:bookmarkStart w:id="64" w:name="_Toc243487925"/>
       <w:r>
         <w:t>Table B.1 Evidence packages used in this report</w:t>
       </w:r>
-      <w:bookmarkEnd w:id="60"/>
+      <w:bookmarkEnd w:id="64"/>
     </w:p>
     <w:tbl>
       <w:tblPr>
@@ -11091,11 +11611,8 @@
             </w:tcBorders>
           </w:tcPr>
           <w:p>
-            <w:pPr>
-              <w:pStyle w:val="ReportTable"/>
-            </w:pPr>
-            <w:r>
-              <w:t>Fresh report-preparation suite logs</w:t>
+            <w:r>
+              <w:t>Historical report-preparation suite logs</w:t>
             </w:r>
           </w:p>
         </w:tc>
@@ -11107,11 +11624,96 @@
             </w:tcBorders>
           </w:tcPr>
           <w:p>
-            <w:pPr>
-              <w:pStyle w:val="ReportTable"/>
-            </w:pPr>
-            <w:r>
-              <w:t>Additional review tracked separately</w:t>
+            <w:r>
+              <w:t>Preserve original dates</w:t>
+            </w:r>
+          </w:p>
+        </w:tc>
+      </w:tr>
+      <w:tr>
+        <w:trPr>
+          <w:cantSplit/>
+        </w:trPr>
+        <w:tc>
+          <w:tcPr>
+            <w:tcW w:w="1871" w:type="dxa"/>
+          </w:tcPr>
+          <w:p>
+            <w:pPr>
+              <w:pStyle w:val="ReportTable"/>
+            </w:pPr>
+            <w:r>
+              <w:t>docs/evidence/uiux-audit-20261011</w:t>
+            </w:r>
+          </w:p>
+        </w:tc>
+        <w:tc>
+          <w:tcPr>
+            <w:tcW w:w="3061" w:type="dxa"/>
+          </w:tcPr>
+          <w:p>
+            <w:pPr>
+              <w:pStyle w:val="ReportTable"/>
+            </w:pPr>
+            <w:r>
+              <w:t>133 Flutter, 17 API, Windows native and profile</w:t>
+            </w:r>
+          </w:p>
+        </w:tc>
+        <w:tc>
+          <w:tcPr>
+            <w:tcW w:w="3855" w:type="dxa"/>
+          </w:tcPr>
+          <w:p>
+            <w:pPr>
+              <w:pStyle w:val="ReportTable"/>
+            </w:pPr>
+            <w:r>
+              <w:t>Final online rerun distinguished</w:t>
+            </w:r>
+          </w:p>
+        </w:tc>
+      </w:tr>
+      <w:tr>
+        <w:trPr>
+          <w:cantSplit/>
+        </w:trPr>
+        <w:tc>
+          <w:tcPr>
+            <w:tcW w:w="1871" w:type="dxa"/>
+          </w:tcPr>
+          <w:p>
+            <w:pPr>
+              <w:pStyle w:val="ReportTable"/>
+            </w:pPr>
+            <w:r>
+              <w:t>docs/evidence/android-loopback-20261011</w:t>
+            </w:r>
+          </w:p>
+        </w:tc>
+        <w:tc>
+          <w:tcPr>
+            <w:tcW w:w="3061" w:type="dxa"/>
+          </w:tcPr>
+          <w:p>
+            <w:pPr>
+              <w:pStyle w:val="ReportTable"/>
+            </w:pPr>
+            <w:r>
+              <w:t>15 Android scenarios and release restart</w:t>
+            </w:r>
+          </w:p>
+        </w:tc>
+        <w:tc>
+          <w:tcPr>
+            <w:tcW w:w="3855" w:type="dxa"/>
+          </w:tcPr>
+          <w:p>
+            <w:pPr>
+              <w:pStyle w:val="ReportTable"/>
+            </w:pPr>
+            <w:r>
+              <w:t>Basic TalkBack compatibility only</w:t>
             </w:r>
           </w:p>
         </w:tc>
@@ -11122,12 +11724,12 @@
       <w:pPr>
         <w:pStyle w:val="Heading1"/>
       </w:pPr>
-      <w:bookmarkStart w:id="61" w:name="_Toc240744460"/>
+      <w:bookmarkStart w:id="65" w:name="_Toc243487909"/>
       <w:r>
         <w:lastRenderedPageBreak/>
         <w:t>Appendix C Submission verification</w:t>
       </w:r>
-      <w:bookmarkEnd w:id="61"/>
+      <w:bookmarkEnd w:id="65"/>
     </w:p>
     <w:p>
       <w:pPr>
@@ -11146,8 +11748,8 @@
       </w:r>
     </w:p>
     <w:sectPr>
-      <w:headerReference w:type="default" r:id="rId20"/>
-      <w:footerReference w:type="default" r:id="rId21"/>
+      <w:headerReference w:type="default" r:id="rId23"/>
+      <w:footerReference w:type="default" r:id="rId24"/>
       <w:pgSz w:w="11906" w:h="16838" w:code="9"/>
       <w:pgMar w:top="1984" w:right="1134" w:bottom="1701" w:left="1984" w:header="1020" w:footer="720" w:gutter="0"/>
       <w:pgNumType w:start="1"/>
@@ -11159,7 +11761,7 @@
 </file>
 
 <file path=word/endnotes.xml><?xml version="1.0" encoding="utf-8"?>
-<w:endnotes xmlns:wpc="http://schemas.microsoft.com/office/word/2010/wordprocessingCanvas" xmlns:cx="http://schemas.microsoft.com/office/drawing/2014/chartex" xmlns:cx1="http://schemas.microsoft.com/office/drawing/2015/9/8/chartex" xmlns:cx2="http://schemas.microsoft.com/office/drawing/2015/10/21/chartex" xmlns:cx3="http://schemas.microsoft.com/office/drawing/2016/5/9/chartex" xmlns:cx4="http://schemas.microsoft.com/office/drawing/2016/5/10/chartex" xmlns:cx5="http://schemas.microsoft.com/office/drawing/2016/5/11/chartex" xmlns:cx6="http://schemas.microsoft.com/office/drawing/2016/5/12/chartex" xmlns:cx7="http://schemas.microsoft.com/office/drawing/2016/5/13/chartex" xmlns:cx8="http://schemas.microsoft.com/office/drawing/2016/5/14/chartex" xmlns:mc="http://schemas.openxmlformats.org/markup-compatibility/2006" xmlns:aink="http://schemas.microsoft.com/office/drawing/2016/ink" xmlns:am3d="http://schemas.microsoft.com/office/drawing/2017/model3d" xmlns:o="urn:schemas-microsoft-com:office:office" xmlns:oel="http://schemas.microsoft.com/office/2019/extlst" xmlns:r="http://schemas.openxmlformats.org/officeDocument/2006/relationships" xmlns:m="http://schemas.openxmlformats.org/officeDocument/2006/math" xmlns:v="urn:schemas-microsoft-com:vml" xmlns:wp14="http://schemas.microsoft.com/office/word/2010/wordprocessingDrawing" xmlns:wp="http://schemas.openxmlformats.org/drawingml/2006/wordprocessingDrawing" xmlns:w10="urn:schemas-microsoft-com:office:word" xmlns:w="http://schemas.openxmlformats.org/wordprocessingml/2006/main" xmlns:w14="http://schemas.microsoft.com/office/word/2010/wordml" xmlns:w15="http://schemas.microsoft.com/office/word/2012/wordml" xmlns:w16cex="http://schemas.microsoft.com/office/word/2018/wordml/cex" xmlns:w16cid="http://schemas.microsoft.com/office/word/2016/wordml/cid" xmlns:w16="http://schemas.microsoft.com/office/word/2018/wordml" xmlns:w16du="http://schemas.microsoft.com/office/word/2023/wordml/word16du" xmlns:w16sdtdh="http://schemas.microsoft.com/office/word/2020/wordml/sdtdatahash" xmlns:w16sdtfl="http://schemas.microsoft.com/office/word/2024/wordml/sdtformatlock" xmlns:w16se="http://schemas.microsoft.com/office/word/2015/wordml/symex" xmlns:wpg="http://schemas.microsoft.com/office/word/2010/wordprocessingGroup" xmlns:wpi="http://schemas.microsoft.com/office/word/2010/wordprocessingInk" xmlns:wne="http://schemas.microsoft.com/office/word/2006/wordml" xmlns:wps="http://schemas.microsoft.com/office/word/2010/wordprocessingShape" mc:Ignorable="w14 w15 w16se w16cid w16 w16cex w16sdtdh w16sdtfl w16du wp14">
+<w:endnotes xmlns:wpc="http://schemas.microsoft.com/office/word/2010/wordprocessingCanvas" xmlns:cx="http://schemas.microsoft.com/office/drawing/2014/chartex" xmlns:cx1="http://schemas.microsoft.com/office/drawing/2015/9/8/chartex" xmlns:cx2="http://schemas.microsoft.com/office/drawing/2015/10/21/chartex" xmlns:cx3="http://schemas.microsoft.com/office/drawing/2016/5/9/chartex" xmlns:cx4="http://schemas.microsoft.com/office/drawing/2016/5/10/chartex" xmlns:cx5="http://schemas.microsoft.com/office/drawing/2016/5/11/chartex" xmlns:cx6="http://schemas.microsoft.com/office/drawing/2016/5/12/chartex" xmlns:cx7="http://schemas.microsoft.com/office/drawing/2016/5/13/chartex" xmlns:cx8="http://schemas.microsoft.com/office/drawing/2016/5/14/chartex" xmlns:mc="http://schemas.openxmlformats.org/markup-compatibility/2006" xmlns:aink="http://schemas.microsoft.com/office/drawing/2016/ink" xmlns:am3d="http://schemas.microsoft.com/office/drawing/2017/model3d" xmlns:o="urn:schemas-microsoft-com:office:office" xmlns:oel="http://schemas.microsoft.com/office/2019/extlst" xmlns:r="http://schemas.openxmlformats.org/officeDocument/2006/relationships" xmlns:m="http://schemas.openxmlformats.org/officeDocument/2006/math" xmlns:v="urn:schemas-microsoft-com:vml" xmlns:wp14="http://schemas.microsoft.com/office/word/2010/wordprocessingDrawing" xmlns:wp="http://schemas.openxmlformats.org/drawingml/2006/wordprocessingDrawing" xmlns:w10="urn:schemas-microsoft-com:office:word" xmlns:w="http://schemas.openxmlformats.org/wordprocessingml/2006/main" xmlns:w14="http://schemas.microsoft.com/office/word/2010/wordml" xmlns:w15="http://schemas.microsoft.com/office/word/2012/wordml" xmlns:w16cex="http://schemas.microsoft.com/office/word/2018/wordml/cex" xmlns:w16cid="http://schemas.microsoft.com/office/word/2016/wordml/cid" xmlns:w16="http://schemas.microsoft.com/office/word/2018/wordml" xmlns:w16sdtdh="http://schemas.microsoft.com/office/word/2020/wordml/sdtdatahash" xmlns:w16se="http://schemas.microsoft.com/office/word/2015/wordml/symex" xmlns:wpg="http://schemas.microsoft.com/office/word/2010/wordprocessingGroup" xmlns:wpi="http://schemas.microsoft.com/office/word/2010/wordprocessingInk" xmlns:wne="http://schemas.microsoft.com/office/word/2006/wordml" xmlns:wps="http://schemas.microsoft.com/office/word/2010/wordprocessingShape" mc:Ignorable="w14 w15 w16se w16cid w16 w16cex w16sdtdh wp14">
   <w:endnote w:type="separator" w:id="-1">
     <w:p>
       <w:r>
@@ -11178,7 +11780,7 @@
 </file>
 
 <file path=word/footer1.xml><?xml version="1.0" encoding="utf-8"?>
-<w:ftr xmlns:wpc="http://schemas.microsoft.com/office/word/2010/wordprocessingCanvas" xmlns:cx="http://schemas.microsoft.com/office/drawing/2014/chartex" xmlns:cx1="http://schemas.microsoft.com/office/drawing/2015/9/8/chartex" xmlns:cx2="http://schemas.microsoft.com/office/drawing/2015/10/21/chartex" xmlns:cx3="http://schemas.microsoft.com/office/drawing/2016/5/9/chartex" xmlns:cx4="http://schemas.microsoft.com/office/drawing/2016/5/10/chartex" xmlns:cx5="http://schemas.microsoft.com/office/drawing/2016/5/11/chartex" xmlns:cx6="http://schemas.microsoft.com/office/drawing/2016/5/12/chartex" xmlns:cx7="http://schemas.microsoft.com/office/drawing/2016/5/13/chartex" xmlns:cx8="http://schemas.microsoft.com/office/drawing/2016/5/14/chartex" xmlns:mc="http://schemas.openxmlformats.org/markup-compatibility/2006" xmlns:aink="http://schemas.microsoft.com/office/drawing/2016/ink" xmlns:am3d="http://schemas.microsoft.com/office/drawing/2017/model3d" xmlns:o="urn:schemas-microsoft-com:office:office" xmlns:oel="http://schemas.microsoft.com/office/2019/extlst" xmlns:r="http://schemas.openxmlformats.org/officeDocument/2006/relationships" xmlns:m="http://schemas.openxmlformats.org/officeDocument/2006/math" xmlns:v="urn:schemas-microsoft-com:vml" xmlns:wp14="http://schemas.microsoft.com/office/word/2010/wordprocessingDrawing" xmlns:wp="http://schemas.openxmlformats.org/drawingml/2006/wordprocessingDrawing" xmlns:w10="urn:schemas-microsoft-com:office:word" xmlns:w="http://schemas.openxmlformats.org/wordprocessingml/2006/main" xmlns:w14="http://schemas.microsoft.com/office/word/2010/wordml" xmlns:w15="http://schemas.microsoft.com/office/word/2012/wordml" xmlns:w16cex="http://schemas.microsoft.com/office/word/2018/wordml/cex" xmlns:w16cid="http://schemas.microsoft.com/office/word/2016/wordml/cid" xmlns:w16="http://schemas.microsoft.com/office/word/2018/wordml" xmlns:w16du="http://schemas.microsoft.com/office/word/2023/wordml/word16du" xmlns:w16sdtdh="http://schemas.microsoft.com/office/word/2020/wordml/sdtdatahash" xmlns:w16sdtfl="http://schemas.microsoft.com/office/word/2024/wordml/sdtformatlock" xmlns:w16se="http://schemas.microsoft.com/office/word/2015/wordml/symex" xmlns:wpg="http://schemas.microsoft.com/office/word/2010/wordprocessingGroup" xmlns:wpi="http://schemas.microsoft.com/office/word/2010/wordprocessingInk" xmlns:wne="http://schemas.microsoft.com/office/word/2006/wordml" xmlns:wps="http://schemas.microsoft.com/office/word/2010/wordprocessingShape" mc:Ignorable="w14 w15 w16se w16cid w16 w16cex w16sdtdh w16sdtfl w16du wp14">
+<w:ftr xmlns:wpc="http://schemas.microsoft.com/office/word/2010/wordprocessingCanvas" xmlns:cx="http://schemas.microsoft.com/office/drawing/2014/chartex" xmlns:cx1="http://schemas.microsoft.com/office/drawing/2015/9/8/chartex" xmlns:cx2="http://schemas.microsoft.com/office/drawing/2015/10/21/chartex" xmlns:cx3="http://schemas.microsoft.com/office/drawing/2016/5/9/chartex" xmlns:cx4="http://schemas.microsoft.com/office/drawing/2016/5/10/chartex" xmlns:cx5="http://schemas.microsoft.com/office/drawing/2016/5/11/chartex" xmlns:cx6="http://schemas.microsoft.com/office/drawing/2016/5/12/chartex" xmlns:cx7="http://schemas.microsoft.com/office/drawing/2016/5/13/chartex" xmlns:cx8="http://schemas.microsoft.com/office/drawing/2016/5/14/chartex" xmlns:mc="http://schemas.openxmlformats.org/markup-compatibility/2006" xmlns:aink="http://schemas.microsoft.com/office/drawing/2016/ink" xmlns:am3d="http://schemas.microsoft.com/office/drawing/2017/model3d" xmlns:o="urn:schemas-microsoft-com:office:office" xmlns:oel="http://schemas.microsoft.com/office/2019/extlst" xmlns:r="http://schemas.openxmlformats.org/officeDocument/2006/relationships" xmlns:m="http://schemas.openxmlformats.org/officeDocument/2006/math" xmlns:v="urn:schemas-microsoft-com:vml" xmlns:wp14="http://schemas.microsoft.com/office/word/2010/wordprocessingDrawing" xmlns:wp="http://schemas.openxmlformats.org/drawingml/2006/wordprocessingDrawing" xmlns:w10="urn:schemas-microsoft-com:office:word" xmlns:w="http://schemas.openxmlformats.org/wordprocessingml/2006/main" xmlns:w14="http://schemas.microsoft.com/office/word/2010/wordml" xmlns:w15="http://schemas.microsoft.com/office/word/2012/wordml" xmlns:w16cex="http://schemas.microsoft.com/office/word/2018/wordml/cex" xmlns:w16cid="http://schemas.microsoft.com/office/word/2016/wordml/cid" xmlns:w16="http://schemas.microsoft.com/office/word/2018/wordml" xmlns:w16sdtdh="http://schemas.microsoft.com/office/word/2020/wordml/sdtdatahash" xmlns:w16se="http://schemas.microsoft.com/office/word/2015/wordml/symex" xmlns:wpg="http://schemas.microsoft.com/office/word/2010/wordprocessingGroup" xmlns:wpi="http://schemas.microsoft.com/office/word/2010/wordprocessingInk" xmlns:wne="http://schemas.microsoft.com/office/word/2006/wordml" xmlns:wps="http://schemas.microsoft.com/office/word/2010/wordprocessingShape" mc:Ignorable="w14 w15 w16se w16cid w16 w16cex w16sdtdh wp14">
   <w:p>
     <w:pPr>
       <w:pStyle w:val="Footer"/>
@@ -11216,7 +11818,7 @@
 </file>
 
 <file path=word/footer2.xml><?xml version="1.0" encoding="utf-8"?>
-<w:ftr xmlns:wpc="http://schemas.microsoft.com/office/word/2010/wordprocessingCanvas" xmlns:cx="http://schemas.microsoft.com/office/drawing/2014/chartex" xmlns:cx1="http://schemas.microsoft.com/office/drawing/2015/9/8/chartex" xmlns:cx2="http://schemas.microsoft.com/office/drawing/2015/10/21/chartex" xmlns:cx3="http://schemas.microsoft.com/office/drawing/2016/5/9/chartex" xmlns:cx4="http://schemas.microsoft.com/office/drawing/2016/5/10/chartex" xmlns:cx5="http://schemas.microsoft.com/office/drawing/2016/5/11/chartex" xmlns:cx6="http://schemas.microsoft.com/office/drawing/2016/5/12/chartex" xmlns:cx7="http://schemas.microsoft.com/office/drawing/2016/5/13/chartex" xmlns:cx8="http://schemas.microsoft.com/office/drawing/2016/5/14/chartex" xmlns:mc="http://schemas.openxmlformats.org/markup-compatibility/2006" xmlns:aink="http://schemas.microsoft.com/office/drawing/2016/ink" xmlns:am3d="http://schemas.microsoft.com/office/drawing/2017/model3d" xmlns:o="urn:schemas-microsoft-com:office:office" xmlns:oel="http://schemas.microsoft.com/office/2019/extlst" xmlns:r="http://schemas.openxmlformats.org/officeDocument/2006/relationships" xmlns:m="http://schemas.openxmlformats.org/officeDocument/2006/math" xmlns:v="urn:schemas-microsoft-com:vml" xmlns:wp14="http://schemas.microsoft.com/office/word/2010/wordprocessingDrawing" xmlns:wp="http://schemas.openxmlformats.org/drawingml/2006/wordprocessingDrawing" xmlns:w10="urn:schemas-microsoft-com:office:word" xmlns:w="http://schemas.openxmlformats.org/wordprocessingml/2006/main" xmlns:w14="http://schemas.microsoft.com/office/word/2010/wordml" xmlns:w15="http://schemas.microsoft.com/office/word/2012/wordml" xmlns:w16cex="http://schemas.microsoft.com/office/word/2018/wordml/cex" xmlns:w16cid="http://schemas.microsoft.com/office/word/2016/wordml/cid" xmlns:w16="http://schemas.microsoft.com/office/word/2018/wordml" xmlns:w16du="http://schemas.microsoft.com/office/word/2023/wordml/word16du" xmlns:w16sdtdh="http://schemas.microsoft.com/office/word/2020/wordml/sdtdatahash" xmlns:w16sdtfl="http://schemas.microsoft.com/office/word/2024/wordml/sdtformatlock" xmlns:w16se="http://schemas.microsoft.com/office/word/2015/wordml/symex" xmlns:wpg="http://schemas.microsoft.com/office/word/2010/wordprocessingGroup" xmlns:wpi="http://schemas.microsoft.com/office/word/2010/wordprocessingInk" xmlns:wne="http://schemas.microsoft.com/office/word/2006/wordml" xmlns:wps="http://schemas.microsoft.com/office/word/2010/wordprocessingShape" mc:Ignorable="w14 w15 w16se w16cid w16 w16cex w16sdtdh w16sdtfl w16du wp14">
+<w:ftr xmlns:wpc="http://schemas.microsoft.com/office/word/2010/wordprocessingCanvas" xmlns:cx="http://schemas.microsoft.com/office/drawing/2014/chartex" xmlns:cx1="http://schemas.microsoft.com/office/drawing/2015/9/8/chartex" xmlns:cx2="http://schemas.microsoft.com/office/drawing/2015/10/21/chartex" xmlns:cx3="http://schemas.microsoft.com/office/drawing/2016/5/9/chartex" xmlns:cx4="http://schemas.microsoft.com/office/drawing/2016/5/10/chartex" xmlns:cx5="http://schemas.microsoft.com/office/drawing/2016/5/11/chartex" xmlns:cx6="http://schemas.microsoft.com/office/drawing/2016/5/12/chartex" xmlns:cx7="http://schemas.microsoft.com/office/drawing/2016/5/13/chartex" xmlns:cx8="http://schemas.microsoft.com/office/drawing/2016/5/14/chartex" xmlns:mc="http://schemas.openxmlformats.org/markup-compatibility/2006" xmlns:aink="http://schemas.microsoft.com/office/drawing/2016/ink" xmlns:am3d="http://schemas.microsoft.com/office/drawing/2017/model3d" xmlns:o="urn:schemas-microsoft-com:office:office" xmlns:oel="http://schemas.microsoft.com/office/2019/extlst" xmlns:r="http://schemas.openxmlformats.org/officeDocument/2006/relationships" xmlns:m="http://schemas.openxmlformats.org/officeDocument/2006/math" xmlns:v="urn:schemas-microsoft-com:vml" xmlns:wp14="http://schemas.microsoft.com/office/word/2010/wordprocessingDrawing" xmlns:wp="http://schemas.openxmlformats.org/drawingml/2006/wordprocessingDrawing" xmlns:w10="urn:schemas-microsoft-com:office:word" xmlns:w="http://schemas.openxmlformats.org/wordprocessingml/2006/main" xmlns:w14="http://schemas.microsoft.com/office/word/2010/wordml" xmlns:w15="http://schemas.microsoft.com/office/word/2012/wordml" xmlns:w16cex="http://schemas.microsoft.com/office/word/2018/wordml/cex" xmlns:w16cid="http://schemas.microsoft.com/office/word/2016/wordml/cid" xmlns:w16="http://schemas.microsoft.com/office/word/2018/wordml" xmlns:w16sdtdh="http://schemas.microsoft.com/office/word/2020/wordml/sdtdatahash" xmlns:w16se="http://schemas.microsoft.com/office/word/2015/wordml/symex" xmlns:wpg="http://schemas.microsoft.com/office/word/2010/wordprocessingGroup" xmlns:wpi="http://schemas.microsoft.com/office/word/2010/wordprocessingInk" xmlns:wne="http://schemas.microsoft.com/office/word/2006/wordml" xmlns:wps="http://schemas.microsoft.com/office/word/2010/wordprocessingShape" mc:Ignorable="w14 w15 w16se w16cid w16 w16cex w16sdtdh wp14">
   <w:p>
     <w:pPr>
       <w:pStyle w:val="Footer"/>
@@ -11236,7 +11838,7 @@
 </file>
 
 <file path=word/footer3.xml><?xml version="1.0" encoding="utf-8"?>
-<w:ftr xmlns:wpc="http://schemas.microsoft.com/office/word/2010/wordprocessingCanvas" xmlns:cx="http://schemas.microsoft.com/office/drawing/2014/chartex" xmlns:cx1="http://schemas.microsoft.com/office/drawing/2015/9/8/chartex" xmlns:cx2="http://schemas.microsoft.com/office/drawing/2015/10/21/chartex" xmlns:cx3="http://schemas.microsoft.com/office/drawing/2016/5/9/chartex" xmlns:cx4="http://schemas.microsoft.com/office/drawing/2016/5/10/chartex" xmlns:cx5="http://schemas.microsoft.com/office/drawing/2016/5/11/chartex" xmlns:cx6="http://schemas.microsoft.com/office/drawing/2016/5/12/chartex" xmlns:cx7="http://schemas.microsoft.com/office/drawing/2016/5/13/chartex" xmlns:cx8="http://schemas.microsoft.com/office/drawing/2016/5/14/chartex" xmlns:mc="http://schemas.openxmlformats.org/markup-compatibility/2006" xmlns:aink="http://schemas.microsoft.com/office/drawing/2016/ink" xmlns:am3d="http://schemas.microsoft.com/office/drawing/2017/model3d" xmlns:o="urn:schemas-microsoft-com:office:office" xmlns:oel="http://schemas.microsoft.com/office/2019/extlst" xmlns:r="http://schemas.openxmlformats.org/officeDocument/2006/relationships" xmlns:m="http://schemas.openxmlformats.org/officeDocument/2006/math" xmlns:v="urn:schemas-microsoft-com:vml" xmlns:wp14="http://schemas.microsoft.com/office/word/2010/wordprocessingDrawing" xmlns:wp="http://schemas.openxmlformats.org/drawingml/2006/wordprocessingDrawing" xmlns:w10="urn:schemas-microsoft-com:office:word" xmlns:w="http://schemas.openxmlformats.org/wordprocessingml/2006/main" xmlns:w14="http://schemas.microsoft.com/office/word/2010/wordml" xmlns:w15="http://schemas.microsoft.com/office/word/2012/wordml" xmlns:w16cex="http://schemas.microsoft.com/office/word/2018/wordml/cex" xmlns:w16cid="http://schemas.microsoft.com/office/word/2016/wordml/cid" xmlns:w16="http://schemas.microsoft.com/office/word/2018/wordml" xmlns:w16du="http://schemas.microsoft.com/office/word/2023/wordml/word16du" xmlns:w16sdtdh="http://schemas.microsoft.com/office/word/2020/wordml/sdtdatahash" xmlns:w16sdtfl="http://schemas.microsoft.com/office/word/2024/wordml/sdtformatlock" xmlns:w16se="http://schemas.microsoft.com/office/word/2015/wordml/symex" xmlns:wpg="http://schemas.microsoft.com/office/word/2010/wordprocessingGroup" xmlns:wpi="http://schemas.microsoft.com/office/word/2010/wordprocessingInk" xmlns:wne="http://schemas.microsoft.com/office/word/2006/wordml" xmlns:wps="http://schemas.microsoft.com/office/word/2010/wordprocessingShape" mc:Ignorable="w14 w15 w16se w16cid w16 w16cex w16sdtdh w16sdtfl w16du wp14">
+<w:ftr xmlns:wpc="http://schemas.microsoft.com/office/word/2010/wordprocessingCanvas" xmlns:cx="http://schemas.microsoft.com/office/drawing/2014/chartex" xmlns:cx1="http://schemas.microsoft.com/office/drawing/2015/9/8/chartex" xmlns:cx2="http://schemas.microsoft.com/office/drawing/2015/10/21/chartex" xmlns:cx3="http://schemas.microsoft.com/office/drawing/2016/5/9/chartex" xmlns:cx4="http://schemas.microsoft.com/office/drawing/2016/5/10/chartex" xmlns:cx5="http://schemas.microsoft.com/office/drawing/2016/5/11/chartex" xmlns:cx6="http://schemas.microsoft.com/office/drawing/2016/5/12/chartex" xmlns:cx7="http://schemas.microsoft.com/office/drawing/2016/5/13/chartex" xmlns:cx8="http://schemas.microsoft.com/office/drawing/2016/5/14/chartex" xmlns:mc="http://schemas.openxmlformats.org/markup-compatibility/2006" xmlns:aink="http://schemas.microsoft.com/office/drawing/2016/ink" xmlns:am3d="http://schemas.microsoft.com/office/drawing/2017/model3d" xmlns:o="urn:schemas-microsoft-com:office:office" xmlns:oel="http://schemas.microsoft.com/office/2019/extlst" xmlns:r="http://schemas.openxmlformats.org/officeDocument/2006/relationships" xmlns:m="http://schemas.openxmlformats.org/officeDocument/2006/math" xmlns:v="urn:schemas-microsoft-com:vml" xmlns:wp14="http://schemas.microsoft.com/office/word/2010/wordprocessingDrawing" xmlns:wp="http://schemas.openxmlformats.org/drawingml/2006/wordprocessingDrawing" xmlns:w10="urn:schemas-microsoft-com:office:word" xmlns:w="http://schemas.openxmlformats.org/wordprocessingml/2006/main" xmlns:w14="http://schemas.microsoft.com/office/word/2010/wordml" xmlns:w15="http://schemas.microsoft.com/office/word/2012/wordml" xmlns:w16cex="http://schemas.microsoft.com/office/word/2018/wordml/cex" xmlns:w16cid="http://schemas.microsoft.com/office/word/2016/wordml/cid" xmlns:w16="http://schemas.microsoft.com/office/word/2018/wordml" xmlns:w16sdtdh="http://schemas.microsoft.com/office/word/2020/wordml/sdtdatahash" xmlns:w16se="http://schemas.microsoft.com/office/word/2015/wordml/symex" xmlns:wpg="http://schemas.microsoft.com/office/word/2010/wordprocessingGroup" xmlns:wpi="http://schemas.microsoft.com/office/word/2010/wordprocessingInk" xmlns:wne="http://schemas.microsoft.com/office/word/2006/wordml" xmlns:wps="http://schemas.microsoft.com/office/word/2010/wordprocessingShape" mc:Ignorable="w14 w15 w16se w16cid w16 w16cex w16sdtdh wp14">
   <w:p>
     <w:pPr>
       <w:pStyle w:val="Footer"/>
@@ -11246,7 +11848,7 @@
 </file>
 
 <file path=word/footer4.xml><?xml version="1.0" encoding="utf-8"?>
-<w:ftr xmlns:wpc="http://schemas.microsoft.com/office/word/2010/wordprocessingCanvas" xmlns:cx="http://schemas.microsoft.com/office/drawing/2014/chartex" xmlns:cx1="http://schemas.microsoft.com/office/drawing/2015/9/8/chartex" xmlns:cx2="http://schemas.microsoft.com/office/drawing/2015/10/21/chartex" xmlns:cx3="http://schemas.microsoft.com/office/drawing/2016/5/9/chartex" xmlns:cx4="http://schemas.microsoft.com/office/drawing/2016/5/10/chartex" xmlns:cx5="http://schemas.microsoft.com/office/drawing/2016/5/11/chartex" xmlns:cx6="http://schemas.microsoft.com/office/drawing/2016/5/12/chartex" xmlns:cx7="http://schemas.microsoft.com/office/drawing/2016/5/13/chartex" xmlns:cx8="http://schemas.microsoft.com/office/drawing/2016/5/14/chartex" xmlns:mc="http://schemas.openxmlformats.org/markup-compatibility/2006" xmlns:aink="http://schemas.microsoft.com/office/drawing/2016/ink" xmlns:am3d="http://schemas.microsoft.com/office/drawing/2017/model3d" xmlns:o="urn:schemas-microsoft-com:office:office" xmlns:oel="http://schemas.microsoft.com/office/2019/extlst" xmlns:r="http://schemas.openxmlformats.org/officeDocument/2006/relationships" xmlns:m="http://schemas.openxmlformats.org/officeDocument/2006/math" xmlns:v="urn:schemas-microsoft-com:vml" xmlns:wp14="http://schemas.microsoft.com/office/word/2010/wordprocessingDrawing" xmlns:wp="http://schemas.openxmlformats.org/drawingml/2006/wordprocessingDrawing" xmlns:w10="urn:schemas-microsoft-com:office:word" xmlns:w="http://schemas.openxmlformats.org/wordprocessingml/2006/main" xmlns:w14="http://schemas.microsoft.com/office/word/2010/wordml" xmlns:w15="http://schemas.microsoft.com/office/word/2012/wordml" xmlns:w16cex="http://schemas.microsoft.com/office/word/2018/wordml/cex" xmlns:w16cid="http://schemas.microsoft.com/office/word/2016/wordml/cid" xmlns:w16="http://schemas.microsoft.com/office/word/2018/wordml" xmlns:w16du="http://schemas.microsoft.com/office/word/2023/wordml/word16du" xmlns:w16sdtdh="http://schemas.microsoft.com/office/word/2020/wordml/sdtdatahash" xmlns:w16sdtfl="http://schemas.microsoft.com/office/word/2024/wordml/sdtformatlock" xmlns:w16se="http://schemas.microsoft.com/office/word/2015/wordml/symex" xmlns:wpg="http://schemas.microsoft.com/office/word/2010/wordprocessingGroup" xmlns:wpi="http://schemas.microsoft.com/office/word/2010/wordprocessingInk" xmlns:wne="http://schemas.microsoft.com/office/word/2006/wordml" xmlns:wps="http://schemas.microsoft.com/office/word/2010/wordprocessingShape" mc:Ignorable="w14 w15 w16se w16cid w16 w16cex w16sdtdh w16sdtfl w16du wp14">
+<w:ftr xmlns:wpc="http://schemas.microsoft.com/office/word/2010/wordprocessingCanvas" xmlns:cx="http://schemas.microsoft.com/office/drawing/2014/chartex" xmlns:cx1="http://schemas.microsoft.com/office/drawing/2015/9/8/chartex" xmlns:cx2="http://schemas.microsoft.com/office/drawing/2015/10/21/chartex" xmlns:cx3="http://schemas.microsoft.com/office/drawing/2016/5/9/chartex" xmlns:cx4="http://schemas.microsoft.com/office/drawing/2016/5/10/chartex" xmlns:cx5="http://schemas.microsoft.com/office/drawing/2016/5/11/chartex" xmlns:cx6="http://schemas.microsoft.com/office/drawing/2016/5/12/chartex" xmlns:cx7="http://schemas.microsoft.com/office/drawing/2016/5/13/chartex" xmlns:cx8="http://schemas.microsoft.com/office/drawing/2016/5/14/chartex" xmlns:mc="http://schemas.openxmlformats.org/markup-compatibility/2006" xmlns:aink="http://schemas.microsoft.com/office/drawing/2016/ink" xmlns:am3d="http://schemas.microsoft.com/office/drawing/2017/model3d" xmlns:o="urn:schemas-microsoft-com:office:office" xmlns:oel="http://schemas.microsoft.com/office/2019/extlst" xmlns:r="http://schemas.openxmlformats.org/officeDocument/2006/relationships" xmlns:m="http://schemas.openxmlformats.org/officeDocument/2006/math" xmlns:v="urn:schemas-microsoft-com:vml" xmlns:wp14="http://schemas.microsoft.com/office/word/2010/wordprocessingDrawing" xmlns:wp="http://schemas.openxmlformats.org/drawingml/2006/wordprocessingDrawing" xmlns:w10="urn:schemas-microsoft-com:office:word" xmlns:w="http://schemas.openxmlformats.org/wordprocessingml/2006/main" xmlns:w14="http://schemas.microsoft.com/office/word/2010/wordml" xmlns:w15="http://schemas.microsoft.com/office/word/2012/wordml" xmlns:w16cex="http://schemas.microsoft.com/office/word/2018/wordml/cex" xmlns:w16cid="http://schemas.microsoft.com/office/word/2016/wordml/cid" xmlns:w16="http://schemas.microsoft.com/office/word/2018/wordml" xmlns:w16sdtdh="http://schemas.microsoft.com/office/word/2020/wordml/sdtdatahash" xmlns:w16se="http://schemas.microsoft.com/office/word/2015/wordml/symex" xmlns:wpg="http://schemas.microsoft.com/office/word/2010/wordprocessingGroup" xmlns:wpi="http://schemas.microsoft.com/office/word/2010/wordprocessingInk" xmlns:wne="http://schemas.microsoft.com/office/word/2006/wordml" xmlns:wps="http://schemas.microsoft.com/office/word/2010/wordprocessingShape" mc:Ignorable="w14 w15 w16se w16cid w16 w16cex w16sdtdh wp14">
   <w:p>
     <w:pPr>
       <w:pStyle w:val="Footer"/>
@@ -11256,7 +11858,7 @@
 </file>
 
 <file path=word/footer5.xml><?xml version="1.0" encoding="utf-8"?>
-<w:ftr xmlns:wpc="http://schemas.microsoft.com/office/word/2010/wordprocessingCanvas" xmlns:cx="http://schemas.microsoft.com/office/drawing/2014/chartex" xmlns:cx1="http://schemas.microsoft.com/office/drawing/2015/9/8/chartex" xmlns:cx2="http://schemas.microsoft.com/office/drawing/2015/10/21/chartex" xmlns:cx3="http://schemas.microsoft.com/office/drawing/2016/5/9/chartex" xmlns:cx4="http://schemas.microsoft.com/office/drawing/2016/5/10/chartex" xmlns:cx5="http://schemas.microsoft.com/office/drawing/2016/5/11/chartex" xmlns:cx6="http://schemas.microsoft.com/office/drawing/2016/5/12/chartex" xmlns:cx7="http://schemas.microsoft.com/office/drawing/2016/5/13/chartex" xmlns:cx8="http://schemas.microsoft.com/office/drawing/2016/5/14/chartex" xmlns:mc="http://schemas.openxmlformats.org/markup-compatibility/2006" xmlns:aink="http://schemas.microsoft.com/office/drawing/2016/ink" xmlns:am3d="http://schemas.microsoft.com/office/drawing/2017/model3d" xmlns:o="urn:schemas-microsoft-com:office:office" xmlns:oel="http://schemas.microsoft.com/office/2019/extlst" xmlns:r="http://schemas.openxmlformats.org/officeDocument/2006/relationships" xmlns:m="http://schemas.openxmlformats.org/officeDocument/2006/math" xmlns:v="urn:schemas-microsoft-com:vml" xmlns:wp14="http://schemas.microsoft.com/office/word/2010/wordprocessingDrawing" xmlns:wp="http://schemas.openxmlformats.org/drawingml/2006/wordprocessingDrawing" xmlns:w10="urn:schemas-microsoft-com:office:word" xmlns:w="http://schemas.openxmlformats.org/wordprocessingml/2006/main" xmlns:w14="http://schemas.microsoft.com/office/word/2010/wordml" xmlns:w15="http://schemas.microsoft.com/office/word/2012/wordml" xmlns:w16cex="http://schemas.microsoft.com/office/word/2018/wordml/cex" xmlns:w16cid="http://schemas.microsoft.com/office/word/2016/wordml/cid" xmlns:w16="http://schemas.microsoft.com/office/word/2018/wordml" xmlns:w16du="http://schemas.microsoft.com/office/word/2023/wordml/word16du" xmlns:w16sdtdh="http://schemas.microsoft.com/office/word/2020/wordml/sdtdatahash" xmlns:w16sdtfl="http://schemas.microsoft.com/office/word/2024/wordml/sdtformatlock" xmlns:w16se="http://schemas.microsoft.com/office/word/2015/wordml/symex" xmlns:wpg="http://schemas.microsoft.com/office/word/2010/wordprocessingGroup" xmlns:wpi="http://schemas.microsoft.com/office/word/2010/wordprocessingInk" xmlns:wne="http://schemas.microsoft.com/office/word/2006/wordml" xmlns:wps="http://schemas.microsoft.com/office/word/2010/wordprocessingShape" mc:Ignorable="w14 w15 w16se w16cid w16 w16cex w16sdtdh w16sdtfl w16du wp14">
+<w:ftr xmlns:wpc="http://schemas.microsoft.com/office/word/2010/wordprocessingCanvas" xmlns:cx="http://schemas.microsoft.com/office/drawing/2014/chartex" xmlns:cx1="http://schemas.microsoft.com/office/drawing/2015/9/8/chartex" xmlns:cx2="http://schemas.microsoft.com/office/drawing/2015/10/21/chartex" xmlns:cx3="http://schemas.microsoft.com/office/drawing/2016/5/9/chartex" xmlns:cx4="http://schemas.microsoft.com/office/drawing/2016/5/10/chartex" xmlns:cx5="http://schemas.microsoft.com/office/drawing/2016/5/11/chartex" xmlns:cx6="http://schemas.microsoft.com/office/drawing/2016/5/12/chartex" xmlns:cx7="http://schemas.microsoft.com/office/drawing/2016/5/13/chartex" xmlns:cx8="http://schemas.microsoft.com/office/drawing/2016/5/14/chartex" xmlns:mc="http://schemas.openxmlformats.org/markup-compatibility/2006" xmlns:aink="http://schemas.microsoft.com/office/drawing/2016/ink" xmlns:am3d="http://schemas.microsoft.com/office/drawing/2017/model3d" xmlns:o="urn:schemas-microsoft-com:office:office" xmlns:oel="http://schemas.microsoft.com/office/2019/extlst" xmlns:r="http://schemas.openxmlformats.org/officeDocument/2006/relationships" xmlns:m="http://schemas.openxmlformats.org/officeDocument/2006/math" xmlns:v="urn:schemas-microsoft-com:vml" xmlns:wp14="http://schemas.microsoft.com/office/word/2010/wordprocessingDrawing" xmlns:wp="http://schemas.openxmlformats.org/drawingml/2006/wordprocessingDrawing" xmlns:w10="urn:schemas-microsoft-com:office:word" xmlns:w="http://schemas.openxmlformats.org/wordprocessingml/2006/main" xmlns:w14="http://schemas.microsoft.com/office/word/2010/wordml" xmlns:w15="http://schemas.microsoft.com/office/word/2012/wordml" xmlns:w16cex="http://schemas.microsoft.com/office/word/2018/wordml/cex" xmlns:w16cid="http://schemas.microsoft.com/office/word/2016/wordml/cid" xmlns:w16="http://schemas.microsoft.com/office/word/2018/wordml" xmlns:w16sdtdh="http://schemas.microsoft.com/office/word/2020/wordml/sdtdatahash" xmlns:w16se="http://schemas.microsoft.com/office/word/2015/wordml/symex" xmlns:wpg="http://schemas.microsoft.com/office/word/2010/wordprocessingGroup" xmlns:wpi="http://schemas.microsoft.com/office/word/2010/wordprocessingInk" xmlns:wne="http://schemas.microsoft.com/office/word/2006/wordml" xmlns:wps="http://schemas.microsoft.com/office/word/2010/wordprocessingShape" mc:Ignorable="w14 w15 w16se w16cid w16 w16cex w16sdtdh wp14">
   <w:p>
     <w:pPr>
       <w:pStyle w:val="Footer"/>
@@ -11266,7 +11868,7 @@
 </file>
 
 <file path=word/footnotes.xml><?xml version="1.0" encoding="utf-8"?>
-<w:footnotes xmlns:wpc="http://schemas.microsoft.com/office/word/2010/wordprocessingCanvas" xmlns:cx="http://schemas.microsoft.com/office/drawing/2014/chartex" xmlns:cx1="http://schemas.microsoft.com/office/drawing/2015/9/8/chartex" xmlns:cx2="http://schemas.microsoft.com/office/drawing/2015/10/21/chartex" xmlns:cx3="http://schemas.microsoft.com/office/drawing/2016/5/9/chartex" xmlns:cx4="http://schemas.microsoft.com/office/drawing/2016/5/10/chartex" xmlns:cx5="http://schemas.microsoft.com/office/drawing/2016/5/11/chartex" xmlns:cx6="http://schemas.microsoft.com/office/drawing/2016/5/12/chartex" xmlns:cx7="http://schemas.microsoft.com/office/drawing/2016/5/13/chartex" xmlns:cx8="http://schemas.microsoft.com/office/drawing/2016/5/14/chartex" xmlns:mc="http://schemas.openxmlformats.org/markup-compatibility/2006" xmlns:aink="http://schemas.microsoft.com/office/drawing/2016/ink" xmlns:am3d="http://schemas.microsoft.com/office/drawing/2017/model3d" xmlns:o="urn:schemas-microsoft-com:office:office" xmlns:oel="http://schemas.microsoft.com/office/2019/extlst" xmlns:r="http://schemas.openxmlformats.org/officeDocument/2006/relationships" xmlns:m="http://schemas.openxmlformats.org/officeDocument/2006/math" xmlns:v="urn:schemas-microsoft-com:vml" xmlns:wp14="http://schemas.microsoft.com/office/word/2010/wordprocessingDrawing" xmlns:wp="http://schemas.openxmlformats.org/drawingml/2006/wordprocessingDrawing" xmlns:w10="urn:schemas-microsoft-com:office:word" xmlns:w="http://schemas.openxmlformats.org/wordprocessingml/2006/main" xmlns:w14="http://schemas.microsoft.com/office/word/2010/wordml" xmlns:w15="http://schemas.microsoft.com/office/word/2012/wordml" xmlns:w16cex="http://schemas.microsoft.com/office/word/2018/wordml/cex" xmlns:w16cid="http://schemas.microsoft.com/office/word/2016/wordml/cid" xmlns:w16="http://schemas.microsoft.com/office/word/2018/wordml" xmlns:w16du="http://schemas.microsoft.com/office/word/2023/wordml/word16du" xmlns:w16sdtdh="http://schemas.microsoft.com/office/word/2020/wordml/sdtdatahash" xmlns:w16sdtfl="http://schemas.microsoft.com/office/word/2024/wordml/sdtformatlock" xmlns:w16se="http://schemas.microsoft.com/office/word/2015/wordml/symex" xmlns:wpg="http://schemas.microsoft.com/office/word/2010/wordprocessingGroup" xmlns:wpi="http://schemas.microsoft.com/office/word/2010/wordprocessingInk" xmlns:wne="http://schemas.microsoft.com/office/word/2006/wordml" xmlns:wps="http://schemas.microsoft.com/office/word/2010/wordprocessingShape" mc:Ignorable="w14 w15 w16se w16cid w16 w16cex w16sdtdh w16sdtfl w16du wp14">
+<w:footnotes xmlns:wpc="http://schemas.microsoft.com/office/word/2010/wordprocessingCanvas" xmlns:cx="http://schemas.microsoft.com/office/drawing/2014/chartex" xmlns:cx1="http://schemas.microsoft.com/office/drawing/2015/9/8/chartex" xmlns:cx2="http://schemas.microsoft.com/office/drawing/2015/10/21/chartex" xmlns:cx3="http://schemas.microsoft.com/office/drawing/2016/5/9/chartex" xmlns:cx4="http://schemas.microsoft.com/office/drawing/2016/5/10/chartex" xmlns:cx5="http://schemas.microsoft.com/office/drawing/2016/5/11/chartex" xmlns:cx6="http://schemas.microsoft.com/office/drawing/2016/5/12/chartex" xmlns:cx7="http://schemas.microsoft.com/office/drawing/2016/5/13/chartex" xmlns:cx8="http://schemas.microsoft.com/office/drawing/2016/5/14/chartex" xmlns:mc="http://schemas.openxmlformats.org/markup-compatibility/2006" xmlns:aink="http://schemas.microsoft.com/office/drawing/2016/ink" xmlns:am3d="http://schemas.microsoft.com/office/drawing/2017/model3d" xmlns:o="urn:schemas-microsoft-com:office:office" xmlns:oel="http://schemas.microsoft.com/office/2019/extlst" xmlns:r="http://schemas.openxmlformats.org/officeDocument/2006/relationships" xmlns:m="http://schemas.openxmlformats.org/officeDocument/2006/math" xmlns:v="urn:schemas-microsoft-com:vml" xmlns:wp14="http://schemas.microsoft.com/office/word/2010/wordprocessingDrawing" xmlns:wp="http://schemas.openxmlformats.org/drawingml/2006/wordprocessingDrawing" xmlns:w10="urn:schemas-microsoft-com:office:word" xmlns:w="http://schemas.openxmlformats.org/wordprocessingml/2006/main" xmlns:w14="http://schemas.microsoft.com/office/word/2010/wordml" xmlns:w15="http://schemas.microsoft.com/office/word/2012/wordml" xmlns:w16cex="http://schemas.microsoft.com/office/word/2018/wordml/cex" xmlns:w16cid="http://schemas.microsoft.com/office/word/2016/wordml/cid" xmlns:w16="http://schemas.microsoft.com/office/word/2018/wordml" xmlns:w16sdtdh="http://schemas.microsoft.com/office/word/2020/wordml/sdtdatahash" xmlns:w16se="http://schemas.microsoft.com/office/word/2015/wordml/symex" xmlns:wpg="http://schemas.microsoft.com/office/word/2010/wordprocessingGroup" xmlns:wpi="http://schemas.microsoft.com/office/word/2010/wordprocessingInk" xmlns:wne="http://schemas.microsoft.com/office/word/2006/wordml" xmlns:wps="http://schemas.microsoft.com/office/word/2010/wordprocessingShape" mc:Ignorable="w14 w15 w16se w16cid w16 w16cex w16sdtdh wp14">
   <w:footnote w:type="separator" w:id="-1">
     <w:p>
       <w:r>
@@ -11285,7 +11887,7 @@
 </file>
 
 <file path=word/header1.xml><?xml version="1.0" encoding="utf-8"?>
-<w:hdr xmlns:wpc="http://schemas.microsoft.com/office/word/2010/wordprocessingCanvas" xmlns:cx="http://schemas.microsoft.com/office/drawing/2014/chartex" xmlns:cx1="http://schemas.microsoft.com/office/drawing/2015/9/8/chartex" xmlns:cx2="http://schemas.microsoft.com/office/drawing/2015/10/21/chartex" xmlns:cx3="http://schemas.microsoft.com/office/drawing/2016/5/9/chartex" xmlns:cx4="http://schemas.microsoft.com/office/drawing/2016/5/10/chartex" xmlns:cx5="http://schemas.microsoft.com/office/drawing/2016/5/11/chartex" xmlns:cx6="http://schemas.microsoft.com/office/drawing/2016/5/12/chartex" xmlns:cx7="http://schemas.microsoft.com/office/drawing/2016/5/13/chartex" xmlns:cx8="http://schemas.microsoft.com/office/drawing/2016/5/14/chartex" xmlns:mc="http://schemas.openxmlformats.org/markup-compatibility/2006" xmlns:aink="http://schemas.microsoft.com/office/drawing/2016/ink" xmlns:am3d="http://schemas.microsoft.com/office/drawing/2017/model3d" xmlns:o="urn:schemas-microsoft-com:office:office" xmlns:oel="http://schemas.microsoft.com/office/2019/extlst" xmlns:r="http://schemas.openxmlformats.org/officeDocument/2006/relationships" xmlns:m="http://schemas.openxmlformats.org/officeDocument/2006/math" xmlns:v="urn:schemas-microsoft-com:vml" xmlns:wp14="http://schemas.microsoft.com/office/word/2010/wordprocessingDrawing" xmlns:wp="http://schemas.openxmlformats.org/drawingml/2006/wordprocessingDrawing" xmlns:w10="urn:schemas-microsoft-com:office:word" xmlns:w="http://schemas.openxmlformats.org/wordprocessingml/2006/main" xmlns:w14="http://schemas.microsoft.com/office/word/2010/wordml" xmlns:w15="http://schemas.microsoft.com/office/word/2012/wordml" xmlns:w16cex="http://schemas.microsoft.com/office/word/2018/wordml/cex" xmlns:w16cid="http://schemas.microsoft.com/office/word/2016/wordml/cid" xmlns:w16="http://schemas.microsoft.com/office/word/2018/wordml" xmlns:w16du="http://schemas.microsoft.com/office/word/2023/wordml/word16du" xmlns:w16sdtdh="http://schemas.microsoft.com/office/word/2020/wordml/sdtdatahash" xmlns:w16sdtfl="http://schemas.microsoft.com/office/word/2024/wordml/sdtformatlock" xmlns:w16se="http://schemas.microsoft.com/office/word/2015/wordml/symex" xmlns:wpg="http://schemas.microsoft.com/office/word/2010/wordprocessingGroup" xmlns:wpi="http://schemas.microsoft.com/office/word/2010/wordprocessingInk" xmlns:wne="http://schemas.microsoft.com/office/word/2006/wordml" xmlns:wps="http://schemas.microsoft.com/office/word/2010/wordprocessingShape" mc:Ignorable="w14 w15 w16se w16cid w16 w16cex w16sdtdh w16sdtfl w16du wp14">
+<w:hdr xmlns:wpc="http://schemas.microsoft.com/office/word/2010/wordprocessingCanvas" xmlns:cx="http://schemas.microsoft.com/office/drawing/2014/chartex" xmlns:cx1="http://schemas.microsoft.com/office/drawing/2015/9/8/chartex" xmlns:cx2="http://schemas.microsoft.com/office/drawing/2015/10/21/chartex" xmlns:cx3="http://schemas.microsoft.com/office/drawing/2016/5/9/chartex" xmlns:cx4="http://schemas.microsoft.com/office/drawing/2016/5/10/chartex" xmlns:cx5="http://schemas.microsoft.com/office/drawing/2016/5/11/chartex" xmlns:cx6="http://schemas.microsoft.com/office/drawing/2016/5/12/chartex" xmlns:cx7="http://schemas.microsoft.com/office/drawing/2016/5/13/chartex" xmlns:cx8="http://schemas.microsoft.com/office/drawing/2016/5/14/chartex" xmlns:mc="http://schemas.openxmlformats.org/markup-compatibility/2006" xmlns:aink="http://schemas.microsoft.com/office/drawing/2016/ink" xmlns:am3d="http://schemas.microsoft.com/office/drawing/2017/model3d" xmlns:o="urn:schemas-microsoft-com:office:office" xmlns:oel="http://schemas.microsoft.com/office/2019/extlst" xmlns:r="http://schemas.openxmlformats.org/officeDocument/2006/relationships" xmlns:m="http://schemas.openxmlformats.org/officeDocument/2006/math" xmlns:v="urn:schemas-microsoft-com:vml" xmlns:wp14="http://schemas.microsoft.com/office/word/2010/wordprocessingDrawing" xmlns:wp="http://schemas.openxmlformats.org/drawingml/2006/wordprocessingDrawing" xmlns:w10="urn:schemas-microsoft-com:office:word" xmlns:w="http://schemas.openxmlformats.org/wordprocessingml/2006/main" xmlns:w14="http://schemas.microsoft.com/office/word/2010/wordml" xmlns:w15="http://schemas.microsoft.com/office/word/2012/wordml" xmlns:w16cex="http://schemas.microsoft.com/office/word/2018/wordml/cex" xmlns:w16cid="http://schemas.microsoft.com/office/word/2016/wordml/cid" xmlns:w16="http://schemas.microsoft.com/office/word/2018/wordml" xmlns:w16sdtdh="http://schemas.microsoft.com/office/word/2020/wordml/sdtdatahash" xmlns:w16se="http://schemas.microsoft.com/office/word/2015/wordml/symex" xmlns:wpg="http://schemas.microsoft.com/office/word/2010/wordprocessingGroup" xmlns:wpi="http://schemas.microsoft.com/office/word/2010/wordprocessingInk" xmlns:wne="http://schemas.microsoft.com/office/word/2006/wordml" xmlns:wps="http://schemas.microsoft.com/office/word/2010/wordprocessingShape" mc:Ignorable="w14 w15 w16se w16cid w16 w16cex w16sdtdh wp14">
   <w:p>
     <w:pPr>
       <w:pStyle w:val="Header"/>
@@ -11295,7 +11897,7 @@
 </file>
 
 <file path=word/header2.xml><?xml version="1.0" encoding="utf-8"?>
-<w:hdr xmlns:wpc="http://schemas.microsoft.com/office/word/2010/wordprocessingCanvas" xmlns:cx="http://schemas.microsoft.com/office/drawing/2014/chartex" xmlns:cx1="http://schemas.microsoft.com/office/drawing/2015/9/8/chartex" xmlns:cx2="http://schemas.microsoft.com/office/drawing/2015/10/21/chartex" xmlns:cx3="http://schemas.microsoft.com/office/drawing/2016/5/9/chartex" xmlns:cx4="http://schemas.microsoft.com/office/drawing/2016/5/10/chartex" xmlns:cx5="http://schemas.microsoft.com/office/drawing/2016/5/11/chartex" xmlns:cx6="http://schemas.microsoft.com/office/drawing/2016/5/12/chartex" xmlns:cx7="http://schemas.microsoft.com/office/drawing/2016/5/13/chartex" xmlns:cx8="http://schemas.microsoft.com/office/drawing/2016/5/14/chartex" xmlns:mc="http://schemas.openxmlformats.org/markup-compatibility/2006" xmlns:aink="http://schemas.microsoft.com/office/drawing/2016/ink" xmlns:am3d="http://schemas.microsoft.com/office/drawing/2017/model3d" xmlns:o="urn:schemas-microsoft-com:office:office" xmlns:oel="http://schemas.microsoft.com/office/2019/extlst" xmlns:r="http://schemas.openxmlformats.org/officeDocument/2006/relationships" xmlns:m="http://schemas.openxmlformats.org/officeDocument/2006/math" xmlns:v="urn:schemas-microsoft-com:vml" xmlns:wp14="http://schemas.microsoft.com/office/word/2010/wordprocessingDrawing" xmlns:wp="http://schemas.openxmlformats.org/drawingml/2006/wordprocessingDrawing" xmlns:w10="urn:schemas-microsoft-com:office:word" xmlns:w="http://schemas.openxmlformats.org/wordprocessingml/2006/main" xmlns:w14="http://schemas.microsoft.com/office/word/2010/wordml" xmlns:w15="http://schemas.microsoft.com/office/word/2012/wordml" xmlns:w16cex="http://schemas.microsoft.com/office/word/2018/wordml/cex" xmlns:w16cid="http://schemas.microsoft.com/office/word/2016/wordml/cid" xmlns:w16="http://schemas.microsoft.com/office/word/2018/wordml" xmlns:w16du="http://schemas.microsoft.com/office/word/2023/wordml/word16du" xmlns:w16sdtdh="http://schemas.microsoft.com/office/word/2020/wordml/sdtdatahash" xmlns:w16sdtfl="http://schemas.microsoft.com/office/word/2024/wordml/sdtformatlock" xmlns:w16se="http://schemas.microsoft.com/office/word/2015/wordml/symex" xmlns:wpg="http://schemas.microsoft.com/office/word/2010/wordprocessingGroup" xmlns:wpi="http://schemas.microsoft.com/office/word/2010/wordprocessingInk" xmlns:wne="http://schemas.microsoft.com/office/word/2006/wordml" xmlns:wps="http://schemas.microsoft.com/office/word/2010/wordprocessingShape" mc:Ignorable="w14 w15 w16se w16cid w16 w16cex w16sdtdh w16sdtfl w16du wp14">
+<w:hdr xmlns:wpc="http://schemas.microsoft.com/office/word/2010/wordprocessingCanvas" xmlns:cx="http://schemas.microsoft.com/office/drawing/2014/chartex" xmlns:cx1="http://schemas.microsoft.com/office/drawing/2015/9/8/chartex" xmlns:cx2="http://schemas.microsoft.com/office/drawing/2015/10/21/chartex" xmlns:cx3="http://schemas.microsoft.com/office/drawing/2016/5/9/chartex" xmlns:cx4="http://schemas.microsoft.com/office/drawing/2016/5/10/chartex" xmlns:cx5="http://schemas.microsoft.com/office/drawing/2016/5/11/chartex" xmlns:cx6="http://schemas.microsoft.com/office/drawing/2016/5/12/chartex" xmlns:cx7="http://schemas.microsoft.com/office/drawing/2016/5/13/chartex" xmlns:cx8="http://schemas.microsoft.com/office/drawing/2016/5/14/chartex" xmlns:mc="http://schemas.openxmlformats.org/markup-compatibility/2006" xmlns:aink="http://schemas.microsoft.com/office/drawing/2016/ink" xmlns:am3d="http://schemas.microsoft.com/office/drawing/2017/model3d" xmlns:o="urn:schemas-microsoft-com:office:office" xmlns:oel="http://schemas.microsoft.com/office/2019/extlst" xmlns:r="http://schemas.openxmlformats.org/officeDocument/2006/relationships" xmlns:m="http://schemas.openxmlformats.org/officeDocument/2006/math" xmlns:v="urn:schemas-microsoft-com:vml" xmlns:wp14="http://schemas.microsoft.com/office/word/2010/wordprocessingDrawing" xmlns:wp="http://schemas.openxmlformats.org/drawingml/2006/wordprocessingDrawing" xmlns:w10="urn:schemas-microsoft-com:office:word" xmlns:w="http://schemas.openxmlformats.org/wordprocessingml/2006/main" xmlns:w14="http://schemas.microsoft.com/office/word/2010/wordml" xmlns:w15="http://schemas.microsoft.com/office/word/2012/wordml" xmlns:w16cex="http://schemas.microsoft.com/office/word/2018/wordml/cex" xmlns:w16cid="http://schemas.microsoft.com/office/word/2016/wordml/cid" xmlns:w16="http://schemas.microsoft.com/office/word/2018/wordml" xmlns:w16sdtdh="http://schemas.microsoft.com/office/word/2020/wordml/sdtdatahash" xmlns:w16se="http://schemas.microsoft.com/office/word/2015/wordml/symex" xmlns:wpg="http://schemas.microsoft.com/office/word/2010/wordprocessingGroup" xmlns:wpi="http://schemas.microsoft.com/office/word/2010/wordprocessingInk" xmlns:wne="http://schemas.microsoft.com/office/word/2006/wordml" xmlns:wps="http://schemas.microsoft.com/office/word/2010/wordprocessingShape" mc:Ignorable="w14 w15 w16se w16cid w16 w16cex w16sdtdh wp14">
   <w:p>
     <w:pPr>
       <w:pStyle w:val="Header"/>
@@ -11305,7 +11907,7 @@
 </file>
 
 <file path=word/header3.xml><?xml version="1.0" encoding="utf-8"?>
-<w:hdr xmlns:wpc="http://schemas.microsoft.com/office/word/2010/wordprocessingCanvas" xmlns:cx="http://schemas.microsoft.com/office/drawing/2014/chartex" xmlns:cx1="http://schemas.microsoft.com/office/drawing/2015/9/8/chartex" xmlns:cx2="http://schemas.microsoft.com/office/drawing/2015/10/21/chartex" xmlns:cx3="http://schemas.microsoft.com/office/drawing/2016/5/9/chartex" xmlns:cx4="http://schemas.microsoft.com/office/drawing/2016/5/10/chartex" xmlns:cx5="http://schemas.microsoft.com/office/drawing/2016/5/11/chartex" xmlns:cx6="http://schemas.microsoft.com/office/drawing/2016/5/12/chartex" xmlns:cx7="http://schemas.microsoft.com/office/drawing/2016/5/13/chartex" xmlns:cx8="http://schemas.microsoft.com/office/drawing/2016/5/14/chartex" xmlns:mc="http://schemas.openxmlformats.org/markup-compatibility/2006" xmlns:aink="http://schemas.microsoft.com/office/drawing/2016/ink" xmlns:am3d="http://schemas.microsoft.com/office/drawing/2017/model3d" xmlns:o="urn:schemas-microsoft-com:office:office" xmlns:oel="http://schemas.microsoft.com/office/2019/extlst" xmlns:r="http://schemas.openxmlformats.org/officeDocument/2006/relationships" xmlns:m="http://schemas.openxmlformats.org/officeDocument/2006/math" xmlns:v="urn:schemas-microsoft-com:vml" xmlns:wp14="http://schemas.microsoft.com/office/word/2010/wordprocessingDrawing" xmlns:wp="http://schemas.openxmlformats.org/drawingml/2006/wordprocessingDrawing" xmlns:w10="urn:schemas-microsoft-com:office:word" xmlns:w="http://schemas.openxmlformats.org/wordprocessingml/2006/main" xmlns:w14="http://schemas.microsoft.com/office/word/2010/wordml" xmlns:w15="http://schemas.microsoft.com/office/word/2012/wordml" xmlns:w16cex="http://schemas.microsoft.com/office/word/2018/wordml/cex" xmlns:w16cid="http://schemas.microsoft.com/office/word/2016/wordml/cid" xmlns:w16="http://schemas.microsoft.com/office/word/2018/wordml" xmlns:w16du="http://schemas.microsoft.com/office/word/2023/wordml/word16du" xmlns:w16sdtdh="http://schemas.microsoft.com/office/word/2020/wordml/sdtdatahash" xmlns:w16sdtfl="http://schemas.microsoft.com/office/word/2024/wordml/sdtformatlock" xmlns:w16se="http://schemas.microsoft.com/office/word/2015/wordml/symex" xmlns:wpg="http://schemas.microsoft.com/office/word/2010/wordprocessingGroup" xmlns:wpi="http://schemas.microsoft.com/office/word/2010/wordprocessingInk" xmlns:wne="http://schemas.microsoft.com/office/word/2006/wordml" xmlns:wps="http://schemas.microsoft.com/office/word/2010/wordprocessingShape" mc:Ignorable="w14 w15 w16se w16cid w16 w16cex w16sdtdh w16sdtfl w16du wp14">
+<w:hdr xmlns:wpc="http://schemas.microsoft.com/office/word/2010/wordprocessingCanvas" xmlns:cx="http://schemas.microsoft.com/office/drawing/2014/chartex" xmlns:cx1="http://schemas.microsoft.com/office/drawing/2015/9/8/chartex" xmlns:cx2="http://schemas.microsoft.com/office/drawing/2015/10/21/chartex" xmlns:cx3="http://schemas.microsoft.com/office/drawing/2016/5/9/chartex" xmlns:cx4="http://schemas.microsoft.com/office/drawing/2016/5/10/chartex" xmlns:cx5="http://schemas.microsoft.com/office/drawing/2016/5/11/chartex" xmlns:cx6="http://schemas.microsoft.com/office/drawing/2016/5/12/chartex" xmlns:cx7="http://schemas.microsoft.com/office/drawing/2016/5/13/chartex" xmlns:cx8="http://schemas.microsoft.com/office/drawing/2016/5/14/chartex" xmlns:mc="http://schemas.openxmlformats.org/markup-compatibility/2006" xmlns:aink="http://schemas.microsoft.com/office/drawing/2016/ink" xmlns:am3d="http://schemas.microsoft.com/office/drawing/2017/model3d" xmlns:o="urn:schemas-microsoft-com:office:office" xmlns:oel="http://schemas.microsoft.com/office/2019/extlst" xmlns:r="http://schemas.openxmlformats.org/officeDocument/2006/relationships" xmlns:m="http://schemas.openxmlformats.org/officeDocument/2006/math" xmlns:v="urn:schemas-microsoft-com:vml" xmlns:wp14="http://schemas.microsoft.com/office/word/2010/wordprocessingDrawing" xmlns:wp="http://schemas.openxmlformats.org/drawingml/2006/wordprocessingDrawing" xmlns:w10="urn:schemas-microsoft-com:office:word" xmlns:w="http://schemas.openxmlformats.org/wordprocessingml/2006/main" xmlns:w14="http://schemas.microsoft.com/office/word/2010/wordml" xmlns:w15="http://schemas.microsoft.com/office/word/2012/wordml" xmlns:w16cex="http://schemas.microsoft.com/office/word/2018/wordml/cex" xmlns:w16cid="http://schemas.microsoft.com/office/word/2016/wordml/cid" xmlns:w16="http://schemas.microsoft.com/office/word/2018/wordml" xmlns:w16sdtdh="http://schemas.microsoft.com/office/word/2020/wordml/sdtdatahash" xmlns:w16se="http://schemas.microsoft.com/office/word/2015/wordml/symex" xmlns:wpg="http://schemas.microsoft.com/office/word/2010/wordprocessingGroup" xmlns:wpi="http://schemas.microsoft.com/office/word/2010/wordprocessingInk" xmlns:wne="http://schemas.microsoft.com/office/word/2006/wordml" xmlns:wps="http://schemas.microsoft.com/office/word/2010/wordprocessingShape" mc:Ignorable="w14 w15 w16se w16cid w16 w16cex w16sdtdh wp14">
   <w:p>
     <w:pPr>
       <w:pStyle w:val="Header"/>
@@ -11331,7 +11933,7 @@
 </file>
 
 <file path=word/header4.xml><?xml version="1.0" encoding="utf-8"?>
-<w:hdr xmlns:wpc="http://schemas.microsoft.com/office/word/2010/wordprocessingCanvas" xmlns:cx="http://schemas.microsoft.com/office/drawing/2014/chartex" xmlns:cx1="http://schemas.microsoft.com/office/drawing/2015/9/8/chartex" xmlns:cx2="http://schemas.microsoft.com/office/drawing/2015/10/21/chartex" xmlns:cx3="http://schemas.microsoft.com/office/drawing/2016/5/9/chartex" xmlns:cx4="http://schemas.microsoft.com/office/drawing/2016/5/10/chartex" xmlns:cx5="http://schemas.microsoft.com/office/drawing/2016/5/11/chartex" xmlns:cx6="http://schemas.microsoft.com/office/drawing/2016/5/12/chartex" xmlns:cx7="http://schemas.microsoft.com/office/drawing/2016/5/13/chartex" xmlns:cx8="http://schemas.microsoft.com/office/drawing/2016/5/14/chartex" xmlns:mc="http://schemas.openxmlformats.org/markup-compatibility/2006" xmlns:aink="http://schemas.microsoft.com/office/drawing/2016/ink" xmlns:am3d="http://schemas.microsoft.com/office/drawing/2017/model3d" xmlns:o="urn:schemas-microsoft-com:office:office" xmlns:oel="http://schemas.microsoft.com/office/2019/extlst" xmlns:r="http://schemas.openxmlformats.org/officeDocument/2006/relationships" xmlns:m="http://schemas.openxmlformats.org/officeDocument/2006/math" xmlns:v="urn:schemas-microsoft-com:vml" xmlns:wp14="http://schemas.microsoft.com/office/word/2010/wordprocessingDrawing" xmlns:wp="http://schemas.openxmlformats.org/drawingml/2006/wordprocessingDrawing" xmlns:w10="urn:schemas-microsoft-com:office:word" xmlns:w="http://schemas.openxmlformats.org/wordprocessingml/2006/main" xmlns:w14="http://schemas.microsoft.com/office/word/2010/wordml" xmlns:w15="http://schemas.microsoft.com/office/word/2012/wordml" xmlns:w16cex="http://schemas.microsoft.com/office/word/2018/wordml/cex" xmlns:w16cid="http://schemas.microsoft.com/office/word/2016/wordml/cid" xmlns:w16="http://schemas.microsoft.com/office/word/2018/wordml" xmlns:w16du="http://schemas.microsoft.com/office/word/2023/wordml/word16du" xmlns:w16sdtdh="http://schemas.microsoft.com/office/word/2020/wordml/sdtdatahash" xmlns:w16sdtfl="http://schemas.microsoft.com/office/word/2024/wordml/sdtformatlock" xmlns:w16se="http://schemas.microsoft.com/office/word/2015/wordml/symex" xmlns:wpg="http://schemas.microsoft.com/office/word/2010/wordprocessingGroup" xmlns:wpi="http://schemas.microsoft.com/office/word/2010/wordprocessingInk" xmlns:wne="http://schemas.microsoft.com/office/word/2006/wordml" xmlns:wps="http://schemas.microsoft.com/office/word/2010/wordprocessingShape" mc:Ignorable="w14 w15 w16se w16cid w16 w16cex w16sdtdh w16sdtfl w16du wp14">
+<w:hdr xmlns:wpc="http://schemas.microsoft.com/office/word/2010/wordprocessingCanvas" xmlns:cx="http://schemas.microsoft.com/office/drawing/2014/chartex" xmlns:cx1="http://schemas.microsoft.com/office/drawing/2015/9/8/chartex" xmlns:cx2="http://schemas.microsoft.com/office/drawing/2015/10/21/chartex" xmlns:cx3="http://schemas.microsoft.com/office/drawing/2016/5/9/chartex" xmlns:cx4="http://schemas.microsoft.com/office/drawing/2016/5/10/chartex" xmlns:cx5="http://schemas.microsoft.com/office/drawing/2016/5/11/chartex" xmlns:cx6="http://schemas.microsoft.com/office/drawing/2016/5/12/chartex" xmlns:cx7="http://schemas.microsoft.com/office/drawing/2016/5/13/chartex" xmlns:cx8="http://schemas.microsoft.com/office/drawing/2016/5/14/chartex" xmlns:mc="http://schemas.openxmlformats.org/markup-compatibility/2006" xmlns:aink="http://schemas.microsoft.com/office/drawing/2016/ink" xmlns:am3d="http://schemas.microsoft.com/office/drawing/2017/model3d" xmlns:o="urn:schemas-microsoft-com:office:office" xmlns:oel="http://schemas.microsoft.com/office/2019/extlst" xmlns:r="http://schemas.openxmlformats.org/officeDocument/2006/relationships" xmlns:m="http://schemas.openxmlformats.org/officeDocument/2006/math" xmlns:v="urn:schemas-microsoft-com:vml" xmlns:wp14="http://schemas.microsoft.com/office/word/2010/wordprocessingDrawing" xmlns:wp="http://schemas.openxmlformats.org/drawingml/2006/wordprocessingDrawing" xmlns:w10="urn:schemas-microsoft-com:office:word" xmlns:w="http://schemas.openxmlformats.org/wordprocessingml/2006/main" xmlns:w14="http://schemas.microsoft.com/office/word/2010/wordml" xmlns:w15="http://schemas.microsoft.com/office/word/2012/wordml" xmlns:w16cex="http://schemas.microsoft.com/office/word/2018/wordml/cex" xmlns:w16cid="http://schemas.microsoft.com/office/word/2016/wordml/cid" xmlns:w16="http://schemas.microsoft.com/office/word/2018/wordml" xmlns:w16sdtdh="http://schemas.microsoft.com/office/word/2020/wordml/sdtdatahash" xmlns:w16se="http://schemas.microsoft.com/office/word/2015/wordml/symex" xmlns:wpg="http://schemas.microsoft.com/office/word/2010/wordprocessingGroup" xmlns:wpi="http://schemas.microsoft.com/office/word/2010/wordprocessingInk" xmlns:wne="http://schemas.microsoft.com/office/word/2006/wordml" xmlns:wps="http://schemas.microsoft.com/office/word/2010/wordprocessingShape" mc:Ignorable="w14 w15 w16se w16cid w16 w16cex w16sdtdh wp14">
   <w:p>
     <w:pPr>
       <w:pStyle w:val="Header"/>
@@ -11357,7 +11959,7 @@
 </file>
 
 <file path=word/numbering.xml><?xml version="1.0" encoding="utf-8"?>
-<w:numbering xmlns:wpc="http://schemas.microsoft.com/office/word/2010/wordprocessingCanvas" xmlns:cx="http://schemas.microsoft.com/office/drawing/2014/chartex" xmlns:cx1="http://schemas.microsoft.com/office/drawing/2015/9/8/chartex" xmlns:cx2="http://schemas.microsoft.com/office/drawing/2015/10/21/chartex" xmlns:cx3="http://schemas.microsoft.com/office/drawing/2016/5/9/chartex" xmlns:cx4="http://schemas.microsoft.com/office/drawing/2016/5/10/chartex" xmlns:cx5="http://schemas.microsoft.com/office/drawing/2016/5/11/chartex" xmlns:cx6="http://schemas.microsoft.com/office/drawing/2016/5/12/chartex" xmlns:cx7="http://schemas.microsoft.com/office/drawing/2016/5/13/chartex" xmlns:cx8="http://schemas.microsoft.com/office/drawing/2016/5/14/chartex" xmlns:mc="http://schemas.openxmlformats.org/markup-compatibility/2006" xmlns:aink="http://schemas.microsoft.com/office/drawing/2016/ink" xmlns:am3d="http://schemas.microsoft.com/office/drawing/2017/model3d" xmlns:o="urn:schemas-microsoft-com:office:office" xmlns:oel="http://schemas.microsoft.com/office/2019/extlst" xmlns:r="http://schemas.openxmlformats.org/officeDocument/2006/relationships" xmlns:m="http://schemas.openxmlformats.org/officeDocument/2006/math" xmlns:v="urn:schemas-microsoft-com:vml" xmlns:wp14="http://schemas.microsoft.com/office/word/2010/wordprocessingDrawing" xmlns:wp="http://schemas.openxmlformats.org/drawingml/2006/wordprocessingDrawing" xmlns:w10="urn:schemas-microsoft-com:office:word" xmlns:w="http://schemas.openxmlformats.org/wordprocessingml/2006/main" xmlns:w14="http://schemas.microsoft.com/office/word/2010/wordml" xmlns:w15="http://schemas.microsoft.com/office/word/2012/wordml" xmlns:w16cex="http://schemas.microsoft.com/office/word/2018/wordml/cex" xmlns:w16cid="http://schemas.microsoft.com/office/word/2016/wordml/cid" xmlns:w16="http://schemas.microsoft.com/office/word/2018/wordml" xmlns:w16du="http://schemas.microsoft.com/office/word/2023/wordml/word16du" xmlns:w16sdtdh="http://schemas.microsoft.com/office/word/2020/wordml/sdtdatahash" xmlns:w16sdtfl="http://schemas.microsoft.com/office/word/2024/wordml/sdtformatlock" xmlns:w16se="http://schemas.microsoft.com/office/word/2015/wordml/symex" xmlns:wpg="http://schemas.microsoft.com/office/word/2010/wordprocessingGroup" xmlns:wpi="http://schemas.microsoft.com/office/word/2010/wordprocessingInk" xmlns:wne="http://schemas.microsoft.com/office/word/2006/wordml" xmlns:wps="http://schemas.microsoft.com/office/word/2010/wordprocessingShape" mc:Ignorable="w14 w15 w16se w16cid w16 w16cex w16sdtdh w16sdtfl w16du wp14">
+<w:numbering xmlns:wpc="http://schemas.microsoft.com/office/word/2010/wordprocessingCanvas" xmlns:cx="http://schemas.microsoft.com/office/drawing/2014/chartex" xmlns:cx1="http://schemas.microsoft.com/office/drawing/2015/9/8/chartex" xmlns:cx2="http://schemas.microsoft.com/office/drawing/2015/10/21/chartex" xmlns:cx3="http://schemas.microsoft.com/office/drawing/2016/5/9/chartex" xmlns:cx4="http://schemas.microsoft.com/office/drawing/2016/5/10/chartex" xmlns:cx5="http://schemas.microsoft.com/office/drawing/2016/5/11/chartex" xmlns:cx6="http://schemas.microsoft.com/office/drawing/2016/5/12/chartex" xmlns:cx7="http://schemas.microsoft.com/office/drawing/2016/5/13/chartex" xmlns:cx8="http://schemas.microsoft.com/office/drawing/2016/5/14/chartex" xmlns:mc="http://schemas.openxmlformats.org/markup-compatibility/2006" xmlns:aink="http://schemas.microsoft.com/office/drawing/2016/ink" xmlns:am3d="http://schemas.microsoft.com/office/drawing/2017/model3d" xmlns:o="urn:schemas-microsoft-com:office:office" xmlns:oel="http://schemas.microsoft.com/office/2019/extlst" xmlns:r="http://schemas.openxmlformats.org/officeDocument/2006/relationships" xmlns:m="http://schemas.openxmlformats.org/officeDocument/2006/math" xmlns:v="urn:schemas-microsoft-com:vml" xmlns:wp14="http://schemas.microsoft.com/office/word/2010/wordprocessingDrawing" xmlns:wp="http://schemas.openxmlformats.org/drawingml/2006/wordprocessingDrawing" xmlns:w10="urn:schemas-microsoft-com:office:word" xmlns:w="http://schemas.openxmlformats.org/wordprocessingml/2006/main" xmlns:w14="http://schemas.microsoft.com/office/word/2010/wordml" xmlns:w15="http://schemas.microsoft.com/office/word/2012/wordml" xmlns:w16cex="http://schemas.microsoft.com/office/word/2018/wordml/cex" xmlns:w16cid="http://schemas.microsoft.com/office/word/2016/wordml/cid" xmlns:w16="http://schemas.microsoft.com/office/word/2018/wordml" xmlns:w16sdtdh="http://schemas.microsoft.com/office/word/2020/wordml/sdtdatahash" xmlns:w16se="http://schemas.microsoft.com/office/word/2015/wordml/symex" xmlns:wpg="http://schemas.microsoft.com/office/word/2010/wordprocessingGroup" xmlns:wpi="http://schemas.microsoft.com/office/word/2010/wordprocessingInk" xmlns:wne="http://schemas.microsoft.com/office/word/2006/wordml" xmlns:wps="http://schemas.microsoft.com/office/word/2010/wordprocessingShape" mc:Ignorable="w14 w15 w16se w16cid w16 w16cex w16sdtdh wp14">
   <w:abstractNum w:abstractNumId="0" w15:restartNumberingAfterBreak="0">
     <w:nsid w:val="027A3388"/>
     <w:multiLevelType w:val="hybridMultilevel"/>
@@ -14948,7 +15550,7 @@
 </file>
 
 <file path=word/styles.xml><?xml version="1.0" encoding="utf-8"?>
-<w:styles xmlns:mc="http://schemas.openxmlformats.org/markup-compatibility/2006" xmlns:r="http://schemas.openxmlformats.org/officeDocument/2006/relationships" xmlns:w="http://schemas.openxmlformats.org/wordprocessingml/2006/main" xmlns:w14="http://schemas.microsoft.com/office/word/2010/wordml" xmlns:w15="http://schemas.microsoft.com/office/word/2012/wordml" xmlns:w16cex="http://schemas.microsoft.com/office/word/2018/wordml/cex" xmlns:w16cid="http://schemas.microsoft.com/office/word/2016/wordml/cid" xmlns:w16="http://schemas.microsoft.com/office/word/2018/wordml" xmlns:w16du="http://schemas.microsoft.com/office/word/2023/wordml/word16du" xmlns:w16sdtdh="http://schemas.microsoft.com/office/word/2020/wordml/sdtdatahash" xmlns:w16sdtfl="http://schemas.microsoft.com/office/word/2024/wordml/sdtformatlock" xmlns:w16se="http://schemas.microsoft.com/office/word/2015/wordml/symex" mc:Ignorable="w14 w15 w16se w16cid w16 w16cex w16sdtdh w16sdtfl w16du">
+<w:styles xmlns:mc="http://schemas.openxmlformats.org/markup-compatibility/2006" xmlns:r="http://schemas.openxmlformats.org/officeDocument/2006/relationships" xmlns:w="http://schemas.openxmlformats.org/wordprocessingml/2006/main" xmlns:w14="http://schemas.microsoft.com/office/word/2010/wordml" xmlns:w15="http://schemas.microsoft.com/office/word/2012/wordml" xmlns:w16cex="http://schemas.microsoft.com/office/word/2018/wordml/cex" xmlns:w16cid="http://schemas.microsoft.com/office/word/2016/wordml/cid" xmlns:w16="http://schemas.microsoft.com/office/word/2018/wordml" xmlns:w16sdtdh="http://schemas.microsoft.com/office/word/2020/wordml/sdtdatahash" xmlns:w16se="http://schemas.microsoft.com/office/word/2015/wordml/symex" mc:Ignorable="w14 w15 w16se w16cid w16 w16cex w16sdtdh">
   <w:docDefaults>
     <w:rPrDefault>
       <w:rPr>

</xml_diff>